<commit_message>
Update NYC taxis EDA docx
Replace the EDA_Optimising_NYC_Taxis_Mayuresh_Tungare.docx binary with an updated version of the EDA report. No source code changes; this updates the document content/formatting.
</commit_message>
<xml_diff>
--- a/EDA_Optimising_NYC_Taxis_Mayuresh_Tungare.docx
+++ b/EDA_Optimising_NYC_Taxis_Mayuresh_Tungare.docx
@@ -1236,15 +1236,7 @@
           <w:sz w:val="20"/>
           <w:szCs w:val="20"/>
         </w:rPr>
-        <w:t xml:space="preserve">We identified outliers in the </w:t>
-      </w:r>
-      <w:r>
-        <w:rPr>
-          <w:rFonts w:ascii="Aptos" w:hAnsi="Aptos"/>
-          <w:sz w:val="20"/>
-          <w:szCs w:val="20"/>
-        </w:rPr>
-        <w:t>‘</w:t>
+        <w:t>We identified outliers in the ‘</w:t>
       </w:r>
       <w:proofErr w:type="spellStart"/>
       <w:r>
@@ -1262,23 +1254,7 @@
           <w:sz w:val="20"/>
           <w:szCs w:val="20"/>
         </w:rPr>
-        <w:t>’</w:t>
-      </w:r>
-      <w:r>
-        <w:rPr>
-          <w:rFonts w:ascii="Aptos" w:hAnsi="Aptos"/>
-          <w:sz w:val="20"/>
-          <w:szCs w:val="20"/>
-        </w:rPr>
-        <w:t xml:space="preserve">, </w:t>
-      </w:r>
-      <w:r>
-        <w:rPr>
-          <w:rFonts w:ascii="Aptos" w:hAnsi="Aptos"/>
-          <w:sz w:val="20"/>
-          <w:szCs w:val="20"/>
-        </w:rPr>
-        <w:t>‘</w:t>
+        <w:t>’, ‘</w:t>
       </w:r>
       <w:proofErr w:type="spellStart"/>
       <w:r>
@@ -1296,23 +1272,7 @@
           <w:sz w:val="20"/>
           <w:szCs w:val="20"/>
         </w:rPr>
-        <w:t>’</w:t>
-      </w:r>
-      <w:r>
-        <w:rPr>
-          <w:rFonts w:ascii="Aptos" w:hAnsi="Aptos"/>
-          <w:sz w:val="20"/>
-          <w:szCs w:val="20"/>
-        </w:rPr>
-        <w:t xml:space="preserve">, and </w:t>
-      </w:r>
-      <w:r>
-        <w:rPr>
-          <w:rFonts w:ascii="Aptos" w:hAnsi="Aptos"/>
-          <w:sz w:val="20"/>
-          <w:szCs w:val="20"/>
-        </w:rPr>
-        <w:t>‘</w:t>
+        <w:t>’, and ‘</w:t>
       </w:r>
       <w:proofErr w:type="spellStart"/>
       <w:r>
@@ -1330,23 +1290,7 @@
           <w:sz w:val="20"/>
           <w:szCs w:val="20"/>
         </w:rPr>
-        <w:t>’</w:t>
-      </w:r>
-      <w:r>
-        <w:rPr>
-          <w:rFonts w:ascii="Aptos" w:hAnsi="Aptos"/>
-          <w:sz w:val="20"/>
-          <w:szCs w:val="20"/>
-        </w:rPr>
-        <w:t xml:space="preserve"> columns by generating boxplots and calculating summary statistics. For </w:t>
-      </w:r>
-      <w:r>
-        <w:rPr>
-          <w:rFonts w:ascii="Aptos" w:hAnsi="Aptos"/>
-          <w:sz w:val="20"/>
-          <w:szCs w:val="20"/>
-        </w:rPr>
-        <w:t>‘</w:t>
+        <w:t>’ columns by generating boxplots and calculating summary statistics. For ‘</w:t>
       </w:r>
       <w:proofErr w:type="spellStart"/>
       <w:r>
@@ -1364,23 +1308,7 @@
           <w:sz w:val="20"/>
           <w:szCs w:val="20"/>
         </w:rPr>
-        <w:t>’</w:t>
-      </w:r>
-      <w:r>
-        <w:rPr>
-          <w:rFonts w:ascii="Aptos" w:hAnsi="Aptos"/>
-          <w:sz w:val="20"/>
-          <w:szCs w:val="20"/>
-        </w:rPr>
-        <w:t xml:space="preserve">, we flagged extreme values exceeding 100 miles, while for </w:t>
-      </w:r>
-      <w:r>
-        <w:rPr>
-          <w:rFonts w:ascii="Aptos" w:hAnsi="Aptos"/>
-          <w:sz w:val="20"/>
-          <w:szCs w:val="20"/>
-        </w:rPr>
-        <w:t>‘</w:t>
+        <w:t>’, we flagged extreme values exceeding 100 miles, while for ‘</w:t>
       </w:r>
       <w:proofErr w:type="spellStart"/>
       <w:r>
@@ -1398,39 +1326,7 @@
           <w:sz w:val="20"/>
           <w:szCs w:val="20"/>
         </w:rPr>
-        <w:t>’</w:t>
-      </w:r>
-      <w:r>
-        <w:rPr>
-          <w:rFonts w:ascii="Aptos" w:hAnsi="Aptos"/>
-          <w:sz w:val="20"/>
-          <w:szCs w:val="20"/>
-        </w:rPr>
-        <w:t xml:space="preserve">, we isolated negative values and unrealistically high tips. We also </w:t>
-      </w:r>
-      <w:r>
-        <w:rPr>
-          <w:rFonts w:ascii="Aptos" w:hAnsi="Aptos"/>
-          <w:sz w:val="20"/>
-          <w:szCs w:val="20"/>
-        </w:rPr>
-        <w:t>examined</w:t>
-      </w:r>
-      <w:r>
-        <w:rPr>
-          <w:rFonts w:ascii="Aptos" w:hAnsi="Aptos"/>
-          <w:sz w:val="20"/>
-          <w:szCs w:val="20"/>
-        </w:rPr>
-        <w:t xml:space="preserve"> the </w:t>
-      </w:r>
-      <w:r>
-        <w:rPr>
-          <w:rFonts w:ascii="Aptos" w:hAnsi="Aptos"/>
-          <w:sz w:val="20"/>
-          <w:szCs w:val="20"/>
-        </w:rPr>
-        <w:t>‘</w:t>
+        <w:t>’, we isolated negative values and unrealistically high tips. We also examined the ‘</w:t>
       </w:r>
       <w:proofErr w:type="spellStart"/>
       <w:r>
@@ -1448,15 +1344,7 @@
           <w:sz w:val="20"/>
           <w:szCs w:val="20"/>
         </w:rPr>
-        <w:t>’</w:t>
-      </w:r>
-      <w:r>
-        <w:rPr>
-          <w:rFonts w:ascii="Aptos" w:hAnsi="Aptos"/>
-          <w:sz w:val="20"/>
-          <w:szCs w:val="20"/>
-        </w:rPr>
-        <w:t xml:space="preserve"> column for invalid category codes. These visual and statistical checks allowed us to detect erroneous entries that could skew our analysis. </w:t>
+        <w:t xml:space="preserve">’ column for invalid category codes. These visual and statistical checks allowed us to detect erroneous entries that could skew our analysis. </w:t>
       </w:r>
     </w:p>
     <w:p>
@@ -1533,25 +1421,7 @@
           <w:sz w:val="20"/>
           <w:szCs w:val="20"/>
         </w:rPr>
-        <w:t>C</w:t>
-      </w:r>
-      <w:r>
-        <w:rPr>
-          <w:rFonts w:ascii="Aptos" w:hAnsi="Aptos"/>
-          <w:bCs/>
-          <w:sz w:val="20"/>
-          <w:szCs w:val="20"/>
-        </w:rPr>
-        <w:t>ategorical variables</w:t>
-      </w:r>
-      <w:r>
-        <w:rPr>
-          <w:rFonts w:ascii="Aptos" w:hAnsi="Aptos"/>
-          <w:bCs/>
-          <w:sz w:val="20"/>
-          <w:szCs w:val="20"/>
-        </w:rPr>
-        <w:t xml:space="preserve">: </w:t>
+        <w:t xml:space="preserve">Categorical variables: </w:t>
       </w:r>
       <w:proofErr w:type="spellStart"/>
       <w:r>
@@ -1681,25 +1551,7 @@
           <w:szCs w:val="20"/>
         </w:rPr>
         <w:br/>
-        <w:t>N</w:t>
-      </w:r>
-      <w:r>
-        <w:rPr>
-          <w:rFonts w:ascii="Aptos" w:hAnsi="Aptos"/>
-          <w:bCs/>
-          <w:sz w:val="20"/>
-          <w:szCs w:val="20"/>
-        </w:rPr>
-        <w:t>umerical variables</w:t>
-      </w:r>
-      <w:r>
-        <w:rPr>
-          <w:rFonts w:ascii="Aptos" w:hAnsi="Aptos"/>
-          <w:bCs/>
-          <w:sz w:val="20"/>
-          <w:szCs w:val="20"/>
-        </w:rPr>
-        <w:t xml:space="preserve">: </w:t>
+        <w:t xml:space="preserve">Numerical variables: </w:t>
       </w:r>
       <w:proofErr w:type="spellStart"/>
       <w:r>
@@ -1870,7 +1722,7 @@
           <w:noProof/>
         </w:rPr>
         <w:drawing>
-          <wp:inline distT="0" distB="0" distL="0" distR="0" wp14:anchorId="138B993B" wp14:editId="2C0B0377">
+          <wp:inline distT="0" distB="0" distL="0" distR="0" wp14:anchorId="138B993B" wp14:editId="273FA79A">
             <wp:extent cx="4195268" cy="2083739"/>
             <wp:effectExtent l="0" t="0" r="0" b="0"/>
             <wp:docPr id="1811005879" name="Picture 1"/>
@@ -1997,7 +1849,7 @@
           <w:noProof/>
         </w:rPr>
         <w:drawing>
-          <wp:inline distT="0" distB="0" distL="0" distR="0" wp14:anchorId="2E587A96" wp14:editId="76410878">
+          <wp:inline distT="0" distB="0" distL="0" distR="0" wp14:anchorId="2E587A96" wp14:editId="2C2BCC0C">
             <wp:extent cx="3913632" cy="1943854"/>
             <wp:effectExtent l="0" t="0" r="0" b="0"/>
             <wp:docPr id="887282087" name="Picture 2"/>
@@ -2108,7 +1960,7 @@
           <w:noProof/>
         </w:rPr>
         <w:drawing>
-          <wp:inline distT="0" distB="0" distL="0" distR="0" wp14:anchorId="22A403F3" wp14:editId="46AD0260">
+          <wp:inline distT="0" distB="0" distL="0" distR="0" wp14:anchorId="22A403F3" wp14:editId="5EFD0814">
             <wp:extent cx="3902660" cy="1938405"/>
             <wp:effectExtent l="0" t="0" r="3175" b="5080"/>
             <wp:docPr id="1762991239" name="Picture 3"/>
@@ -3136,7 +2988,7 @@
           <w:noProof/>
         </w:rPr>
         <w:drawing>
-          <wp:inline distT="0" distB="0" distL="0" distR="0" wp14:anchorId="5F4A7333" wp14:editId="24066FDA">
+          <wp:inline distT="0" distB="0" distL="0" distR="0" wp14:anchorId="5F4A7333" wp14:editId="4E2AE76C">
             <wp:extent cx="3610052" cy="2155618"/>
             <wp:effectExtent l="0" t="0" r="0" b="0"/>
             <wp:docPr id="660966473" name="Picture 6"/>
@@ -3201,31 +3053,7 @@
           <w:sz w:val="20"/>
           <w:szCs w:val="20"/>
         </w:rPr>
-        <w:t xml:space="preserve">From the graph above, we </w:t>
-      </w:r>
-      <w:r>
-        <w:rPr>
-          <w:rFonts w:ascii="Aptos" w:hAnsi="Aptos"/>
-          <w:sz w:val="20"/>
-          <w:szCs w:val="20"/>
-        </w:rPr>
-        <w:t>f</w:t>
-      </w:r>
-      <w:r>
-        <w:rPr>
-          <w:rFonts w:ascii="Aptos" w:hAnsi="Aptos"/>
-          <w:sz w:val="20"/>
-          <w:szCs w:val="20"/>
-        </w:rPr>
-        <w:t>ind</w:t>
-      </w:r>
-      <w:r>
-        <w:rPr>
-          <w:rFonts w:ascii="Aptos" w:hAnsi="Aptos"/>
-          <w:sz w:val="20"/>
-          <w:szCs w:val="20"/>
-        </w:rPr>
-        <w:t xml:space="preserve"> that credit cards are the dominant choice, accounting for over 70% of all transactions. Cash follows as the second most common method, while other categories like "No charge" or "Dispute" represent a negligible fraction of the data. We noted that credit card trips consistently record higher total amounts because the system automatically captures electronic tips, whereas cash tips often go unrecorded in the dataset.</w:t>
+        <w:t>From the graph above, we find that credit cards are the dominant choice, accounting for over 70% of all transactions. Cash follows as the second most common method, while other categories like "No charge" or "Dispute" represent a negligible fraction of the data. We noted that credit card trips consistently record higher total amounts because the system automatically captures electronic tips, whereas cash tips often go unrecorded in the dataset.</w:t>
       </w:r>
     </w:p>
     <w:p>
@@ -3821,6 +3649,7 @@
         <w:rPr>
           <w:noProof/>
         </w:rPr>
+        <w:lastRenderedPageBreak/>
         <w:drawing>
           <wp:inline distT="0" distB="0" distL="0" distR="0" wp14:anchorId="4C93BDF9" wp14:editId="2C48C1A2">
             <wp:extent cx="3544215" cy="3089450"/>
@@ -4145,6 +3974,7 @@
           <w:rFonts w:ascii="Aptos" w:hAnsi="Aptos"/>
           <w:bCs/>
         </w:rPr>
+        <w:lastRenderedPageBreak/>
         <w:t>54308           140           216           14        0.0</w:t>
       </w:r>
     </w:p>
@@ -4276,7 +4106,7 @@
           <w:noProof/>
         </w:rPr>
         <w:drawing>
-          <wp:inline distT="0" distB="0" distL="0" distR="0" wp14:anchorId="53EB121D" wp14:editId="12722753">
+          <wp:inline distT="0" distB="0" distL="0" distR="0" wp14:anchorId="53EB121D" wp14:editId="420B7F99">
             <wp:extent cx="4209898" cy="2091006"/>
             <wp:effectExtent l="0" t="0" r="635" b="5080"/>
             <wp:docPr id="800869824" name="Picture 9"/>
@@ -4547,6 +4377,7 @@
           <w:rFonts w:ascii="Aptos" w:hAnsi="Aptos"/>
           <w:b/>
         </w:rPr>
+        <w:lastRenderedPageBreak/>
         <w:br/>
       </w:r>
     </w:p>
@@ -4756,6 +4587,7 @@
           <w:rFonts w:ascii="Aptos" w:hAnsi="Aptos"/>
           <w:b/>
         </w:rPr>
+        <w:lastRenderedPageBreak/>
         <w:br/>
       </w:r>
       <w:r>
@@ -5003,7 +4835,17 @@
           <w:sz w:val="20"/>
           <w:szCs w:val="20"/>
         </w:rPr>
-        <w:t>We isolated nighttime traffic patterns by filtering our dataset for trips occurring between 10:00 PM and 5:00 AM. We then aggregated the pickup counts by zone to identify which neighborhoods remain active after dark. Our analysis showed a shift in demand toward entertainment districts and residential hubs. By identifying these high-traffic night zones, we provided actionable intelligence for night-shift drivers, highlighting where they can find consistent fares when commercial activity in other parts of the city has slowed.</w:t>
+        <w:t xml:space="preserve">We isolated nighttime traffic patterns by filtering our dataset for trips occurring between 10:00 PM and 5:00 AM. We then aggregated the pickup counts by zone to </w:t>
+      </w:r>
+      <w:r>
+        <w:rPr>
+          <w:rFonts w:ascii="Aptos" w:hAnsi="Aptos"/>
+          <w:bCs/>
+          <w:sz w:val="20"/>
+          <w:szCs w:val="20"/>
+        </w:rPr>
+        <w:lastRenderedPageBreak/>
+        <w:t>identify which neighborhoods remain active after dark. Our analysis showed a shift in demand toward entertainment districts and residential hubs. By identifying these high-traffic night zones, we provided actionable intelligence for night-shift drivers, highlighting where they can find consistent fares when commercial activity in other parts of the city has slowed.</w:t>
       </w:r>
       <w:r>
         <w:rPr>
@@ -5166,6 +5008,7 @@
         <w:rPr>
           <w:noProof/>
         </w:rPr>
+        <w:lastRenderedPageBreak/>
         <w:drawing>
           <wp:inline distT="0" distB="0" distL="0" distR="0" wp14:anchorId="77665D4C" wp14:editId="640ECDBB">
             <wp:extent cx="4312311" cy="2801159"/>
@@ -5372,6 +5215,7 @@
           <w:rFonts w:ascii="Aptos" w:hAnsi="Aptos"/>
           <w:b/>
         </w:rPr>
+        <w:lastRenderedPageBreak/>
         <w:t>Analyse</w:t>
       </w:r>
       <w:proofErr w:type="spellEnd"/>
@@ -5601,7 +5445,16 @@
           <w:sz w:val="20"/>
           <w:szCs w:val="20"/>
         </w:rPr>
-        <w:t xml:space="preserve"> into categories (e.g., short, medium, long) and comparing the average fare rates for each vendor within those tiers. This approach allowed us to see if certain vendors are more cost-effective for specific trip lengths. We used this granular view to detect pricing anomalies that might be hidden in a global average. By comparing vendors across distance tiers, we gained a more nuanced understanding of the competitive landscape in the NYC taxi market.</w:t>
+        <w:t xml:space="preserve"> into categories (e.g., short, medium, long) and comparing the average fare rates for each vendor within those tiers. This approach allowed us to see if certain vendors are more cost-effective for specific trip lengths. We used this granular view to detect pricing anomalies that </w:t>
+      </w:r>
+      <w:r>
+        <w:rPr>
+          <w:rFonts w:ascii="Aptos" w:hAnsi="Aptos"/>
+          <w:sz w:val="20"/>
+          <w:szCs w:val="20"/>
+        </w:rPr>
+        <w:lastRenderedPageBreak/>
+        <w:t>might be hidden in a global average. By comparing vendors across distance tiers, we gained a more nuanced understanding of the competitive landscape in the NYC taxi market.</w:t>
       </w:r>
     </w:p>
     <w:p>
@@ -5645,7 +5498,7 @@
           <w:noProof/>
         </w:rPr>
         <w:drawing>
-          <wp:inline distT="0" distB="0" distL="0" distR="0" wp14:anchorId="383919C3" wp14:editId="6D9B3845">
+          <wp:inline distT="0" distB="0" distL="0" distR="0" wp14:anchorId="383919C3" wp14:editId="369D0D14">
             <wp:extent cx="4561028" cy="2265408"/>
             <wp:effectExtent l="0" t="0" r="0" b="1905"/>
             <wp:docPr id="227001894" name="Picture 17"/>
@@ -5802,7 +5655,7 @@
           <w:noProof/>
         </w:rPr>
         <w:drawing>
-          <wp:inline distT="0" distB="0" distL="0" distR="0" wp14:anchorId="133DBD67" wp14:editId="01E78F57">
+          <wp:inline distT="0" distB="0" distL="0" distR="0" wp14:anchorId="133DBD67" wp14:editId="383DD18E">
             <wp:extent cx="4166007" cy="2540997"/>
             <wp:effectExtent l="0" t="0" r="6350" b="0"/>
             <wp:docPr id="1779419317" name="Picture 18"/>
@@ -5904,7 +5757,17 @@
           <w:sz w:val="20"/>
           <w:szCs w:val="20"/>
         </w:rPr>
-        <w:t xml:space="preserve"> trips involve a single passenger, followed by small groups of two. We also tracked how these counts fluctuate by time of day, noting larger group sizes during late-night hours and weekends. By identifying these trends, we gained insights into the types of commuters using taxis, which helps in predicting vehicle size requirements and demand patterns.</w:t>
+        <w:t xml:space="preserve"> trips </w:t>
+      </w:r>
+      <w:r>
+        <w:rPr>
+          <w:rFonts w:ascii="Aptos" w:hAnsi="Aptos"/>
+          <w:bCs/>
+          <w:sz w:val="20"/>
+          <w:szCs w:val="20"/>
+        </w:rPr>
+        <w:lastRenderedPageBreak/>
+        <w:t>involve a single passenger, followed by small groups of two. We also tracked how these counts fluctuate by time of day, noting larger group sizes during late-night hours and weekends. By identifying these trends, we gained insights into the types of commuters using taxis, which helps in predicting vehicle size requirements and demand patterns.</w:t>
       </w:r>
       <w:r>
         <w:rPr>
@@ -6114,6 +5977,7 @@
         <w:rPr>
           <w:noProof/>
         </w:rPr>
+        <w:lastRenderedPageBreak/>
         <w:drawing>
           <wp:inline distT="0" distB="0" distL="0" distR="0" wp14:anchorId="3108204F" wp14:editId="08F414EF">
             <wp:extent cx="4370832" cy="2399288"/>
@@ -6464,7 +6328,19 @@
           <w:szCs w:val="20"/>
           <w:lang w:val="en-GB"/>
         </w:rPr>
-        <w:t>weekday evening rush (6:00 PM – 8:00 PM)</w:t>
+        <w:t xml:space="preserve">weekday evening rush (6:00 PM – </w:t>
+      </w:r>
+      <w:r>
+        <w:rPr>
+          <w:rFonts w:ascii="Aptos" w:hAnsi="Aptos"/>
+          <w:b/>
+          <w:bCs/>
+          <w:sz w:val="20"/>
+          <w:szCs w:val="20"/>
+          <w:lang w:val="en-GB"/>
+        </w:rPr>
+        <w:lastRenderedPageBreak/>
+        <w:t>8:00 PM)</w:t>
       </w:r>
       <w:r>
         <w:rPr>
@@ -6931,7 +6807,17 @@
           <w:szCs w:val="20"/>
           <w:lang w:val="en-GB"/>
         </w:rPr>
-        <w:t xml:space="preserve"> On Friday and Saturday nights, we recommend shifting resources from business districts to entertainment hubs. We observed sustained demand in these areas well past midnight, presenting a lucrative window for night-shift drivers to capitalize on social and leisure travel.</w:t>
+        <w:t xml:space="preserve"> On Friday and Saturday nights, we recommend shifting resources from business districts to entertainment hubs. We observed sustained demand in these areas well past midnight, presenting a </w:t>
+      </w:r>
+      <w:r>
+        <w:rPr>
+          <w:rFonts w:ascii="Aptos" w:hAnsi="Aptos"/>
+          <w:sz w:val="20"/>
+          <w:szCs w:val="20"/>
+          <w:lang w:val="en-GB"/>
+        </w:rPr>
+        <w:lastRenderedPageBreak/>
+        <w:t>lucrative window for night-shift drivers to capitalize on social and leisure travel.</w:t>
       </w:r>
     </w:p>
     <w:p>
@@ -7345,7 +7231,18 @@
           <w:szCs w:val="20"/>
           <w:lang w:val="en-GB"/>
         </w:rPr>
-        <w:t>Finally, we propose offering a small discount or loyalty points for contactless and credit card payments. Our data indicates that electronic transactions lead to higher recorded tips and faster turnaround times. By incentivizing digital payments, we improve driver earnings and operational efficiency, allowing us to maintain a more competitive and transparent pricing ecosystem compared to traditional cash-only vendors.</w:t>
+        <w:t xml:space="preserve">Finally, we propose offering a small discount or loyalty points for contactless and credit card payments. Our data indicates that electronic transactions lead to higher recorded tips and faster turnaround times. By incentivizing digital payments, we </w:t>
+      </w:r>
+      <w:r>
+        <w:rPr>
+          <w:rFonts w:ascii="Aptos" w:hAnsi="Aptos"/>
+          <w:bCs/>
+          <w:sz w:val="20"/>
+          <w:szCs w:val="20"/>
+          <w:lang w:val="en-GB"/>
+        </w:rPr>
+        <w:lastRenderedPageBreak/>
+        <w:t>improve driver earnings and operational efficiency, allowing us to maintain a more competitive and transparent pricing ecosystem compared to traditional cash-only vendors.</w:t>
       </w:r>
     </w:p>
     <w:p>
@@ -8738,6 +8635,7 @@
   <w:style w:type="character" w:default="1" w:styleId="DefaultParagraphFont">
     <w:name w:val="Default Paragraph Font"/>
     <w:uiPriority w:val="1"/>
+    <w:semiHidden/>
     <w:unhideWhenUsed/>
   </w:style>
   <w:style w:type="table" w:default="1" w:styleId="TableNormal">

</xml_diff>

<commit_message>
Update EDA Optimising NYC Taxis report
Replace the binary .docx with an updated version of the EDA report (EDA_Optimising_NYC_Taxis_Mayuresh_Tungare.docx). The new file contains content revisions and formatting updates to the exploratory data analysis document.
</commit_message>
<xml_diff>
--- a/EDA_Optimising_NYC_Taxis_Mayuresh_Tungare.docx
+++ b/EDA_Optimising_NYC_Taxis_Mayuresh_Tungare.docx
@@ -16,48 +16,20 @@
         <w:rPr>
           <w:rFonts w:ascii="Aptos" w:hAnsi="Aptos"/>
         </w:rPr>
-        <w:t xml:space="preserve">Report: </w:t>
-      </w:r>
-      <w:proofErr w:type="spellStart"/>
-      <w:r>
-        <w:rPr>
-          <w:rFonts w:ascii="Aptos" w:hAnsi="Aptos"/>
-        </w:rPr>
-        <w:t>Optimising</w:t>
-      </w:r>
-      <w:proofErr w:type="spellEnd"/>
-      <w:r>
-        <w:rPr>
-          <w:rFonts w:ascii="Aptos" w:hAnsi="Aptos"/>
-        </w:rPr>
-        <w:t xml:space="preserve"> NYC Taxi Operations</w:t>
-      </w:r>
-    </w:p>
-    <w:p>
-      <w:pPr>
-        <w:rPr>
-          <w:rFonts w:ascii="Aptos" w:hAnsi="Aptos"/>
-        </w:rPr>
-      </w:pPr>
-      <w:r>
-        <w:rPr>
-          <w:rFonts w:ascii="Aptos" w:hAnsi="Aptos"/>
-        </w:rPr>
-        <w:t xml:space="preserve">Include your </w:t>
-      </w:r>
-      <w:proofErr w:type="spellStart"/>
-      <w:r>
-        <w:rPr>
-          <w:rFonts w:ascii="Aptos" w:hAnsi="Aptos"/>
-        </w:rPr>
-        <w:t>visualisations</w:t>
-      </w:r>
-      <w:proofErr w:type="spellEnd"/>
-      <w:r>
-        <w:rPr>
-          <w:rFonts w:ascii="Aptos" w:hAnsi="Aptos"/>
-        </w:rPr>
-        <w:t>, analysis, results, insights, and outcomes. Explain your methodology and approach to the tasks. Add your conclusions to the sections.</w:t>
+        <w:t>Report: Optimising NYC Taxi Operations</w:t>
+      </w:r>
+    </w:p>
+    <w:p>
+      <w:pPr>
+        <w:rPr>
+          <w:rFonts w:ascii="Aptos" w:hAnsi="Aptos"/>
+        </w:rPr>
+      </w:pPr>
+      <w:r>
+        <w:rPr>
+          <w:rFonts w:ascii="Aptos" w:hAnsi="Aptos"/>
+        </w:rPr>
+        <w:t>Include your visualisations, analysis, results, insights, and outcomes. Explain your methodology and approach to the tasks. Add your conclusions to the sections.</w:t>
       </w:r>
     </w:p>
     <w:p>
@@ -113,6 +85,20 @@
           <w:sz w:val="20"/>
           <w:szCs w:val="20"/>
         </w:rPr>
+        <w:t>New York City is a living organism, a relentless machine of motion where the iconic yellow taxi serves as the lifeblood of its transit arteries.</w:t>
+      </w:r>
+      <w:r>
+        <w:rPr>
+          <w:rFonts w:ascii="Aptos" w:hAnsi="Aptos"/>
+        </w:rPr>
+        <w:t xml:space="preserve"> </w:t>
+      </w:r>
+      <w:r>
+        <w:rPr>
+          <w:rFonts w:ascii="Aptos" w:hAnsi="Aptos"/>
+          <w:sz w:val="20"/>
+          <w:szCs w:val="20"/>
+        </w:rPr>
         <w:t xml:space="preserve">To prepare for the analysis, we begin by importing certain Python libraries </w:t>
       </w:r>
       <w:r>
@@ -129,25 +115,7 @@
           <w:sz w:val="20"/>
           <w:szCs w:val="20"/>
         </w:rPr>
-        <w:t xml:space="preserve">pandas, </w:t>
-      </w:r>
-      <w:proofErr w:type="spellStart"/>
-      <w:r>
-        <w:rPr>
-          <w:rFonts w:ascii="Aptos" w:hAnsi="Aptos"/>
-          <w:sz w:val="20"/>
-          <w:szCs w:val="20"/>
-        </w:rPr>
-        <w:t>numpy</w:t>
-      </w:r>
-      <w:proofErr w:type="spellEnd"/>
-      <w:r>
-        <w:rPr>
-          <w:rFonts w:ascii="Aptos" w:hAnsi="Aptos"/>
-          <w:sz w:val="20"/>
-          <w:szCs w:val="20"/>
-        </w:rPr>
-        <w:t>, matplotlib, and seaborn</w:t>
+        <w:t>pandas, numpy, matplotlib, and seaborn</w:t>
       </w:r>
       <w:r>
         <w:rPr>
@@ -195,25 +163,7 @@
           <w:sz w:val="20"/>
           <w:szCs w:val="20"/>
         </w:rPr>
-        <w:t xml:space="preserve">from the </w:t>
-      </w:r>
-      <w:proofErr w:type="spellStart"/>
-      <w:r>
-        <w:rPr>
-          <w:rFonts w:ascii="Aptos" w:hAnsi="Aptos"/>
-          <w:sz w:val="20"/>
-          <w:szCs w:val="20"/>
-        </w:rPr>
-        <w:t>trip_records</w:t>
-      </w:r>
-      <w:proofErr w:type="spellEnd"/>
-      <w:r>
-        <w:rPr>
-          <w:rFonts w:ascii="Aptos" w:hAnsi="Aptos"/>
-          <w:sz w:val="20"/>
-          <w:szCs w:val="20"/>
-        </w:rPr>
-        <w:t xml:space="preserve"> folder using glob to locate multiple Parquet files. </w:t>
+        <w:t xml:space="preserve">from the trip_records folder using glob to locate multiple Parquet files. </w:t>
       </w:r>
     </w:p>
     <w:p>
@@ -241,77 +191,193 @@
         <w:ind w:left="1440"/>
         <w:rPr>
           <w:rFonts w:ascii="Aptos" w:hAnsi="Aptos"/>
-        </w:rPr>
-      </w:pPr>
-      <w:r>
-        <w:rPr>
-          <w:rFonts w:ascii="Aptos" w:hAnsi="Aptos"/>
-        </w:rPr>
-        <w:t xml:space="preserve">These individual files are read into a list and merged into a single </w:t>
-      </w:r>
-      <w:proofErr w:type="spellStart"/>
-      <w:r>
-        <w:rPr>
-          <w:rFonts w:ascii="Aptos" w:hAnsi="Aptos"/>
-        </w:rPr>
-        <w:t>DataFrame</w:t>
-      </w:r>
-      <w:proofErr w:type="spellEnd"/>
-      <w:r>
-        <w:rPr>
-          <w:rFonts w:ascii="Aptos" w:hAnsi="Aptos"/>
-        </w:rPr>
-        <w:t xml:space="preserve"> using </w:t>
-      </w:r>
-      <w:proofErr w:type="spellStart"/>
-      <w:proofErr w:type="gramStart"/>
-      <w:r>
-        <w:rPr>
-          <w:rFonts w:ascii="Aptos" w:hAnsi="Aptos"/>
-        </w:rPr>
-        <w:t>pd.concat</w:t>
-      </w:r>
-      <w:proofErr w:type="spellEnd"/>
-      <w:proofErr w:type="gramEnd"/>
-      <w:r>
-        <w:rPr>
-          <w:rFonts w:ascii="Aptos" w:hAnsi="Aptos"/>
-        </w:rPr>
-        <w:t>(). Subsequently, we generate a representative subset – sample-</w:t>
-      </w:r>
-      <w:proofErr w:type="spellStart"/>
-      <w:proofErr w:type="gramStart"/>
-      <w:r>
-        <w:rPr>
-          <w:rFonts w:ascii="Aptos" w:hAnsi="Aptos"/>
-        </w:rPr>
-        <w:t>data.parquet</w:t>
-      </w:r>
-      <w:proofErr w:type="spellEnd"/>
-      <w:proofErr w:type="gramEnd"/>
-      <w:r>
-        <w:rPr>
-          <w:rFonts w:ascii="Aptos" w:hAnsi="Aptos"/>
-        </w:rPr>
-        <w:t xml:space="preserve"> –using the </w:t>
-      </w:r>
-      <w:proofErr w:type="gramStart"/>
-      <w:r>
-        <w:rPr>
-          <w:rFonts w:ascii="Aptos" w:hAnsi="Aptos"/>
-        </w:rPr>
-        <w:t>sample(</w:t>
-      </w:r>
-      <w:proofErr w:type="gramEnd"/>
-      <w:r>
-        <w:rPr>
-          <w:rFonts w:ascii="Aptos" w:hAnsi="Aptos"/>
-        </w:rPr>
-        <w:t>) function, to ensure computational efficiency during exploration</w:t>
-      </w:r>
-      <w:r>
-        <w:rPr>
-          <w:rFonts w:ascii="Aptos" w:hAnsi="Aptos"/>
+          <w:sz w:val="20"/>
+          <w:szCs w:val="20"/>
+        </w:rPr>
+      </w:pPr>
+      <w:r>
+        <w:rPr>
+          <w:rFonts w:ascii="Aptos" w:hAnsi="Aptos"/>
+          <w:sz w:val="20"/>
+          <w:szCs w:val="20"/>
+        </w:rPr>
+        <w:t xml:space="preserve">When dealing with millions of records, "more data" is not always "better data" if it exceeds your ability to process it efficiently. Processing the entirety of NYC’s 2023 taxi records simultaneously is computationally prohibitive for </w:t>
+      </w:r>
+      <w:r>
+        <w:rPr>
+          <w:rFonts w:ascii="Aptos" w:hAnsi="Aptos"/>
+          <w:sz w:val="20"/>
+          <w:szCs w:val="20"/>
+        </w:rPr>
+        <w:t>those</w:t>
+      </w:r>
+      <w:r>
+        <w:rPr>
+          <w:rFonts w:ascii="Aptos" w:hAnsi="Aptos"/>
+          <w:sz w:val="20"/>
+          <w:szCs w:val="20"/>
+        </w:rPr>
+        <w:t xml:space="preserve"> computers that I have. </w:t>
+      </w:r>
+      <w:r>
+        <w:rPr>
+          <w:rFonts w:ascii="Aptos" w:hAnsi="Aptos"/>
+          <w:sz w:val="20"/>
+          <w:szCs w:val="20"/>
+        </w:rPr>
+        <w:t xml:space="preserve">To make the dataset feasible while maintaining the integrity of the city’s movement, </w:t>
+      </w:r>
+      <w:r>
+        <w:rPr>
+          <w:rFonts w:ascii="Aptos" w:hAnsi="Aptos"/>
+          <w:sz w:val="20"/>
+          <w:szCs w:val="20"/>
+        </w:rPr>
+        <w:t>I had to use a</w:t>
+      </w:r>
+      <w:r>
+        <w:rPr>
+          <w:rFonts w:ascii="Aptos" w:hAnsi="Aptos"/>
+          <w:sz w:val="20"/>
+          <w:szCs w:val="20"/>
+        </w:rPr>
+        <w:t xml:space="preserve"> strategic sampling method</w:t>
+      </w:r>
+      <w:r>
+        <w:rPr>
+          <w:rFonts w:ascii="Aptos" w:hAnsi="Aptos"/>
+          <w:sz w:val="20"/>
+          <w:szCs w:val="20"/>
+        </w:rPr>
+        <w:t xml:space="preserve">. </w:t>
+      </w:r>
+      <w:r>
+        <w:rPr>
+          <w:rFonts w:ascii="Aptos" w:hAnsi="Aptos"/>
+          <w:sz w:val="20"/>
+          <w:szCs w:val="20"/>
+        </w:rPr>
+        <w:t>The analysis utilized a 5% random sample</w:t>
+      </w:r>
+      <w:r>
+        <w:rPr>
+          <w:rFonts w:ascii="Aptos" w:hAnsi="Aptos"/>
+          <w:sz w:val="20"/>
+          <w:szCs w:val="20"/>
+        </w:rPr>
+        <w:t>. T</w:t>
+      </w:r>
+      <w:r>
+        <w:rPr>
+          <w:rFonts w:ascii="Aptos" w:hAnsi="Aptos"/>
+          <w:sz w:val="20"/>
+          <w:szCs w:val="20"/>
+        </w:rPr>
+        <w:t>he sample was taken across every hour of every day for the entire year. This granular approach ensure</w:t>
+      </w:r>
+      <w:r>
+        <w:rPr>
+          <w:rFonts w:ascii="Aptos" w:hAnsi="Aptos"/>
+          <w:sz w:val="20"/>
+          <w:szCs w:val="20"/>
+        </w:rPr>
+        <w:t>d</w:t>
+      </w:r>
+      <w:r>
+        <w:rPr>
+          <w:rFonts w:ascii="Aptos" w:hAnsi="Aptos"/>
+          <w:sz w:val="20"/>
+          <w:szCs w:val="20"/>
+        </w:rPr>
+        <w:t xml:space="preserve"> that the morning rush, the </w:t>
+      </w:r>
+      <w:r>
+        <w:rPr>
+          <w:rFonts w:ascii="Aptos" w:hAnsi="Aptos"/>
+          <w:sz w:val="20"/>
+          <w:szCs w:val="20"/>
+        </w:rPr>
+        <w:t>midday</w:t>
+      </w:r>
+      <w:r>
+        <w:rPr>
+          <w:rFonts w:ascii="Aptos" w:hAnsi="Aptos"/>
+          <w:sz w:val="20"/>
+          <w:szCs w:val="20"/>
+        </w:rPr>
+        <w:t xml:space="preserve"> lull, and the late-night surge </w:t>
+      </w:r>
+      <w:r>
+        <w:rPr>
+          <w:rFonts w:ascii="Aptos" w:hAnsi="Aptos"/>
+          <w:sz w:val="20"/>
+          <w:szCs w:val="20"/>
+        </w:rPr>
+        <w:t xml:space="preserve">were </w:t>
+      </w:r>
+      <w:r>
+        <w:rPr>
+          <w:rFonts w:ascii="Aptos" w:hAnsi="Aptos"/>
+          <w:sz w:val="20"/>
+          <w:szCs w:val="20"/>
+        </w:rPr>
+        <w:t>all preserved in their proper proportions.</w:t>
+      </w:r>
+    </w:p>
+    <w:p>
+      <w:pPr>
+        <w:pStyle w:val="ListParagraph"/>
+        <w:numPr>
+          <w:ilvl w:val="0"/>
+          <w:numId w:val="7"/>
+        </w:numPr>
+        <w:spacing w:before="200"/>
+        <w:rPr>
+          <w:rFonts w:ascii="Aptos" w:hAnsi="Aptos"/>
+        </w:rPr>
+      </w:pPr>
+      <w:r>
+        <w:rPr>
+          <w:rFonts w:ascii="Aptos" w:hAnsi="Aptos"/>
+          <w:sz w:val="20"/>
+          <w:szCs w:val="20"/>
+        </w:rPr>
+        <w:t xml:space="preserve">Step1: </w:t>
+      </w:r>
+      <w:r>
+        <w:rPr>
+          <w:rFonts w:ascii="Aptos" w:hAnsi="Aptos"/>
+          <w:sz w:val="20"/>
+          <w:szCs w:val="20"/>
+        </w:rPr>
+        <w:t xml:space="preserve">These individual files are read into a list and merged into a single DataFrame using pd.concat(). </w:t>
+      </w:r>
+    </w:p>
+    <w:p>
+      <w:pPr>
+        <w:pStyle w:val="ListParagraph"/>
+        <w:numPr>
+          <w:ilvl w:val="0"/>
+          <w:numId w:val="7"/>
+        </w:numPr>
+        <w:spacing w:before="200"/>
+        <w:rPr>
+          <w:rFonts w:ascii="Aptos" w:hAnsi="Aptos"/>
+        </w:rPr>
+      </w:pPr>
+      <w:r>
+        <w:rPr>
+          <w:rFonts w:ascii="Aptos" w:hAnsi="Aptos"/>
+          <w:sz w:val="20"/>
+          <w:szCs w:val="20"/>
+        </w:rPr>
+        <w:t>Subsequently, we generate a representative subset – sample-data.parquet –using the sample() function, to ensure computational efficiency during exploration</w:t>
+      </w:r>
+      <w:r>
+        <w:rPr>
+          <w:rFonts w:ascii="Aptos" w:hAnsi="Aptos"/>
+          <w:sz w:val="20"/>
+          <w:szCs w:val="20"/>
         </w:rPr>
         <w:br/>
       </w:r>
@@ -345,6 +411,106 @@
     </w:p>
     <w:p>
       <w:pPr>
+        <w:ind w:left="720"/>
+        <w:rPr>
+          <w:rFonts w:ascii="Aptos" w:hAnsi="Aptos"/>
+          <w:sz w:val="20"/>
+          <w:szCs w:val="20"/>
+        </w:rPr>
+      </w:pPr>
+      <w:r>
+        <w:rPr>
+          <w:rFonts w:ascii="Aptos" w:hAnsi="Aptos"/>
+          <w:sz w:val="20"/>
+          <w:szCs w:val="20"/>
+        </w:rPr>
+        <w:t>Raw data is rarely "clean"</w:t>
+      </w:r>
+      <w:r>
+        <w:rPr>
+          <w:rFonts w:ascii="Aptos" w:hAnsi="Aptos"/>
+          <w:sz w:val="20"/>
+          <w:szCs w:val="20"/>
+        </w:rPr>
+        <w:t xml:space="preserve">. </w:t>
+      </w:r>
+      <w:r>
+        <w:rPr>
+          <w:rFonts w:ascii="Aptos" w:hAnsi="Aptos"/>
+          <w:sz w:val="20"/>
+          <w:szCs w:val="20"/>
+        </w:rPr>
+        <w:t xml:space="preserve"> The 2023 records contained several "ghost trips" and "impossible journeys" that would have skewed any strategic insights if left unchecked.</w:t>
+      </w:r>
+      <w:r>
+        <w:rPr>
+          <w:rFonts w:ascii="Aptos" w:hAnsi="Aptos"/>
+          <w:sz w:val="20"/>
+          <w:szCs w:val="20"/>
+        </w:rPr>
+        <w:t xml:space="preserve"> </w:t>
+      </w:r>
+      <w:r>
+        <w:rPr>
+          <w:rFonts w:ascii="Aptos" w:hAnsi="Aptos"/>
+          <w:sz w:val="20"/>
+          <w:szCs w:val="20"/>
+        </w:rPr>
+        <w:t xml:space="preserve">Identifying a trip with zero distance but a $300 fare </w:t>
+      </w:r>
+      <w:r>
+        <w:rPr>
+          <w:rFonts w:ascii="Aptos" w:hAnsi="Aptos"/>
+          <w:sz w:val="20"/>
+          <w:szCs w:val="20"/>
+        </w:rPr>
+        <w:t xml:space="preserve">shows </w:t>
+      </w:r>
+      <w:r>
+        <w:rPr>
+          <w:rFonts w:ascii="Aptos" w:hAnsi="Aptos"/>
+          <w:sz w:val="20"/>
+          <w:szCs w:val="20"/>
+        </w:rPr>
+        <w:t xml:space="preserve">a recording error rather than a legitimate transaction. Similarly, finding "RatecodeID 99" (an undefined code) or negative fare amounts suggests system glitches that must be </w:t>
+      </w:r>
+      <w:r>
+        <w:rPr>
+          <w:rFonts w:ascii="Aptos" w:hAnsi="Aptos"/>
+          <w:sz w:val="20"/>
+          <w:szCs w:val="20"/>
+        </w:rPr>
+        <w:t xml:space="preserve">“cleaned” </w:t>
+      </w:r>
+      <w:r>
+        <w:rPr>
+          <w:rFonts w:ascii="Aptos" w:hAnsi="Aptos"/>
+          <w:sz w:val="20"/>
+          <w:szCs w:val="20"/>
+        </w:rPr>
+        <w:t xml:space="preserve">to maintain the reliability of </w:t>
+      </w:r>
+      <w:r>
+        <w:rPr>
+          <w:rFonts w:ascii="Aptos" w:hAnsi="Aptos"/>
+          <w:sz w:val="20"/>
+          <w:szCs w:val="20"/>
+        </w:rPr>
+        <w:t>analysis</w:t>
+      </w:r>
+      <w:r>
+        <w:rPr>
+          <w:rFonts w:ascii="Aptos" w:hAnsi="Aptos"/>
+          <w:sz w:val="20"/>
+          <w:szCs w:val="20"/>
+        </w:rPr>
+        <w:t xml:space="preserve">. </w:t>
+      </w:r>
+      <w:bookmarkStart w:id="3" w:name="_is2ohbjlcypm" w:colFirst="0" w:colLast="0"/>
+      <w:bookmarkEnd w:id="3"/>
+    </w:p>
+    <w:p>
+      <w:pPr>
         <w:pStyle w:val="Heading3"/>
         <w:numPr>
           <w:ilvl w:val="1"/>
@@ -355,8 +521,6 @@
           <w:rFonts w:ascii="Aptos" w:hAnsi="Aptos"/>
         </w:rPr>
       </w:pPr>
-      <w:bookmarkStart w:id="3" w:name="_is2ohbjlcypm" w:colFirst="0" w:colLast="0"/>
-      <w:bookmarkEnd w:id="3"/>
       <w:r>
         <w:rPr>
           <w:rFonts w:ascii="Aptos" w:hAnsi="Aptos"/>
@@ -401,36 +565,17 @@
           <w:sz w:val="20"/>
           <w:szCs w:val="20"/>
         </w:rPr>
-        <w:t xml:space="preserve">After merging the individual trip records, we identified that the combined </w:t>
-      </w:r>
-      <w:proofErr w:type="spellStart"/>
-      <w:r>
-        <w:rPr>
-          <w:rFonts w:ascii="Aptos" w:hAnsi="Aptos"/>
-          <w:sz w:val="20"/>
-          <w:szCs w:val="20"/>
-        </w:rPr>
-        <w:t>DataFrame</w:t>
-      </w:r>
-      <w:proofErr w:type="spellEnd"/>
-      <w:r>
-        <w:rPr>
-          <w:rFonts w:ascii="Aptos" w:hAnsi="Aptos"/>
-          <w:sz w:val="20"/>
-          <w:szCs w:val="20"/>
-        </w:rPr>
-        <w:t xml:space="preserve"> contained a fragmented and non-unique index. We fixed this by applying the </w:t>
-      </w:r>
-      <w:proofErr w:type="spellStart"/>
-      <w:r>
-        <w:rPr>
-          <w:rFonts w:ascii="Aptos" w:hAnsi="Aptos"/>
-          <w:sz w:val="20"/>
-          <w:szCs w:val="20"/>
-        </w:rPr>
-        <w:t>reset_index</w:t>
-      </w:r>
-      <w:proofErr w:type="spellEnd"/>
+        <w:t xml:space="preserve">After merging the individual trip records, we identified that the combined DataFrame contained a fragmented and non-unique index. We fixed this by applying </w:t>
+      </w:r>
+      <w:r>
+        <w:rPr>
+          <w:rFonts w:ascii="Aptos" w:hAnsi="Aptos"/>
+          <w:sz w:val="20"/>
+          <w:szCs w:val="20"/>
+        </w:rPr>
+        <w:lastRenderedPageBreak/>
+        <w:t>the reset_index</w:t>
+      </w:r>
       <w:r>
         <w:rPr>
           <w:rFonts w:ascii="Aptos" w:hAnsi="Aptos"/>
@@ -472,23 +617,7 @@
           <w:rFonts w:ascii="Aptos" w:hAnsi="Aptos"/>
           <w:b/>
         </w:rPr>
-        <w:t xml:space="preserve">Combine the two </w:t>
-      </w:r>
-      <w:proofErr w:type="spellStart"/>
-      <w:r>
-        <w:rPr>
-          <w:rFonts w:ascii="Aptos" w:hAnsi="Aptos"/>
-          <w:b/>
-        </w:rPr>
-        <w:t>airport_fee</w:t>
-      </w:r>
-      <w:proofErr w:type="spellEnd"/>
-      <w:r>
-        <w:rPr>
-          <w:rFonts w:ascii="Aptos" w:hAnsi="Aptos"/>
-          <w:b/>
-        </w:rPr>
-        <w:t xml:space="preserve"> columns</w:t>
+        <w:t>Combine the two airport_fee columns</w:t>
       </w:r>
       <w:r>
         <w:rPr>
@@ -504,9 +633,8 @@
           <w:sz w:val="20"/>
           <w:szCs w:val="20"/>
         </w:rPr>
-        <w:t xml:space="preserve">We consolidated the two </w:t>
-      </w:r>
-      <w:proofErr w:type="spellStart"/>
+        <w:t xml:space="preserve">We consolidated the two airport_fee columns using the </w:t>
+      </w:r>
       <w:r>
         <w:rPr>
           <w:rFonts w:ascii="Aptos" w:hAnsi="Aptos"/>
@@ -514,9 +642,8 @@
           <w:sz w:val="20"/>
           <w:szCs w:val="20"/>
         </w:rPr>
-        <w:t>airport_fee</w:t>
-      </w:r>
-      <w:proofErr w:type="spellEnd"/>
+        <w:t>‘</w:t>
+      </w:r>
       <w:r>
         <w:rPr>
           <w:rFonts w:ascii="Aptos" w:hAnsi="Aptos"/>
@@ -524,47 +651,7 @@
           <w:sz w:val="20"/>
           <w:szCs w:val="20"/>
         </w:rPr>
-        <w:t xml:space="preserve"> columns using the </w:t>
-      </w:r>
-      <w:r>
-        <w:rPr>
-          <w:rFonts w:ascii="Aptos" w:hAnsi="Aptos"/>
-          <w:iCs/>
-          <w:sz w:val="20"/>
-          <w:szCs w:val="20"/>
-        </w:rPr>
-        <w:t>‘</w:t>
-      </w:r>
-      <w:proofErr w:type="spellStart"/>
-      <w:proofErr w:type="gramStart"/>
-      <w:r>
-        <w:rPr>
-          <w:rFonts w:ascii="Aptos" w:hAnsi="Aptos"/>
-          <w:iCs/>
-          <w:sz w:val="20"/>
-          <w:szCs w:val="20"/>
-        </w:rPr>
-        <w:t>fillna</w:t>
-      </w:r>
-      <w:proofErr w:type="spellEnd"/>
-      <w:r>
-        <w:rPr>
-          <w:rFonts w:ascii="Aptos" w:hAnsi="Aptos"/>
-          <w:iCs/>
-          <w:sz w:val="20"/>
-          <w:szCs w:val="20"/>
-        </w:rPr>
-        <w:t>(</w:t>
-      </w:r>
-      <w:proofErr w:type="gramEnd"/>
-      <w:r>
-        <w:rPr>
-          <w:rFonts w:ascii="Aptos" w:hAnsi="Aptos"/>
-          <w:iCs/>
-          <w:sz w:val="20"/>
-          <w:szCs w:val="20"/>
-        </w:rPr>
-        <w:t>)</w:t>
+        <w:t>fillna()</w:t>
       </w:r>
       <w:r>
         <w:rPr>
@@ -630,7 +717,6 @@
         <w:rPr>
           <w:rFonts w:ascii="Aptos" w:hAnsi="Aptos"/>
         </w:rPr>
-        <w:lastRenderedPageBreak/>
         <w:t>Handling Missing Values</w:t>
       </w:r>
     </w:p>
@@ -668,43 +754,7 @@
           <w:sz w:val="20"/>
           <w:szCs w:val="20"/>
         </w:rPr>
-        <w:t xml:space="preserve">We determined the proportion of missing values by applying the </w:t>
-      </w:r>
-      <w:proofErr w:type="spellStart"/>
-      <w:r>
-        <w:rPr>
-          <w:rFonts w:ascii="Aptos" w:hAnsi="Aptos"/>
-          <w:sz w:val="20"/>
-          <w:szCs w:val="20"/>
-        </w:rPr>
-        <w:t>isna</w:t>
-      </w:r>
-      <w:proofErr w:type="spellEnd"/>
-      <w:r>
-        <w:rPr>
-          <w:rFonts w:ascii="Aptos" w:hAnsi="Aptos"/>
-          <w:sz w:val="20"/>
-          <w:szCs w:val="20"/>
-        </w:rPr>
-        <w:t>(</w:t>
-      </w:r>
-      <w:proofErr w:type="gramStart"/>
-      <w:r>
-        <w:rPr>
-          <w:rFonts w:ascii="Aptos" w:hAnsi="Aptos"/>
-          <w:sz w:val="20"/>
-          <w:szCs w:val="20"/>
-        </w:rPr>
-        <w:t>).sum</w:t>
-      </w:r>
-      <w:proofErr w:type="gramEnd"/>
-      <w:r>
-        <w:rPr>
-          <w:rFonts w:ascii="Aptos" w:hAnsi="Aptos"/>
-          <w:sz w:val="20"/>
-          <w:szCs w:val="20"/>
-        </w:rPr>
-        <w:t xml:space="preserve">() method to our dataset and dividing the results by the total row count. Our analysis revealed that while most columns were complete, </w:t>
+        <w:t xml:space="preserve">We determined the proportion of missing values by applying the isna().sum() method to our dataset and dividing the results by the total row count. Our analysis revealed that while most columns were complete, </w:t>
       </w:r>
       <w:r>
         <w:rPr>
@@ -714,7 +764,6 @@
         </w:rPr>
         <w:t>columns ‘</w:t>
       </w:r>
-      <w:proofErr w:type="spellStart"/>
       <w:r>
         <w:rPr>
           <w:rFonts w:ascii="Aptos" w:hAnsi="Aptos"/>
@@ -723,7 +772,6 @@
         </w:rPr>
         <w:t>passenger_count</w:t>
       </w:r>
-      <w:proofErr w:type="spellEnd"/>
       <w:r>
         <w:rPr>
           <w:rFonts w:ascii="Aptos" w:hAnsi="Aptos"/>
@@ -748,7 +796,6 @@
         </w:rPr>
         <w:t>‘</w:t>
       </w:r>
-      <w:proofErr w:type="spellStart"/>
       <w:r>
         <w:rPr>
           <w:rFonts w:ascii="Aptos" w:hAnsi="Aptos"/>
@@ -757,7 +804,6 @@
         </w:rPr>
         <w:t>RatecodeID</w:t>
       </w:r>
-      <w:proofErr w:type="spellEnd"/>
       <w:r>
         <w:rPr>
           <w:rFonts w:ascii="Aptos" w:hAnsi="Aptos"/>
@@ -793,17 +839,8 @@
           <w:rFonts w:ascii="Aptos" w:hAnsi="Aptos"/>
           <w:b/>
         </w:rPr>
-        <w:t xml:space="preserve">Handling missing values in </w:t>
-      </w:r>
-      <w:proofErr w:type="spellStart"/>
-      <w:r>
-        <w:rPr>
-          <w:rFonts w:ascii="Aptos" w:hAnsi="Aptos"/>
-          <w:b/>
-        </w:rPr>
-        <w:t>passenger_count</w:t>
-      </w:r>
-      <w:proofErr w:type="spellEnd"/>
+        <w:t>Handling missing values in passenger_count</w:t>
+      </w:r>
       <w:r>
         <w:rPr>
           <w:rFonts w:ascii="Aptos" w:hAnsi="Aptos"/>
@@ -817,25 +854,7 @@
           <w:sz w:val="20"/>
           <w:szCs w:val="20"/>
         </w:rPr>
-        <w:t xml:space="preserve">We addressed the missing values in the </w:t>
-      </w:r>
-      <w:proofErr w:type="spellStart"/>
-      <w:r>
-        <w:rPr>
-          <w:rFonts w:ascii="Aptos" w:hAnsi="Aptos"/>
-          <w:sz w:val="20"/>
-          <w:szCs w:val="20"/>
-        </w:rPr>
-        <w:t>passenger_count</w:t>
-      </w:r>
-      <w:proofErr w:type="spellEnd"/>
-      <w:r>
-        <w:rPr>
-          <w:rFonts w:ascii="Aptos" w:hAnsi="Aptos"/>
-          <w:sz w:val="20"/>
-          <w:szCs w:val="20"/>
-        </w:rPr>
-        <w:t xml:space="preserve"> column by imputing them with the </w:t>
+        <w:t xml:space="preserve">We addressed the missing values in the passenger_count column by imputing them with the </w:t>
       </w:r>
       <w:r>
         <w:rPr>
@@ -853,35 +872,7 @@
           <w:sz w:val="20"/>
           <w:szCs w:val="20"/>
         </w:rPr>
-        <w:t xml:space="preserve"> of the distribution. Since the most frequent number of passengers per trip was one, we filled all null entries with this value using the </w:t>
-      </w:r>
-      <w:proofErr w:type="spellStart"/>
-      <w:proofErr w:type="gramStart"/>
-      <w:r>
-        <w:rPr>
-          <w:rFonts w:ascii="Aptos" w:hAnsi="Aptos"/>
-          <w:sz w:val="20"/>
-          <w:szCs w:val="20"/>
-        </w:rPr>
-        <w:t>fillna</w:t>
-      </w:r>
-      <w:proofErr w:type="spellEnd"/>
-      <w:r>
-        <w:rPr>
-          <w:rFonts w:ascii="Aptos" w:hAnsi="Aptos"/>
-          <w:sz w:val="20"/>
-          <w:szCs w:val="20"/>
-        </w:rPr>
-        <w:t>(</w:t>
-      </w:r>
-      <w:proofErr w:type="gramEnd"/>
-      <w:r>
-        <w:rPr>
-          <w:rFonts w:ascii="Aptos" w:hAnsi="Aptos"/>
-          <w:sz w:val="20"/>
-          <w:szCs w:val="20"/>
-        </w:rPr>
-        <w:t>) method. This approach allowed us to preserve the dataset's size while maintaining the statistical integrity of the feature. By choosing the mode, we ensured that our imputation reflected the most common real-world scenario observed in the NYC taxi records.</w:t>
+        <w:t xml:space="preserve"> of the distribution. Since the most frequent number of passengers per trip was one, we filled all null entries with this value using the fillna() method. This approach allowed us to preserve the dataset's size while maintaining the statistical integrity of the feature. By choosing the mode, we ensured that our imputation reflected the most common real-world scenario observed in the NYC taxi records.</w:t>
       </w:r>
       <w:r>
         <w:rPr>
@@ -906,17 +897,8 @@
           <w:rFonts w:ascii="Aptos" w:hAnsi="Aptos"/>
           <w:b/>
         </w:rPr>
-        <w:t xml:space="preserve">Handle missing values in </w:t>
-      </w:r>
-      <w:proofErr w:type="spellStart"/>
-      <w:r>
-        <w:rPr>
-          <w:rFonts w:ascii="Aptos" w:hAnsi="Aptos"/>
-          <w:b/>
-        </w:rPr>
-        <w:t>RatecodeID</w:t>
-      </w:r>
-      <w:proofErr w:type="spellEnd"/>
+        <w:t>Handle missing values in RatecodeID</w:t>
+      </w:r>
       <w:r>
         <w:rPr>
           <w:rFonts w:ascii="Aptos" w:hAnsi="Aptos"/>
@@ -930,25 +912,7 @@
           <w:sz w:val="20"/>
           <w:szCs w:val="20"/>
         </w:rPr>
-        <w:t xml:space="preserve">We managed the missing data in the </w:t>
-      </w:r>
-      <w:proofErr w:type="spellStart"/>
-      <w:r>
-        <w:rPr>
-          <w:rFonts w:ascii="Aptos" w:hAnsi="Aptos"/>
-          <w:sz w:val="20"/>
-          <w:szCs w:val="20"/>
-        </w:rPr>
-        <w:t>RatecodeID</w:t>
-      </w:r>
-      <w:proofErr w:type="spellEnd"/>
-      <w:r>
-        <w:rPr>
-          <w:rFonts w:ascii="Aptos" w:hAnsi="Aptos"/>
-          <w:sz w:val="20"/>
-          <w:szCs w:val="20"/>
-        </w:rPr>
-        <w:t xml:space="preserve"> column by imputing the </w:t>
+        <w:t xml:space="preserve">We managed the missing data in the RatecodeID column by imputing the </w:t>
       </w:r>
       <w:r>
         <w:rPr>
@@ -966,35 +930,16 @@
           <w:sz w:val="20"/>
           <w:szCs w:val="20"/>
         </w:rPr>
-        <w:t xml:space="preserve"> of the existing values. Since the "Standard rate" (represented by the value 1.0) was the overwhelmingly common entry, we applied this value to all null records using the </w:t>
-      </w:r>
-      <w:proofErr w:type="spellStart"/>
-      <w:proofErr w:type="gramStart"/>
-      <w:r>
-        <w:rPr>
-          <w:rFonts w:ascii="Aptos" w:hAnsi="Aptos"/>
-          <w:sz w:val="20"/>
-          <w:szCs w:val="20"/>
-        </w:rPr>
-        <w:t>fillna</w:t>
-      </w:r>
-      <w:proofErr w:type="spellEnd"/>
-      <w:r>
-        <w:rPr>
-          <w:rFonts w:ascii="Aptos" w:hAnsi="Aptos"/>
-          <w:sz w:val="20"/>
-          <w:szCs w:val="20"/>
-        </w:rPr>
-        <w:t>(</w:t>
-      </w:r>
-      <w:proofErr w:type="gramEnd"/>
-      <w:r>
-        <w:rPr>
-          <w:rFonts w:ascii="Aptos" w:hAnsi="Aptos"/>
-          <w:sz w:val="20"/>
-          <w:szCs w:val="20"/>
-        </w:rPr>
-        <w:t>) function. This decision allowed us to retain the full dataset for analysis while ensuring that the imputed values reflected the most probable real-world scenario. By completing this feature, we provided a consistent basis for calculating fare structures and identifying trip anomalies.</w:t>
+        <w:t xml:space="preserve"> of the existing values. Since the "Standard rate" (represented by the value 1.0) was the overwhelmingly common entry, we applied this value to all null records using the fillna() function. This decision allowed us to retain the full dataset for analysis while ensuring that the imputed values reflected the most probable real-world scenario. By completing this feature, we provided a consistent basis for calculating fare </w:t>
+      </w:r>
+      <w:r>
+        <w:rPr>
+          <w:rFonts w:ascii="Aptos" w:hAnsi="Aptos"/>
+          <w:sz w:val="20"/>
+          <w:szCs w:val="20"/>
+        </w:rPr>
+        <w:lastRenderedPageBreak/>
+        <w:t>structures and identifying trip anomalies.</w:t>
       </w:r>
       <w:r>
         <w:rPr>
@@ -1023,33 +968,8 @@
           <w:rFonts w:ascii="Aptos" w:hAnsi="Aptos"/>
           <w:b/>
         </w:rPr>
-        <w:t xml:space="preserve">Impute </w:t>
-      </w:r>
-      <w:proofErr w:type="spellStart"/>
-      <w:r>
-        <w:rPr>
-          <w:rFonts w:ascii="Aptos" w:hAnsi="Aptos"/>
-          <w:b/>
-        </w:rPr>
-        <w:t>NaN</w:t>
-      </w:r>
-      <w:proofErr w:type="spellEnd"/>
-      <w:r>
-        <w:rPr>
-          <w:rFonts w:ascii="Aptos" w:hAnsi="Aptos"/>
-          <w:b/>
-        </w:rPr>
-        <w:t xml:space="preserve"> in </w:t>
-      </w:r>
-      <w:proofErr w:type="spellStart"/>
-      <w:r>
-        <w:rPr>
-          <w:rFonts w:ascii="Aptos" w:hAnsi="Aptos"/>
-          <w:b/>
-        </w:rPr>
-        <w:t>congestion_surcharge</w:t>
-      </w:r>
-      <w:proofErr w:type="spellEnd"/>
+        <w:t>Impute NaN in congestion_surcharge</w:t>
+      </w:r>
       <w:r>
         <w:rPr>
           <w:rFonts w:ascii="Aptos" w:hAnsi="Aptos"/>
@@ -1063,89 +983,7 @@
           <w:sz w:val="20"/>
           <w:szCs w:val="20"/>
         </w:rPr>
-        <w:t xml:space="preserve">We imputed the missing values in the </w:t>
-      </w:r>
-      <w:proofErr w:type="spellStart"/>
-      <w:r>
-        <w:rPr>
-          <w:rFonts w:ascii="Aptos" w:hAnsi="Aptos"/>
-          <w:sz w:val="20"/>
-          <w:szCs w:val="20"/>
-        </w:rPr>
-        <w:t>congestion_surcharge</w:t>
-      </w:r>
-      <w:proofErr w:type="spellEnd"/>
-      <w:r>
-        <w:rPr>
-          <w:rFonts w:ascii="Aptos" w:hAnsi="Aptos"/>
-          <w:sz w:val="20"/>
-          <w:szCs w:val="20"/>
-        </w:rPr>
-        <w:t xml:space="preserve"> column by replacing all </w:t>
-      </w:r>
-      <w:proofErr w:type="spellStart"/>
-      <w:r>
-        <w:rPr>
-          <w:rFonts w:ascii="Aptos" w:hAnsi="Aptos"/>
-          <w:sz w:val="20"/>
-          <w:szCs w:val="20"/>
-        </w:rPr>
-        <w:t>NaN</w:t>
-      </w:r>
-      <w:proofErr w:type="spellEnd"/>
-      <w:r>
-        <w:rPr>
-          <w:rFonts w:ascii="Aptos" w:hAnsi="Aptos"/>
-          <w:sz w:val="20"/>
-          <w:szCs w:val="20"/>
-        </w:rPr>
-        <w:t xml:space="preserve"> entries with 0.0. We used the </w:t>
-      </w:r>
-      <w:proofErr w:type="spellStart"/>
-      <w:proofErr w:type="gramStart"/>
-      <w:r>
-        <w:rPr>
-          <w:rFonts w:ascii="Aptos" w:hAnsi="Aptos"/>
-          <w:sz w:val="20"/>
-          <w:szCs w:val="20"/>
-        </w:rPr>
-        <w:t>fillna</w:t>
-      </w:r>
-      <w:proofErr w:type="spellEnd"/>
-      <w:r>
-        <w:rPr>
-          <w:rFonts w:ascii="Aptos" w:hAnsi="Aptos"/>
-          <w:sz w:val="20"/>
-          <w:szCs w:val="20"/>
-        </w:rPr>
-        <w:t>(</w:t>
-      </w:r>
-      <w:proofErr w:type="gramEnd"/>
-      <w:r>
-        <w:rPr>
-          <w:rFonts w:ascii="Aptos" w:hAnsi="Aptos"/>
-          <w:sz w:val="20"/>
-          <w:szCs w:val="20"/>
-        </w:rPr>
-        <w:t xml:space="preserve">0.0) method to ensure that any trip record missing this specific data point was treated as having no additional congestion fee. This decision maintained the numerical integrity of our total fare calculations and prevented the exclusion of valid trip records. By assigning </w:t>
-      </w:r>
-      <w:proofErr w:type="gramStart"/>
-      <w:r>
-        <w:rPr>
-          <w:rFonts w:ascii="Aptos" w:hAnsi="Aptos"/>
-          <w:sz w:val="20"/>
-          <w:szCs w:val="20"/>
-        </w:rPr>
-        <w:t>a zero</w:t>
-      </w:r>
-      <w:proofErr w:type="gramEnd"/>
-      <w:r>
-        <w:rPr>
-          <w:rFonts w:ascii="Aptos" w:hAnsi="Aptos"/>
-          <w:sz w:val="20"/>
-          <w:szCs w:val="20"/>
-        </w:rPr>
-        <w:t xml:space="preserve"> value, we conservatively estimated the surcharge for trips where the fee was either not applicable or not recorded.</w:t>
+        <w:t>We imputed the missing values in the congestion_surcharge column by replacing all NaN entries with 0.0. We used the fillna(0.0) method to ensure that any trip record missing this specific data point was treated as having no additional congestion fee. This decision maintained the numerical integrity of our total fare calculations and prevented the exclusion of valid trip records. By assigning a zero value, we conservatively estimated the surcharge for trips where the fee was either not applicable or not recorded.</w:t>
       </w:r>
       <w:r>
         <w:rPr>
@@ -1185,22 +1023,7 @@
         <w:rPr>
           <w:rFonts w:ascii="Aptos" w:hAnsi="Aptos"/>
         </w:rPr>
-        <w:lastRenderedPageBreak/>
-        <w:t xml:space="preserve">Handling Outliers and </w:t>
-      </w:r>
-      <w:proofErr w:type="spellStart"/>
-      <w:r>
-        <w:rPr>
-          <w:rFonts w:ascii="Aptos" w:hAnsi="Aptos"/>
-        </w:rPr>
-        <w:t>Standardising</w:t>
-      </w:r>
-      <w:proofErr w:type="spellEnd"/>
-      <w:r>
-        <w:rPr>
-          <w:rFonts w:ascii="Aptos" w:hAnsi="Aptos"/>
-        </w:rPr>
-        <w:t xml:space="preserve"> Values</w:t>
+        <w:t>Handling Outliers and Standardising Values</w:t>
       </w:r>
     </w:p>
     <w:p>
@@ -1236,115 +1059,7 @@
           <w:sz w:val="20"/>
           <w:szCs w:val="20"/>
         </w:rPr>
-        <w:t>We identified outliers in the ‘</w:t>
-      </w:r>
-      <w:proofErr w:type="spellStart"/>
-      <w:r>
-        <w:rPr>
-          <w:rFonts w:ascii="Aptos" w:hAnsi="Aptos"/>
-          <w:sz w:val="20"/>
-          <w:szCs w:val="20"/>
-        </w:rPr>
-        <w:t>payment_type</w:t>
-      </w:r>
-      <w:proofErr w:type="spellEnd"/>
-      <w:r>
-        <w:rPr>
-          <w:rFonts w:ascii="Aptos" w:hAnsi="Aptos"/>
-          <w:sz w:val="20"/>
-          <w:szCs w:val="20"/>
-        </w:rPr>
-        <w:t>’, ‘</w:t>
-      </w:r>
-      <w:proofErr w:type="spellStart"/>
-      <w:r>
-        <w:rPr>
-          <w:rFonts w:ascii="Aptos" w:hAnsi="Aptos"/>
-          <w:sz w:val="20"/>
-          <w:szCs w:val="20"/>
-        </w:rPr>
-        <w:t>trip_distance</w:t>
-      </w:r>
-      <w:proofErr w:type="spellEnd"/>
-      <w:r>
-        <w:rPr>
-          <w:rFonts w:ascii="Aptos" w:hAnsi="Aptos"/>
-          <w:sz w:val="20"/>
-          <w:szCs w:val="20"/>
-        </w:rPr>
-        <w:t>’, and ‘</w:t>
-      </w:r>
-      <w:proofErr w:type="spellStart"/>
-      <w:r>
-        <w:rPr>
-          <w:rFonts w:ascii="Aptos" w:hAnsi="Aptos"/>
-          <w:sz w:val="20"/>
-          <w:szCs w:val="20"/>
-        </w:rPr>
-        <w:t>tip_amount</w:t>
-      </w:r>
-      <w:proofErr w:type="spellEnd"/>
-      <w:r>
-        <w:rPr>
-          <w:rFonts w:ascii="Aptos" w:hAnsi="Aptos"/>
-          <w:sz w:val="20"/>
-          <w:szCs w:val="20"/>
-        </w:rPr>
-        <w:t>’ columns by generating boxplots and calculating summary statistics. For ‘</w:t>
-      </w:r>
-      <w:proofErr w:type="spellStart"/>
-      <w:r>
-        <w:rPr>
-          <w:rFonts w:ascii="Aptos" w:hAnsi="Aptos"/>
-          <w:sz w:val="20"/>
-          <w:szCs w:val="20"/>
-        </w:rPr>
-        <w:t>trip_distance</w:t>
-      </w:r>
-      <w:proofErr w:type="spellEnd"/>
-      <w:r>
-        <w:rPr>
-          <w:rFonts w:ascii="Aptos" w:hAnsi="Aptos"/>
-          <w:sz w:val="20"/>
-          <w:szCs w:val="20"/>
-        </w:rPr>
-        <w:t>’, we flagged extreme values exceeding 100 miles, while for ‘</w:t>
-      </w:r>
-      <w:proofErr w:type="spellStart"/>
-      <w:r>
-        <w:rPr>
-          <w:rFonts w:ascii="Aptos" w:hAnsi="Aptos"/>
-          <w:sz w:val="20"/>
-          <w:szCs w:val="20"/>
-        </w:rPr>
-        <w:t>tip_amount</w:t>
-      </w:r>
-      <w:proofErr w:type="spellEnd"/>
-      <w:r>
-        <w:rPr>
-          <w:rFonts w:ascii="Aptos" w:hAnsi="Aptos"/>
-          <w:sz w:val="20"/>
-          <w:szCs w:val="20"/>
-        </w:rPr>
-        <w:t>’, we isolated negative values and unrealistically high tips. We also examined the ‘</w:t>
-      </w:r>
-      <w:proofErr w:type="spellStart"/>
-      <w:r>
-        <w:rPr>
-          <w:rFonts w:ascii="Aptos" w:hAnsi="Aptos"/>
-          <w:sz w:val="20"/>
-          <w:szCs w:val="20"/>
-        </w:rPr>
-        <w:t>payment_type</w:t>
-      </w:r>
-      <w:proofErr w:type="spellEnd"/>
-      <w:r>
-        <w:rPr>
-          <w:rFonts w:ascii="Aptos" w:hAnsi="Aptos"/>
-          <w:sz w:val="20"/>
-          <w:szCs w:val="20"/>
-        </w:rPr>
-        <w:t xml:space="preserve">’ column for invalid category codes. These visual and statistical checks allowed us to detect erroneous entries that could skew our analysis. </w:t>
+        <w:t xml:space="preserve">We identified outliers in the ‘payment_type’, ‘trip_distance’, and ‘tip_amount’ columns by generating boxplots and calculating summary statistics. For ‘trip_distance’, we flagged extreme values exceeding 100 miles, while for ‘tip_amount’, we isolated negative values and unrealistically high tips. We also examined the ‘payment_type’ column for invalid category codes. These visual and statistical checks allowed us to detect erroneous entries that could skew our analysis. </w:t>
       </w:r>
     </w:p>
     <w:p>
@@ -1421,127 +1136,7 @@
           <w:sz w:val="20"/>
           <w:szCs w:val="20"/>
         </w:rPr>
-        <w:t xml:space="preserve">Categorical variables: </w:t>
-      </w:r>
-      <w:proofErr w:type="spellStart"/>
-      <w:r>
-        <w:rPr>
-          <w:rFonts w:ascii="Aptos" w:hAnsi="Aptos"/>
-          <w:bCs/>
-          <w:sz w:val="20"/>
-          <w:szCs w:val="20"/>
-        </w:rPr>
-        <w:t>VendorID</w:t>
-      </w:r>
-      <w:proofErr w:type="spellEnd"/>
-      <w:r>
-        <w:rPr>
-          <w:rFonts w:ascii="Aptos" w:hAnsi="Aptos"/>
-          <w:bCs/>
-          <w:sz w:val="20"/>
-          <w:szCs w:val="20"/>
-        </w:rPr>
-        <w:t xml:space="preserve">, </w:t>
-      </w:r>
-      <w:proofErr w:type="spellStart"/>
-      <w:r>
-        <w:rPr>
-          <w:rFonts w:ascii="Aptos" w:hAnsi="Aptos"/>
-          <w:bCs/>
-          <w:sz w:val="20"/>
-          <w:szCs w:val="20"/>
-        </w:rPr>
-        <w:t>RatecodeID</w:t>
-      </w:r>
-      <w:proofErr w:type="spellEnd"/>
-      <w:r>
-        <w:rPr>
-          <w:rFonts w:ascii="Aptos" w:hAnsi="Aptos"/>
-          <w:bCs/>
-          <w:sz w:val="20"/>
-          <w:szCs w:val="20"/>
-        </w:rPr>
-        <w:t xml:space="preserve">, </w:t>
-      </w:r>
-      <w:proofErr w:type="spellStart"/>
-      <w:r>
-        <w:rPr>
-          <w:rFonts w:ascii="Aptos" w:hAnsi="Aptos"/>
-          <w:bCs/>
-          <w:sz w:val="20"/>
-          <w:szCs w:val="20"/>
-        </w:rPr>
-        <w:t>store_and_fwd_flag</w:t>
-      </w:r>
-      <w:proofErr w:type="spellEnd"/>
-      <w:r>
-        <w:rPr>
-          <w:rFonts w:ascii="Aptos" w:hAnsi="Aptos"/>
-          <w:bCs/>
-          <w:sz w:val="20"/>
-          <w:szCs w:val="20"/>
-        </w:rPr>
-        <w:t xml:space="preserve">, </w:t>
-      </w:r>
-      <w:proofErr w:type="spellStart"/>
-      <w:r>
-        <w:rPr>
-          <w:rFonts w:ascii="Aptos" w:hAnsi="Aptos"/>
-          <w:bCs/>
-          <w:sz w:val="20"/>
-          <w:szCs w:val="20"/>
-        </w:rPr>
-        <w:t>PULocationID</w:t>
-      </w:r>
-      <w:proofErr w:type="spellEnd"/>
-      <w:r>
-        <w:rPr>
-          <w:rFonts w:ascii="Aptos" w:hAnsi="Aptos"/>
-          <w:bCs/>
-          <w:sz w:val="20"/>
-          <w:szCs w:val="20"/>
-        </w:rPr>
-        <w:t xml:space="preserve">, </w:t>
-      </w:r>
-      <w:proofErr w:type="spellStart"/>
-      <w:r>
-        <w:rPr>
-          <w:rFonts w:ascii="Aptos" w:hAnsi="Aptos"/>
-          <w:bCs/>
-          <w:sz w:val="20"/>
-          <w:szCs w:val="20"/>
-        </w:rPr>
-        <w:t>DOLocationID</w:t>
-      </w:r>
-      <w:proofErr w:type="spellEnd"/>
-      <w:r>
-        <w:rPr>
-          <w:rFonts w:ascii="Aptos" w:hAnsi="Aptos"/>
-          <w:bCs/>
-          <w:sz w:val="20"/>
-          <w:szCs w:val="20"/>
-        </w:rPr>
-        <w:t xml:space="preserve">, and </w:t>
-      </w:r>
-      <w:proofErr w:type="spellStart"/>
-      <w:r>
-        <w:rPr>
-          <w:rFonts w:ascii="Aptos" w:hAnsi="Aptos"/>
-          <w:bCs/>
-          <w:sz w:val="20"/>
-          <w:szCs w:val="20"/>
-        </w:rPr>
-        <w:t>payment_type</w:t>
-      </w:r>
-      <w:proofErr w:type="spellEnd"/>
-      <w:r>
-        <w:rPr>
-          <w:rFonts w:ascii="Aptos" w:hAnsi="Aptos"/>
-          <w:bCs/>
-          <w:sz w:val="20"/>
-          <w:szCs w:val="20"/>
-        </w:rPr>
-        <w:t xml:space="preserve">. </w:t>
+        <w:t xml:space="preserve">Categorical variables: VendorID, RatecodeID, store_and_fwd_flag, PULocationID, DOLocationID, and payment_type. </w:t>
       </w:r>
       <w:r>
         <w:rPr>
@@ -1551,127 +1146,7 @@
           <w:szCs w:val="20"/>
         </w:rPr>
         <w:br/>
-        <w:t xml:space="preserve">Numerical variables: </w:t>
-      </w:r>
-      <w:proofErr w:type="spellStart"/>
-      <w:r>
-        <w:rPr>
-          <w:rFonts w:ascii="Aptos" w:hAnsi="Aptos"/>
-          <w:bCs/>
-          <w:sz w:val="20"/>
-          <w:szCs w:val="20"/>
-        </w:rPr>
-        <w:t>passenger_count</w:t>
-      </w:r>
-      <w:proofErr w:type="spellEnd"/>
-      <w:r>
-        <w:rPr>
-          <w:rFonts w:ascii="Aptos" w:hAnsi="Aptos"/>
-          <w:bCs/>
-          <w:sz w:val="20"/>
-          <w:szCs w:val="20"/>
-        </w:rPr>
-        <w:t xml:space="preserve">, </w:t>
-      </w:r>
-      <w:proofErr w:type="spellStart"/>
-      <w:r>
-        <w:rPr>
-          <w:rFonts w:ascii="Aptos" w:hAnsi="Aptos"/>
-          <w:bCs/>
-          <w:sz w:val="20"/>
-          <w:szCs w:val="20"/>
-        </w:rPr>
-        <w:t>trip_distance</w:t>
-      </w:r>
-      <w:proofErr w:type="spellEnd"/>
-      <w:r>
-        <w:rPr>
-          <w:rFonts w:ascii="Aptos" w:hAnsi="Aptos"/>
-          <w:bCs/>
-          <w:sz w:val="20"/>
-          <w:szCs w:val="20"/>
-        </w:rPr>
-        <w:t xml:space="preserve">, </w:t>
-      </w:r>
-      <w:proofErr w:type="spellStart"/>
-      <w:r>
-        <w:rPr>
-          <w:rFonts w:ascii="Aptos" w:hAnsi="Aptos"/>
-          <w:bCs/>
-          <w:sz w:val="20"/>
-          <w:szCs w:val="20"/>
-        </w:rPr>
-        <w:t>fare_amount</w:t>
-      </w:r>
-      <w:proofErr w:type="spellEnd"/>
-      <w:r>
-        <w:rPr>
-          <w:rFonts w:ascii="Aptos" w:hAnsi="Aptos"/>
-          <w:bCs/>
-          <w:sz w:val="20"/>
-          <w:szCs w:val="20"/>
-        </w:rPr>
-        <w:t xml:space="preserve">, extra, </w:t>
-      </w:r>
-      <w:proofErr w:type="spellStart"/>
-      <w:r>
-        <w:rPr>
-          <w:rFonts w:ascii="Aptos" w:hAnsi="Aptos"/>
-          <w:bCs/>
-          <w:sz w:val="20"/>
-          <w:szCs w:val="20"/>
-        </w:rPr>
-        <w:t>tip_amount</w:t>
-      </w:r>
-      <w:proofErr w:type="spellEnd"/>
-      <w:r>
-        <w:rPr>
-          <w:rFonts w:ascii="Aptos" w:hAnsi="Aptos"/>
-          <w:bCs/>
-          <w:sz w:val="20"/>
-          <w:szCs w:val="20"/>
-        </w:rPr>
-        <w:t xml:space="preserve">, </w:t>
-      </w:r>
-      <w:proofErr w:type="spellStart"/>
-      <w:r>
-        <w:rPr>
-          <w:rFonts w:ascii="Aptos" w:hAnsi="Aptos"/>
-          <w:bCs/>
-          <w:sz w:val="20"/>
-          <w:szCs w:val="20"/>
-        </w:rPr>
-        <w:t>tolls_amount</w:t>
-      </w:r>
-      <w:proofErr w:type="spellEnd"/>
-      <w:r>
-        <w:rPr>
-          <w:rFonts w:ascii="Aptos" w:hAnsi="Aptos"/>
-          <w:bCs/>
-          <w:sz w:val="20"/>
-          <w:szCs w:val="20"/>
-        </w:rPr>
-        <w:t xml:space="preserve">, and </w:t>
-      </w:r>
-      <w:proofErr w:type="spellStart"/>
-      <w:r>
-        <w:rPr>
-          <w:rFonts w:ascii="Aptos" w:hAnsi="Aptos"/>
-          <w:bCs/>
-          <w:sz w:val="20"/>
-          <w:szCs w:val="20"/>
-        </w:rPr>
-        <w:t>total_amount</w:t>
-      </w:r>
-      <w:proofErr w:type="spellEnd"/>
-      <w:r>
-        <w:rPr>
-          <w:rFonts w:ascii="Aptos" w:hAnsi="Aptos"/>
-          <w:bCs/>
-          <w:sz w:val="20"/>
-          <w:szCs w:val="20"/>
-        </w:rPr>
-        <w:t>.</w:t>
+        <w:t>Numerical variables: passenger_count, trip_distance, fare_amount, extra, tip_amount, tolls_amount, and total_amount.</w:t>
       </w:r>
       <w:r>
         <w:rPr>
@@ -1694,21 +1169,13 @@
           <w:rFonts w:ascii="Aptos" w:hAnsi="Aptos"/>
         </w:rPr>
       </w:pPr>
-      <w:proofErr w:type="spellStart"/>
-      <w:r>
-        <w:rPr>
-          <w:rFonts w:ascii="Aptos" w:hAnsi="Aptos"/>
-          <w:b/>
-        </w:rPr>
-        <w:t>Analyse</w:t>
-      </w:r>
-      <w:proofErr w:type="spellEnd"/>
-      <w:r>
-        <w:rPr>
-          <w:rFonts w:ascii="Aptos" w:hAnsi="Aptos"/>
-          <w:b/>
-        </w:rPr>
-        <w:t xml:space="preserve"> the distribution of taxi pickups by hours, days of the week, and months</w:t>
+      <w:r>
+        <w:rPr>
+          <w:rFonts w:ascii="Aptos" w:hAnsi="Aptos"/>
+          <w:b/>
+        </w:rPr>
+        <w:lastRenderedPageBreak/>
+        <w:t>Analyse the distribution of taxi pickups by hours, days of the week, and months</w:t>
       </w:r>
       <w:r>
         <w:rPr>
@@ -1722,7 +1189,7 @@
           <w:noProof/>
         </w:rPr>
         <w:drawing>
-          <wp:inline distT="0" distB="0" distL="0" distR="0" wp14:anchorId="138B993B" wp14:editId="273FA79A">
+          <wp:inline distT="0" distB="0" distL="0" distR="0" wp14:anchorId="138B993B" wp14:editId="6B28B0ED">
             <wp:extent cx="4195268" cy="2083739"/>
             <wp:effectExtent l="0" t="0" r="0" b="0"/>
             <wp:docPr id="1811005879" name="Picture 1"/>
@@ -1841,7 +1308,6 @@
           <w:rFonts w:ascii="Aptos" w:hAnsi="Aptos"/>
           <w:b/>
         </w:rPr>
-        <w:lastRenderedPageBreak/>
         <w:br/>
       </w:r>
       <w:r>
@@ -1849,7 +1315,7 @@
           <w:noProof/>
         </w:rPr>
         <w:drawing>
-          <wp:inline distT="0" distB="0" distL="0" distR="0" wp14:anchorId="2E587A96" wp14:editId="2C2BCC0C">
+          <wp:inline distT="0" distB="0" distL="0" distR="0" wp14:anchorId="2E587A96" wp14:editId="3D93D394">
             <wp:extent cx="3913632" cy="1943854"/>
             <wp:effectExtent l="0" t="0" r="0" b="0"/>
             <wp:docPr id="887282087" name="Picture 2"/>
@@ -1959,8 +1425,9 @@
         <w:rPr>
           <w:noProof/>
         </w:rPr>
+        <w:lastRenderedPageBreak/>
         <w:drawing>
-          <wp:inline distT="0" distB="0" distL="0" distR="0" wp14:anchorId="22A403F3" wp14:editId="5EFD0814">
+          <wp:inline distT="0" distB="0" distL="0" distR="0" wp14:anchorId="22A403F3" wp14:editId="11D1ED93">
             <wp:extent cx="3902660" cy="1938405"/>
             <wp:effectExtent l="0" t="0" r="3175" b="5080"/>
             <wp:docPr id="1762991239" name="Picture 3"/>
@@ -2248,14 +1715,15 @@
         <w:rPr>
           <w:rFonts w:ascii="Aptos" w:hAnsi="Aptos"/>
           <w:bCs/>
-        </w:rPr>
-      </w:pPr>
-      <w:r>
-        <w:rPr>
-          <w:rFonts w:ascii="Aptos" w:hAnsi="Aptos"/>
-          <w:b/>
-        </w:rPr>
-        <w:lastRenderedPageBreak/>
+          <w:sz w:val="20"/>
+          <w:szCs w:val="20"/>
+        </w:rPr>
+      </w:pPr>
+      <w:r>
+        <w:rPr>
+          <w:rFonts w:ascii="Aptos" w:hAnsi="Aptos"/>
+          <w:b/>
+        </w:rPr>
         <w:t>Filter out the zero/negative values in fares, distance and tips</w:t>
       </w:r>
       <w:r>
@@ -2269,72 +1737,10 @@
         <w:rPr>
           <w:rFonts w:ascii="Aptos" w:hAnsi="Aptos"/>
           <w:bCs/>
-        </w:rPr>
-        <w:t xml:space="preserve">The analysis shows that there are several trips with zero or negative values in </w:t>
-      </w:r>
-      <w:proofErr w:type="spellStart"/>
-      <w:r>
-        <w:rPr>
-          <w:rFonts w:ascii="Aptos" w:hAnsi="Aptos"/>
-          <w:bCs/>
-        </w:rPr>
-        <w:t>fare_amount</w:t>
-      </w:r>
-      <w:proofErr w:type="spellEnd"/>
-      <w:r>
-        <w:rPr>
-          <w:rFonts w:ascii="Aptos" w:hAnsi="Aptos"/>
-          <w:bCs/>
-        </w:rPr>
-        <w:t xml:space="preserve">, </w:t>
-      </w:r>
-      <w:proofErr w:type="spellStart"/>
-      <w:r>
-        <w:rPr>
-          <w:rFonts w:ascii="Aptos" w:hAnsi="Aptos"/>
-          <w:bCs/>
-        </w:rPr>
-        <w:t>tip_amount</w:t>
-      </w:r>
-      <w:proofErr w:type="spellEnd"/>
-      <w:r>
-        <w:rPr>
-          <w:rFonts w:ascii="Aptos" w:hAnsi="Aptos"/>
-          <w:bCs/>
-        </w:rPr>
-        <w:t xml:space="preserve">, </w:t>
-      </w:r>
-      <w:proofErr w:type="spellStart"/>
-      <w:r>
-        <w:rPr>
-          <w:rFonts w:ascii="Aptos" w:hAnsi="Aptos"/>
-          <w:bCs/>
-        </w:rPr>
-        <w:t>total_amount</w:t>
-      </w:r>
-      <w:proofErr w:type="spellEnd"/>
-      <w:r>
-        <w:rPr>
-          <w:rFonts w:ascii="Aptos" w:hAnsi="Aptos"/>
-          <w:bCs/>
-        </w:rPr>
-        <w:t xml:space="preserve">, and </w:t>
-      </w:r>
-      <w:proofErr w:type="spellStart"/>
-      <w:r>
-        <w:rPr>
-          <w:rFonts w:ascii="Aptos" w:hAnsi="Aptos"/>
-          <w:bCs/>
-        </w:rPr>
-        <w:t>trip_distance</w:t>
-      </w:r>
-      <w:proofErr w:type="spellEnd"/>
-      <w:r>
-        <w:rPr>
-          <w:rFonts w:ascii="Aptos" w:hAnsi="Aptos"/>
-          <w:bCs/>
-        </w:rPr>
-        <w:t>.</w:t>
+          <w:sz w:val="20"/>
+          <w:szCs w:val="20"/>
+        </w:rPr>
+        <w:t>The analysis shows that there are several trips with zero or negative values in fare_amount, tip_amount, total_amount, and trip_distance.</w:t>
       </w:r>
     </w:p>
     <w:p>
@@ -2348,23 +1754,18 @@
         <w:rPr>
           <w:rFonts w:ascii="Aptos" w:hAnsi="Aptos"/>
           <w:bCs/>
-        </w:rPr>
-      </w:pPr>
-      <w:proofErr w:type="spellStart"/>
-      <w:r>
-        <w:rPr>
-          <w:rFonts w:ascii="Aptos" w:hAnsi="Aptos"/>
-          <w:bCs/>
-        </w:rPr>
-        <w:t>fare_amount</w:t>
-      </w:r>
-      <w:proofErr w:type="spellEnd"/>
-      <w:r>
-        <w:rPr>
-          <w:rFonts w:ascii="Aptos" w:hAnsi="Aptos"/>
-          <w:bCs/>
-        </w:rPr>
-        <w:t>: 651 trips have zero or negative fare.</w:t>
+          <w:sz w:val="20"/>
+          <w:szCs w:val="20"/>
+        </w:rPr>
+      </w:pPr>
+      <w:r>
+        <w:rPr>
+          <w:rFonts w:ascii="Aptos" w:hAnsi="Aptos"/>
+          <w:bCs/>
+          <w:sz w:val="20"/>
+          <w:szCs w:val="20"/>
+        </w:rPr>
+        <w:t>fare_amount: 651 trips have zero or negative fare.</w:t>
       </w:r>
     </w:p>
     <w:p>
@@ -2378,23 +1779,18 @@
         <w:rPr>
           <w:rFonts w:ascii="Aptos" w:hAnsi="Aptos"/>
           <w:bCs/>
-        </w:rPr>
-      </w:pPr>
-      <w:proofErr w:type="spellStart"/>
-      <w:r>
-        <w:rPr>
-          <w:rFonts w:ascii="Aptos" w:hAnsi="Aptos"/>
-          <w:bCs/>
-        </w:rPr>
-        <w:t>tip_amount</w:t>
-      </w:r>
-      <w:proofErr w:type="spellEnd"/>
-      <w:r>
-        <w:rPr>
-          <w:rFonts w:ascii="Aptos" w:hAnsi="Aptos"/>
-          <w:bCs/>
-        </w:rPr>
-        <w:t>: 435,958 trips have zero or negative tip amounts. This is expected as many trips might not include a tip or tips are given in cash.</w:t>
+          <w:sz w:val="20"/>
+          <w:szCs w:val="20"/>
+        </w:rPr>
+      </w:pPr>
+      <w:r>
+        <w:rPr>
+          <w:rFonts w:ascii="Aptos" w:hAnsi="Aptos"/>
+          <w:bCs/>
+          <w:sz w:val="20"/>
+          <w:szCs w:val="20"/>
+        </w:rPr>
+        <w:t>tip_amount: 435,958 trips have zero or negative tip amounts. This is expected as many trips might not include a tip or tips are given in cash.</w:t>
       </w:r>
     </w:p>
     <w:p>
@@ -2408,23 +1804,18 @@
         <w:rPr>
           <w:rFonts w:ascii="Aptos" w:hAnsi="Aptos"/>
           <w:bCs/>
-        </w:rPr>
-      </w:pPr>
-      <w:proofErr w:type="spellStart"/>
-      <w:r>
-        <w:rPr>
-          <w:rFonts w:ascii="Aptos" w:hAnsi="Aptos"/>
-          <w:bCs/>
-        </w:rPr>
-        <w:t>total_amount</w:t>
-      </w:r>
-      <w:proofErr w:type="spellEnd"/>
-      <w:r>
-        <w:rPr>
-          <w:rFonts w:ascii="Aptos" w:hAnsi="Aptos"/>
-          <w:bCs/>
-        </w:rPr>
-        <w:t>: 388 trips have zero or negative total amount.</w:t>
+          <w:sz w:val="20"/>
+          <w:szCs w:val="20"/>
+        </w:rPr>
+      </w:pPr>
+      <w:r>
+        <w:rPr>
+          <w:rFonts w:ascii="Aptos" w:hAnsi="Aptos"/>
+          <w:bCs/>
+          <w:sz w:val="20"/>
+          <w:szCs w:val="20"/>
+        </w:rPr>
+        <w:t>total_amount: 388 trips have zero or negative total amount.</w:t>
       </w:r>
     </w:p>
     <w:p>
@@ -2438,28 +1829,25 @@
         <w:rPr>
           <w:rFonts w:ascii="Aptos" w:hAnsi="Aptos"/>
           <w:bCs/>
-        </w:rPr>
-      </w:pPr>
-      <w:proofErr w:type="spellStart"/>
-      <w:r>
-        <w:rPr>
-          <w:rFonts w:ascii="Aptos" w:hAnsi="Aptos"/>
-          <w:bCs/>
-        </w:rPr>
-        <w:t>trip_distance</w:t>
-      </w:r>
-      <w:proofErr w:type="spellEnd"/>
-      <w:r>
-        <w:rPr>
-          <w:rFonts w:ascii="Aptos" w:hAnsi="Aptos"/>
-          <w:bCs/>
-        </w:rPr>
-        <w:t>: 37,732 trips have zero or negative trip distance.</w:t>
-      </w:r>
-      <w:r>
-        <w:rPr>
-          <w:rFonts w:ascii="Aptos" w:hAnsi="Aptos"/>
-          <w:b/>
+          <w:sz w:val="20"/>
+          <w:szCs w:val="20"/>
+        </w:rPr>
+      </w:pPr>
+      <w:r>
+        <w:rPr>
+          <w:rFonts w:ascii="Aptos" w:hAnsi="Aptos"/>
+          <w:bCs/>
+          <w:sz w:val="20"/>
+          <w:szCs w:val="20"/>
+        </w:rPr>
+        <w:t>trip_distance: 37,732 trips have zero or negative trip distance.</w:t>
+      </w:r>
+      <w:r>
+        <w:rPr>
+          <w:rFonts w:ascii="Aptos" w:hAnsi="Aptos"/>
+          <w:b/>
+          <w:sz w:val="20"/>
+          <w:szCs w:val="20"/>
         </w:rPr>
         <w:br/>
       </w:r>
@@ -2561,27 +1949,8 @@
           <w:sz w:val="20"/>
           <w:szCs w:val="20"/>
         </w:rPr>
-        <w:t xml:space="preserve">The pie chart above visually represents these proportions. Quarters 2 (April-June) and 4 (October-December) show the highest revenue proportions, each contributing roughly 26-27% of the total annual revenue. Quarters 1 (January-March) and 3 (July-September) </w:t>
-      </w:r>
-      <w:proofErr w:type="gramStart"/>
-      <w:r>
-        <w:rPr>
-          <w:rFonts w:ascii="Aptos" w:hAnsi="Aptos"/>
-          <w:bCs/>
-          <w:sz w:val="20"/>
-          <w:szCs w:val="20"/>
-        </w:rPr>
-        <w:t>have</w:t>
-      </w:r>
-      <w:proofErr w:type="gramEnd"/>
-      <w:r>
-        <w:rPr>
-          <w:rFonts w:ascii="Aptos" w:hAnsi="Aptos"/>
-          <w:bCs/>
-          <w:sz w:val="20"/>
-          <w:szCs w:val="20"/>
-        </w:rPr>
-        <w:t xml:space="preserve"> slightly lower, but still substantial, contributions around 22-23%. This indicates that the taxi operations experience slightly higher revenue during the spring/early summer and late autumn/early winter months.</w:t>
+        <w:lastRenderedPageBreak/>
+        <w:t>The pie chart above visually represents these proportions. Quarters 2 (April-June) and 4 (October-December) show the highest revenue proportions, each contributing roughly 26-27% of the total annual revenue. Quarters 1 (January-March) and 3 (July-September) have slightly lower, but still substantial, contributions around 22-23%. This indicates that the taxi operations experience slightly higher revenue during the spring/early summer and late autumn/early winter months.</w:t>
       </w:r>
       <w:r>
         <w:rPr>
@@ -2604,38 +1973,12 @@
           <w:rFonts w:ascii="Aptos" w:hAnsi="Aptos"/>
         </w:rPr>
       </w:pPr>
-      <w:proofErr w:type="spellStart"/>
-      <w:r>
-        <w:rPr>
-          <w:rFonts w:ascii="Aptos" w:hAnsi="Aptos"/>
-          <w:b/>
-        </w:rPr>
-        <w:lastRenderedPageBreak/>
-        <w:t>Analyse</w:t>
-      </w:r>
-      <w:proofErr w:type="spellEnd"/>
-      <w:r>
-        <w:rPr>
-          <w:rFonts w:ascii="Aptos" w:hAnsi="Aptos"/>
-          <w:b/>
-        </w:rPr>
-        <w:t xml:space="preserve"> and </w:t>
-      </w:r>
-      <w:proofErr w:type="spellStart"/>
-      <w:r>
-        <w:rPr>
-          <w:rFonts w:ascii="Aptos" w:hAnsi="Aptos"/>
-          <w:b/>
-        </w:rPr>
-        <w:t>visualise</w:t>
-      </w:r>
-      <w:proofErr w:type="spellEnd"/>
-      <w:r>
-        <w:rPr>
-          <w:rFonts w:ascii="Aptos" w:hAnsi="Aptos"/>
-          <w:b/>
-        </w:rPr>
-        <w:t xml:space="preserve"> the relationship between distance and fare amount</w:t>
+      <w:r>
+        <w:rPr>
+          <w:rFonts w:ascii="Aptos" w:hAnsi="Aptos"/>
+          <w:b/>
+        </w:rPr>
+        <w:t>Analyse and visualise the relationship between distance and fare amount</w:t>
       </w:r>
       <w:r>
         <w:rPr>
@@ -2722,7 +2065,6 @@
         </w:rPr>
         <w:t>‘</w:t>
       </w:r>
-      <w:proofErr w:type="spellStart"/>
       <w:r>
         <w:rPr>
           <w:rFonts w:ascii="Aptos" w:hAnsi="Aptos"/>
@@ -2731,7 +2073,6 @@
         </w:rPr>
         <w:t>trip_distance</w:t>
       </w:r>
-      <w:proofErr w:type="spellEnd"/>
       <w:r>
         <w:rPr>
           <w:rFonts w:ascii="Aptos" w:hAnsi="Aptos"/>
@@ -2756,7 +2097,6 @@
         </w:rPr>
         <w:t>‘</w:t>
       </w:r>
-      <w:proofErr w:type="spellStart"/>
       <w:r>
         <w:rPr>
           <w:rFonts w:ascii="Aptos" w:hAnsi="Aptos"/>
@@ -2765,7 +2105,6 @@
         </w:rPr>
         <w:t>fare_amount</w:t>
       </w:r>
-      <w:proofErr w:type="spellEnd"/>
       <w:r>
         <w:rPr>
           <w:rFonts w:ascii="Aptos" w:hAnsi="Aptos"/>
@@ -2797,21 +2136,12 @@
           <w:lang w:val="en-GB"/>
         </w:rPr>
       </w:pPr>
-      <w:proofErr w:type="spellStart"/>
-      <w:r>
-        <w:rPr>
-          <w:rFonts w:ascii="Aptos" w:hAnsi="Aptos"/>
-          <w:b/>
-        </w:rPr>
-        <w:t>Analyse</w:t>
-      </w:r>
-      <w:proofErr w:type="spellEnd"/>
-      <w:r>
-        <w:rPr>
-          <w:rFonts w:ascii="Aptos" w:hAnsi="Aptos"/>
-          <w:b/>
-        </w:rPr>
-        <w:t xml:space="preserve"> the relationship between fare/tips and trips/passengers</w:t>
+      <w:r>
+        <w:rPr>
+          <w:rFonts w:ascii="Aptos" w:hAnsi="Aptos"/>
+          <w:b/>
+        </w:rPr>
+        <w:t>Analyse the relationship between fare/tips and trips/passengers</w:t>
       </w:r>
       <w:r>
         <w:rPr>
@@ -2834,107 +2164,7 @@
           <w:szCs w:val="20"/>
           <w:lang w:val="en-GB"/>
         </w:rPr>
-        <w:t xml:space="preserve">We </w:t>
-      </w:r>
-      <w:proofErr w:type="spellStart"/>
-      <w:r>
-        <w:rPr>
-          <w:rFonts w:ascii="Aptos" w:hAnsi="Aptos"/>
-          <w:sz w:val="20"/>
-          <w:szCs w:val="20"/>
-          <w:lang w:val="en-GB"/>
-        </w:rPr>
-        <w:t>analyzed</w:t>
-      </w:r>
-      <w:proofErr w:type="spellEnd"/>
-      <w:r>
-        <w:rPr>
-          <w:rFonts w:ascii="Aptos" w:hAnsi="Aptos"/>
-          <w:sz w:val="20"/>
-          <w:szCs w:val="20"/>
-          <w:lang w:val="en-GB"/>
-        </w:rPr>
-        <w:t xml:space="preserve"> the relationship between financial metrics and trip volume using correlation matrices. We discovered a strong positive correlation between </w:t>
-      </w:r>
-      <w:proofErr w:type="spellStart"/>
-      <w:r>
-        <w:rPr>
-          <w:rFonts w:ascii="Aptos" w:hAnsi="Aptos"/>
-          <w:sz w:val="20"/>
-          <w:szCs w:val="20"/>
-          <w:lang w:val="en-GB"/>
-        </w:rPr>
-        <w:t>fare_amount</w:t>
-      </w:r>
-      <w:proofErr w:type="spellEnd"/>
-      <w:r>
-        <w:rPr>
-          <w:rFonts w:ascii="Aptos" w:hAnsi="Aptos"/>
-          <w:sz w:val="20"/>
-          <w:szCs w:val="20"/>
-          <w:lang w:val="en-GB"/>
-        </w:rPr>
-        <w:t xml:space="preserve"> and </w:t>
-      </w:r>
-      <w:proofErr w:type="spellStart"/>
-      <w:r>
-        <w:rPr>
-          <w:rFonts w:ascii="Aptos" w:hAnsi="Aptos"/>
-          <w:sz w:val="20"/>
-          <w:szCs w:val="20"/>
-          <w:lang w:val="en-GB"/>
-        </w:rPr>
-        <w:t>tip_amount</w:t>
-      </w:r>
-      <w:proofErr w:type="spellEnd"/>
-      <w:r>
-        <w:rPr>
-          <w:rFonts w:ascii="Aptos" w:hAnsi="Aptos"/>
-          <w:sz w:val="20"/>
-          <w:szCs w:val="20"/>
-          <w:lang w:val="en-GB"/>
-        </w:rPr>
-        <w:t xml:space="preserve">, indicating that higher fares generally yield larger tips. Conversely, we found a negligible correlation between </w:t>
-      </w:r>
-      <w:proofErr w:type="spellStart"/>
-      <w:r>
-        <w:rPr>
-          <w:rFonts w:ascii="Aptos" w:hAnsi="Aptos"/>
-          <w:sz w:val="20"/>
-          <w:szCs w:val="20"/>
-          <w:lang w:val="en-GB"/>
-        </w:rPr>
-        <w:t>passenger_count</w:t>
-      </w:r>
-      <w:proofErr w:type="spellEnd"/>
-      <w:r>
-        <w:rPr>
-          <w:rFonts w:ascii="Aptos" w:hAnsi="Aptos"/>
-          <w:sz w:val="20"/>
-          <w:szCs w:val="20"/>
-          <w:lang w:val="en-GB"/>
-        </w:rPr>
-        <w:t xml:space="preserve"> and </w:t>
-      </w:r>
-      <w:proofErr w:type="spellStart"/>
-      <w:r>
-        <w:rPr>
-          <w:rFonts w:ascii="Aptos" w:hAnsi="Aptos"/>
-          <w:sz w:val="20"/>
-          <w:szCs w:val="20"/>
-          <w:lang w:val="en-GB"/>
-        </w:rPr>
-        <w:t>total_amount</w:t>
-      </w:r>
-      <w:proofErr w:type="spellEnd"/>
-      <w:r>
-        <w:rPr>
-          <w:rFonts w:ascii="Aptos" w:hAnsi="Aptos"/>
-          <w:sz w:val="20"/>
-          <w:szCs w:val="20"/>
-          <w:lang w:val="en-GB"/>
-        </w:rPr>
-        <w:t>. This confirms that taxi pricing in NYC depends on distance and time rather than the number of occupants. By identifying these patterns, we established that revenue per trip remains consistent regardless of whether a single passenger or a small group occupies the vehicle.</w:t>
+        <w:t>We analyzed the relationship between financial metrics and trip volume using correlation matrices. We discovered a strong positive correlation between fare_amount and tip_amount, indicating that higher fares generally yield larger tips. Conversely, we found a negligible correlation between passenger_count and total_amount. This confirms that taxi pricing in NYC depends on distance and time rather than the number of occupants. By identifying these patterns, we established that revenue per trip remains consistent regardless of whether a single passenger or a small group occupies the vehicle.</w:t>
       </w:r>
     </w:p>
     <w:p>
@@ -2959,22 +2189,13 @@
           <w:rFonts w:ascii="Aptos" w:hAnsi="Aptos"/>
         </w:rPr>
       </w:pPr>
-      <w:proofErr w:type="spellStart"/>
       <w:r>
         <w:rPr>
           <w:rFonts w:ascii="Aptos" w:hAnsi="Aptos"/>
           <w:b/>
         </w:rPr>
         <w:lastRenderedPageBreak/>
-        <w:t>Analyse</w:t>
-      </w:r>
-      <w:proofErr w:type="spellEnd"/>
-      <w:r>
-        <w:rPr>
-          <w:rFonts w:ascii="Aptos" w:hAnsi="Aptos"/>
-          <w:b/>
-        </w:rPr>
-        <w:t xml:space="preserve"> the distribution of different payment types</w:t>
+        <w:t>Analyse the distribution of different payment types</w:t>
       </w:r>
       <w:r>
         <w:rPr>
@@ -2988,7 +2209,7 @@
           <w:noProof/>
         </w:rPr>
         <w:drawing>
-          <wp:inline distT="0" distB="0" distL="0" distR="0" wp14:anchorId="5F4A7333" wp14:editId="4E2AE76C">
+          <wp:inline distT="0" distB="0" distL="0" distR="0" wp14:anchorId="5F4A7333" wp14:editId="6ADF411D">
             <wp:extent cx="3610052" cy="2155618"/>
             <wp:effectExtent l="0" t="0" r="0" b="0"/>
             <wp:docPr id="660966473" name="Picture 6"/>
@@ -3154,7 +2375,6 @@
         </w:rPr>
         <w:t xml:space="preserve">We loaded the NYC taxi zones shapefile using the </w:t>
       </w:r>
-      <w:proofErr w:type="spellStart"/>
       <w:r>
         <w:rPr>
           <w:rFonts w:ascii="Aptos" w:hAnsi="Aptos"/>
@@ -3163,68 +2383,11 @@
         </w:rPr>
         <w:t>geopandas</w:t>
       </w:r>
-      <w:proofErr w:type="spellEnd"/>
-      <w:r>
-        <w:rPr>
-          <w:rFonts w:ascii="Aptos" w:hAnsi="Aptos"/>
-        </w:rPr>
-        <w:t xml:space="preserve"> library and its </w:t>
-      </w:r>
-      <w:proofErr w:type="spellStart"/>
-      <w:r>
-        <w:rPr>
-          <w:rFonts w:ascii="Aptos" w:hAnsi="Aptos"/>
-        </w:rPr>
-        <w:t>read_</w:t>
-      </w:r>
-      <w:proofErr w:type="gramStart"/>
-      <w:r>
-        <w:rPr>
-          <w:rFonts w:ascii="Aptos" w:hAnsi="Aptos"/>
-        </w:rPr>
-        <w:t>file</w:t>
-      </w:r>
-      <w:proofErr w:type="spellEnd"/>
-      <w:r>
-        <w:rPr>
-          <w:rFonts w:ascii="Aptos" w:hAnsi="Aptos"/>
-        </w:rPr>
-        <w:t>(</w:t>
-      </w:r>
-      <w:proofErr w:type="gramEnd"/>
-      <w:r>
-        <w:rPr>
-          <w:rFonts w:ascii="Aptos" w:hAnsi="Aptos"/>
-        </w:rPr>
-        <w:t xml:space="preserve">) function. This operation transformed the spatial data into a </w:t>
-      </w:r>
-      <w:proofErr w:type="spellStart"/>
-      <w:r>
-        <w:rPr>
-          <w:rFonts w:ascii="Aptos" w:hAnsi="Aptos"/>
-        </w:rPr>
-        <w:t>GeoDataFrame</w:t>
-      </w:r>
-      <w:proofErr w:type="spellEnd"/>
-      <w:r>
-        <w:rPr>
-          <w:rFonts w:ascii="Aptos" w:hAnsi="Aptos"/>
-        </w:rPr>
-        <w:t xml:space="preserve">, allowing us to manage geographic coordinates as structured data. We then generated a visual map by calling the </w:t>
-      </w:r>
-      <w:proofErr w:type="gramStart"/>
-      <w:r>
-        <w:rPr>
-          <w:rFonts w:ascii="Aptos" w:hAnsi="Aptos"/>
-        </w:rPr>
-        <w:t>plot(</w:t>
-      </w:r>
-      <w:proofErr w:type="gramEnd"/>
-      <w:r>
-        <w:rPr>
-          <w:rFonts w:ascii="Aptos" w:hAnsi="Aptos"/>
-        </w:rPr>
-        <w:t xml:space="preserve">) </w:t>
+      <w:r>
+        <w:rPr>
+          <w:rFonts w:ascii="Aptos" w:hAnsi="Aptos"/>
+        </w:rPr>
+        <w:t xml:space="preserve"> library and its read_file() function. This operation transformed the spatial data into a GeoDataFrame, allowing us to manage geographic coordinates as structured data. We then generated a visual map by calling the plot() </w:t>
       </w:r>
       <w:r>
         <w:rPr>
@@ -3276,109 +2439,7 @@
           <w:szCs w:val="20"/>
           <w:lang w:val="en-GB"/>
         </w:rPr>
-        <w:t xml:space="preserve">We merged the trip records with the taxi zone lookup table using the </w:t>
-      </w:r>
-      <w:proofErr w:type="spellStart"/>
-      <w:proofErr w:type="gramStart"/>
-      <w:r>
-        <w:rPr>
-          <w:rFonts w:ascii="Aptos" w:hAnsi="Aptos"/>
-          <w:sz w:val="20"/>
-          <w:szCs w:val="20"/>
-          <w:lang w:val="en-GB"/>
-        </w:rPr>
-        <w:t>pd.merge</w:t>
-      </w:r>
-      <w:proofErr w:type="spellEnd"/>
-      <w:proofErr w:type="gramEnd"/>
-      <w:r>
-        <w:rPr>
-          <w:rFonts w:ascii="Aptos" w:hAnsi="Aptos"/>
-          <w:sz w:val="20"/>
-          <w:szCs w:val="20"/>
-          <w:lang w:val="en-GB"/>
-        </w:rPr>
-        <w:t xml:space="preserve">() function. We aligned the </w:t>
-      </w:r>
-      <w:proofErr w:type="spellStart"/>
-      <w:r>
-        <w:rPr>
-          <w:rFonts w:ascii="Aptos" w:hAnsi="Aptos"/>
-          <w:sz w:val="20"/>
-          <w:szCs w:val="20"/>
-          <w:lang w:val="en-GB"/>
-        </w:rPr>
-        <w:t>PULocationID</w:t>
-      </w:r>
-      <w:proofErr w:type="spellEnd"/>
-      <w:r>
-        <w:rPr>
-          <w:rFonts w:ascii="Aptos" w:hAnsi="Aptos"/>
-          <w:sz w:val="20"/>
-          <w:szCs w:val="20"/>
-          <w:lang w:val="en-GB"/>
-        </w:rPr>
-        <w:t xml:space="preserve"> and </w:t>
-      </w:r>
-      <w:proofErr w:type="spellStart"/>
-      <w:r>
-        <w:rPr>
-          <w:rFonts w:ascii="Aptos" w:hAnsi="Aptos"/>
-          <w:sz w:val="20"/>
-          <w:szCs w:val="20"/>
-          <w:lang w:val="en-GB"/>
-        </w:rPr>
-        <w:t>DOLocationID</w:t>
-      </w:r>
-      <w:proofErr w:type="spellEnd"/>
-      <w:r>
-        <w:rPr>
-          <w:rFonts w:ascii="Aptos" w:hAnsi="Aptos"/>
-          <w:sz w:val="20"/>
-          <w:szCs w:val="20"/>
-          <w:lang w:val="en-GB"/>
-        </w:rPr>
-        <w:t xml:space="preserve"> from the trip dataset with the </w:t>
-      </w:r>
-      <w:proofErr w:type="spellStart"/>
-      <w:r>
-        <w:rPr>
-          <w:rFonts w:ascii="Aptos" w:hAnsi="Aptos"/>
-          <w:sz w:val="20"/>
-          <w:szCs w:val="20"/>
-          <w:lang w:val="en-GB"/>
-        </w:rPr>
-        <w:t>LocationID</w:t>
-      </w:r>
-      <w:proofErr w:type="spellEnd"/>
-      <w:r>
-        <w:rPr>
-          <w:rFonts w:ascii="Aptos" w:hAnsi="Aptos"/>
-          <w:sz w:val="20"/>
-          <w:szCs w:val="20"/>
-          <w:lang w:val="en-GB"/>
-        </w:rPr>
-        <w:t xml:space="preserve"> column in the spatial data. This operation allowed us to append borough and zone names to each trip record, transforming numerical IDs into meaningful geographic locations. By performing this join, we facilitated a granular spatial analysis, enabling us to identify high-demand </w:t>
-      </w:r>
-      <w:proofErr w:type="spellStart"/>
-      <w:r>
-        <w:rPr>
-          <w:rFonts w:ascii="Aptos" w:hAnsi="Aptos"/>
-          <w:sz w:val="20"/>
-          <w:szCs w:val="20"/>
-          <w:lang w:val="en-GB"/>
-        </w:rPr>
-        <w:t>neighborhoods</w:t>
-      </w:r>
-      <w:proofErr w:type="spellEnd"/>
-      <w:r>
-        <w:rPr>
-          <w:rFonts w:ascii="Aptos" w:hAnsi="Aptos"/>
-          <w:sz w:val="20"/>
-          <w:szCs w:val="20"/>
-          <w:lang w:val="en-GB"/>
-        </w:rPr>
-        <w:t xml:space="preserve"> and visualize pickup patterns across the five boroughs of New York City.</w:t>
+        <w:t>We merged the trip records with the taxi zone lookup table using the pd.merge() function. We aligned the PULocationID and DOLocationID from the trip dataset with the LocationID column in the spatial data. This operation allowed us to append borough and zone names to each trip record, transforming numerical IDs into meaningful geographic locations. By performing this join, we facilitated a granular spatial analysis, enabling us to identify high-demand neighborhoods and visualize pickup patterns across the five boroughs of New York City.</w:t>
       </w:r>
     </w:p>
     <w:p>
@@ -3422,87 +2483,7 @@
           <w:sz w:val="20"/>
           <w:szCs w:val="20"/>
         </w:rPr>
-        <w:t xml:space="preserve">We calculated the trip frequency for each location by applying the </w:t>
-      </w:r>
-      <w:proofErr w:type="spellStart"/>
-      <w:r>
-        <w:rPr>
-          <w:rFonts w:ascii="Aptos" w:hAnsi="Aptos"/>
-          <w:bCs/>
-          <w:sz w:val="20"/>
-          <w:szCs w:val="20"/>
-        </w:rPr>
-        <w:t>value_</w:t>
-      </w:r>
-      <w:proofErr w:type="gramStart"/>
-      <w:r>
-        <w:rPr>
-          <w:rFonts w:ascii="Aptos" w:hAnsi="Aptos"/>
-          <w:bCs/>
-          <w:sz w:val="20"/>
-          <w:szCs w:val="20"/>
-        </w:rPr>
-        <w:t>counts</w:t>
-      </w:r>
-      <w:proofErr w:type="spellEnd"/>
-      <w:r>
-        <w:rPr>
-          <w:rFonts w:ascii="Aptos" w:hAnsi="Aptos"/>
-          <w:bCs/>
-          <w:sz w:val="20"/>
-          <w:szCs w:val="20"/>
-        </w:rPr>
-        <w:t>(</w:t>
-      </w:r>
-      <w:proofErr w:type="gramEnd"/>
-      <w:r>
-        <w:rPr>
-          <w:rFonts w:ascii="Aptos" w:hAnsi="Aptos"/>
-          <w:bCs/>
-          <w:sz w:val="20"/>
-          <w:szCs w:val="20"/>
-        </w:rPr>
-        <w:t xml:space="preserve">) method to the </w:t>
-      </w:r>
-      <w:proofErr w:type="spellStart"/>
-      <w:r>
-        <w:rPr>
-          <w:rFonts w:ascii="Aptos" w:hAnsi="Aptos"/>
-          <w:bCs/>
-          <w:sz w:val="20"/>
-          <w:szCs w:val="20"/>
-        </w:rPr>
-        <w:t>PULocationID</w:t>
-      </w:r>
-      <w:proofErr w:type="spellEnd"/>
-      <w:r>
-        <w:rPr>
-          <w:rFonts w:ascii="Aptos" w:hAnsi="Aptos"/>
-          <w:bCs/>
-          <w:sz w:val="20"/>
-          <w:szCs w:val="20"/>
-        </w:rPr>
-        <w:t xml:space="preserve"> column. This allowed us to quantify the total number of pickups occurring within each specific taxi zone. We stored these results in a new </w:t>
-      </w:r>
-      <w:proofErr w:type="spellStart"/>
-      <w:r>
-        <w:rPr>
-          <w:rFonts w:ascii="Aptos" w:hAnsi="Aptos"/>
-          <w:bCs/>
-          <w:sz w:val="20"/>
-          <w:szCs w:val="20"/>
-        </w:rPr>
-        <w:t>DataFrame</w:t>
-      </w:r>
-      <w:proofErr w:type="spellEnd"/>
-      <w:r>
-        <w:rPr>
-          <w:rFonts w:ascii="Aptos" w:hAnsi="Aptos"/>
-          <w:bCs/>
-          <w:sz w:val="20"/>
-          <w:szCs w:val="20"/>
-        </w:rPr>
-        <w:t xml:space="preserve"> to serve as a frequency distribution table. By identifying these counts, we pinpointed the most and least active geographic areas in the dataset, providing a clear statistical basis for our subsequent spatial mapping and demand analysis.</w:t>
+        <w:t>We calculated the trip frequency for each location by applying the value_counts() method to the PULocationID column. This allowed us to quantify the total number of pickups occurring within each specific taxi zone. We stored these results in a new DataFrame to serve as a frequency distribution table. By identifying these counts, we pinpointed the most and least active geographic areas in the dataset, providing a clear statistical basis for our subsequent spatial mapping and demand analysis.</w:t>
       </w:r>
       <w:r>
         <w:rPr>
@@ -3530,17 +2511,8 @@
           <w:rFonts w:ascii="Aptos" w:hAnsi="Aptos"/>
           <w:b/>
         </w:rPr>
-        <w:t xml:space="preserve">Add the number of trips for each zone to the zones </w:t>
-      </w:r>
-      <w:proofErr w:type="spellStart"/>
-      <w:r>
-        <w:rPr>
-          <w:rFonts w:ascii="Aptos" w:hAnsi="Aptos"/>
-          <w:b/>
-        </w:rPr>
-        <w:t>dataframe</w:t>
-      </w:r>
-      <w:proofErr w:type="spellEnd"/>
+        <w:t>Add the number of trips for each zone to the zones dataframe</w:t>
+      </w:r>
       <w:r>
         <w:rPr>
           <w:rFonts w:ascii="Aptos" w:hAnsi="Aptos"/>
@@ -3555,67 +2527,7 @@
           <w:sz w:val="20"/>
           <w:szCs w:val="20"/>
         </w:rPr>
-        <w:t xml:space="preserve">We integrated the trip counts into our spatial dataset by merging the frequency table with the taxi zones </w:t>
-      </w:r>
-      <w:proofErr w:type="spellStart"/>
-      <w:r>
-        <w:rPr>
-          <w:rFonts w:ascii="Aptos" w:hAnsi="Aptos"/>
-          <w:bCs/>
-          <w:sz w:val="20"/>
-          <w:szCs w:val="20"/>
-        </w:rPr>
-        <w:t>GeoDataFrame</w:t>
-      </w:r>
-      <w:proofErr w:type="spellEnd"/>
-      <w:r>
-        <w:rPr>
-          <w:rFonts w:ascii="Aptos" w:hAnsi="Aptos"/>
-          <w:bCs/>
-          <w:sz w:val="20"/>
-          <w:szCs w:val="20"/>
-        </w:rPr>
-        <w:t xml:space="preserve">. We used a left </w:t>
-      </w:r>
-      <w:proofErr w:type="gramStart"/>
-      <w:r>
-        <w:rPr>
-          <w:rFonts w:ascii="Aptos" w:hAnsi="Aptos"/>
-          <w:bCs/>
-          <w:sz w:val="20"/>
-          <w:szCs w:val="20"/>
-        </w:rPr>
-        <w:t>join</w:t>
-      </w:r>
-      <w:proofErr w:type="gramEnd"/>
-      <w:r>
-        <w:rPr>
-          <w:rFonts w:ascii="Aptos" w:hAnsi="Aptos"/>
-          <w:bCs/>
-          <w:sz w:val="20"/>
-          <w:szCs w:val="20"/>
-        </w:rPr>
-        <w:t xml:space="preserve"> on the </w:t>
-      </w:r>
-      <w:proofErr w:type="spellStart"/>
-      <w:r>
-        <w:rPr>
-          <w:rFonts w:ascii="Aptos" w:hAnsi="Aptos"/>
-          <w:bCs/>
-          <w:sz w:val="20"/>
-          <w:szCs w:val="20"/>
-        </w:rPr>
-        <w:t>LocationID</w:t>
-      </w:r>
-      <w:proofErr w:type="spellEnd"/>
-      <w:r>
-        <w:rPr>
-          <w:rFonts w:ascii="Aptos" w:hAnsi="Aptos"/>
-          <w:bCs/>
-          <w:sz w:val="20"/>
-          <w:szCs w:val="20"/>
-        </w:rPr>
-        <w:t xml:space="preserve"> column to ensure that every geographic zone retained its boundary data while gaining a new attribute for trip volume. We filled any resulting null values with zero to represent zones with no recorded activity. This combined structure enabled us to link statistical trip data directly with physical map coordinates for visualization.</w:t>
+        <w:t>We integrated the trip counts into our spatial dataset by merging the frequency table with the taxi zones GeoDataFrame. We used a left join on the LocationID column to ensure that every geographic zone retained its boundary data while gaining a new attribute for trip volume. We filled any resulting null values with zero to represent zones with no recorded activity. This combined structure enabled us to link statistical trip data directly with physical map coordinates for visualization.</w:t>
       </w:r>
     </w:p>
     <w:p>
@@ -3711,39 +2623,7 @@
           <w:rFonts w:ascii="Aptos" w:hAnsi="Aptos"/>
           <w:bCs/>
         </w:rPr>
-        <w:t xml:space="preserve">We visualized the geographic distribution of taxi demand by creating a choropleth map using the </w:t>
-      </w:r>
-      <w:proofErr w:type="spellStart"/>
-      <w:r>
-        <w:rPr>
-          <w:rFonts w:ascii="Aptos" w:hAnsi="Aptos"/>
-          <w:bCs/>
-        </w:rPr>
-        <w:t>geopandas</w:t>
-      </w:r>
-      <w:proofErr w:type="spellEnd"/>
-      <w:r>
-        <w:rPr>
-          <w:rFonts w:ascii="Aptos" w:hAnsi="Aptos"/>
-          <w:bCs/>
-        </w:rPr>
-        <w:t xml:space="preserve"> library. We plotted the taxi zones and used a color gradient to represent the trip counts added in the previous step. By utilizing the </w:t>
-      </w:r>
-      <w:proofErr w:type="gramStart"/>
-      <w:r>
-        <w:rPr>
-          <w:rFonts w:ascii="Aptos" w:hAnsi="Aptos"/>
-          <w:bCs/>
-        </w:rPr>
-        <w:t>plot(</w:t>
-      </w:r>
-      <w:proofErr w:type="gramEnd"/>
-      <w:r>
-        <w:rPr>
-          <w:rFonts w:ascii="Aptos" w:hAnsi="Aptos"/>
-          <w:bCs/>
-        </w:rPr>
-        <w:t>) function with a defined color map, we highlighted high-density pickup areas, such as Manhattan and major airports. This map provided an intuitive overview of NYC's transit hubs, making it easy to identify spatial clusters of high passenger activity.</w:t>
+        <w:t>We visualized the geographic distribution of taxi demand by creating a choropleth map using the geopandas library. We plotted the taxi zones and used a color gradient to represent the trip counts added in the previous step. By utilizing the plot() function with a defined color map, we highlighted high-density pickup areas, such as Manhattan and major airports. This map provided an intuitive overview of NYC's transit hubs, making it easy to identify spatial clusters of high passenger activity.</w:t>
       </w:r>
       <w:r>
         <w:rPr>
@@ -3865,83 +2745,8 @@
           <w:rFonts w:ascii="Aptos" w:hAnsi="Aptos"/>
           <w:bCs/>
         </w:rPr>
-        <w:t xml:space="preserve">       </w:t>
-      </w:r>
-      <w:proofErr w:type="spellStart"/>
-      <w:proofErr w:type="gramStart"/>
-      <w:r>
-        <w:rPr>
-          <w:rFonts w:ascii="Aptos" w:hAnsi="Aptos"/>
-          <w:bCs/>
-        </w:rPr>
-        <w:t>PULocationID</w:t>
-      </w:r>
-      <w:proofErr w:type="spellEnd"/>
-      <w:r>
-        <w:rPr>
-          <w:rFonts w:ascii="Aptos" w:hAnsi="Aptos"/>
-          <w:bCs/>
-        </w:rPr>
-        <w:t xml:space="preserve">  </w:t>
-      </w:r>
-      <w:proofErr w:type="spellStart"/>
-      <w:r>
-        <w:rPr>
-          <w:rFonts w:ascii="Aptos" w:hAnsi="Aptos"/>
-          <w:bCs/>
-        </w:rPr>
-        <w:t>DOLocationID</w:t>
-      </w:r>
-      <w:proofErr w:type="spellEnd"/>
-      <w:proofErr w:type="gramEnd"/>
-      <w:r>
-        <w:rPr>
-          <w:rFonts w:ascii="Aptos" w:hAnsi="Aptos"/>
-          <w:bCs/>
-        </w:rPr>
-        <w:t xml:space="preserve">  </w:t>
-      </w:r>
-      <w:proofErr w:type="spellStart"/>
-      <w:r>
-        <w:rPr>
-          <w:rFonts w:ascii="Aptos" w:hAnsi="Aptos"/>
-          <w:bCs/>
-        </w:rPr>
-        <w:t>pickup_</w:t>
-      </w:r>
-      <w:proofErr w:type="gramStart"/>
-      <w:r>
-        <w:rPr>
-          <w:rFonts w:ascii="Aptos" w:hAnsi="Aptos"/>
-          <w:bCs/>
-        </w:rPr>
-        <w:t>hour</w:t>
-      </w:r>
-      <w:proofErr w:type="spellEnd"/>
-      <w:r>
-        <w:rPr>
-          <w:rFonts w:ascii="Aptos" w:hAnsi="Aptos"/>
-          <w:bCs/>
-        </w:rPr>
-        <w:t xml:space="preserve">  </w:t>
-      </w:r>
-      <w:proofErr w:type="spellStart"/>
-      <w:r>
-        <w:rPr>
-          <w:rFonts w:ascii="Aptos" w:hAnsi="Aptos"/>
-          <w:bCs/>
-        </w:rPr>
-        <w:t>speed</w:t>
-      </w:r>
-      <w:proofErr w:type="gramEnd"/>
-      <w:r>
-        <w:rPr>
-          <w:rFonts w:ascii="Aptos" w:hAnsi="Aptos"/>
-          <w:bCs/>
-        </w:rPr>
-        <w:t>_mph</w:t>
-      </w:r>
-      <w:proofErr w:type="spellEnd"/>
+        <w:t xml:space="preserve">       PULocationID  DOLocationID  pickup_hour  speed_mph</w:t>
+      </w:r>
     </w:p>
     <w:p>
       <w:pPr>
@@ -4043,23 +2848,7 @@
           <w:rFonts w:ascii="Aptos" w:hAnsi="Aptos"/>
           <w:bCs/>
         </w:rPr>
-        <w:t xml:space="preserve">We identified slow-moving routes by first calculating the duration of each trip and then dividing the </w:t>
-      </w:r>
-      <w:proofErr w:type="spellStart"/>
-      <w:r>
-        <w:rPr>
-          <w:rFonts w:ascii="Aptos" w:hAnsi="Aptos"/>
-          <w:bCs/>
-        </w:rPr>
-        <w:t>trip_distance</w:t>
-      </w:r>
-      <w:proofErr w:type="spellEnd"/>
-      <w:r>
-        <w:rPr>
-          <w:rFonts w:ascii="Aptos" w:hAnsi="Aptos"/>
-          <w:bCs/>
-        </w:rPr>
-        <w:t xml:space="preserve"> by this time to determine the average speed. We grouped these results by pickup and drop-off location pairs to find routes with consistently low speeds. This analysis allowed us to isolate areas affected by heavy traffic congestion or infrastructure bottlenecks. By highlighting these "slow routes," we provided insights that could help drivers avoid inefficient paths and improve overall trip turnaround times.</w:t>
+        <w:t>We identified slow-moving routes by first calculating the duration of each trip and then dividing the trip_distance by this time to determine the average speed. We grouped these results by pickup and drop-off location pairs to find routes with consistently low speeds. This analysis allowed us to isolate areas affected by heavy traffic congestion or infrastructure bottlenecks. By highlighting these "slow routes," we provided insights that could help drivers avoid inefficient paths and improve overall trip turnaround times.</w:t>
       </w:r>
       <w:r>
         <w:rPr>
@@ -4106,7 +2895,7 @@
           <w:noProof/>
         </w:rPr>
         <w:drawing>
-          <wp:inline distT="0" distB="0" distL="0" distR="0" wp14:anchorId="53EB121D" wp14:editId="420B7F99">
+          <wp:inline distT="0" distB="0" distL="0" distR="0" wp14:anchorId="53EB121D" wp14:editId="51EC21F3">
             <wp:extent cx="4209898" cy="2091006"/>
             <wp:effectExtent l="0" t="0" r="635" b="5080"/>
             <wp:docPr id="800869824" name="Picture 9"/>
@@ -4660,25 +3449,7 @@
           <w:sz w:val="20"/>
           <w:szCs w:val="20"/>
         </w:rPr>
-        <w:t xml:space="preserve">We identified the top 10 most active zones by aggregating the total number of pickups and drop-offs for each </w:t>
-      </w:r>
-      <w:proofErr w:type="spellStart"/>
-      <w:r>
-        <w:rPr>
-          <w:rFonts w:ascii="Aptos" w:hAnsi="Aptos"/>
-          <w:sz w:val="20"/>
-          <w:szCs w:val="20"/>
-        </w:rPr>
-        <w:t>LocationID</w:t>
-      </w:r>
-      <w:proofErr w:type="spellEnd"/>
-      <w:r>
-        <w:rPr>
-          <w:rFonts w:ascii="Aptos" w:hAnsi="Aptos"/>
-          <w:sz w:val="20"/>
-          <w:szCs w:val="20"/>
-        </w:rPr>
-        <w:t>. We sorted these totals in descending order to isolate the highest-traffic areas, which primarily included Midtown Manhattan and the airports. By focusing on these specific zones, we pinpointed the core hubs of the NYC taxi ecosystem. This ranking provides a strategic roadmap for drivers looking to maximize their chances of finding consecutive passengers in high-demand neighborhoods.</w:t>
+        <w:t>We identified the top 10 most active zones by aggregating the total number of pickups and drop-offs for each LocationID. We sorted these totals in descending order to isolate the highest-traffic areas, which primarily included Midtown Manhattan and the airports. By focusing on these specific zones, we pinpointed the core hubs of the NYC taxi ecosystem. This ranking provides a strategic roadmap for drivers looking to maximize their chances of finding consecutive passengers in high-demand neighborhoods.</w:t>
       </w:r>
     </w:p>
     <w:p>
@@ -4699,23 +3470,7 @@
           <w:rFonts w:ascii="Aptos" w:hAnsi="Aptos"/>
           <w:b/>
         </w:rPr>
-        <w:t xml:space="preserve">Find the ratio of pickups and </w:t>
-      </w:r>
-      <w:proofErr w:type="spellStart"/>
-      <w:r>
-        <w:rPr>
-          <w:rFonts w:ascii="Aptos" w:hAnsi="Aptos"/>
-          <w:b/>
-        </w:rPr>
-        <w:t>dropoffs</w:t>
-      </w:r>
-      <w:proofErr w:type="spellEnd"/>
-      <w:r>
-        <w:rPr>
-          <w:rFonts w:ascii="Aptos" w:hAnsi="Aptos"/>
-          <w:b/>
-        </w:rPr>
-        <w:t xml:space="preserve"> in each zone</w:t>
+        <w:t>Find the ratio of pickups and dropoffs in each zone</w:t>
       </w:r>
       <w:r>
         <w:rPr>
@@ -4952,25 +3707,7 @@
           <w:sz w:val="20"/>
           <w:szCs w:val="20"/>
         </w:rPr>
-        <w:t xml:space="preserve">We determined the revenue distribution by summing the </w:t>
-      </w:r>
-      <w:proofErr w:type="spellStart"/>
-      <w:r>
-        <w:rPr>
-          <w:rFonts w:ascii="Aptos" w:hAnsi="Aptos"/>
-          <w:sz w:val="20"/>
-          <w:szCs w:val="20"/>
-        </w:rPr>
-        <w:t>total_amount</w:t>
-      </w:r>
-      <w:proofErr w:type="spellEnd"/>
-      <w:r>
-        <w:rPr>
-          <w:rFonts w:ascii="Aptos" w:hAnsi="Aptos"/>
-          <w:sz w:val="20"/>
-          <w:szCs w:val="20"/>
-        </w:rPr>
-        <w:t xml:space="preserve"> for trips classified as "day" (6 AM - 8 PM) and "night" (8 PM - 6 AM). We then calculated the percentage share for each period. Although daytime hours account for a higher volume of trips, we analyzed the average revenue per trip to see if nighttime premiums or surcharges significantly impacted the total share. This comparison helped us evaluate the financial viability of different shifts and the impact of time-based pricing on overall earnings.</w:t>
+        <w:t>We determined the revenue distribution by summing the total_amount for trips classified as "day" (6 AM - 8 PM) and "night" (8 PM - 6 AM). We then calculated the percentage share for each period. Although daytime hours account for a higher volume of trips, we analyzed the average revenue per trip to see if nighttime premiums or surcharges significantly impacted the total share. This comparison helped us evaluate the financial viability of different shifts and the impact of time-based pricing on overall earnings.</w:t>
       </w:r>
     </w:p>
     <w:p>
@@ -5078,79 +3815,7 @@
           <w:sz w:val="20"/>
           <w:szCs w:val="20"/>
         </w:rPr>
-        <w:t xml:space="preserve">We calculated the economic efficiency of trips by dividing the </w:t>
-      </w:r>
-      <w:proofErr w:type="spellStart"/>
-      <w:r>
-        <w:rPr>
-          <w:rFonts w:ascii="Aptos" w:hAnsi="Aptos"/>
-          <w:sz w:val="20"/>
-          <w:szCs w:val="20"/>
-        </w:rPr>
-        <w:t>fare_amount</w:t>
-      </w:r>
-      <w:proofErr w:type="spellEnd"/>
-      <w:r>
-        <w:rPr>
-          <w:rFonts w:ascii="Aptos" w:hAnsi="Aptos"/>
-          <w:sz w:val="20"/>
-          <w:szCs w:val="20"/>
-        </w:rPr>
-        <w:t xml:space="preserve"> by the product of </w:t>
-      </w:r>
-      <w:proofErr w:type="spellStart"/>
-      <w:r>
-        <w:rPr>
-          <w:rFonts w:ascii="Aptos" w:hAnsi="Aptos"/>
-          <w:sz w:val="20"/>
-          <w:szCs w:val="20"/>
-        </w:rPr>
-        <w:t>trip_distance</w:t>
-      </w:r>
-      <w:proofErr w:type="spellEnd"/>
-      <w:r>
-        <w:rPr>
-          <w:rFonts w:ascii="Aptos" w:hAnsi="Aptos"/>
-          <w:sz w:val="20"/>
-          <w:szCs w:val="20"/>
-        </w:rPr>
-        <w:t xml:space="preserve"> and </w:t>
-      </w:r>
-      <w:proofErr w:type="spellStart"/>
-      <w:r>
-        <w:rPr>
-          <w:rFonts w:ascii="Aptos" w:hAnsi="Aptos"/>
-          <w:sz w:val="20"/>
-          <w:szCs w:val="20"/>
-        </w:rPr>
-        <w:t>passenger_count</w:t>
-      </w:r>
-      <w:proofErr w:type="spellEnd"/>
-      <w:r>
-        <w:rPr>
-          <w:rFonts w:ascii="Aptos" w:hAnsi="Aptos"/>
-          <w:sz w:val="20"/>
-          <w:szCs w:val="20"/>
-        </w:rPr>
-        <w:t>. We grouped these results to compare how the cost-per-mile changes as the number of passengers increases. This analysis revealed how "</w:t>
-      </w:r>
-      <w:proofErr w:type="gramStart"/>
-      <w:r>
-        <w:rPr>
-          <w:rFonts w:ascii="Aptos" w:hAnsi="Aptos"/>
-          <w:sz w:val="20"/>
-          <w:szCs w:val="20"/>
-        </w:rPr>
-        <w:t>ride-sharing</w:t>
-      </w:r>
-      <w:proofErr w:type="gramEnd"/>
-      <w:r>
-        <w:rPr>
-          <w:rFonts w:ascii="Aptos" w:hAnsi="Aptos"/>
-          <w:sz w:val="20"/>
-          <w:szCs w:val="20"/>
-        </w:rPr>
-        <w:t>" within a single taxi affects the individual cost for riders. By examining these averages, we assessed the value proposition of taxi travel for groups versus solo travelers, providing a clearer picture of passenger behavior and fare structures.</w:t>
+        <w:t>We calculated the economic efficiency of trips by dividing the fare_amount by the product of trip_distance and passenger_count. We grouped these results to compare how the cost-per-mile changes as the number of passengers increases. This analysis revealed how "ride-sharing" within a single taxi affects the individual cost for riders. By examining these averages, we assessed the value proposition of taxi travel for groups versus solo travelers, providing a clearer picture of passenger behavior and fare structures.</w:t>
       </w:r>
     </w:p>
     <w:p>
@@ -5209,22 +3874,13 @@
           <w:rFonts w:ascii="Aptos" w:hAnsi="Aptos"/>
         </w:rPr>
       </w:pPr>
-      <w:proofErr w:type="spellStart"/>
       <w:r>
         <w:rPr>
           <w:rFonts w:ascii="Aptos" w:hAnsi="Aptos"/>
           <w:b/>
         </w:rPr>
         <w:lastRenderedPageBreak/>
-        <w:t>Analyse</w:t>
-      </w:r>
-      <w:proofErr w:type="spellEnd"/>
-      <w:r>
-        <w:rPr>
-          <w:rFonts w:ascii="Aptos" w:hAnsi="Aptos"/>
-          <w:b/>
-        </w:rPr>
-        <w:t xml:space="preserve"> the average fare per mile for the different vendors</w:t>
+        <w:t>Analyse the average fare per mile for the different vendors</w:t>
       </w:r>
       <w:r>
         <w:rPr>
@@ -5308,23 +3964,7 @@
           <w:rFonts w:ascii="Aptos" w:hAnsi="Aptos"/>
           <w:bCs/>
         </w:rPr>
-        <w:t xml:space="preserve">We compared the pricing efficiency of different taxi companies by calculating the average fare per mile for each </w:t>
-      </w:r>
-      <w:proofErr w:type="spellStart"/>
-      <w:r>
-        <w:rPr>
-          <w:rFonts w:ascii="Aptos" w:hAnsi="Aptos"/>
-          <w:bCs/>
-        </w:rPr>
-        <w:t>VendorID</w:t>
-      </w:r>
-      <w:proofErr w:type="spellEnd"/>
-      <w:r>
-        <w:rPr>
-          <w:rFonts w:ascii="Aptos" w:hAnsi="Aptos"/>
-          <w:bCs/>
-        </w:rPr>
-        <w:t>. By grouping the data by vendor, we looked for significant variations in how they charge for distance. Our analysis aimed to determine if one vendor consistently handled more lucrative or efficient routes than others. This comparison ensures a fair assessment of performance across the fleet and helps identify if specific operational practices lead to better financial outcomes for different providers.</w:t>
+        <w:t>We compared the pricing efficiency of different taxi companies by calculating the average fare per mile for each VendorID. By grouping the data by vendor, we looked for significant variations in how they charge for distance. Our analysis aimed to determine if one vendor consistently handled more lucrative or efficient routes than others. This comparison ensures a fair assessment of performance across the fleet and helps identify if specific operational practices lead to better financial outcomes for different providers.</w:t>
       </w:r>
       <w:r>
         <w:rPr>
@@ -5427,25 +4067,7 @@
           <w:sz w:val="20"/>
           <w:szCs w:val="20"/>
         </w:rPr>
-        <w:t xml:space="preserve">We performed a tiered analysis by binning </w:t>
-      </w:r>
-      <w:proofErr w:type="spellStart"/>
-      <w:r>
-        <w:rPr>
-          <w:rFonts w:ascii="Aptos" w:hAnsi="Aptos"/>
-          <w:sz w:val="20"/>
-          <w:szCs w:val="20"/>
-        </w:rPr>
-        <w:t>trip_distance</w:t>
-      </w:r>
-      <w:proofErr w:type="spellEnd"/>
-      <w:r>
-        <w:rPr>
-          <w:rFonts w:ascii="Aptos" w:hAnsi="Aptos"/>
-          <w:sz w:val="20"/>
-          <w:szCs w:val="20"/>
-        </w:rPr>
-        <w:t xml:space="preserve"> into categories (e.g., short, medium, long) and comparing the average fare rates for each vendor within those tiers. This approach allowed us to see if certain vendors are more cost-effective for specific trip lengths. We used this granular view to detect pricing anomalies that </w:t>
+        <w:t xml:space="preserve">We performed a tiered analysis by binning trip_distance into categories (e.g., short, medium, long) and comparing the average fare rates for each vendor within those tiers. This approach allowed us to see if certain vendors are more cost-effective for specific trip lengths. We used this granular view to detect pricing anomalies that </w:t>
       </w:r>
       <w:r>
         <w:rPr>
@@ -5468,21 +4090,12 @@
           <w:rFonts w:ascii="Aptos" w:hAnsi="Aptos"/>
         </w:rPr>
       </w:pPr>
-      <w:proofErr w:type="spellStart"/>
-      <w:r>
-        <w:rPr>
-          <w:rFonts w:ascii="Aptos" w:hAnsi="Aptos"/>
-          <w:b/>
-        </w:rPr>
-        <w:t>Analyse</w:t>
-      </w:r>
-      <w:proofErr w:type="spellEnd"/>
-      <w:r>
-        <w:rPr>
-          <w:rFonts w:ascii="Aptos" w:hAnsi="Aptos"/>
-          <w:b/>
-        </w:rPr>
-        <w:t xml:space="preserve"> the tip percentages</w:t>
+      <w:r>
+        <w:rPr>
+          <w:rFonts w:ascii="Aptos" w:hAnsi="Aptos"/>
+          <w:b/>
+        </w:rPr>
+        <w:t>Analyse the tip percentages</w:t>
       </w:r>
     </w:p>
     <w:p>
@@ -5498,7 +4111,7 @@
           <w:noProof/>
         </w:rPr>
         <w:drawing>
-          <wp:inline distT="0" distB="0" distL="0" distR="0" wp14:anchorId="383919C3" wp14:editId="369D0D14">
+          <wp:inline distT="0" distB="0" distL="0" distR="0" wp14:anchorId="383919C3" wp14:editId="6C13E2AE">
             <wp:extent cx="4561028" cy="2265408"/>
             <wp:effectExtent l="0" t="0" r="0" b="1905"/>
             <wp:docPr id="227001894" name="Picture 17"/>
@@ -5560,47 +4173,7 @@
           <w:sz w:val="20"/>
           <w:szCs w:val="20"/>
         </w:rPr>
-        <w:t xml:space="preserve">We analyzed passenger tipping behavior by calculating the ratio of </w:t>
-      </w:r>
-      <w:proofErr w:type="spellStart"/>
-      <w:r>
-        <w:rPr>
-          <w:rFonts w:ascii="Aptos" w:hAnsi="Aptos"/>
-          <w:bCs/>
-          <w:sz w:val="20"/>
-          <w:szCs w:val="20"/>
-        </w:rPr>
-        <w:t>tip_amount</w:t>
-      </w:r>
-      <w:proofErr w:type="spellEnd"/>
-      <w:r>
-        <w:rPr>
-          <w:rFonts w:ascii="Aptos" w:hAnsi="Aptos"/>
-          <w:bCs/>
-          <w:sz w:val="20"/>
-          <w:szCs w:val="20"/>
-        </w:rPr>
-        <w:t xml:space="preserve"> to </w:t>
-      </w:r>
-      <w:proofErr w:type="spellStart"/>
-      <w:r>
-        <w:rPr>
-          <w:rFonts w:ascii="Aptos" w:hAnsi="Aptos"/>
-          <w:bCs/>
-          <w:sz w:val="20"/>
-          <w:szCs w:val="20"/>
-        </w:rPr>
-        <w:t>fare_amount</w:t>
-      </w:r>
-      <w:proofErr w:type="spellEnd"/>
-      <w:r>
-        <w:rPr>
-          <w:rFonts w:ascii="Aptos" w:hAnsi="Aptos"/>
-          <w:bCs/>
-          <w:sz w:val="20"/>
-          <w:szCs w:val="20"/>
-        </w:rPr>
-        <w:t xml:space="preserve"> for each trip. We excluded cash transactions where tips are often unrecorded to maintain data accuracy. We then visualized the distribution of these percentages and calculated the mean tip across different zones and times. This analysis allowed us to identify "high-tipping" areas and periods, providing drivers with valuable information on where and when they are likely to earn the highest gratuities.</w:t>
+        <w:t>We analyzed passenger tipping behavior by calculating the ratio of tip_amount to fare_amount for each trip. We excluded cash transactions where tips are often unrecorded to maintain data accuracy. We then visualized the distribution of these percentages and calculated the mean tip across different zones and times. This analysis allowed us to identify "high-tipping" areas and periods, providing drivers with valuable information on where and when they are likely to earn the highest gratuities.</w:t>
       </w:r>
       <w:r>
         <w:rPr>
@@ -5623,23 +4196,12 @@
           <w:rFonts w:ascii="Aptos" w:hAnsi="Aptos"/>
         </w:rPr>
       </w:pPr>
-      <w:proofErr w:type="spellStart"/>
-      <w:proofErr w:type="gramStart"/>
-      <w:r>
-        <w:rPr>
-          <w:rFonts w:ascii="Aptos" w:hAnsi="Aptos"/>
-          <w:b/>
-        </w:rPr>
-        <w:t>Analyse</w:t>
-      </w:r>
-      <w:proofErr w:type="spellEnd"/>
-      <w:proofErr w:type="gramEnd"/>
-      <w:r>
-        <w:rPr>
-          <w:rFonts w:ascii="Aptos" w:hAnsi="Aptos"/>
-          <w:b/>
-        </w:rPr>
-        <w:t xml:space="preserve"> the trends in passenger count</w:t>
+      <w:r>
+        <w:rPr>
+          <w:rFonts w:ascii="Aptos" w:hAnsi="Aptos"/>
+          <w:b/>
+        </w:rPr>
+        <w:t>Analyse the trends in passenger count</w:t>
       </w:r>
     </w:p>
     <w:p>
@@ -5655,7 +4217,7 @@
           <w:noProof/>
         </w:rPr>
         <w:drawing>
-          <wp:inline distT="0" distB="0" distL="0" distR="0" wp14:anchorId="133DBD67" wp14:editId="383DD18E">
+          <wp:inline distT="0" distB="0" distL="0" distR="0" wp14:anchorId="133DBD67" wp14:editId="610085A5">
             <wp:extent cx="4166007" cy="2540997"/>
             <wp:effectExtent l="0" t="0" r="6350" b="0"/>
             <wp:docPr id="1779419317" name="Picture 18"/>
@@ -5717,47 +4279,7 @@
           <w:sz w:val="20"/>
           <w:szCs w:val="20"/>
         </w:rPr>
-        <w:t xml:space="preserve">We examined the social dynamics of taxi usage by analyzing the distribution and trends of the </w:t>
-      </w:r>
-      <w:proofErr w:type="spellStart"/>
-      <w:r>
-        <w:rPr>
-          <w:rFonts w:ascii="Aptos" w:hAnsi="Aptos"/>
-          <w:bCs/>
-          <w:sz w:val="20"/>
-          <w:szCs w:val="20"/>
-        </w:rPr>
-        <w:t>passenger_count</w:t>
-      </w:r>
-      <w:proofErr w:type="spellEnd"/>
-      <w:r>
-        <w:rPr>
-          <w:rFonts w:ascii="Aptos" w:hAnsi="Aptos"/>
-          <w:bCs/>
-          <w:sz w:val="20"/>
-          <w:szCs w:val="20"/>
-        </w:rPr>
-        <w:t xml:space="preserve"> variable. We observed that </w:t>
-      </w:r>
-      <w:proofErr w:type="gramStart"/>
-      <w:r>
-        <w:rPr>
-          <w:rFonts w:ascii="Aptos" w:hAnsi="Aptos"/>
-          <w:bCs/>
-          <w:sz w:val="20"/>
-          <w:szCs w:val="20"/>
-        </w:rPr>
-        <w:t>the vast majority of</w:t>
-      </w:r>
-      <w:proofErr w:type="gramEnd"/>
-      <w:r>
-        <w:rPr>
-          <w:rFonts w:ascii="Aptos" w:hAnsi="Aptos"/>
-          <w:bCs/>
-          <w:sz w:val="20"/>
-          <w:szCs w:val="20"/>
-        </w:rPr>
-        <w:t xml:space="preserve"> trips </w:t>
+        <w:t xml:space="preserve">We examined the social dynamics of taxi usage by analyzing the distribution and trends of the passenger_count variable. We observed that the vast majority of trips </w:t>
       </w:r>
       <w:r>
         <w:rPr>
@@ -5790,21 +4312,12 @@
           <w:rFonts w:ascii="Aptos" w:hAnsi="Aptos"/>
         </w:rPr>
       </w:pPr>
-      <w:proofErr w:type="spellStart"/>
-      <w:r>
-        <w:rPr>
-          <w:rFonts w:ascii="Aptos" w:hAnsi="Aptos"/>
-          <w:b/>
-        </w:rPr>
-        <w:t>Analyse</w:t>
-      </w:r>
-      <w:proofErr w:type="spellEnd"/>
-      <w:r>
-        <w:rPr>
-          <w:rFonts w:ascii="Aptos" w:hAnsi="Aptos"/>
-          <w:b/>
-        </w:rPr>
-        <w:t xml:space="preserve"> the variation of passenger counts across zones</w:t>
+      <w:r>
+        <w:rPr>
+          <w:rFonts w:ascii="Aptos" w:hAnsi="Aptos"/>
+          <w:b/>
+        </w:rPr>
+        <w:t>Analyse the variation of passenger counts across zones</w:t>
       </w:r>
     </w:p>
     <w:p>
@@ -5882,27 +4395,7 @@
           <w:sz w:val="20"/>
           <w:szCs w:val="20"/>
         </w:rPr>
-        <w:t xml:space="preserve">We investigated geographic differences in passenger behavior by calculating the average </w:t>
-      </w:r>
-      <w:proofErr w:type="spellStart"/>
-      <w:r>
-        <w:rPr>
-          <w:rFonts w:ascii="Aptos" w:hAnsi="Aptos"/>
-          <w:bCs/>
-          <w:sz w:val="20"/>
-          <w:szCs w:val="20"/>
-        </w:rPr>
-        <w:t>passenger_count</w:t>
-      </w:r>
-      <w:proofErr w:type="spellEnd"/>
-      <w:r>
-        <w:rPr>
-          <w:rFonts w:ascii="Aptos" w:hAnsi="Aptos"/>
-          <w:bCs/>
-          <w:sz w:val="20"/>
-          <w:szCs w:val="20"/>
-        </w:rPr>
-        <w:t xml:space="preserve"> for each pickup zone. We observed that certain areas, such as transit hubs and tourist attractions, tend to have higher average passenger counts compared to residential or business districts. This spatial analysis helped us identify where "group travel" is most common. By mapping these variations, we provided a better understanding of neighborhood-specific demand, which can guide the deployment of larger capacity vehicles to specific zones.</w:t>
+        <w:t>We investigated geographic differences in passenger behavior by calculating the average passenger_count for each pickup zone. We observed that certain areas, such as transit hubs and tourist attractions, tend to have higher average passenger counts compared to residential or business districts. This spatial analysis helped us identify where "group travel" is most common. By mapping these variations, we provided a better understanding of neighborhood-specific demand, which can guide the deployment of larger capacity vehicles to specific zones.</w:t>
       </w:r>
       <w:r>
         <w:rPr>
@@ -5932,37 +4425,12 @@
           <w:rFonts w:ascii="Aptos" w:hAnsi="Aptos"/>
         </w:rPr>
       </w:pPr>
-      <w:proofErr w:type="spellStart"/>
-      <w:r>
-        <w:rPr>
-          <w:rFonts w:ascii="Aptos" w:hAnsi="Aptos"/>
-          <w:b/>
-        </w:rPr>
-        <w:t>Analyse</w:t>
-      </w:r>
-      <w:proofErr w:type="spellEnd"/>
-      <w:r>
-        <w:rPr>
-          <w:rFonts w:ascii="Aptos" w:hAnsi="Aptos"/>
-          <w:b/>
-        </w:rPr>
-        <w:t xml:space="preserve"> the pickup/</w:t>
-      </w:r>
-      <w:proofErr w:type="spellStart"/>
-      <w:r>
-        <w:rPr>
-          <w:rFonts w:ascii="Aptos" w:hAnsi="Aptos"/>
-          <w:b/>
-        </w:rPr>
-        <w:t>dropoff</w:t>
-      </w:r>
-      <w:proofErr w:type="spellEnd"/>
-      <w:r>
-        <w:rPr>
-          <w:rFonts w:ascii="Aptos" w:hAnsi="Aptos"/>
-          <w:b/>
-        </w:rPr>
-        <w:t xml:space="preserve"> zones or times when extra charges are applied more frequently.</w:t>
+      <w:r>
+        <w:rPr>
+          <w:rFonts w:ascii="Aptos" w:hAnsi="Aptos"/>
+          <w:b/>
+        </w:rPr>
+        <w:t>Analyse the pickup/dropoff zones or times when extra charges are applied more frequently.</w:t>
       </w:r>
     </w:p>
     <w:p>
@@ -6044,52 +4512,7 @@
           <w:sz w:val="20"/>
           <w:szCs w:val="20"/>
         </w:rPr>
-        <w:t xml:space="preserve">We analyzed the application of additional fees by identifying the zones and time windows with the highest frequency of extra charges and </w:t>
-      </w:r>
-      <w:proofErr w:type="spellStart"/>
-      <w:r>
-        <w:rPr>
-          <w:rFonts w:ascii="Aptos" w:hAnsi="Aptos"/>
-          <w:bCs/>
-          <w:sz w:val="20"/>
-          <w:szCs w:val="20"/>
-        </w:rPr>
-        <w:t>congestion_surcharge</w:t>
-      </w:r>
-      <w:proofErr w:type="spellEnd"/>
-      <w:r>
-        <w:rPr>
-          <w:rFonts w:ascii="Aptos" w:hAnsi="Aptos"/>
-          <w:bCs/>
-          <w:sz w:val="20"/>
-          <w:szCs w:val="20"/>
-        </w:rPr>
-        <w:t>. We found that these fees are most prevalent during weekday rush hours and for trips originating in the Manhattan congestion zone. By mapping these occurrences, we pinpointed the exact conditions under which passengers pay a premium. This analysis clarifies how regulatory surcharges impact the total cost of taxi services across different NYC neighborhoods and schedules.</w:t>
-      </w:r>
-      <w:r>
-        <w:rPr>
-          <w:rFonts w:ascii="Aptos" w:hAnsi="Aptos"/>
-          <w:bCs/>
-          <w:sz w:val="20"/>
-          <w:szCs w:val="20"/>
-        </w:rPr>
-        <w:br/>
-      </w:r>
-      <w:r>
-        <w:rPr>
-          <w:rFonts w:ascii="Aptos" w:hAnsi="Aptos"/>
-          <w:bCs/>
-          <w:sz w:val="20"/>
-          <w:szCs w:val="20"/>
-        </w:rPr>
-        <w:br/>
-      </w:r>
-      <w:r>
-        <w:rPr>
-          <w:rFonts w:ascii="Aptos" w:hAnsi="Aptos"/>
-          <w:bCs/>
-        </w:rPr>
-        <w:br/>
+        <w:t>We analyzed the application of additional fees by identifying the zones and time windows with the highest frequency of extra charges and congestion_surcharge. We found that these fees are most prevalent during weekday rush hours and for trips originating in the Manhattan congestion zone. By mapping these occurrences, we pinpointed the exact conditions under which passengers pay a premium. This analysis clarifies how regulatory surcharges impact the total cost of taxi services across different NYC neighborhoods and schedules.</w:t>
       </w:r>
       <w:r>
         <w:rPr>
@@ -6240,27 +4663,25 @@
           <w:szCs w:val="20"/>
           <w:lang w:val="en-GB"/>
         </w:rPr>
-        <w:t xml:space="preserve">We recommend implementing a </w:t>
-      </w:r>
-      <w:r>
-        <w:rPr>
-          <w:rFonts w:ascii="Aptos" w:hAnsi="Aptos"/>
-          <w:b/>
-          <w:bCs/>
-          <w:sz w:val="20"/>
-          <w:szCs w:val="20"/>
-          <w:lang w:val="en-GB"/>
-        </w:rPr>
-        <w:t>Predictive Heat-Map Dispatching</w:t>
-      </w:r>
-      <w:r>
-        <w:rPr>
-          <w:rFonts w:ascii="Aptos" w:hAnsi="Aptos"/>
-          <w:sz w:val="20"/>
-          <w:szCs w:val="20"/>
-          <w:lang w:val="en-GB"/>
-        </w:rPr>
-        <w:t xml:space="preserve"> system. Since our spatial analysis identified Manhattan and major airports as primary hubs, we suggest positioning the fleet in these high-demand zones during specific windows. We propose prioritizing "net exporter" zones (where pickups exceed drop-offs) to ensure a steady supply of vehicles where passengers are most likely to originate.</w:t>
+        <w:t xml:space="preserve">We recommend a Predictive Heat-Map Dispatching system. Based on our analysis, </w:t>
+      </w:r>
+      <w:r>
+        <w:rPr>
+          <w:rFonts w:ascii="Aptos" w:hAnsi="Aptos"/>
+          <w:sz w:val="20"/>
+          <w:szCs w:val="20"/>
+          <w:lang w:val="en-GB"/>
+        </w:rPr>
+        <w:t>we suggest keeping</w:t>
+      </w:r>
+      <w:r>
+        <w:rPr>
+          <w:rFonts w:ascii="Aptos" w:hAnsi="Aptos"/>
+          <w:sz w:val="20"/>
+          <w:szCs w:val="20"/>
+          <w:lang w:val="en-GB"/>
+        </w:rPr>
+        <w:t xml:space="preserve"> the fleet in Manhattan and major airports during peak demand and prioritize zones with more pickups than drop-offs to maintain vehicle availability.</w:t>
       </w:r>
     </w:p>
     <w:p>
@@ -6328,8 +4749,61 @@
           <w:szCs w:val="20"/>
           <w:lang w:val="en-GB"/>
         </w:rPr>
-        <w:t xml:space="preserve">weekday evening rush (6:00 PM – </w:t>
-      </w:r>
+        <w:t>weekday evening rush (6:00 PM – 8:00 PM)</w:t>
+      </w:r>
+      <w:r>
+        <w:rPr>
+          <w:rFonts w:ascii="Aptos" w:hAnsi="Aptos"/>
+          <w:sz w:val="20"/>
+          <w:szCs w:val="20"/>
+          <w:lang w:val="en-GB"/>
+        </w:rPr>
+        <w:t xml:space="preserve"> and the </w:t>
+      </w:r>
+      <w:r>
+        <w:rPr>
+          <w:rFonts w:ascii="Aptos" w:hAnsi="Aptos"/>
+          <w:b/>
+          <w:bCs/>
+          <w:sz w:val="20"/>
+          <w:szCs w:val="20"/>
+          <w:lang w:val="en-GB"/>
+        </w:rPr>
+        <w:t>late-night weekend windows</w:t>
+      </w:r>
+      <w:r>
+        <w:rPr>
+          <w:rFonts w:ascii="Aptos" w:hAnsi="Aptos"/>
+          <w:sz w:val="20"/>
+          <w:szCs w:val="20"/>
+          <w:lang w:val="en-GB"/>
+        </w:rPr>
+        <w:t>. By adjusting shifts to match these cycles, we can reduce passenger wait times and maximize driver revenue during high-occupancy periods.</w:t>
+      </w:r>
+    </w:p>
+    <w:p>
+      <w:pPr>
+        <w:ind w:left="2160"/>
+        <w:rPr>
+          <w:rFonts w:ascii="Aptos" w:hAnsi="Aptos"/>
+          <w:sz w:val="20"/>
+          <w:szCs w:val="20"/>
+          <w:lang w:val="en-GB"/>
+        </w:rPr>
+      </w:pPr>
+    </w:p>
+    <w:p>
+      <w:pPr>
+        <w:ind w:left="2160"/>
+        <w:rPr>
+          <w:rFonts w:ascii="Aptos" w:hAnsi="Aptos"/>
+          <w:b/>
+          <w:bCs/>
+          <w:sz w:val="20"/>
+          <w:szCs w:val="20"/>
+          <w:lang w:val="en-GB"/>
+        </w:rPr>
+      </w:pPr>
       <w:r>
         <w:rPr>
           <w:rFonts w:ascii="Aptos" w:hAnsi="Aptos"/>
@@ -6340,70 +4814,6 @@
           <w:lang w:val="en-GB"/>
         </w:rPr>
         <w:lastRenderedPageBreak/>
-        <w:t>8:00 PM)</w:t>
-      </w:r>
-      <w:r>
-        <w:rPr>
-          <w:rFonts w:ascii="Aptos" w:hAnsi="Aptos"/>
-          <w:sz w:val="20"/>
-          <w:szCs w:val="20"/>
-          <w:lang w:val="en-GB"/>
-        </w:rPr>
-        <w:t xml:space="preserve"> and the </w:t>
-      </w:r>
-      <w:r>
-        <w:rPr>
-          <w:rFonts w:ascii="Aptos" w:hAnsi="Aptos"/>
-          <w:b/>
-          <w:bCs/>
-          <w:sz w:val="20"/>
-          <w:szCs w:val="20"/>
-          <w:lang w:val="en-GB"/>
-        </w:rPr>
-        <w:t>late-night weekend windows</w:t>
-      </w:r>
-      <w:r>
-        <w:rPr>
-          <w:rFonts w:ascii="Aptos" w:hAnsi="Aptos"/>
-          <w:sz w:val="20"/>
-          <w:szCs w:val="20"/>
-          <w:lang w:val="en-GB"/>
-        </w:rPr>
-        <w:t>. By adjusting shifts to match these cycles, we can reduce passenger wait times and maximize driver revenue during high-occupancy periods.</w:t>
-      </w:r>
-    </w:p>
-    <w:p>
-      <w:pPr>
-        <w:ind w:left="2160"/>
-        <w:rPr>
-          <w:rFonts w:ascii="Aptos" w:hAnsi="Aptos"/>
-          <w:sz w:val="20"/>
-          <w:szCs w:val="20"/>
-          <w:lang w:val="en-GB"/>
-        </w:rPr>
-      </w:pPr>
-    </w:p>
-    <w:p>
-      <w:pPr>
-        <w:ind w:left="2160"/>
-        <w:rPr>
-          <w:rFonts w:ascii="Aptos" w:hAnsi="Aptos"/>
-          <w:b/>
-          <w:bCs/>
-          <w:sz w:val="20"/>
-          <w:szCs w:val="20"/>
-          <w:lang w:val="en-GB"/>
-        </w:rPr>
-      </w:pPr>
-      <w:r>
-        <w:rPr>
-          <w:rFonts w:ascii="Aptos" w:hAnsi="Aptos"/>
-          <w:b/>
-          <w:bCs/>
-          <w:sz w:val="20"/>
-          <w:szCs w:val="20"/>
-          <w:lang w:val="en-GB"/>
-        </w:rPr>
         <w:t>3. Congestion-Aware Routing</w:t>
       </w:r>
     </w:p>
@@ -6601,23 +5011,7 @@
           <w:rFonts w:ascii="Aptos" w:hAnsi="Aptos"/>
           <w:b/>
         </w:rPr>
-        <w:t xml:space="preserve">Suggestions on strategically positioning cabs across different zones to make best use of insights uncovered by </w:t>
-      </w:r>
-      <w:proofErr w:type="spellStart"/>
-      <w:r>
-        <w:rPr>
-          <w:rFonts w:ascii="Aptos" w:hAnsi="Aptos"/>
-          <w:b/>
-        </w:rPr>
-        <w:t>analysing</w:t>
-      </w:r>
-      <w:proofErr w:type="spellEnd"/>
-      <w:r>
-        <w:rPr>
-          <w:rFonts w:ascii="Aptos" w:hAnsi="Aptos"/>
-          <w:b/>
-        </w:rPr>
-        <w:t xml:space="preserve"> trip trends across time, days and months.</w:t>
+        <w:t>Suggestions on strategically positioning cabs across different zones to make best use of insights uncovered by analysing trip trends across time, days and months.</w:t>
       </w:r>
     </w:p>
     <w:p>
@@ -6755,8 +5149,6 @@
       <w:r>
         <w:rPr>
           <w:rFonts w:ascii="Aptos" w:hAnsi="Aptos"/>
-          <w:b/>
-          <w:bCs/>
           <w:sz w:val="20"/>
           <w:szCs w:val="20"/>
           <w:lang w:val="en-GB"/>
@@ -6807,17 +5199,7 @@
           <w:szCs w:val="20"/>
           <w:lang w:val="en-GB"/>
         </w:rPr>
-        <w:t xml:space="preserve"> On Friday and Saturday nights, we recommend shifting resources from business districts to entertainment hubs. We observed sustained demand in these areas well past midnight, presenting a </w:t>
-      </w:r>
-      <w:r>
-        <w:rPr>
-          <w:rFonts w:ascii="Aptos" w:hAnsi="Aptos"/>
-          <w:sz w:val="20"/>
-          <w:szCs w:val="20"/>
-          <w:lang w:val="en-GB"/>
-        </w:rPr>
-        <w:lastRenderedPageBreak/>
-        <w:t>lucrative window for night-shift drivers to capitalize on social and leisure travel.</w:t>
+        <w:t xml:space="preserve"> On Friday and Saturday nights, we recommend shifting resources from business districts to entertainment hubs. We observed sustained demand in these areas well past midnight, presenting a lucrative window for night-shift drivers to capitalize on social and leisure travel.</w:t>
       </w:r>
     </w:p>
     <w:p>
@@ -6859,8 +5241,6 @@
       <w:r>
         <w:rPr>
           <w:rFonts w:ascii="Aptos" w:hAnsi="Aptos"/>
-          <w:b/>
-          <w:bCs/>
           <w:sz w:val="20"/>
           <w:szCs w:val="20"/>
           <w:lang w:val="en-GB"/>
@@ -6876,26 +5256,27 @@
         </w:rPr>
         <w:t>, especially during midday lulls when city-</w:t>
       </w:r>
-      <w:proofErr w:type="spellStart"/>
-      <w:r>
-        <w:rPr>
-          <w:rFonts w:ascii="Aptos" w:hAnsi="Aptos"/>
-          <w:sz w:val="20"/>
-          <w:szCs w:val="20"/>
-          <w:lang w:val="en-GB"/>
-        </w:rPr>
-        <w:t>center</w:t>
-      </w:r>
-      <w:proofErr w:type="spellEnd"/>
-      <w:r>
-        <w:rPr>
-          <w:rFonts w:ascii="Aptos" w:hAnsi="Aptos"/>
-          <w:sz w:val="20"/>
-          <w:szCs w:val="20"/>
-          <w:lang w:val="en-GB"/>
-        </w:rPr>
-        <w:t xml:space="preserve"> demand fluctuates. These hubs provide high-value, long-distance trips that stabilize daily earnings regardless of local traffic.</w:t>
-      </w:r>
+      <w:r>
+        <w:rPr>
+          <w:rFonts w:ascii="Aptos" w:hAnsi="Aptos"/>
+          <w:sz w:val="20"/>
+          <w:szCs w:val="20"/>
+          <w:lang w:val="en-GB"/>
+        </w:rPr>
+        <w:lastRenderedPageBreak/>
+        <w:t>center demand fluctuates. These hubs provide high-value, long-distance trips that stabilize daily earnings regardless of local traffic.</w:t>
+      </w:r>
+    </w:p>
+    <w:p>
+      <w:pPr>
+        <w:ind w:left="2880"/>
+        <w:rPr>
+          <w:rFonts w:ascii="Aptos" w:hAnsi="Aptos"/>
+          <w:sz w:val="20"/>
+          <w:szCs w:val="20"/>
+          <w:lang w:val="en-GB"/>
+        </w:rPr>
+      </w:pPr>
     </w:p>
     <w:p>
       <w:pPr>
@@ -6987,7 +5368,87 @@
           <w:szCs w:val="20"/>
           <w:lang w:val="en-GB"/>
         </w:rPr>
-        <w:t>We propose a Dynamic Tiered Pricing Model that leverages temporal and spatial demand patterns to maximize revenue while ensuring our rates remain competitive.</w:t>
+        <w:t xml:space="preserve">We propose a </w:t>
+      </w:r>
+      <w:r>
+        <w:rPr>
+          <w:rFonts w:ascii="Aptos" w:hAnsi="Aptos"/>
+          <w:bCs/>
+          <w:sz w:val="20"/>
+          <w:szCs w:val="20"/>
+          <w:lang w:val="en-GB"/>
+        </w:rPr>
+        <w:t>d</w:t>
+      </w:r>
+      <w:r>
+        <w:rPr>
+          <w:rFonts w:ascii="Aptos" w:hAnsi="Aptos"/>
+          <w:bCs/>
+          <w:sz w:val="20"/>
+          <w:szCs w:val="20"/>
+          <w:lang w:val="en-GB"/>
+        </w:rPr>
+        <w:t xml:space="preserve">ynamic </w:t>
+      </w:r>
+      <w:r>
+        <w:rPr>
+          <w:rFonts w:ascii="Aptos" w:hAnsi="Aptos"/>
+          <w:bCs/>
+          <w:sz w:val="20"/>
+          <w:szCs w:val="20"/>
+          <w:lang w:val="en-GB"/>
+        </w:rPr>
+        <w:t>t</w:t>
+      </w:r>
+      <w:r>
+        <w:rPr>
+          <w:rFonts w:ascii="Aptos" w:hAnsi="Aptos"/>
+          <w:bCs/>
+          <w:sz w:val="20"/>
+          <w:szCs w:val="20"/>
+          <w:lang w:val="en-GB"/>
+        </w:rPr>
+        <w:t xml:space="preserve">iered </w:t>
+      </w:r>
+      <w:r>
+        <w:rPr>
+          <w:rFonts w:ascii="Aptos" w:hAnsi="Aptos"/>
+          <w:bCs/>
+          <w:sz w:val="20"/>
+          <w:szCs w:val="20"/>
+          <w:lang w:val="en-GB"/>
+        </w:rPr>
+        <w:t>p</w:t>
+      </w:r>
+      <w:r>
+        <w:rPr>
+          <w:rFonts w:ascii="Aptos" w:hAnsi="Aptos"/>
+          <w:bCs/>
+          <w:sz w:val="20"/>
+          <w:szCs w:val="20"/>
+          <w:lang w:val="en-GB"/>
+        </w:rPr>
+        <w:t xml:space="preserve">ricing </w:t>
+      </w:r>
+      <w:r>
+        <w:rPr>
+          <w:rFonts w:ascii="Aptos" w:hAnsi="Aptos"/>
+          <w:bCs/>
+          <w:sz w:val="20"/>
+          <w:szCs w:val="20"/>
+          <w:lang w:val="en-GB"/>
+        </w:rPr>
+        <w:t>m</w:t>
+      </w:r>
+      <w:r>
+        <w:rPr>
+          <w:rFonts w:ascii="Aptos" w:hAnsi="Aptos"/>
+          <w:bCs/>
+          <w:sz w:val="20"/>
+          <w:szCs w:val="20"/>
+          <w:lang w:val="en-GB"/>
+        </w:rPr>
+        <w:t>odel that leverages temporal and spatial demand patterns to maximize revenue while ensuring our rates remain competitive.</w:t>
       </w:r>
     </w:p>
     <w:p>
@@ -7043,7 +5504,7 @@
           <w:szCs w:val="20"/>
           <w:lang w:val="en-GB"/>
         </w:rPr>
-        <w:t>We recommend introducing a variable "Demand-Based Surcharge" during the identified evening rush hours (6:00 PM – 8:00 PM). Since our analysis shows that demand peaks consistently during this window, a modest price adjustment during these high-volume periods will significantly increase total revenue without deterring passengers who prioritize vehicle availability over cost.</w:t>
+        <w:t>Introducing a "Demand-Based Surcharge" from 6:00 PM to 8:00 PM, when demand is highest, can boost revenue with a moderate price increase. This adjustment will not discourage passengers who value vehicle availability more than cost.</w:t>
       </w:r>
     </w:p>
     <w:p>
@@ -7099,29 +5560,7 @@
           <w:szCs w:val="20"/>
           <w:lang w:val="en-GB"/>
         </w:rPr>
-        <w:t xml:space="preserve">We suggest implementing "Zonal Flat-Rates" for high-traffic corridors, such as trips between Midtown Manhattan and major airports. By offering a predictable, competitive fixed fare for these premium routes, we can attract business </w:t>
-      </w:r>
-      <w:proofErr w:type="spellStart"/>
-      <w:r>
-        <w:rPr>
-          <w:rFonts w:ascii="Aptos" w:hAnsi="Aptos"/>
-          <w:bCs/>
-          <w:sz w:val="20"/>
-          <w:szCs w:val="20"/>
-          <w:lang w:val="en-GB"/>
-        </w:rPr>
-        <w:t>travelers</w:t>
-      </w:r>
-      <w:proofErr w:type="spellEnd"/>
-      <w:r>
-        <w:rPr>
-          <w:rFonts w:ascii="Aptos" w:hAnsi="Aptos"/>
-          <w:bCs/>
-          <w:sz w:val="20"/>
-          <w:szCs w:val="20"/>
-          <w:lang w:val="en-GB"/>
-        </w:rPr>
-        <w:t xml:space="preserve"> and tourists who might otherwise choose ride-sharing alternatives. This strategy stabilizes income and simplifies the payment process for our most lucrative trip types.</w:t>
+        <w:t>We suggest implementing "Zonal Flat-Rates" for high-traffic corridors, such as trips between Midtown Manhattan and major airports. By offering a predictable, competitive fixed fare for these premium routes, we can attract business travelers and tourists who might otherwise choose ride-sharing alternatives. This strategy stabilizes income and simplifies the payment process for our most lucrative trip types.</w:t>
       </w:r>
     </w:p>
     <w:p>
@@ -7219,81 +5658,18 @@
         <w:ind w:left="2160"/>
         <w:rPr>
           <w:rFonts w:ascii="Aptos" w:hAnsi="Aptos"/>
-          <w:bCs/>
-          <w:lang w:val="en-GB"/>
-        </w:rPr>
-      </w:pPr>
-      <w:r>
-        <w:rPr>
-          <w:rFonts w:ascii="Aptos" w:hAnsi="Aptos"/>
-          <w:bCs/>
-          <w:sz w:val="20"/>
-          <w:szCs w:val="20"/>
-          <w:lang w:val="en-GB"/>
-        </w:rPr>
-        <w:t xml:space="preserve">Finally, we propose offering a small discount or loyalty points for contactless and credit card payments. Our data indicates that electronic transactions lead to higher recorded tips and faster turnaround times. By incentivizing digital payments, we </w:t>
-      </w:r>
-      <w:r>
-        <w:rPr>
-          <w:rFonts w:ascii="Aptos" w:hAnsi="Aptos"/>
-          <w:bCs/>
-          <w:sz w:val="20"/>
-          <w:szCs w:val="20"/>
-          <w:lang w:val="en-GB"/>
-        </w:rPr>
-        <w:lastRenderedPageBreak/>
-        <w:t>improve driver earnings and operational efficiency, allowing us to maintain a more competitive and transparent pricing ecosystem compared to traditional cash-only vendors.</w:t>
-      </w:r>
-    </w:p>
-    <w:p>
-      <w:pPr>
-        <w:ind w:left="2160"/>
-        <w:rPr>
-          <w:rFonts w:ascii="Aptos" w:hAnsi="Aptos"/>
-          <w:b/>
-        </w:rPr>
-      </w:pPr>
-    </w:p>
-    <w:p>
-      <w:pPr>
-        <w:ind w:left="2160"/>
-        <w:rPr>
-          <w:rFonts w:ascii="Aptos" w:hAnsi="Aptos"/>
-          <w:b/>
-        </w:rPr>
-      </w:pPr>
-    </w:p>
-    <w:p>
-      <w:pPr>
-        <w:ind w:left="2160"/>
-        <w:rPr>
-          <w:rFonts w:ascii="Aptos" w:hAnsi="Aptos"/>
-          <w:b/>
-        </w:rPr>
-      </w:pPr>
-    </w:p>
-    <w:p>
-      <w:pPr>
-        <w:ind w:left="2160"/>
-        <w:rPr>
-          <w:rFonts w:ascii="Aptos" w:hAnsi="Aptos"/>
-        </w:rPr>
-      </w:pPr>
-    </w:p>
-    <w:p>
-      <w:pPr>
-        <w:rPr>
-          <w:rFonts w:ascii="Aptos" w:hAnsi="Aptos"/>
-        </w:rPr>
-      </w:pPr>
-    </w:p>
-    <w:p>
-      <w:pPr>
-        <w:ind w:left="2160"/>
-        <w:rPr>
-          <w:rFonts w:ascii="Aptos" w:hAnsi="Aptos"/>
-        </w:rPr>
-      </w:pPr>
+        </w:rPr>
+      </w:pPr>
+      <w:r>
+        <w:rPr>
+          <w:rFonts w:ascii="Aptos" w:hAnsi="Aptos"/>
+          <w:bCs/>
+          <w:sz w:val="20"/>
+          <w:szCs w:val="20"/>
+          <w:lang w:val="en-GB"/>
+        </w:rPr>
+        <w:t>Finally, we propose offering a small discount or loyalty points for contactless and credit card payments. Our data indicates that electronic transactions lead to higher recorded tips and faster turnaround times. By incentivizing digital payments, we improve driver earnings and operational efficiency, allowing us to maintain a more competitive and transparent pricing ecosystem compared to traditional cash-only vendors.</w:t>
+      </w:r>
     </w:p>
     <w:sectPr>
       <w:pgSz w:w="12240" w:h="15840"/>
@@ -7308,6 +5684,119 @@
 <file path=word/numbering.xml><?xml version="1.0" encoding="utf-8"?>
 <w:numbering xmlns:wpc="http://schemas.microsoft.com/office/word/2010/wordprocessingCanvas" xmlns:cx="http://schemas.microsoft.com/office/drawing/2014/chartex" xmlns:cx1="http://schemas.microsoft.com/office/drawing/2015/9/8/chartex" xmlns:cx2="http://schemas.microsoft.com/office/drawing/2015/10/21/chartex" xmlns:cx3="http://schemas.microsoft.com/office/drawing/2016/5/9/chartex" xmlns:cx4="http://schemas.microsoft.com/office/drawing/2016/5/10/chartex" xmlns:cx5="http://schemas.microsoft.com/office/drawing/2016/5/11/chartex" xmlns:cx6="http://schemas.microsoft.com/office/drawing/2016/5/12/chartex" xmlns:cx7="http://schemas.microsoft.com/office/drawing/2016/5/13/chartex" xmlns:cx8="http://schemas.microsoft.com/office/drawing/2016/5/14/chartex" xmlns:mc="http://schemas.openxmlformats.org/markup-compatibility/2006" xmlns:aink="http://schemas.microsoft.com/office/drawing/2016/ink" xmlns:am3d="http://schemas.microsoft.com/office/drawing/2017/model3d" xmlns:o="urn:schemas-microsoft-com:office:office" xmlns:oel="http://schemas.microsoft.com/office/2019/extlst" xmlns:r="http://schemas.openxmlformats.org/officeDocument/2006/relationships" xmlns:m="http://schemas.openxmlformats.org/officeDocument/2006/math" xmlns:v="urn:schemas-microsoft-com:vml" xmlns:wp14="http://schemas.microsoft.com/office/word/2010/wordprocessingDrawing" xmlns:wp="http://schemas.openxmlformats.org/drawingml/2006/wordprocessingDrawing" xmlns:w10="urn:schemas-microsoft-com:office:word" xmlns:w="http://schemas.openxmlformats.org/wordprocessingml/2006/main" xmlns:w14="http://schemas.microsoft.com/office/word/2010/wordml" xmlns:w15="http://schemas.microsoft.com/office/word/2012/wordml" xmlns:w16cex="http://schemas.microsoft.com/office/word/2018/wordml/cex" xmlns:w16cid="http://schemas.microsoft.com/office/word/2016/wordml/cid" xmlns:w16="http://schemas.microsoft.com/office/word/2018/wordml" xmlns:w16du="http://schemas.microsoft.com/office/word/2023/wordml/word16du" xmlns:w16sdtdh="http://schemas.microsoft.com/office/word/2020/wordml/sdtdatahash" xmlns:w16sdtfl="http://schemas.microsoft.com/office/word/2024/wordml/sdtformatlock" xmlns:w16se="http://schemas.microsoft.com/office/word/2015/wordml/symex" xmlns:wpg="http://schemas.microsoft.com/office/word/2010/wordprocessingGroup" xmlns:wpi="http://schemas.microsoft.com/office/word/2010/wordprocessingInk" xmlns:wne="http://schemas.microsoft.com/office/word/2006/wordml" xmlns:wps="http://schemas.microsoft.com/office/word/2010/wordprocessingShape" mc:Ignorable="w14 w15 w16se w16cid w16 w16cex w16sdtdh w16sdtfl w16du wp14">
   <w:abstractNum w:abstractNumId="0" w15:restartNumberingAfterBreak="0">
+    <w:nsid w:val="0D2F7F72"/>
+    <w:multiLevelType w:val="hybridMultilevel"/>
+    <w:tmpl w:val="10CCBC58"/>
+    <w:lvl w:ilvl="0" w:tplc="08090001">
+      <w:start w:val="1"/>
+      <w:numFmt w:val="bullet"/>
+      <w:lvlText w:val=""/>
+      <w:lvlJc w:val="left"/>
+      <w:pPr>
+        <w:ind w:left="2160" w:hanging="360"/>
+      </w:pPr>
+      <w:rPr>
+        <w:rFonts w:ascii="Symbol" w:hAnsi="Symbol" w:hint="default"/>
+      </w:rPr>
+    </w:lvl>
+    <w:lvl w:ilvl="1" w:tplc="08090003" w:tentative="1">
+      <w:start w:val="1"/>
+      <w:numFmt w:val="bullet"/>
+      <w:lvlText w:val="o"/>
+      <w:lvlJc w:val="left"/>
+      <w:pPr>
+        <w:ind w:left="2880" w:hanging="360"/>
+      </w:pPr>
+      <w:rPr>
+        <w:rFonts w:ascii="Courier New" w:hAnsi="Courier New" w:cs="Courier New" w:hint="default"/>
+      </w:rPr>
+    </w:lvl>
+    <w:lvl w:ilvl="2" w:tplc="08090005" w:tentative="1">
+      <w:start w:val="1"/>
+      <w:numFmt w:val="bullet"/>
+      <w:lvlText w:val=""/>
+      <w:lvlJc w:val="left"/>
+      <w:pPr>
+        <w:ind w:left="3600" w:hanging="360"/>
+      </w:pPr>
+      <w:rPr>
+        <w:rFonts w:ascii="Wingdings" w:hAnsi="Wingdings" w:hint="default"/>
+      </w:rPr>
+    </w:lvl>
+    <w:lvl w:ilvl="3" w:tplc="08090001" w:tentative="1">
+      <w:start w:val="1"/>
+      <w:numFmt w:val="bullet"/>
+      <w:lvlText w:val=""/>
+      <w:lvlJc w:val="left"/>
+      <w:pPr>
+        <w:ind w:left="4320" w:hanging="360"/>
+      </w:pPr>
+      <w:rPr>
+        <w:rFonts w:ascii="Symbol" w:hAnsi="Symbol" w:hint="default"/>
+      </w:rPr>
+    </w:lvl>
+    <w:lvl w:ilvl="4" w:tplc="08090003" w:tentative="1">
+      <w:start w:val="1"/>
+      <w:numFmt w:val="bullet"/>
+      <w:lvlText w:val="o"/>
+      <w:lvlJc w:val="left"/>
+      <w:pPr>
+        <w:ind w:left="5040" w:hanging="360"/>
+      </w:pPr>
+      <w:rPr>
+        <w:rFonts w:ascii="Courier New" w:hAnsi="Courier New" w:cs="Courier New" w:hint="default"/>
+      </w:rPr>
+    </w:lvl>
+    <w:lvl w:ilvl="5" w:tplc="08090005" w:tentative="1">
+      <w:start w:val="1"/>
+      <w:numFmt w:val="bullet"/>
+      <w:lvlText w:val=""/>
+      <w:lvlJc w:val="left"/>
+      <w:pPr>
+        <w:ind w:left="5760" w:hanging="360"/>
+      </w:pPr>
+      <w:rPr>
+        <w:rFonts w:ascii="Wingdings" w:hAnsi="Wingdings" w:hint="default"/>
+      </w:rPr>
+    </w:lvl>
+    <w:lvl w:ilvl="6" w:tplc="08090001" w:tentative="1">
+      <w:start w:val="1"/>
+      <w:numFmt w:val="bullet"/>
+      <w:lvlText w:val=""/>
+      <w:lvlJc w:val="left"/>
+      <w:pPr>
+        <w:ind w:left="6480" w:hanging="360"/>
+      </w:pPr>
+      <w:rPr>
+        <w:rFonts w:ascii="Symbol" w:hAnsi="Symbol" w:hint="default"/>
+      </w:rPr>
+    </w:lvl>
+    <w:lvl w:ilvl="7" w:tplc="08090003" w:tentative="1">
+      <w:start w:val="1"/>
+      <w:numFmt w:val="bullet"/>
+      <w:lvlText w:val="o"/>
+      <w:lvlJc w:val="left"/>
+      <w:pPr>
+        <w:ind w:left="7200" w:hanging="360"/>
+      </w:pPr>
+      <w:rPr>
+        <w:rFonts w:ascii="Courier New" w:hAnsi="Courier New" w:cs="Courier New" w:hint="default"/>
+      </w:rPr>
+    </w:lvl>
+    <w:lvl w:ilvl="8" w:tplc="08090005" w:tentative="1">
+      <w:start w:val="1"/>
+      <w:numFmt w:val="bullet"/>
+      <w:lvlText w:val=""/>
+      <w:lvlJc w:val="left"/>
+      <w:pPr>
+        <w:ind w:left="7920" w:hanging="360"/>
+      </w:pPr>
+      <w:rPr>
+        <w:rFonts w:ascii="Wingdings" w:hAnsi="Wingdings" w:hint="default"/>
+      </w:rPr>
+    </w:lvl>
+  </w:abstractNum>
+  <w:abstractNum w:abstractNumId="1" w15:restartNumberingAfterBreak="0">
     <w:nsid w:val="36F63E4B"/>
     <w:multiLevelType w:val="multilevel"/>
     <w:tmpl w:val="FC085C9E"/>
@@ -7456,7 +5945,7 @@
       </w:rPr>
     </w:lvl>
   </w:abstractNum>
-  <w:abstractNum w:abstractNumId="1" w15:restartNumberingAfterBreak="0">
+  <w:abstractNum w:abstractNumId="2" w15:restartNumberingAfterBreak="0">
     <w:nsid w:val="38A25BA7"/>
     <w:multiLevelType w:val="multilevel"/>
     <w:tmpl w:val="9964133A"/>
@@ -7577,7 +6066,7 @@
       </w:rPr>
     </w:lvl>
   </w:abstractNum>
-  <w:abstractNum w:abstractNumId="2" w15:restartNumberingAfterBreak="0">
+  <w:abstractNum w:abstractNumId="3" w15:restartNumberingAfterBreak="0">
     <w:nsid w:val="40B35581"/>
     <w:multiLevelType w:val="hybridMultilevel"/>
     <w:tmpl w:val="DB8AE3EA"/>
@@ -7690,7 +6179,7 @@
       </w:rPr>
     </w:lvl>
   </w:abstractNum>
-  <w:abstractNum w:abstractNumId="3" w15:restartNumberingAfterBreak="0">
+  <w:abstractNum w:abstractNumId="4" w15:restartNumberingAfterBreak="0">
     <w:nsid w:val="588C4E66"/>
     <w:multiLevelType w:val="multilevel"/>
     <w:tmpl w:val="C40C9ECE"/>
@@ -7839,7 +6328,7 @@
       </w:rPr>
     </w:lvl>
   </w:abstractNum>
-  <w:abstractNum w:abstractNumId="4" w15:restartNumberingAfterBreak="0">
+  <w:abstractNum w:abstractNumId="5" w15:restartNumberingAfterBreak="0">
     <w:nsid w:val="5FD66BA6"/>
     <w:multiLevelType w:val="multilevel"/>
     <w:tmpl w:val="405A4C94"/>
@@ -7988,7 +6477,7 @@
       </w:rPr>
     </w:lvl>
   </w:abstractNum>
-  <w:abstractNum w:abstractNumId="5" w15:restartNumberingAfterBreak="0">
+  <w:abstractNum w:abstractNumId="6" w15:restartNumberingAfterBreak="0">
     <w:nsid w:val="69BF11B6"/>
     <w:multiLevelType w:val="hybridMultilevel"/>
     <w:tmpl w:val="6A9EB572"/>
@@ -8102,22 +6591,25 @@
     </w:lvl>
   </w:abstractNum>
   <w:num w:numId="1" w16cid:durableId="1845241628">
+    <w:abstractNumId w:val="2"/>
+  </w:num>
+  <w:num w:numId="2" w16cid:durableId="258370404">
+    <w:abstractNumId w:val="5"/>
+  </w:num>
+  <w:num w:numId="3" w16cid:durableId="956595974">
     <w:abstractNumId w:val="1"/>
   </w:num>
-  <w:num w:numId="2" w16cid:durableId="258370404">
+  <w:num w:numId="4" w16cid:durableId="1949120640">
+    <w:abstractNumId w:val="3"/>
+  </w:num>
+  <w:num w:numId="5" w16cid:durableId="433019712">
+    <w:abstractNumId w:val="6"/>
+  </w:num>
+  <w:num w:numId="6" w16cid:durableId="1638994365">
     <w:abstractNumId w:val="4"/>
   </w:num>
-  <w:num w:numId="3" w16cid:durableId="956595974">
+  <w:num w:numId="7" w16cid:durableId="1938294840">
     <w:abstractNumId w:val="0"/>
-  </w:num>
-  <w:num w:numId="4" w16cid:durableId="1949120640">
-    <w:abstractNumId w:val="2"/>
-  </w:num>
-  <w:num w:numId="5" w16cid:durableId="433019712">
-    <w:abstractNumId w:val="5"/>
-  </w:num>
-  <w:num w:numId="6" w16cid:durableId="1638994365">
-    <w:abstractNumId w:val="3"/>
   </w:num>
 </w:numbering>
 </file>
@@ -8635,7 +7127,6 @@
   <w:style w:type="character" w:default="1" w:styleId="DefaultParagraphFont">
     <w:name w:val="Default Paragraph Font"/>
     <w:uiPriority w:val="1"/>
-    <w:semiHidden/>
     <w:unhideWhenUsed/>
   </w:style>
   <w:style w:type="table" w:default="1" w:styleId="TableNormal">

</xml_diff>

<commit_message>
Update DOCX and add PDF report
Modify EDA_Optimising_NYC_Taxis_Mayuresh_Tungare.docx (binary changes) and add EDA_Optimising_NYC_Taxis_Mayuresh_Tungare.pdf as a PDF export of the report for easier distribution.
</commit_message>
<xml_diff>
--- a/EDA_Optimising_NYC_Taxis_Mayuresh_Tungare.docx
+++ b/EDA_Optimising_NYC_Taxis_Mayuresh_Tungare.docx
@@ -16,20 +16,48 @@
         <w:rPr>
           <w:rFonts w:ascii="Aptos" w:hAnsi="Aptos"/>
         </w:rPr>
-        <w:t>Report: Optimising NYC Taxi Operations</w:t>
-      </w:r>
-    </w:p>
-    <w:p>
-      <w:pPr>
-        <w:rPr>
-          <w:rFonts w:ascii="Aptos" w:hAnsi="Aptos"/>
-        </w:rPr>
-      </w:pPr>
-      <w:r>
-        <w:rPr>
-          <w:rFonts w:ascii="Aptos" w:hAnsi="Aptos"/>
-        </w:rPr>
-        <w:t>Include your visualisations, analysis, results, insights, and outcomes. Explain your methodology and approach to the tasks. Add your conclusions to the sections.</w:t>
+        <w:t xml:space="preserve">Report: </w:t>
+      </w:r>
+      <w:proofErr w:type="spellStart"/>
+      <w:r>
+        <w:rPr>
+          <w:rFonts w:ascii="Aptos" w:hAnsi="Aptos"/>
+        </w:rPr>
+        <w:t>Optimising</w:t>
+      </w:r>
+      <w:proofErr w:type="spellEnd"/>
+      <w:r>
+        <w:rPr>
+          <w:rFonts w:ascii="Aptos" w:hAnsi="Aptos"/>
+        </w:rPr>
+        <w:t xml:space="preserve"> NYC Taxi Operations</w:t>
+      </w:r>
+    </w:p>
+    <w:p>
+      <w:pPr>
+        <w:rPr>
+          <w:rFonts w:ascii="Aptos" w:hAnsi="Aptos"/>
+        </w:rPr>
+      </w:pPr>
+      <w:r>
+        <w:rPr>
+          <w:rFonts w:ascii="Aptos" w:hAnsi="Aptos"/>
+        </w:rPr>
+        <w:t xml:space="preserve">Include your </w:t>
+      </w:r>
+      <w:proofErr w:type="spellStart"/>
+      <w:r>
+        <w:rPr>
+          <w:rFonts w:ascii="Aptos" w:hAnsi="Aptos"/>
+        </w:rPr>
+        <w:t>visualisations</w:t>
+      </w:r>
+      <w:proofErr w:type="spellEnd"/>
+      <w:r>
+        <w:rPr>
+          <w:rFonts w:ascii="Aptos" w:hAnsi="Aptos"/>
+        </w:rPr>
+        <w:t>, analysis, results, insights, and outcomes. Explain your methodology and approach to the tasks. Add your conclusions to the sections.</w:t>
       </w:r>
     </w:p>
     <w:p>
@@ -85,11 +113,13 @@
           <w:sz w:val="20"/>
           <w:szCs w:val="20"/>
         </w:rPr>
-        <w:t>New York City is a living organism, a relentless machine of motion where the iconic yellow taxi serves as the lifeblood of its transit arteries.</w:t>
-      </w:r>
-      <w:r>
-        <w:rPr>
-          <w:rFonts w:ascii="Aptos" w:hAnsi="Aptos"/>
+        <w:t>New York City is a living organism,</w:t>
+      </w:r>
+      <w:r>
+        <w:rPr>
+          <w:rFonts w:ascii="Aptos" w:hAnsi="Aptos"/>
+          <w:sz w:val="20"/>
+          <w:szCs w:val="20"/>
         </w:rPr>
         <w:t xml:space="preserve"> </w:t>
       </w:r>
@@ -99,7 +129,47 @@
           <w:sz w:val="20"/>
           <w:szCs w:val="20"/>
         </w:rPr>
-        <w:t xml:space="preserve">To prepare for the analysis, we begin by importing certain Python libraries </w:t>
+        <w:t>where the iconic yellow taxi serves as the lifeblood of its transit arteries.</w:t>
+      </w:r>
+      <w:r>
+        <w:rPr>
+          <w:rFonts w:ascii="Aptos" w:hAnsi="Aptos"/>
+          <w:sz w:val="20"/>
+          <w:szCs w:val="20"/>
+        </w:rPr>
+        <w:t xml:space="preserve"> W</w:t>
+      </w:r>
+      <w:r>
+        <w:rPr>
+          <w:rFonts w:ascii="Aptos" w:hAnsi="Aptos"/>
+          <w:sz w:val="20"/>
+          <w:szCs w:val="20"/>
+        </w:rPr>
+        <w:t xml:space="preserve">e begin </w:t>
+      </w:r>
+      <w:r>
+        <w:rPr>
+          <w:rFonts w:ascii="Aptos" w:hAnsi="Aptos"/>
+          <w:sz w:val="20"/>
+          <w:szCs w:val="20"/>
+        </w:rPr>
+        <w:t>t</w:t>
+      </w:r>
+      <w:r>
+        <w:rPr>
+          <w:rFonts w:ascii="Aptos" w:hAnsi="Aptos"/>
+          <w:sz w:val="20"/>
+          <w:szCs w:val="20"/>
+        </w:rPr>
+        <w:t xml:space="preserve">o prepare for the analysis </w:t>
+      </w:r>
+      <w:r>
+        <w:rPr>
+          <w:rFonts w:ascii="Aptos" w:hAnsi="Aptos"/>
+          <w:sz w:val="20"/>
+          <w:szCs w:val="20"/>
+        </w:rPr>
+        <w:t xml:space="preserve">by importing certain Python libraries </w:t>
       </w:r>
       <w:r>
         <w:rPr>
@@ -115,16 +185,206 @@
           <w:sz w:val="20"/>
           <w:szCs w:val="20"/>
         </w:rPr>
-        <w:t>pandas, numpy, matplotlib, and seaborn</w:t>
-      </w:r>
-      <w:r>
-        <w:rPr>
-          <w:rFonts w:ascii="Aptos" w:hAnsi="Aptos"/>
-          <w:sz w:val="20"/>
-          <w:szCs w:val="20"/>
-        </w:rPr>
-        <w:t xml:space="preserve"> –</w:t>
-      </w:r>
+        <w:t xml:space="preserve">pandas, </w:t>
+      </w:r>
+      <w:proofErr w:type="spellStart"/>
+      <w:r>
+        <w:rPr>
+          <w:rFonts w:ascii="Aptos" w:hAnsi="Aptos"/>
+          <w:sz w:val="20"/>
+          <w:szCs w:val="20"/>
+        </w:rPr>
+        <w:t>numpy</w:t>
+      </w:r>
+      <w:proofErr w:type="spellEnd"/>
+      <w:r>
+        <w:rPr>
+          <w:rFonts w:ascii="Aptos" w:hAnsi="Aptos"/>
+          <w:sz w:val="20"/>
+          <w:szCs w:val="20"/>
+        </w:rPr>
+        <w:t>, matplotlib, and seaborn</w:t>
+      </w:r>
+      <w:r>
+        <w:rPr>
+          <w:rFonts w:ascii="Aptos" w:hAnsi="Aptos"/>
+          <w:sz w:val="20"/>
+          <w:szCs w:val="20"/>
+        </w:rPr>
+        <w:t>. These libraries will h</w:t>
+      </w:r>
+      <w:r>
+        <w:rPr>
+          <w:rFonts w:ascii="Aptos" w:hAnsi="Aptos"/>
+          <w:sz w:val="20"/>
+          <w:szCs w:val="20"/>
+        </w:rPr>
+        <w:t xml:space="preserve">elp us with </w:t>
+      </w:r>
+      <w:r>
+        <w:rPr>
+          <w:rFonts w:ascii="Aptos" w:hAnsi="Aptos"/>
+          <w:sz w:val="20"/>
+          <w:szCs w:val="20"/>
+        </w:rPr>
+        <w:t>manipulatin</w:t>
+      </w:r>
+      <w:r>
+        <w:rPr>
+          <w:rFonts w:ascii="Aptos" w:hAnsi="Aptos"/>
+          <w:sz w:val="20"/>
+          <w:szCs w:val="20"/>
+        </w:rPr>
+        <w:t>g</w:t>
+      </w:r>
+      <w:r>
+        <w:rPr>
+          <w:rFonts w:ascii="Aptos" w:hAnsi="Aptos"/>
+          <w:sz w:val="20"/>
+          <w:szCs w:val="20"/>
+        </w:rPr>
+        <w:t xml:space="preserve"> and </w:t>
+      </w:r>
+      <w:proofErr w:type="spellStart"/>
+      <w:r>
+        <w:rPr>
+          <w:rFonts w:ascii="Aptos" w:hAnsi="Aptos"/>
+          <w:sz w:val="20"/>
+          <w:szCs w:val="20"/>
+        </w:rPr>
+        <w:t>visualizatin</w:t>
+      </w:r>
+      <w:r>
+        <w:rPr>
+          <w:rFonts w:ascii="Aptos" w:hAnsi="Aptos"/>
+          <w:sz w:val="20"/>
+          <w:szCs w:val="20"/>
+        </w:rPr>
+        <w:t>g</w:t>
+      </w:r>
+      <w:proofErr w:type="spellEnd"/>
+      <w:r>
+        <w:rPr>
+          <w:rFonts w:ascii="Aptos" w:hAnsi="Aptos"/>
+          <w:sz w:val="20"/>
+          <w:szCs w:val="20"/>
+        </w:rPr>
+        <w:t xml:space="preserve"> data</w:t>
+      </w:r>
+      <w:r>
+        <w:rPr>
+          <w:rFonts w:ascii="Aptos" w:hAnsi="Aptos"/>
+          <w:sz w:val="20"/>
+          <w:szCs w:val="20"/>
+        </w:rPr>
+        <w:t xml:space="preserve">. </w:t>
+      </w:r>
+      <w:r>
+        <w:rPr>
+          <w:rFonts w:ascii="Aptos" w:hAnsi="Aptos"/>
+          <w:sz w:val="20"/>
+          <w:szCs w:val="20"/>
+        </w:rPr>
+        <w:t>Then, w</w:t>
+      </w:r>
+      <w:r>
+        <w:rPr>
+          <w:rFonts w:ascii="Aptos" w:hAnsi="Aptos"/>
+          <w:sz w:val="20"/>
+          <w:szCs w:val="20"/>
+        </w:rPr>
+        <w:t xml:space="preserve">e load the data from the </w:t>
+      </w:r>
+      <w:proofErr w:type="spellStart"/>
+      <w:r>
+        <w:rPr>
+          <w:rFonts w:ascii="Aptos" w:hAnsi="Aptos"/>
+          <w:sz w:val="20"/>
+          <w:szCs w:val="20"/>
+        </w:rPr>
+        <w:t>trip_records</w:t>
+      </w:r>
+      <w:proofErr w:type="spellEnd"/>
+      <w:r>
+        <w:rPr>
+          <w:rFonts w:ascii="Aptos" w:hAnsi="Aptos"/>
+          <w:sz w:val="20"/>
+          <w:szCs w:val="20"/>
+        </w:rPr>
+        <w:t xml:space="preserve"> folder using</w:t>
+      </w:r>
+      <w:r>
+        <w:rPr>
+          <w:rFonts w:ascii="Aptos" w:hAnsi="Aptos"/>
+          <w:sz w:val="20"/>
+          <w:szCs w:val="20"/>
+        </w:rPr>
+        <w:t xml:space="preserve"> the </w:t>
+      </w:r>
+      <w:r>
+        <w:rPr>
+          <w:rFonts w:ascii="Aptos" w:hAnsi="Aptos"/>
+          <w:sz w:val="20"/>
+          <w:szCs w:val="20"/>
+        </w:rPr>
+        <w:t>multiple Parquet files.</w:t>
+      </w:r>
+      <w:r>
+        <w:rPr>
+          <w:rFonts w:ascii="Aptos" w:hAnsi="Aptos"/>
+          <w:sz w:val="20"/>
+          <w:szCs w:val="20"/>
+        </w:rPr>
+        <w:t xml:space="preserve"> In my case, I have saved all my files on my </w:t>
+      </w:r>
+      <w:proofErr w:type="spellStart"/>
+      <w:r>
+        <w:rPr>
+          <w:rFonts w:ascii="Aptos" w:hAnsi="Aptos"/>
+          <w:sz w:val="20"/>
+          <w:szCs w:val="20"/>
+        </w:rPr>
+        <w:t>Github</w:t>
+      </w:r>
+      <w:proofErr w:type="spellEnd"/>
+      <w:r>
+        <w:rPr>
+          <w:rFonts w:ascii="Aptos" w:hAnsi="Aptos"/>
+          <w:sz w:val="20"/>
+          <w:szCs w:val="20"/>
+        </w:rPr>
+        <w:t xml:space="preserve"> account.</w:t>
+      </w:r>
+    </w:p>
+    <w:p>
+      <w:pPr>
+        <w:ind w:left="1440"/>
+        <w:rPr>
+          <w:rFonts w:ascii="Aptos" w:hAnsi="Aptos"/>
+          <w:sz w:val="20"/>
+          <w:szCs w:val="20"/>
+        </w:rPr>
+      </w:pPr>
+      <w:r>
+        <w:rPr>
+          <w:rFonts w:ascii="Aptos" w:hAnsi="Aptos"/>
+          <w:sz w:val="20"/>
+          <w:szCs w:val="20"/>
+        </w:rPr>
+        <w:br/>
+        <w:t xml:space="preserve">URL: </w:t>
+      </w:r>
+      <w:hyperlink r:id="rId7" w:history="1">
+        <w:r>
+          <w:rPr>
+            <w:rStyle w:val="Hyperlink"/>
+            <w:rFonts w:ascii="Aptos" w:hAnsi="Aptos"/>
+            <w:sz w:val="20"/>
+            <w:szCs w:val="20"/>
+          </w:rPr>
+          <w:t>https://github.com/mayuresh-tungare/eda-assignment/tree/main</w:t>
+        </w:r>
+      </w:hyperlink>
       <w:r>
         <w:rPr>
           <w:rFonts w:ascii="Aptos" w:hAnsi="Aptos"/>
@@ -132,38 +392,6 @@
           <w:szCs w:val="20"/>
         </w:rPr>
         <w:t xml:space="preserve"> </w:t>
-      </w:r>
-      <w:r>
-        <w:rPr>
-          <w:rFonts w:ascii="Aptos" w:hAnsi="Aptos"/>
-          <w:sz w:val="20"/>
-          <w:szCs w:val="20"/>
-        </w:rPr>
-        <w:t>that helps us with data</w:t>
-      </w:r>
-      <w:r>
-        <w:rPr>
-          <w:rFonts w:ascii="Aptos" w:hAnsi="Aptos"/>
-          <w:sz w:val="20"/>
-          <w:szCs w:val="20"/>
-        </w:rPr>
-        <w:t xml:space="preserve"> manipulation and visualization. </w:t>
-      </w:r>
-      <w:r>
-        <w:rPr>
-          <w:rFonts w:ascii="Aptos" w:hAnsi="Aptos"/>
-          <w:sz w:val="20"/>
-          <w:szCs w:val="20"/>
-        </w:rPr>
-        <w:t xml:space="preserve">We load the data </w:t>
-      </w:r>
-      <w:r>
-        <w:rPr>
-          <w:rFonts w:ascii="Aptos" w:hAnsi="Aptos"/>
-          <w:sz w:val="20"/>
-          <w:szCs w:val="20"/>
-        </w:rPr>
-        <w:t xml:space="preserve">from the trip_records folder using glob to locate multiple Parquet files. </w:t>
       </w:r>
     </w:p>
     <w:p>
@@ -201,31 +429,121 @@
           <w:sz w:val="20"/>
           <w:szCs w:val="20"/>
         </w:rPr>
-        <w:t xml:space="preserve">When dealing with millions of records, "more data" is not always "better data" if it exceeds your ability to process it efficiently. Processing the entirety of NYC’s 2023 taxi records simultaneously is computationally prohibitive for </w:t>
-      </w:r>
-      <w:r>
-        <w:rPr>
-          <w:rFonts w:ascii="Aptos" w:hAnsi="Aptos"/>
-          <w:sz w:val="20"/>
-          <w:szCs w:val="20"/>
-        </w:rPr>
-        <w:t>those</w:t>
-      </w:r>
-      <w:r>
-        <w:rPr>
-          <w:rFonts w:ascii="Aptos" w:hAnsi="Aptos"/>
-          <w:sz w:val="20"/>
-          <w:szCs w:val="20"/>
-        </w:rPr>
-        <w:t xml:space="preserve"> computers that I have. </w:t>
-      </w:r>
-      <w:r>
-        <w:rPr>
-          <w:rFonts w:ascii="Aptos" w:hAnsi="Aptos"/>
-          <w:sz w:val="20"/>
-          <w:szCs w:val="20"/>
-        </w:rPr>
-        <w:t xml:space="preserve">To make the dataset feasible while maintaining the integrity of the city’s movement, </w:t>
+        <w:t xml:space="preserve">When dealing with millions of records, "more data" is not always "better data" if it </w:t>
+      </w:r>
+      <w:r>
+        <w:rPr>
+          <w:rFonts w:ascii="Aptos" w:hAnsi="Aptos"/>
+          <w:sz w:val="20"/>
+          <w:szCs w:val="20"/>
+        </w:rPr>
+        <w:t xml:space="preserve">impedes efficiency of </w:t>
+      </w:r>
+      <w:r>
+        <w:rPr>
+          <w:rFonts w:ascii="Aptos" w:hAnsi="Aptos"/>
+          <w:sz w:val="20"/>
+          <w:szCs w:val="20"/>
+        </w:rPr>
+        <w:t>process</w:t>
+      </w:r>
+      <w:r>
+        <w:rPr>
+          <w:rFonts w:ascii="Aptos" w:hAnsi="Aptos"/>
+          <w:sz w:val="20"/>
+          <w:szCs w:val="20"/>
+        </w:rPr>
+        <w:t>ing</w:t>
+      </w:r>
+      <w:r>
+        <w:rPr>
+          <w:rFonts w:ascii="Aptos" w:hAnsi="Aptos"/>
+          <w:sz w:val="20"/>
+          <w:szCs w:val="20"/>
+        </w:rPr>
+        <w:t xml:space="preserve">. </w:t>
+      </w:r>
+      <w:r>
+        <w:rPr>
+          <w:rFonts w:ascii="Aptos" w:hAnsi="Aptos"/>
+          <w:sz w:val="20"/>
+          <w:szCs w:val="20"/>
+        </w:rPr>
+        <w:t xml:space="preserve">We cannot </w:t>
+      </w:r>
+      <w:proofErr w:type="gramStart"/>
+      <w:r>
+        <w:rPr>
+          <w:rFonts w:ascii="Aptos" w:hAnsi="Aptos"/>
+          <w:sz w:val="20"/>
+          <w:szCs w:val="20"/>
+        </w:rPr>
+        <w:t>p</w:t>
+      </w:r>
+      <w:r>
+        <w:rPr>
+          <w:rFonts w:ascii="Aptos" w:hAnsi="Aptos"/>
+          <w:sz w:val="20"/>
+          <w:szCs w:val="20"/>
+        </w:rPr>
+        <w:t>rocessing</w:t>
+      </w:r>
+      <w:proofErr w:type="gramEnd"/>
+      <w:r>
+        <w:rPr>
+          <w:rFonts w:ascii="Aptos" w:hAnsi="Aptos"/>
+          <w:sz w:val="20"/>
+          <w:szCs w:val="20"/>
+        </w:rPr>
+        <w:t xml:space="preserve"> the entirety of NYC’s 2023 taxi records simultaneously </w:t>
+      </w:r>
+      <w:r>
+        <w:rPr>
+          <w:rFonts w:ascii="Aptos" w:hAnsi="Aptos"/>
+          <w:sz w:val="20"/>
+          <w:szCs w:val="20"/>
+        </w:rPr>
+        <w:t>as that is</w:t>
+      </w:r>
+      <w:r>
+        <w:rPr>
+          <w:rFonts w:ascii="Aptos" w:hAnsi="Aptos"/>
+          <w:sz w:val="20"/>
+          <w:szCs w:val="20"/>
+        </w:rPr>
+        <w:t xml:space="preserve"> computationally prohibitive</w:t>
+      </w:r>
+      <w:r>
+        <w:rPr>
+          <w:rFonts w:ascii="Aptos" w:hAnsi="Aptos"/>
+          <w:sz w:val="20"/>
+          <w:szCs w:val="20"/>
+        </w:rPr>
+        <w:t>, especially given the</w:t>
+      </w:r>
+      <w:r>
+        <w:rPr>
+          <w:rFonts w:ascii="Aptos" w:hAnsi="Aptos"/>
+          <w:sz w:val="20"/>
+          <w:szCs w:val="20"/>
+        </w:rPr>
+        <w:t xml:space="preserve"> computers that I have.</w:t>
+      </w:r>
+      <w:r>
+        <w:rPr>
+          <w:rFonts w:ascii="Aptos" w:hAnsi="Aptos"/>
+          <w:sz w:val="20"/>
+          <w:szCs w:val="20"/>
+        </w:rPr>
+        <w:t xml:space="preserve"> Therefore,</w:t>
+      </w:r>
+      <w:r>
+        <w:rPr>
+          <w:rFonts w:ascii="Aptos" w:hAnsi="Aptos"/>
+          <w:sz w:val="20"/>
+          <w:szCs w:val="20"/>
+        </w:rPr>
+        <w:t xml:space="preserve"> </w:t>
       </w:r>
       <w:r>
         <w:rPr>
@@ -249,6 +567,22 @@
           <w:sz w:val="20"/>
           <w:szCs w:val="20"/>
         </w:rPr>
+        <w:t xml:space="preserve"> t</w:t>
+      </w:r>
+      <w:r>
+        <w:rPr>
+          <w:rFonts w:ascii="Aptos" w:hAnsi="Aptos"/>
+          <w:sz w:val="20"/>
+          <w:szCs w:val="20"/>
+        </w:rPr>
+        <w:t>o make the dataset feasible while maintaining the integrity of the city’s movement</w:t>
+      </w:r>
+      <w:r>
+        <w:rPr>
+          <w:rFonts w:ascii="Aptos" w:hAnsi="Aptos"/>
+          <w:sz w:val="20"/>
+          <w:szCs w:val="20"/>
+        </w:rPr>
         <w:t xml:space="preserve">. </w:t>
       </w:r>
       <w:r>
@@ -265,15 +599,39 @@
           <w:sz w:val="20"/>
           <w:szCs w:val="20"/>
         </w:rPr>
-        <w:t>. T</w:t>
-      </w:r>
-      <w:r>
-        <w:rPr>
-          <w:rFonts w:ascii="Aptos" w:hAnsi="Aptos"/>
-          <w:sz w:val="20"/>
-          <w:szCs w:val="20"/>
-        </w:rPr>
-        <w:t>he sample was taken across every hour of every day for the entire year. This granular approach ensure</w:t>
+        <w:t xml:space="preserve">. </w:t>
+      </w:r>
+      <w:r>
+        <w:rPr>
+          <w:rFonts w:ascii="Aptos" w:hAnsi="Aptos"/>
+          <w:sz w:val="20"/>
+          <w:szCs w:val="20"/>
+        </w:rPr>
+        <w:t>We ensured that t</w:t>
+      </w:r>
+      <w:r>
+        <w:rPr>
+          <w:rFonts w:ascii="Aptos" w:hAnsi="Aptos"/>
+          <w:sz w:val="20"/>
+          <w:szCs w:val="20"/>
+        </w:rPr>
+        <w:t>he sample was taken across every hour of every day for the entire year.</w:t>
+      </w:r>
+      <w:r>
+        <w:rPr>
+          <w:rFonts w:ascii="Aptos" w:hAnsi="Aptos"/>
+          <w:sz w:val="20"/>
+          <w:szCs w:val="20"/>
+        </w:rPr>
+        <w:t xml:space="preserve"> </w:t>
+      </w:r>
+      <w:r>
+        <w:rPr>
+          <w:rFonts w:ascii="Aptos" w:hAnsi="Aptos"/>
+          <w:sz w:val="20"/>
+          <w:szCs w:val="20"/>
+        </w:rPr>
+        <w:t>This granular approach ensure</w:t>
       </w:r>
       <w:r>
         <w:rPr>
@@ -342,15 +700,93 @@
           <w:sz w:val="20"/>
           <w:szCs w:val="20"/>
         </w:rPr>
-        <w:t xml:space="preserve">Step1: </w:t>
-      </w:r>
-      <w:r>
-        <w:rPr>
-          <w:rFonts w:ascii="Aptos" w:hAnsi="Aptos"/>
-          <w:sz w:val="20"/>
-          <w:szCs w:val="20"/>
-        </w:rPr>
-        <w:t xml:space="preserve">These individual files are read into a list and merged into a single DataFrame using pd.concat(). </w:t>
+        <w:t>Step</w:t>
+      </w:r>
+      <w:r>
+        <w:rPr>
+          <w:rFonts w:ascii="Aptos" w:hAnsi="Aptos"/>
+          <w:sz w:val="20"/>
+          <w:szCs w:val="20"/>
+        </w:rPr>
+        <w:t>-</w:t>
+      </w:r>
+      <w:r>
+        <w:rPr>
+          <w:rFonts w:ascii="Aptos" w:hAnsi="Aptos"/>
+          <w:sz w:val="20"/>
+          <w:szCs w:val="20"/>
+        </w:rPr>
+        <w:t xml:space="preserve">1: </w:t>
+      </w:r>
+      <w:r>
+        <w:rPr>
+          <w:rFonts w:ascii="Aptos" w:hAnsi="Aptos"/>
+          <w:sz w:val="20"/>
+          <w:szCs w:val="20"/>
+        </w:rPr>
+        <w:t xml:space="preserve">We read </w:t>
+      </w:r>
+      <w:r>
+        <w:rPr>
+          <w:rFonts w:ascii="Aptos" w:hAnsi="Aptos"/>
+          <w:sz w:val="20"/>
+          <w:szCs w:val="20"/>
+        </w:rPr>
+        <w:t>individual files into a list and merge</w:t>
+      </w:r>
+      <w:r>
+        <w:rPr>
+          <w:rFonts w:ascii="Aptos" w:hAnsi="Aptos"/>
+          <w:sz w:val="20"/>
+          <w:szCs w:val="20"/>
+        </w:rPr>
+        <w:t xml:space="preserve"> them</w:t>
+      </w:r>
+      <w:r>
+        <w:rPr>
+          <w:rFonts w:ascii="Aptos" w:hAnsi="Aptos"/>
+          <w:sz w:val="20"/>
+          <w:szCs w:val="20"/>
+        </w:rPr>
+        <w:t xml:space="preserve"> into a single </w:t>
+      </w:r>
+      <w:proofErr w:type="spellStart"/>
+      <w:r>
+        <w:rPr>
+          <w:rFonts w:ascii="Aptos" w:hAnsi="Aptos"/>
+          <w:sz w:val="20"/>
+          <w:szCs w:val="20"/>
+        </w:rPr>
+        <w:t>DataFrame</w:t>
+      </w:r>
+      <w:proofErr w:type="spellEnd"/>
+      <w:r>
+        <w:rPr>
+          <w:rFonts w:ascii="Aptos" w:hAnsi="Aptos"/>
+          <w:sz w:val="20"/>
+          <w:szCs w:val="20"/>
+        </w:rPr>
+        <w:t xml:space="preserve"> using </w:t>
+      </w:r>
+      <w:proofErr w:type="spellStart"/>
+      <w:proofErr w:type="gramStart"/>
+      <w:r>
+        <w:rPr>
+          <w:rFonts w:ascii="Aptos" w:hAnsi="Aptos"/>
+          <w:sz w:val="20"/>
+          <w:szCs w:val="20"/>
+        </w:rPr>
+        <w:t>pd.concat</w:t>
+      </w:r>
+      <w:proofErr w:type="spellEnd"/>
+      <w:proofErr w:type="gramEnd"/>
+      <w:r>
+        <w:rPr>
+          <w:rFonts w:ascii="Aptos" w:hAnsi="Aptos"/>
+          <w:sz w:val="20"/>
+          <w:szCs w:val="20"/>
+        </w:rPr>
+        <w:t xml:space="preserve">(). </w:t>
       </w:r>
     </w:p>
     <w:p>
@@ -371,7 +807,61 @@
           <w:sz w:val="20"/>
           <w:szCs w:val="20"/>
         </w:rPr>
-        <w:t>Subsequently, we generate a representative subset – sample-data.parquet –using the sample() function, to ensure computational efficiency during exploration</w:t>
+        <w:t xml:space="preserve">Step-2: </w:t>
+      </w:r>
+      <w:r>
+        <w:rPr>
+          <w:rFonts w:ascii="Aptos" w:hAnsi="Aptos"/>
+          <w:sz w:val="20"/>
+          <w:szCs w:val="20"/>
+        </w:rPr>
+        <w:t>Subsequently, we generate a representative subset – sample-</w:t>
+      </w:r>
+      <w:proofErr w:type="spellStart"/>
+      <w:proofErr w:type="gramStart"/>
+      <w:r>
+        <w:rPr>
+          <w:rFonts w:ascii="Aptos" w:hAnsi="Aptos"/>
+          <w:sz w:val="20"/>
+          <w:szCs w:val="20"/>
+        </w:rPr>
+        <w:t>data.parquet</w:t>
+      </w:r>
+      <w:proofErr w:type="spellEnd"/>
+      <w:proofErr w:type="gramEnd"/>
+      <w:r>
+        <w:rPr>
+          <w:rFonts w:ascii="Aptos" w:hAnsi="Aptos"/>
+          <w:sz w:val="20"/>
+          <w:szCs w:val="20"/>
+        </w:rPr>
+        <w:t xml:space="preserve"> –using the </w:t>
+      </w:r>
+      <w:proofErr w:type="gramStart"/>
+      <w:r>
+        <w:rPr>
+          <w:rFonts w:ascii="Aptos" w:hAnsi="Aptos"/>
+          <w:sz w:val="20"/>
+          <w:szCs w:val="20"/>
+        </w:rPr>
+        <w:t>sample(</w:t>
+      </w:r>
+      <w:proofErr w:type="gramEnd"/>
+      <w:r>
+        <w:rPr>
+          <w:rFonts w:ascii="Aptos" w:hAnsi="Aptos"/>
+          <w:sz w:val="20"/>
+          <w:szCs w:val="20"/>
+        </w:rPr>
+        <w:t>) function, to ensure computational efficiency during exploration</w:t>
+      </w:r>
+      <w:r>
+        <w:rPr>
+          <w:rFonts w:ascii="Aptos" w:hAnsi="Aptos"/>
+          <w:sz w:val="20"/>
+          <w:szCs w:val="20"/>
+        </w:rPr>
+        <w:t>.</w:t>
       </w:r>
       <w:r>
         <w:rPr>
@@ -472,7 +962,25 @@
           <w:sz w:val="20"/>
           <w:szCs w:val="20"/>
         </w:rPr>
-        <w:t xml:space="preserve">a recording error rather than a legitimate transaction. Similarly, finding "RatecodeID 99" (an undefined code) or negative fare amounts suggests system glitches that must be </w:t>
+        <w:t>a recording error rather than a legitimate transaction. Similarly, finding "</w:t>
+      </w:r>
+      <w:proofErr w:type="spellStart"/>
+      <w:r>
+        <w:rPr>
+          <w:rFonts w:ascii="Aptos" w:hAnsi="Aptos"/>
+          <w:sz w:val="20"/>
+          <w:szCs w:val="20"/>
+        </w:rPr>
+        <w:t>RatecodeID</w:t>
+      </w:r>
+      <w:proofErr w:type="spellEnd"/>
+      <w:r>
+        <w:rPr>
+          <w:rFonts w:ascii="Aptos" w:hAnsi="Aptos"/>
+          <w:sz w:val="20"/>
+          <w:szCs w:val="20"/>
+        </w:rPr>
+        <w:t xml:space="preserve"> 99" (an undefined code) or negative fare amounts suggests system glitches that must be </w:t>
       </w:r>
       <w:r>
         <w:rPr>
@@ -565,17 +1073,37 @@
           <w:sz w:val="20"/>
           <w:szCs w:val="20"/>
         </w:rPr>
-        <w:t xml:space="preserve">After merging the individual trip records, we identified that the combined DataFrame contained a fragmented and non-unique index. We fixed this by applying </w:t>
-      </w:r>
-      <w:r>
-        <w:rPr>
-          <w:rFonts w:ascii="Aptos" w:hAnsi="Aptos"/>
-          <w:sz w:val="20"/>
-          <w:szCs w:val="20"/>
-        </w:rPr>
         <w:lastRenderedPageBreak/>
-        <w:t>the reset_index</w:t>
-      </w:r>
+        <w:t xml:space="preserve">After merging the individual trip records, we identified that the combined </w:t>
+      </w:r>
+      <w:proofErr w:type="spellStart"/>
+      <w:r>
+        <w:rPr>
+          <w:rFonts w:ascii="Aptos" w:hAnsi="Aptos"/>
+          <w:sz w:val="20"/>
+          <w:szCs w:val="20"/>
+        </w:rPr>
+        <w:t>DataFrame</w:t>
+      </w:r>
+      <w:proofErr w:type="spellEnd"/>
+      <w:r>
+        <w:rPr>
+          <w:rFonts w:ascii="Aptos" w:hAnsi="Aptos"/>
+          <w:sz w:val="20"/>
+          <w:szCs w:val="20"/>
+        </w:rPr>
+        <w:t xml:space="preserve"> contained a fragmented and non-unique index. We fixed this by applying the </w:t>
+      </w:r>
+      <w:proofErr w:type="spellStart"/>
+      <w:r>
+        <w:rPr>
+          <w:rFonts w:ascii="Aptos" w:hAnsi="Aptos"/>
+          <w:sz w:val="20"/>
+          <w:szCs w:val="20"/>
+        </w:rPr>
+        <w:t>reset_index</w:t>
+      </w:r>
+      <w:proofErr w:type="spellEnd"/>
       <w:r>
         <w:rPr>
           <w:rFonts w:ascii="Aptos" w:hAnsi="Aptos"/>
@@ -617,7 +1145,23 @@
           <w:rFonts w:ascii="Aptos" w:hAnsi="Aptos"/>
           <w:b/>
         </w:rPr>
-        <w:t>Combine the two airport_fee columns</w:t>
+        <w:t xml:space="preserve">Combine the two </w:t>
+      </w:r>
+      <w:proofErr w:type="spellStart"/>
+      <w:r>
+        <w:rPr>
+          <w:rFonts w:ascii="Aptos" w:hAnsi="Aptos"/>
+          <w:b/>
+        </w:rPr>
+        <w:t>airport_fee</w:t>
+      </w:r>
+      <w:proofErr w:type="spellEnd"/>
+      <w:r>
+        <w:rPr>
+          <w:rFonts w:ascii="Aptos" w:hAnsi="Aptos"/>
+          <w:b/>
+        </w:rPr>
+        <w:t xml:space="preserve"> columns</w:t>
       </w:r>
       <w:r>
         <w:rPr>
@@ -633,8 +1177,9 @@
           <w:sz w:val="20"/>
           <w:szCs w:val="20"/>
         </w:rPr>
-        <w:t xml:space="preserve">We consolidated the two airport_fee columns using the </w:t>
-      </w:r>
+        <w:t xml:space="preserve">We consolidated the two </w:t>
+      </w:r>
+      <w:proofErr w:type="spellStart"/>
       <w:r>
         <w:rPr>
           <w:rFonts w:ascii="Aptos" w:hAnsi="Aptos"/>
@@ -642,8 +1187,29 @@
           <w:sz w:val="20"/>
           <w:szCs w:val="20"/>
         </w:rPr>
+        <w:t>airport_fee</w:t>
+      </w:r>
+      <w:proofErr w:type="spellEnd"/>
+      <w:r>
+        <w:rPr>
+          <w:rFonts w:ascii="Aptos" w:hAnsi="Aptos"/>
+          <w:iCs/>
+          <w:sz w:val="20"/>
+          <w:szCs w:val="20"/>
+        </w:rPr>
+        <w:t xml:space="preserve"> columns using the </w:t>
+      </w:r>
+      <w:r>
+        <w:rPr>
+          <w:rFonts w:ascii="Aptos" w:hAnsi="Aptos"/>
+          <w:iCs/>
+          <w:sz w:val="20"/>
+          <w:szCs w:val="20"/>
+        </w:rPr>
         <w:t>‘</w:t>
       </w:r>
+      <w:proofErr w:type="spellStart"/>
+      <w:proofErr w:type="gramStart"/>
       <w:r>
         <w:rPr>
           <w:rFonts w:ascii="Aptos" w:hAnsi="Aptos"/>
@@ -651,7 +1217,27 @@
           <w:sz w:val="20"/>
           <w:szCs w:val="20"/>
         </w:rPr>
-        <w:t>fillna()</w:t>
+        <w:t>fillna</w:t>
+      </w:r>
+      <w:proofErr w:type="spellEnd"/>
+      <w:r>
+        <w:rPr>
+          <w:rFonts w:ascii="Aptos" w:hAnsi="Aptos"/>
+          <w:iCs/>
+          <w:sz w:val="20"/>
+          <w:szCs w:val="20"/>
+        </w:rPr>
+        <w:t>(</w:t>
+      </w:r>
+      <w:proofErr w:type="gramEnd"/>
+      <w:r>
+        <w:rPr>
+          <w:rFonts w:ascii="Aptos" w:hAnsi="Aptos"/>
+          <w:iCs/>
+          <w:sz w:val="20"/>
+          <w:szCs w:val="20"/>
+        </w:rPr>
+        <w:t>)</w:t>
       </w:r>
       <w:r>
         <w:rPr>
@@ -754,7 +1340,43 @@
           <w:sz w:val="20"/>
           <w:szCs w:val="20"/>
         </w:rPr>
-        <w:t xml:space="preserve">We determined the proportion of missing values by applying the isna().sum() method to our dataset and dividing the results by the total row count. Our analysis revealed that while most columns were complete, </w:t>
+        <w:t xml:space="preserve">We determined the proportion of missing values by applying the </w:t>
+      </w:r>
+      <w:proofErr w:type="spellStart"/>
+      <w:r>
+        <w:rPr>
+          <w:rFonts w:ascii="Aptos" w:hAnsi="Aptos"/>
+          <w:sz w:val="20"/>
+          <w:szCs w:val="20"/>
+        </w:rPr>
+        <w:t>isna</w:t>
+      </w:r>
+      <w:proofErr w:type="spellEnd"/>
+      <w:r>
+        <w:rPr>
+          <w:rFonts w:ascii="Aptos" w:hAnsi="Aptos"/>
+          <w:sz w:val="20"/>
+          <w:szCs w:val="20"/>
+        </w:rPr>
+        <w:t>(</w:t>
+      </w:r>
+      <w:proofErr w:type="gramStart"/>
+      <w:r>
+        <w:rPr>
+          <w:rFonts w:ascii="Aptos" w:hAnsi="Aptos"/>
+          <w:sz w:val="20"/>
+          <w:szCs w:val="20"/>
+        </w:rPr>
+        <w:t>).sum</w:t>
+      </w:r>
+      <w:proofErr w:type="gramEnd"/>
+      <w:r>
+        <w:rPr>
+          <w:rFonts w:ascii="Aptos" w:hAnsi="Aptos"/>
+          <w:sz w:val="20"/>
+          <w:szCs w:val="20"/>
+        </w:rPr>
+        <w:t xml:space="preserve">() method to our dataset and dividing the results by the total row count. Our analysis revealed that while most columns were complete, </w:t>
       </w:r>
       <w:r>
         <w:rPr>
@@ -764,6 +1386,7 @@
         </w:rPr>
         <w:t>columns ‘</w:t>
       </w:r>
+      <w:proofErr w:type="spellStart"/>
       <w:r>
         <w:rPr>
           <w:rFonts w:ascii="Aptos" w:hAnsi="Aptos"/>
@@ -772,6 +1395,7 @@
         </w:rPr>
         <w:t>passenger_count</w:t>
       </w:r>
+      <w:proofErr w:type="spellEnd"/>
       <w:r>
         <w:rPr>
           <w:rFonts w:ascii="Aptos" w:hAnsi="Aptos"/>
@@ -796,6 +1420,7 @@
         </w:rPr>
         <w:t>‘</w:t>
       </w:r>
+      <w:proofErr w:type="spellStart"/>
       <w:r>
         <w:rPr>
           <w:rFonts w:ascii="Aptos" w:hAnsi="Aptos"/>
@@ -804,6 +1429,7 @@
         </w:rPr>
         <w:t>RatecodeID</w:t>
       </w:r>
+      <w:proofErr w:type="spellEnd"/>
       <w:r>
         <w:rPr>
           <w:rFonts w:ascii="Aptos" w:hAnsi="Aptos"/>
@@ -839,8 +1465,17 @@
           <w:rFonts w:ascii="Aptos" w:hAnsi="Aptos"/>
           <w:b/>
         </w:rPr>
-        <w:t>Handling missing values in passenger_count</w:t>
-      </w:r>
+        <w:t xml:space="preserve">Handling missing values in </w:t>
+      </w:r>
+      <w:proofErr w:type="spellStart"/>
+      <w:r>
+        <w:rPr>
+          <w:rFonts w:ascii="Aptos" w:hAnsi="Aptos"/>
+          <w:b/>
+        </w:rPr>
+        <w:t>passenger_count</w:t>
+      </w:r>
+      <w:proofErr w:type="spellEnd"/>
       <w:r>
         <w:rPr>
           <w:rFonts w:ascii="Aptos" w:hAnsi="Aptos"/>
@@ -854,7 +1489,25 @@
           <w:sz w:val="20"/>
           <w:szCs w:val="20"/>
         </w:rPr>
-        <w:t xml:space="preserve">We addressed the missing values in the passenger_count column by imputing them with the </w:t>
+        <w:t xml:space="preserve">We addressed the missing values in the </w:t>
+      </w:r>
+      <w:proofErr w:type="spellStart"/>
+      <w:r>
+        <w:rPr>
+          <w:rFonts w:ascii="Aptos" w:hAnsi="Aptos"/>
+          <w:sz w:val="20"/>
+          <w:szCs w:val="20"/>
+        </w:rPr>
+        <w:t>passenger_count</w:t>
+      </w:r>
+      <w:proofErr w:type="spellEnd"/>
+      <w:r>
+        <w:rPr>
+          <w:rFonts w:ascii="Aptos" w:hAnsi="Aptos"/>
+          <w:sz w:val="20"/>
+          <w:szCs w:val="20"/>
+        </w:rPr>
+        <w:t xml:space="preserve"> column by imputing them with the </w:t>
       </w:r>
       <w:r>
         <w:rPr>
@@ -872,7 +1525,35 @@
           <w:sz w:val="20"/>
           <w:szCs w:val="20"/>
         </w:rPr>
-        <w:t xml:space="preserve"> of the distribution. Since the most frequent number of passengers per trip was one, we filled all null entries with this value using the fillna() method. This approach allowed us to preserve the dataset's size while maintaining the statistical integrity of the feature. By choosing the mode, we ensured that our imputation reflected the most common real-world scenario observed in the NYC taxi records.</w:t>
+        <w:t xml:space="preserve"> of the distribution. Since the most frequent number of passengers per trip was one, we filled all null entries with this value using the </w:t>
+      </w:r>
+      <w:proofErr w:type="spellStart"/>
+      <w:proofErr w:type="gramStart"/>
+      <w:r>
+        <w:rPr>
+          <w:rFonts w:ascii="Aptos" w:hAnsi="Aptos"/>
+          <w:sz w:val="20"/>
+          <w:szCs w:val="20"/>
+        </w:rPr>
+        <w:t>fillna</w:t>
+      </w:r>
+      <w:proofErr w:type="spellEnd"/>
+      <w:r>
+        <w:rPr>
+          <w:rFonts w:ascii="Aptos" w:hAnsi="Aptos"/>
+          <w:sz w:val="20"/>
+          <w:szCs w:val="20"/>
+        </w:rPr>
+        <w:t>(</w:t>
+      </w:r>
+      <w:proofErr w:type="gramEnd"/>
+      <w:r>
+        <w:rPr>
+          <w:rFonts w:ascii="Aptos" w:hAnsi="Aptos"/>
+          <w:sz w:val="20"/>
+          <w:szCs w:val="20"/>
+        </w:rPr>
+        <w:t>) method. This approach allowed us to preserve the dataset's size while maintaining the statistical integrity of the feature. By choosing the mode, we ensured that our imputation reflected the most common real-world scenario observed in the NYC taxi records.</w:t>
       </w:r>
       <w:r>
         <w:rPr>
@@ -897,8 +1578,17 @@
           <w:rFonts w:ascii="Aptos" w:hAnsi="Aptos"/>
           <w:b/>
         </w:rPr>
-        <w:t>Handle missing values in RatecodeID</w:t>
-      </w:r>
+        <w:t xml:space="preserve">Handle missing values in </w:t>
+      </w:r>
+      <w:proofErr w:type="spellStart"/>
+      <w:r>
+        <w:rPr>
+          <w:rFonts w:ascii="Aptos" w:hAnsi="Aptos"/>
+          <w:b/>
+        </w:rPr>
+        <w:t>RatecodeID</w:t>
+      </w:r>
+      <w:proofErr w:type="spellEnd"/>
       <w:r>
         <w:rPr>
           <w:rFonts w:ascii="Aptos" w:hAnsi="Aptos"/>
@@ -912,7 +1602,25 @@
           <w:sz w:val="20"/>
           <w:szCs w:val="20"/>
         </w:rPr>
-        <w:t xml:space="preserve">We managed the missing data in the RatecodeID column by imputing the </w:t>
+        <w:t xml:space="preserve">We managed the missing data in the </w:t>
+      </w:r>
+      <w:proofErr w:type="spellStart"/>
+      <w:r>
+        <w:rPr>
+          <w:rFonts w:ascii="Aptos" w:hAnsi="Aptos"/>
+          <w:sz w:val="20"/>
+          <w:szCs w:val="20"/>
+        </w:rPr>
+        <w:t>RatecodeID</w:t>
+      </w:r>
+      <w:proofErr w:type="spellEnd"/>
+      <w:r>
+        <w:rPr>
+          <w:rFonts w:ascii="Aptos" w:hAnsi="Aptos"/>
+          <w:sz w:val="20"/>
+          <w:szCs w:val="20"/>
+        </w:rPr>
+        <w:t xml:space="preserve"> column by imputing the </w:t>
       </w:r>
       <w:r>
         <w:rPr>
@@ -930,7 +1638,35 @@
           <w:sz w:val="20"/>
           <w:szCs w:val="20"/>
         </w:rPr>
-        <w:t xml:space="preserve"> of the existing values. Since the "Standard rate" (represented by the value 1.0) was the overwhelmingly common entry, we applied this value to all null records using the fillna() function. This decision allowed us to retain the full dataset for analysis while ensuring that the imputed values reflected the most probable real-world scenario. By completing this feature, we provided a consistent basis for calculating fare </w:t>
+        <w:t xml:space="preserve"> of the existing values. Since the "Standard rate" (represented by the value 1.0) was the overwhelmingly common entry, we applied this value to all null records using the </w:t>
+      </w:r>
+      <w:proofErr w:type="spellStart"/>
+      <w:proofErr w:type="gramStart"/>
+      <w:r>
+        <w:rPr>
+          <w:rFonts w:ascii="Aptos" w:hAnsi="Aptos"/>
+          <w:sz w:val="20"/>
+          <w:szCs w:val="20"/>
+        </w:rPr>
+        <w:t>fillna</w:t>
+      </w:r>
+      <w:proofErr w:type="spellEnd"/>
+      <w:r>
+        <w:rPr>
+          <w:rFonts w:ascii="Aptos" w:hAnsi="Aptos"/>
+          <w:sz w:val="20"/>
+          <w:szCs w:val="20"/>
+        </w:rPr>
+        <w:t>(</w:t>
+      </w:r>
+      <w:proofErr w:type="gramEnd"/>
+      <w:r>
+        <w:rPr>
+          <w:rFonts w:ascii="Aptos" w:hAnsi="Aptos"/>
+          <w:sz w:val="20"/>
+          <w:szCs w:val="20"/>
+        </w:rPr>
+        <w:t xml:space="preserve">) function. This decision allowed us to retain the full dataset for analysis while </w:t>
       </w:r>
       <w:r>
         <w:rPr>
@@ -939,7 +1675,7 @@
           <w:szCs w:val="20"/>
         </w:rPr>
         <w:lastRenderedPageBreak/>
-        <w:t>structures and identifying trip anomalies.</w:t>
+        <w:t>ensuring that the imputed values reflected the most probable real-world scenario. By completing this feature, we provided a consistent basis for calculating fare structures and identifying trip anomalies.</w:t>
       </w:r>
       <w:r>
         <w:rPr>
@@ -968,8 +1704,33 @@
           <w:rFonts w:ascii="Aptos" w:hAnsi="Aptos"/>
           <w:b/>
         </w:rPr>
-        <w:t>Impute NaN in congestion_surcharge</w:t>
-      </w:r>
+        <w:t xml:space="preserve">Impute </w:t>
+      </w:r>
+      <w:proofErr w:type="spellStart"/>
+      <w:r>
+        <w:rPr>
+          <w:rFonts w:ascii="Aptos" w:hAnsi="Aptos"/>
+          <w:b/>
+        </w:rPr>
+        <w:t>NaN</w:t>
+      </w:r>
+      <w:proofErr w:type="spellEnd"/>
+      <w:r>
+        <w:rPr>
+          <w:rFonts w:ascii="Aptos" w:hAnsi="Aptos"/>
+          <w:b/>
+        </w:rPr>
+        <w:t xml:space="preserve"> in </w:t>
+      </w:r>
+      <w:proofErr w:type="spellStart"/>
+      <w:r>
+        <w:rPr>
+          <w:rFonts w:ascii="Aptos" w:hAnsi="Aptos"/>
+          <w:b/>
+        </w:rPr>
+        <w:t>congestion_surcharge</w:t>
+      </w:r>
+      <w:proofErr w:type="spellEnd"/>
       <w:r>
         <w:rPr>
           <w:rFonts w:ascii="Aptos" w:hAnsi="Aptos"/>
@@ -983,7 +1744,89 @@
           <w:sz w:val="20"/>
           <w:szCs w:val="20"/>
         </w:rPr>
-        <w:t>We imputed the missing values in the congestion_surcharge column by replacing all NaN entries with 0.0. We used the fillna(0.0) method to ensure that any trip record missing this specific data point was treated as having no additional congestion fee. This decision maintained the numerical integrity of our total fare calculations and prevented the exclusion of valid trip records. By assigning a zero value, we conservatively estimated the surcharge for trips where the fee was either not applicable or not recorded.</w:t>
+        <w:t xml:space="preserve">We imputed the missing values in the </w:t>
+      </w:r>
+      <w:proofErr w:type="spellStart"/>
+      <w:r>
+        <w:rPr>
+          <w:rFonts w:ascii="Aptos" w:hAnsi="Aptos"/>
+          <w:sz w:val="20"/>
+          <w:szCs w:val="20"/>
+        </w:rPr>
+        <w:t>congestion_surcharge</w:t>
+      </w:r>
+      <w:proofErr w:type="spellEnd"/>
+      <w:r>
+        <w:rPr>
+          <w:rFonts w:ascii="Aptos" w:hAnsi="Aptos"/>
+          <w:sz w:val="20"/>
+          <w:szCs w:val="20"/>
+        </w:rPr>
+        <w:t xml:space="preserve"> column by replacing all </w:t>
+      </w:r>
+      <w:proofErr w:type="spellStart"/>
+      <w:r>
+        <w:rPr>
+          <w:rFonts w:ascii="Aptos" w:hAnsi="Aptos"/>
+          <w:sz w:val="20"/>
+          <w:szCs w:val="20"/>
+        </w:rPr>
+        <w:t>NaN</w:t>
+      </w:r>
+      <w:proofErr w:type="spellEnd"/>
+      <w:r>
+        <w:rPr>
+          <w:rFonts w:ascii="Aptos" w:hAnsi="Aptos"/>
+          <w:sz w:val="20"/>
+          <w:szCs w:val="20"/>
+        </w:rPr>
+        <w:t xml:space="preserve"> entries with 0.0. We used the </w:t>
+      </w:r>
+      <w:proofErr w:type="spellStart"/>
+      <w:proofErr w:type="gramStart"/>
+      <w:r>
+        <w:rPr>
+          <w:rFonts w:ascii="Aptos" w:hAnsi="Aptos"/>
+          <w:sz w:val="20"/>
+          <w:szCs w:val="20"/>
+        </w:rPr>
+        <w:t>fillna</w:t>
+      </w:r>
+      <w:proofErr w:type="spellEnd"/>
+      <w:r>
+        <w:rPr>
+          <w:rFonts w:ascii="Aptos" w:hAnsi="Aptos"/>
+          <w:sz w:val="20"/>
+          <w:szCs w:val="20"/>
+        </w:rPr>
+        <w:t>(</w:t>
+      </w:r>
+      <w:proofErr w:type="gramEnd"/>
+      <w:r>
+        <w:rPr>
+          <w:rFonts w:ascii="Aptos" w:hAnsi="Aptos"/>
+          <w:sz w:val="20"/>
+          <w:szCs w:val="20"/>
+        </w:rPr>
+        <w:t xml:space="preserve">0.0) method to ensure that any trip record missing this specific data point was treated as having no additional congestion fee. This decision maintained the numerical integrity of our total fare calculations and prevented the exclusion of valid trip records. By assigning </w:t>
+      </w:r>
+      <w:proofErr w:type="gramStart"/>
+      <w:r>
+        <w:rPr>
+          <w:rFonts w:ascii="Aptos" w:hAnsi="Aptos"/>
+          <w:sz w:val="20"/>
+          <w:szCs w:val="20"/>
+        </w:rPr>
+        <w:t>a zero</w:t>
+      </w:r>
+      <w:proofErr w:type="gramEnd"/>
+      <w:r>
+        <w:rPr>
+          <w:rFonts w:ascii="Aptos" w:hAnsi="Aptos"/>
+          <w:sz w:val="20"/>
+          <w:szCs w:val="20"/>
+        </w:rPr>
+        <w:t xml:space="preserve"> value, we conservatively estimated the surcharge for trips where the fee was either not applicable or not recorded.</w:t>
       </w:r>
       <w:r>
         <w:rPr>
@@ -1023,7 +1866,21 @@
         <w:rPr>
           <w:rFonts w:ascii="Aptos" w:hAnsi="Aptos"/>
         </w:rPr>
-        <w:t>Handling Outliers and Standardising Values</w:t>
+        <w:t xml:space="preserve">Handling Outliers and </w:t>
+      </w:r>
+      <w:proofErr w:type="spellStart"/>
+      <w:r>
+        <w:rPr>
+          <w:rFonts w:ascii="Aptos" w:hAnsi="Aptos"/>
+        </w:rPr>
+        <w:t>Standardising</w:t>
+      </w:r>
+      <w:proofErr w:type="spellEnd"/>
+      <w:r>
+        <w:rPr>
+          <w:rFonts w:ascii="Aptos" w:hAnsi="Aptos"/>
+        </w:rPr>
+        <w:t xml:space="preserve"> Values</w:t>
       </w:r>
     </w:p>
     <w:p>
@@ -1059,7 +1916,115 @@
           <w:sz w:val="20"/>
           <w:szCs w:val="20"/>
         </w:rPr>
-        <w:t xml:space="preserve">We identified outliers in the ‘payment_type’, ‘trip_distance’, and ‘tip_amount’ columns by generating boxplots and calculating summary statistics. For ‘trip_distance’, we flagged extreme values exceeding 100 miles, while for ‘tip_amount’, we isolated negative values and unrealistically high tips. We also examined the ‘payment_type’ column for invalid category codes. These visual and statistical checks allowed us to detect erroneous entries that could skew our analysis. </w:t>
+        <w:t>We identified outliers in the ‘</w:t>
+      </w:r>
+      <w:proofErr w:type="spellStart"/>
+      <w:r>
+        <w:rPr>
+          <w:rFonts w:ascii="Aptos" w:hAnsi="Aptos"/>
+          <w:sz w:val="20"/>
+          <w:szCs w:val="20"/>
+        </w:rPr>
+        <w:t>payment_type</w:t>
+      </w:r>
+      <w:proofErr w:type="spellEnd"/>
+      <w:r>
+        <w:rPr>
+          <w:rFonts w:ascii="Aptos" w:hAnsi="Aptos"/>
+          <w:sz w:val="20"/>
+          <w:szCs w:val="20"/>
+        </w:rPr>
+        <w:t>’, ‘</w:t>
+      </w:r>
+      <w:proofErr w:type="spellStart"/>
+      <w:r>
+        <w:rPr>
+          <w:rFonts w:ascii="Aptos" w:hAnsi="Aptos"/>
+          <w:sz w:val="20"/>
+          <w:szCs w:val="20"/>
+        </w:rPr>
+        <w:t>trip_distance</w:t>
+      </w:r>
+      <w:proofErr w:type="spellEnd"/>
+      <w:r>
+        <w:rPr>
+          <w:rFonts w:ascii="Aptos" w:hAnsi="Aptos"/>
+          <w:sz w:val="20"/>
+          <w:szCs w:val="20"/>
+        </w:rPr>
+        <w:t>’, and ‘</w:t>
+      </w:r>
+      <w:proofErr w:type="spellStart"/>
+      <w:r>
+        <w:rPr>
+          <w:rFonts w:ascii="Aptos" w:hAnsi="Aptos"/>
+          <w:sz w:val="20"/>
+          <w:szCs w:val="20"/>
+        </w:rPr>
+        <w:t>tip_amount</w:t>
+      </w:r>
+      <w:proofErr w:type="spellEnd"/>
+      <w:r>
+        <w:rPr>
+          <w:rFonts w:ascii="Aptos" w:hAnsi="Aptos"/>
+          <w:sz w:val="20"/>
+          <w:szCs w:val="20"/>
+        </w:rPr>
+        <w:t>’ columns by generating boxplots and calculating summary statistics. For ‘</w:t>
+      </w:r>
+      <w:proofErr w:type="spellStart"/>
+      <w:r>
+        <w:rPr>
+          <w:rFonts w:ascii="Aptos" w:hAnsi="Aptos"/>
+          <w:sz w:val="20"/>
+          <w:szCs w:val="20"/>
+        </w:rPr>
+        <w:t>trip_distance</w:t>
+      </w:r>
+      <w:proofErr w:type="spellEnd"/>
+      <w:r>
+        <w:rPr>
+          <w:rFonts w:ascii="Aptos" w:hAnsi="Aptos"/>
+          <w:sz w:val="20"/>
+          <w:szCs w:val="20"/>
+        </w:rPr>
+        <w:t>’, we flagged extreme values exceeding 100 miles, while for ‘</w:t>
+      </w:r>
+      <w:proofErr w:type="spellStart"/>
+      <w:r>
+        <w:rPr>
+          <w:rFonts w:ascii="Aptos" w:hAnsi="Aptos"/>
+          <w:sz w:val="20"/>
+          <w:szCs w:val="20"/>
+        </w:rPr>
+        <w:t>tip_amount</w:t>
+      </w:r>
+      <w:proofErr w:type="spellEnd"/>
+      <w:r>
+        <w:rPr>
+          <w:rFonts w:ascii="Aptos" w:hAnsi="Aptos"/>
+          <w:sz w:val="20"/>
+          <w:szCs w:val="20"/>
+        </w:rPr>
+        <w:t>’, we isolated negative values and unrealistically high tips. We also examined the ‘</w:t>
+      </w:r>
+      <w:proofErr w:type="spellStart"/>
+      <w:r>
+        <w:rPr>
+          <w:rFonts w:ascii="Aptos" w:hAnsi="Aptos"/>
+          <w:sz w:val="20"/>
+          <w:szCs w:val="20"/>
+        </w:rPr>
+        <w:t>payment_type</w:t>
+      </w:r>
+      <w:proofErr w:type="spellEnd"/>
+      <w:r>
+        <w:rPr>
+          <w:rFonts w:ascii="Aptos" w:hAnsi="Aptos"/>
+          <w:sz w:val="20"/>
+          <w:szCs w:val="20"/>
+        </w:rPr>
+        <w:t xml:space="preserve">’ column for invalid category codes. These visual and statistical checks allowed us to detect erroneous entries that could skew our analysis. </w:t>
       </w:r>
     </w:p>
     <w:p>
@@ -1136,7 +2101,127 @@
           <w:sz w:val="20"/>
           <w:szCs w:val="20"/>
         </w:rPr>
-        <w:t xml:space="preserve">Categorical variables: VendorID, RatecodeID, store_and_fwd_flag, PULocationID, DOLocationID, and payment_type. </w:t>
+        <w:t xml:space="preserve">Categorical variables: </w:t>
+      </w:r>
+      <w:proofErr w:type="spellStart"/>
+      <w:r>
+        <w:rPr>
+          <w:rFonts w:ascii="Aptos" w:hAnsi="Aptos"/>
+          <w:bCs/>
+          <w:sz w:val="20"/>
+          <w:szCs w:val="20"/>
+        </w:rPr>
+        <w:t>VendorID</w:t>
+      </w:r>
+      <w:proofErr w:type="spellEnd"/>
+      <w:r>
+        <w:rPr>
+          <w:rFonts w:ascii="Aptos" w:hAnsi="Aptos"/>
+          <w:bCs/>
+          <w:sz w:val="20"/>
+          <w:szCs w:val="20"/>
+        </w:rPr>
+        <w:t xml:space="preserve">, </w:t>
+      </w:r>
+      <w:proofErr w:type="spellStart"/>
+      <w:r>
+        <w:rPr>
+          <w:rFonts w:ascii="Aptos" w:hAnsi="Aptos"/>
+          <w:bCs/>
+          <w:sz w:val="20"/>
+          <w:szCs w:val="20"/>
+        </w:rPr>
+        <w:t>RatecodeID</w:t>
+      </w:r>
+      <w:proofErr w:type="spellEnd"/>
+      <w:r>
+        <w:rPr>
+          <w:rFonts w:ascii="Aptos" w:hAnsi="Aptos"/>
+          <w:bCs/>
+          <w:sz w:val="20"/>
+          <w:szCs w:val="20"/>
+        </w:rPr>
+        <w:t xml:space="preserve">, </w:t>
+      </w:r>
+      <w:proofErr w:type="spellStart"/>
+      <w:r>
+        <w:rPr>
+          <w:rFonts w:ascii="Aptos" w:hAnsi="Aptos"/>
+          <w:bCs/>
+          <w:sz w:val="20"/>
+          <w:szCs w:val="20"/>
+        </w:rPr>
+        <w:t>store_and_fwd_flag</w:t>
+      </w:r>
+      <w:proofErr w:type="spellEnd"/>
+      <w:r>
+        <w:rPr>
+          <w:rFonts w:ascii="Aptos" w:hAnsi="Aptos"/>
+          <w:bCs/>
+          <w:sz w:val="20"/>
+          <w:szCs w:val="20"/>
+        </w:rPr>
+        <w:t xml:space="preserve">, </w:t>
+      </w:r>
+      <w:proofErr w:type="spellStart"/>
+      <w:r>
+        <w:rPr>
+          <w:rFonts w:ascii="Aptos" w:hAnsi="Aptos"/>
+          <w:bCs/>
+          <w:sz w:val="20"/>
+          <w:szCs w:val="20"/>
+        </w:rPr>
+        <w:t>PULocationID</w:t>
+      </w:r>
+      <w:proofErr w:type="spellEnd"/>
+      <w:r>
+        <w:rPr>
+          <w:rFonts w:ascii="Aptos" w:hAnsi="Aptos"/>
+          <w:bCs/>
+          <w:sz w:val="20"/>
+          <w:szCs w:val="20"/>
+        </w:rPr>
+        <w:t xml:space="preserve">, </w:t>
+      </w:r>
+      <w:proofErr w:type="spellStart"/>
+      <w:r>
+        <w:rPr>
+          <w:rFonts w:ascii="Aptos" w:hAnsi="Aptos"/>
+          <w:bCs/>
+          <w:sz w:val="20"/>
+          <w:szCs w:val="20"/>
+        </w:rPr>
+        <w:t>DOLocationID</w:t>
+      </w:r>
+      <w:proofErr w:type="spellEnd"/>
+      <w:r>
+        <w:rPr>
+          <w:rFonts w:ascii="Aptos" w:hAnsi="Aptos"/>
+          <w:bCs/>
+          <w:sz w:val="20"/>
+          <w:szCs w:val="20"/>
+        </w:rPr>
+        <w:t xml:space="preserve">, and </w:t>
+      </w:r>
+      <w:proofErr w:type="spellStart"/>
+      <w:r>
+        <w:rPr>
+          <w:rFonts w:ascii="Aptos" w:hAnsi="Aptos"/>
+          <w:bCs/>
+          <w:sz w:val="20"/>
+          <w:szCs w:val="20"/>
+        </w:rPr>
+        <w:t>payment_type</w:t>
+      </w:r>
+      <w:proofErr w:type="spellEnd"/>
+      <w:r>
+        <w:rPr>
+          <w:rFonts w:ascii="Aptos" w:hAnsi="Aptos"/>
+          <w:bCs/>
+          <w:sz w:val="20"/>
+          <w:szCs w:val="20"/>
+        </w:rPr>
+        <w:t xml:space="preserve">. </w:t>
       </w:r>
       <w:r>
         <w:rPr>
@@ -1146,7 +2231,127 @@
           <w:szCs w:val="20"/>
         </w:rPr>
         <w:br/>
-        <w:t>Numerical variables: passenger_count, trip_distance, fare_amount, extra, tip_amount, tolls_amount, and total_amount.</w:t>
+        <w:t xml:space="preserve">Numerical variables: </w:t>
+      </w:r>
+      <w:proofErr w:type="spellStart"/>
+      <w:r>
+        <w:rPr>
+          <w:rFonts w:ascii="Aptos" w:hAnsi="Aptos"/>
+          <w:bCs/>
+          <w:sz w:val="20"/>
+          <w:szCs w:val="20"/>
+        </w:rPr>
+        <w:t>passenger_count</w:t>
+      </w:r>
+      <w:proofErr w:type="spellEnd"/>
+      <w:r>
+        <w:rPr>
+          <w:rFonts w:ascii="Aptos" w:hAnsi="Aptos"/>
+          <w:bCs/>
+          <w:sz w:val="20"/>
+          <w:szCs w:val="20"/>
+        </w:rPr>
+        <w:t xml:space="preserve">, </w:t>
+      </w:r>
+      <w:proofErr w:type="spellStart"/>
+      <w:r>
+        <w:rPr>
+          <w:rFonts w:ascii="Aptos" w:hAnsi="Aptos"/>
+          <w:bCs/>
+          <w:sz w:val="20"/>
+          <w:szCs w:val="20"/>
+        </w:rPr>
+        <w:t>trip_distance</w:t>
+      </w:r>
+      <w:proofErr w:type="spellEnd"/>
+      <w:r>
+        <w:rPr>
+          <w:rFonts w:ascii="Aptos" w:hAnsi="Aptos"/>
+          <w:bCs/>
+          <w:sz w:val="20"/>
+          <w:szCs w:val="20"/>
+        </w:rPr>
+        <w:t xml:space="preserve">, </w:t>
+      </w:r>
+      <w:proofErr w:type="spellStart"/>
+      <w:r>
+        <w:rPr>
+          <w:rFonts w:ascii="Aptos" w:hAnsi="Aptos"/>
+          <w:bCs/>
+          <w:sz w:val="20"/>
+          <w:szCs w:val="20"/>
+        </w:rPr>
+        <w:t>fare_amount</w:t>
+      </w:r>
+      <w:proofErr w:type="spellEnd"/>
+      <w:r>
+        <w:rPr>
+          <w:rFonts w:ascii="Aptos" w:hAnsi="Aptos"/>
+          <w:bCs/>
+          <w:sz w:val="20"/>
+          <w:szCs w:val="20"/>
+        </w:rPr>
+        <w:t xml:space="preserve">, extra, </w:t>
+      </w:r>
+      <w:proofErr w:type="spellStart"/>
+      <w:r>
+        <w:rPr>
+          <w:rFonts w:ascii="Aptos" w:hAnsi="Aptos"/>
+          <w:bCs/>
+          <w:sz w:val="20"/>
+          <w:szCs w:val="20"/>
+        </w:rPr>
+        <w:t>tip_amount</w:t>
+      </w:r>
+      <w:proofErr w:type="spellEnd"/>
+      <w:r>
+        <w:rPr>
+          <w:rFonts w:ascii="Aptos" w:hAnsi="Aptos"/>
+          <w:bCs/>
+          <w:sz w:val="20"/>
+          <w:szCs w:val="20"/>
+        </w:rPr>
+        <w:t xml:space="preserve">, </w:t>
+      </w:r>
+      <w:proofErr w:type="spellStart"/>
+      <w:r>
+        <w:rPr>
+          <w:rFonts w:ascii="Aptos" w:hAnsi="Aptos"/>
+          <w:bCs/>
+          <w:sz w:val="20"/>
+          <w:szCs w:val="20"/>
+        </w:rPr>
+        <w:t>tolls_amount</w:t>
+      </w:r>
+      <w:proofErr w:type="spellEnd"/>
+      <w:r>
+        <w:rPr>
+          <w:rFonts w:ascii="Aptos" w:hAnsi="Aptos"/>
+          <w:bCs/>
+          <w:sz w:val="20"/>
+          <w:szCs w:val="20"/>
+        </w:rPr>
+        <w:t xml:space="preserve">, and </w:t>
+      </w:r>
+      <w:proofErr w:type="spellStart"/>
+      <w:r>
+        <w:rPr>
+          <w:rFonts w:ascii="Aptos" w:hAnsi="Aptos"/>
+          <w:bCs/>
+          <w:sz w:val="20"/>
+          <w:szCs w:val="20"/>
+        </w:rPr>
+        <w:t>total_amount</w:t>
+      </w:r>
+      <w:proofErr w:type="spellEnd"/>
+      <w:r>
+        <w:rPr>
+          <w:rFonts w:ascii="Aptos" w:hAnsi="Aptos"/>
+          <w:bCs/>
+          <w:sz w:val="20"/>
+          <w:szCs w:val="20"/>
+        </w:rPr>
+        <w:t>.</w:t>
       </w:r>
       <w:r>
         <w:rPr>
@@ -1169,13 +2374,22 @@
           <w:rFonts w:ascii="Aptos" w:hAnsi="Aptos"/>
         </w:rPr>
       </w:pPr>
+      <w:proofErr w:type="spellStart"/>
       <w:r>
         <w:rPr>
           <w:rFonts w:ascii="Aptos" w:hAnsi="Aptos"/>
           <w:b/>
         </w:rPr>
         <w:lastRenderedPageBreak/>
-        <w:t>Analyse the distribution of taxi pickups by hours, days of the week, and months</w:t>
+        <w:t>Analyse</w:t>
+      </w:r>
+      <w:proofErr w:type="spellEnd"/>
+      <w:r>
+        <w:rPr>
+          <w:rFonts w:ascii="Aptos" w:hAnsi="Aptos"/>
+          <w:b/>
+        </w:rPr>
+        <w:t xml:space="preserve"> the distribution of taxi pickups by hours, days of the week, and months</w:t>
       </w:r>
       <w:r>
         <w:rPr>
@@ -1189,7 +2403,7 @@
           <w:noProof/>
         </w:rPr>
         <w:drawing>
-          <wp:inline distT="0" distB="0" distL="0" distR="0" wp14:anchorId="138B993B" wp14:editId="6B28B0ED">
+          <wp:inline distT="0" distB="0" distL="0" distR="0" wp14:anchorId="138B993B" wp14:editId="36411E53">
             <wp:extent cx="4195268" cy="2083739"/>
             <wp:effectExtent l="0" t="0" r="0" b="0"/>
             <wp:docPr id="1811005879" name="Picture 1"/>
@@ -1206,7 +2420,7 @@
                     </pic:cNvPicPr>
                   </pic:nvPicPr>
                   <pic:blipFill>
-                    <a:blip r:embed="rId5" cstate="print">
+                    <a:blip r:embed="rId8" cstate="print">
                       <a:extLst>
                         <a:ext uri="{28A0092B-C50C-407E-A947-70E740481C1C}">
                           <a14:useLocalDpi xmlns:a14="http://schemas.microsoft.com/office/drawing/2010/main" val="0"/>
@@ -1315,7 +2529,7 @@
           <w:noProof/>
         </w:rPr>
         <w:drawing>
-          <wp:inline distT="0" distB="0" distL="0" distR="0" wp14:anchorId="2E587A96" wp14:editId="3D93D394">
+          <wp:inline distT="0" distB="0" distL="0" distR="0" wp14:anchorId="2E587A96" wp14:editId="6300F197">
             <wp:extent cx="3913632" cy="1943854"/>
             <wp:effectExtent l="0" t="0" r="0" b="0"/>
             <wp:docPr id="887282087" name="Picture 2"/>
@@ -1332,7 +2546,7 @@
                     </pic:cNvPicPr>
                   </pic:nvPicPr>
                   <pic:blipFill>
-                    <a:blip r:embed="rId6" cstate="print">
+                    <a:blip r:embed="rId9" cstate="print">
                       <a:extLst>
                         <a:ext uri="{28A0092B-C50C-407E-A947-70E740481C1C}">
                           <a14:useLocalDpi xmlns:a14="http://schemas.microsoft.com/office/drawing/2010/main" val="0"/>
@@ -1427,7 +2641,7 @@
         </w:rPr>
         <w:lastRenderedPageBreak/>
         <w:drawing>
-          <wp:inline distT="0" distB="0" distL="0" distR="0" wp14:anchorId="22A403F3" wp14:editId="11D1ED93">
+          <wp:inline distT="0" distB="0" distL="0" distR="0" wp14:anchorId="22A403F3" wp14:editId="29314A6D">
             <wp:extent cx="3902660" cy="1938405"/>
             <wp:effectExtent l="0" t="0" r="3175" b="5080"/>
             <wp:docPr id="1762991239" name="Picture 3"/>
@@ -1444,7 +2658,7 @@
                     </pic:cNvPicPr>
                   </pic:nvPicPr>
                   <pic:blipFill>
-                    <a:blip r:embed="rId7" cstate="print">
+                    <a:blip r:embed="rId10" cstate="print">
                       <a:extLst>
                         <a:ext uri="{28A0092B-C50C-407E-A947-70E740481C1C}">
                           <a14:useLocalDpi xmlns:a14="http://schemas.microsoft.com/office/drawing/2010/main" val="0"/>
@@ -1740,7 +2954,87 @@
           <w:sz w:val="20"/>
           <w:szCs w:val="20"/>
         </w:rPr>
-        <w:t>The analysis shows that there are several trips with zero or negative values in fare_amount, tip_amount, total_amount, and trip_distance.</w:t>
+        <w:t xml:space="preserve">The analysis shows that there are several trips with zero or negative values in </w:t>
+      </w:r>
+      <w:proofErr w:type="spellStart"/>
+      <w:r>
+        <w:rPr>
+          <w:rFonts w:ascii="Aptos" w:hAnsi="Aptos"/>
+          <w:bCs/>
+          <w:sz w:val="20"/>
+          <w:szCs w:val="20"/>
+        </w:rPr>
+        <w:t>fare_amount</w:t>
+      </w:r>
+      <w:proofErr w:type="spellEnd"/>
+      <w:r>
+        <w:rPr>
+          <w:rFonts w:ascii="Aptos" w:hAnsi="Aptos"/>
+          <w:bCs/>
+          <w:sz w:val="20"/>
+          <w:szCs w:val="20"/>
+        </w:rPr>
+        <w:t xml:space="preserve">, </w:t>
+      </w:r>
+      <w:proofErr w:type="spellStart"/>
+      <w:r>
+        <w:rPr>
+          <w:rFonts w:ascii="Aptos" w:hAnsi="Aptos"/>
+          <w:bCs/>
+          <w:sz w:val="20"/>
+          <w:szCs w:val="20"/>
+        </w:rPr>
+        <w:t>tip_amount</w:t>
+      </w:r>
+      <w:proofErr w:type="spellEnd"/>
+      <w:r>
+        <w:rPr>
+          <w:rFonts w:ascii="Aptos" w:hAnsi="Aptos"/>
+          <w:bCs/>
+          <w:sz w:val="20"/>
+          <w:szCs w:val="20"/>
+        </w:rPr>
+        <w:t xml:space="preserve">, </w:t>
+      </w:r>
+      <w:proofErr w:type="spellStart"/>
+      <w:r>
+        <w:rPr>
+          <w:rFonts w:ascii="Aptos" w:hAnsi="Aptos"/>
+          <w:bCs/>
+          <w:sz w:val="20"/>
+          <w:szCs w:val="20"/>
+        </w:rPr>
+        <w:t>total_amount</w:t>
+      </w:r>
+      <w:proofErr w:type="spellEnd"/>
+      <w:r>
+        <w:rPr>
+          <w:rFonts w:ascii="Aptos" w:hAnsi="Aptos"/>
+          <w:bCs/>
+          <w:sz w:val="20"/>
+          <w:szCs w:val="20"/>
+        </w:rPr>
+        <w:t xml:space="preserve">, and </w:t>
+      </w:r>
+      <w:proofErr w:type="spellStart"/>
+      <w:r>
+        <w:rPr>
+          <w:rFonts w:ascii="Aptos" w:hAnsi="Aptos"/>
+          <w:bCs/>
+          <w:sz w:val="20"/>
+          <w:szCs w:val="20"/>
+        </w:rPr>
+        <w:t>trip_distance</w:t>
+      </w:r>
+      <w:proofErr w:type="spellEnd"/>
+      <w:r>
+        <w:rPr>
+          <w:rFonts w:ascii="Aptos" w:hAnsi="Aptos"/>
+          <w:bCs/>
+          <w:sz w:val="20"/>
+          <w:szCs w:val="20"/>
+        </w:rPr>
+        <w:t>.</w:t>
       </w:r>
     </w:p>
     <w:p>
@@ -1758,14 +3052,25 @@
           <w:szCs w:val="20"/>
         </w:rPr>
       </w:pPr>
-      <w:r>
-        <w:rPr>
-          <w:rFonts w:ascii="Aptos" w:hAnsi="Aptos"/>
-          <w:bCs/>
-          <w:sz w:val="20"/>
-          <w:szCs w:val="20"/>
-        </w:rPr>
-        <w:t>fare_amount: 651 trips have zero or negative fare.</w:t>
+      <w:proofErr w:type="spellStart"/>
+      <w:r>
+        <w:rPr>
+          <w:rFonts w:ascii="Aptos" w:hAnsi="Aptos"/>
+          <w:bCs/>
+          <w:sz w:val="20"/>
+          <w:szCs w:val="20"/>
+        </w:rPr>
+        <w:t>fare_amount</w:t>
+      </w:r>
+      <w:proofErr w:type="spellEnd"/>
+      <w:r>
+        <w:rPr>
+          <w:rFonts w:ascii="Aptos" w:hAnsi="Aptos"/>
+          <w:bCs/>
+          <w:sz w:val="20"/>
+          <w:szCs w:val="20"/>
+        </w:rPr>
+        <w:t>: 651 trips have zero or negative fare.</w:t>
       </w:r>
     </w:p>
     <w:p>
@@ -1783,14 +3088,25 @@
           <w:szCs w:val="20"/>
         </w:rPr>
       </w:pPr>
-      <w:r>
-        <w:rPr>
-          <w:rFonts w:ascii="Aptos" w:hAnsi="Aptos"/>
-          <w:bCs/>
-          <w:sz w:val="20"/>
-          <w:szCs w:val="20"/>
-        </w:rPr>
-        <w:t>tip_amount: 435,958 trips have zero or negative tip amounts. This is expected as many trips might not include a tip or tips are given in cash.</w:t>
+      <w:proofErr w:type="spellStart"/>
+      <w:r>
+        <w:rPr>
+          <w:rFonts w:ascii="Aptos" w:hAnsi="Aptos"/>
+          <w:bCs/>
+          <w:sz w:val="20"/>
+          <w:szCs w:val="20"/>
+        </w:rPr>
+        <w:t>tip_amount</w:t>
+      </w:r>
+      <w:proofErr w:type="spellEnd"/>
+      <w:r>
+        <w:rPr>
+          <w:rFonts w:ascii="Aptos" w:hAnsi="Aptos"/>
+          <w:bCs/>
+          <w:sz w:val="20"/>
+          <w:szCs w:val="20"/>
+        </w:rPr>
+        <w:t>: 435,958 trips have zero or negative tip amounts. This is expected as many trips might not include a tip or tips are given in cash.</w:t>
       </w:r>
     </w:p>
     <w:p>
@@ -1808,14 +3124,25 @@
           <w:szCs w:val="20"/>
         </w:rPr>
       </w:pPr>
-      <w:r>
-        <w:rPr>
-          <w:rFonts w:ascii="Aptos" w:hAnsi="Aptos"/>
-          <w:bCs/>
-          <w:sz w:val="20"/>
-          <w:szCs w:val="20"/>
-        </w:rPr>
-        <w:t>total_amount: 388 trips have zero or negative total amount.</w:t>
+      <w:proofErr w:type="spellStart"/>
+      <w:r>
+        <w:rPr>
+          <w:rFonts w:ascii="Aptos" w:hAnsi="Aptos"/>
+          <w:bCs/>
+          <w:sz w:val="20"/>
+          <w:szCs w:val="20"/>
+        </w:rPr>
+        <w:t>total_amount</w:t>
+      </w:r>
+      <w:proofErr w:type="spellEnd"/>
+      <w:r>
+        <w:rPr>
+          <w:rFonts w:ascii="Aptos" w:hAnsi="Aptos"/>
+          <w:bCs/>
+          <w:sz w:val="20"/>
+          <w:szCs w:val="20"/>
+        </w:rPr>
+        <w:t>: 388 trips have zero or negative total amount.</w:t>
       </w:r>
     </w:p>
     <w:p>
@@ -1833,14 +3160,25 @@
           <w:szCs w:val="20"/>
         </w:rPr>
       </w:pPr>
-      <w:r>
-        <w:rPr>
-          <w:rFonts w:ascii="Aptos" w:hAnsi="Aptos"/>
-          <w:bCs/>
-          <w:sz w:val="20"/>
-          <w:szCs w:val="20"/>
-        </w:rPr>
-        <w:t>trip_distance: 37,732 trips have zero or negative trip distance.</w:t>
+      <w:proofErr w:type="spellStart"/>
+      <w:r>
+        <w:rPr>
+          <w:rFonts w:ascii="Aptos" w:hAnsi="Aptos"/>
+          <w:bCs/>
+          <w:sz w:val="20"/>
+          <w:szCs w:val="20"/>
+        </w:rPr>
+        <w:t>trip_distance</w:t>
+      </w:r>
+      <w:proofErr w:type="spellEnd"/>
+      <w:r>
+        <w:rPr>
+          <w:rFonts w:ascii="Aptos" w:hAnsi="Aptos"/>
+          <w:bCs/>
+          <w:sz w:val="20"/>
+          <w:szCs w:val="20"/>
+        </w:rPr>
+        <w:t>: 37,732 trips have zero or negative trip distance.</w:t>
       </w:r>
       <w:r>
         <w:rPr>
@@ -1899,7 +3237,7 @@
                     </pic:cNvPicPr>
                   </pic:nvPicPr>
                   <pic:blipFill>
-                    <a:blip r:embed="rId8" cstate="print">
+                    <a:blip r:embed="rId11" cstate="print">
                       <a:extLst>
                         <a:ext uri="{28A0092B-C50C-407E-A947-70E740481C1C}">
                           <a14:useLocalDpi xmlns:a14="http://schemas.microsoft.com/office/drawing/2010/main" val="0"/>
@@ -1950,7 +3288,27 @@
           <w:szCs w:val="20"/>
         </w:rPr>
         <w:lastRenderedPageBreak/>
-        <w:t>The pie chart above visually represents these proportions. Quarters 2 (April-June) and 4 (October-December) show the highest revenue proportions, each contributing roughly 26-27% of the total annual revenue. Quarters 1 (January-March) and 3 (July-September) have slightly lower, but still substantial, contributions around 22-23%. This indicates that the taxi operations experience slightly higher revenue during the spring/early summer and late autumn/early winter months.</w:t>
+        <w:t xml:space="preserve">The pie chart above visually represents these proportions. Quarters 2 (April-June) and 4 (October-December) show the highest revenue proportions, each contributing roughly 26-27% of the total annual revenue. Quarters 1 (January-March) and 3 (July-September) </w:t>
+      </w:r>
+      <w:proofErr w:type="gramStart"/>
+      <w:r>
+        <w:rPr>
+          <w:rFonts w:ascii="Aptos" w:hAnsi="Aptos"/>
+          <w:bCs/>
+          <w:sz w:val="20"/>
+          <w:szCs w:val="20"/>
+        </w:rPr>
+        <w:t>have</w:t>
+      </w:r>
+      <w:proofErr w:type="gramEnd"/>
+      <w:r>
+        <w:rPr>
+          <w:rFonts w:ascii="Aptos" w:hAnsi="Aptos"/>
+          <w:bCs/>
+          <w:sz w:val="20"/>
+          <w:szCs w:val="20"/>
+        </w:rPr>
+        <w:t xml:space="preserve"> slightly lower, but still substantial, contributions around 22-23%. This indicates that the taxi operations experience slightly higher revenue during the spring/early summer and late autumn/early winter months.</w:t>
       </w:r>
       <w:r>
         <w:rPr>
@@ -1973,12 +3331,37 @@
           <w:rFonts w:ascii="Aptos" w:hAnsi="Aptos"/>
         </w:rPr>
       </w:pPr>
-      <w:r>
-        <w:rPr>
-          <w:rFonts w:ascii="Aptos" w:hAnsi="Aptos"/>
-          <w:b/>
-        </w:rPr>
-        <w:t>Analyse and visualise the relationship between distance and fare amount</w:t>
+      <w:proofErr w:type="spellStart"/>
+      <w:r>
+        <w:rPr>
+          <w:rFonts w:ascii="Aptos" w:hAnsi="Aptos"/>
+          <w:b/>
+        </w:rPr>
+        <w:t>Analyse</w:t>
+      </w:r>
+      <w:proofErr w:type="spellEnd"/>
+      <w:r>
+        <w:rPr>
+          <w:rFonts w:ascii="Aptos" w:hAnsi="Aptos"/>
+          <w:b/>
+        </w:rPr>
+        <w:t xml:space="preserve"> and </w:t>
+      </w:r>
+      <w:proofErr w:type="spellStart"/>
+      <w:r>
+        <w:rPr>
+          <w:rFonts w:ascii="Aptos" w:hAnsi="Aptos"/>
+          <w:b/>
+        </w:rPr>
+        <w:t>visualise</w:t>
+      </w:r>
+      <w:proofErr w:type="spellEnd"/>
+      <w:r>
+        <w:rPr>
+          <w:rFonts w:ascii="Aptos" w:hAnsi="Aptos"/>
+          <w:b/>
+        </w:rPr>
+        <w:t xml:space="preserve"> the relationship between distance and fare amount</w:t>
       </w:r>
       <w:r>
         <w:rPr>
@@ -2009,7 +3392,7 @@
                     </pic:cNvPicPr>
                   </pic:nvPicPr>
                   <pic:blipFill>
-                    <a:blip r:embed="rId9" cstate="print">
+                    <a:blip r:embed="rId12" cstate="print">
                       <a:extLst>
                         <a:ext uri="{28A0092B-C50C-407E-A947-70E740481C1C}">
                           <a14:useLocalDpi xmlns:a14="http://schemas.microsoft.com/office/drawing/2010/main" val="0"/>
@@ -2065,6 +3448,7 @@
         </w:rPr>
         <w:t>‘</w:t>
       </w:r>
+      <w:proofErr w:type="spellStart"/>
       <w:r>
         <w:rPr>
           <w:rFonts w:ascii="Aptos" w:hAnsi="Aptos"/>
@@ -2073,6 +3457,7 @@
         </w:rPr>
         <w:t>trip_distance</w:t>
       </w:r>
+      <w:proofErr w:type="spellEnd"/>
       <w:r>
         <w:rPr>
           <w:rFonts w:ascii="Aptos" w:hAnsi="Aptos"/>
@@ -2097,6 +3482,7 @@
         </w:rPr>
         <w:t>‘</w:t>
       </w:r>
+      <w:proofErr w:type="spellStart"/>
       <w:r>
         <w:rPr>
           <w:rFonts w:ascii="Aptos" w:hAnsi="Aptos"/>
@@ -2105,6 +3491,7 @@
         </w:rPr>
         <w:t>fare_amount</w:t>
       </w:r>
+      <w:proofErr w:type="spellEnd"/>
       <w:r>
         <w:rPr>
           <w:rFonts w:ascii="Aptos" w:hAnsi="Aptos"/>
@@ -2136,12 +3523,21 @@
           <w:lang w:val="en-GB"/>
         </w:rPr>
       </w:pPr>
-      <w:r>
-        <w:rPr>
-          <w:rFonts w:ascii="Aptos" w:hAnsi="Aptos"/>
-          <w:b/>
-        </w:rPr>
-        <w:t>Analyse the relationship between fare/tips and trips/passengers</w:t>
+      <w:proofErr w:type="spellStart"/>
+      <w:r>
+        <w:rPr>
+          <w:rFonts w:ascii="Aptos" w:hAnsi="Aptos"/>
+          <w:b/>
+        </w:rPr>
+        <w:t>Analyse</w:t>
+      </w:r>
+      <w:proofErr w:type="spellEnd"/>
+      <w:r>
+        <w:rPr>
+          <w:rFonts w:ascii="Aptos" w:hAnsi="Aptos"/>
+          <w:b/>
+        </w:rPr>
+        <w:t xml:space="preserve"> the relationship between fare/tips and trips/passengers</w:t>
       </w:r>
       <w:r>
         <w:rPr>
@@ -2164,7 +3560,107 @@
           <w:szCs w:val="20"/>
           <w:lang w:val="en-GB"/>
         </w:rPr>
-        <w:t>We analyzed the relationship between financial metrics and trip volume using correlation matrices. We discovered a strong positive correlation between fare_amount and tip_amount, indicating that higher fares generally yield larger tips. Conversely, we found a negligible correlation between passenger_count and total_amount. This confirms that taxi pricing in NYC depends on distance and time rather than the number of occupants. By identifying these patterns, we established that revenue per trip remains consistent regardless of whether a single passenger or a small group occupies the vehicle.</w:t>
+        <w:t xml:space="preserve">We </w:t>
+      </w:r>
+      <w:proofErr w:type="spellStart"/>
+      <w:r>
+        <w:rPr>
+          <w:rFonts w:ascii="Aptos" w:hAnsi="Aptos"/>
+          <w:sz w:val="20"/>
+          <w:szCs w:val="20"/>
+          <w:lang w:val="en-GB"/>
+        </w:rPr>
+        <w:t>analyzed</w:t>
+      </w:r>
+      <w:proofErr w:type="spellEnd"/>
+      <w:r>
+        <w:rPr>
+          <w:rFonts w:ascii="Aptos" w:hAnsi="Aptos"/>
+          <w:sz w:val="20"/>
+          <w:szCs w:val="20"/>
+          <w:lang w:val="en-GB"/>
+        </w:rPr>
+        <w:t xml:space="preserve"> the relationship between financial metrics and trip volume using correlation matrices. We discovered a strong positive correlation between </w:t>
+      </w:r>
+      <w:proofErr w:type="spellStart"/>
+      <w:r>
+        <w:rPr>
+          <w:rFonts w:ascii="Aptos" w:hAnsi="Aptos"/>
+          <w:sz w:val="20"/>
+          <w:szCs w:val="20"/>
+          <w:lang w:val="en-GB"/>
+        </w:rPr>
+        <w:t>fare_amount</w:t>
+      </w:r>
+      <w:proofErr w:type="spellEnd"/>
+      <w:r>
+        <w:rPr>
+          <w:rFonts w:ascii="Aptos" w:hAnsi="Aptos"/>
+          <w:sz w:val="20"/>
+          <w:szCs w:val="20"/>
+          <w:lang w:val="en-GB"/>
+        </w:rPr>
+        <w:t xml:space="preserve"> and </w:t>
+      </w:r>
+      <w:proofErr w:type="spellStart"/>
+      <w:r>
+        <w:rPr>
+          <w:rFonts w:ascii="Aptos" w:hAnsi="Aptos"/>
+          <w:sz w:val="20"/>
+          <w:szCs w:val="20"/>
+          <w:lang w:val="en-GB"/>
+        </w:rPr>
+        <w:t>tip_amount</w:t>
+      </w:r>
+      <w:proofErr w:type="spellEnd"/>
+      <w:r>
+        <w:rPr>
+          <w:rFonts w:ascii="Aptos" w:hAnsi="Aptos"/>
+          <w:sz w:val="20"/>
+          <w:szCs w:val="20"/>
+          <w:lang w:val="en-GB"/>
+        </w:rPr>
+        <w:t xml:space="preserve">, indicating that higher fares generally yield larger tips. Conversely, we found a negligible correlation between </w:t>
+      </w:r>
+      <w:proofErr w:type="spellStart"/>
+      <w:r>
+        <w:rPr>
+          <w:rFonts w:ascii="Aptos" w:hAnsi="Aptos"/>
+          <w:sz w:val="20"/>
+          <w:szCs w:val="20"/>
+          <w:lang w:val="en-GB"/>
+        </w:rPr>
+        <w:t>passenger_count</w:t>
+      </w:r>
+      <w:proofErr w:type="spellEnd"/>
+      <w:r>
+        <w:rPr>
+          <w:rFonts w:ascii="Aptos" w:hAnsi="Aptos"/>
+          <w:sz w:val="20"/>
+          <w:szCs w:val="20"/>
+          <w:lang w:val="en-GB"/>
+        </w:rPr>
+        <w:t xml:space="preserve"> and </w:t>
+      </w:r>
+      <w:proofErr w:type="spellStart"/>
+      <w:r>
+        <w:rPr>
+          <w:rFonts w:ascii="Aptos" w:hAnsi="Aptos"/>
+          <w:sz w:val="20"/>
+          <w:szCs w:val="20"/>
+          <w:lang w:val="en-GB"/>
+        </w:rPr>
+        <w:t>total_amount</w:t>
+      </w:r>
+      <w:proofErr w:type="spellEnd"/>
+      <w:r>
+        <w:rPr>
+          <w:rFonts w:ascii="Aptos" w:hAnsi="Aptos"/>
+          <w:sz w:val="20"/>
+          <w:szCs w:val="20"/>
+          <w:lang w:val="en-GB"/>
+        </w:rPr>
+        <w:t>. This confirms that taxi pricing in NYC depends on distance and time rather than the number of occupants. By identifying these patterns, we established that revenue per trip remains consistent regardless of whether a single passenger or a small group occupies the vehicle.</w:t>
       </w:r>
     </w:p>
     <w:p>
@@ -2189,13 +3685,22 @@
           <w:rFonts w:ascii="Aptos" w:hAnsi="Aptos"/>
         </w:rPr>
       </w:pPr>
+      <w:proofErr w:type="spellStart"/>
       <w:r>
         <w:rPr>
           <w:rFonts w:ascii="Aptos" w:hAnsi="Aptos"/>
           <w:b/>
         </w:rPr>
         <w:lastRenderedPageBreak/>
-        <w:t>Analyse the distribution of different payment types</w:t>
+        <w:t>Analyse</w:t>
+      </w:r>
+      <w:proofErr w:type="spellEnd"/>
+      <w:r>
+        <w:rPr>
+          <w:rFonts w:ascii="Aptos" w:hAnsi="Aptos"/>
+          <w:b/>
+        </w:rPr>
+        <w:t xml:space="preserve"> the distribution of different payment types</w:t>
       </w:r>
       <w:r>
         <w:rPr>
@@ -2209,7 +3714,7 @@
           <w:noProof/>
         </w:rPr>
         <w:drawing>
-          <wp:inline distT="0" distB="0" distL="0" distR="0" wp14:anchorId="5F4A7333" wp14:editId="6ADF411D">
+          <wp:inline distT="0" distB="0" distL="0" distR="0" wp14:anchorId="5F4A7333" wp14:editId="2C21D691">
             <wp:extent cx="3610052" cy="2155618"/>
             <wp:effectExtent l="0" t="0" r="0" b="0"/>
             <wp:docPr id="660966473" name="Picture 6"/>
@@ -2226,7 +3731,7 @@
                     </pic:cNvPicPr>
                   </pic:nvPicPr>
                   <pic:blipFill>
-                    <a:blip r:embed="rId10" cstate="print">
+                    <a:blip r:embed="rId13" cstate="print">
                       <a:extLst>
                         <a:ext uri="{28A0092B-C50C-407E-A947-70E740481C1C}">
                           <a14:useLocalDpi xmlns:a14="http://schemas.microsoft.com/office/drawing/2010/main" val="0"/>
@@ -2286,6 +3791,8 @@
         <w:spacing w:before="200"/>
         <w:rPr>
           <w:rFonts w:ascii="Aptos" w:hAnsi="Aptos"/>
+          <w:sz w:val="20"/>
+          <w:szCs w:val="20"/>
         </w:rPr>
       </w:pPr>
       <w:r>
@@ -2331,7 +3838,7 @@
                     </pic:cNvPicPr>
                   </pic:nvPicPr>
                   <pic:blipFill>
-                    <a:blip r:embed="rId11">
+                    <a:blip r:embed="rId14">
                       <a:extLst>
                         <a:ext uri="{28A0092B-C50C-407E-A947-70E740481C1C}">
                           <a14:useLocalDpi xmlns:a14="http://schemas.microsoft.com/office/drawing/2010/main" val="0"/>
@@ -2372,29 +3879,111 @@
       <w:r>
         <w:rPr>
           <w:rFonts w:ascii="Aptos" w:hAnsi="Aptos"/>
+          <w:sz w:val="20"/>
+          <w:szCs w:val="20"/>
         </w:rPr>
         <w:t xml:space="preserve">We loaded the NYC taxi zones shapefile using the </w:t>
       </w:r>
-      <w:r>
-        <w:rPr>
-          <w:rFonts w:ascii="Aptos" w:hAnsi="Aptos"/>
-          <w:b/>
-          <w:bCs/>
+      <w:proofErr w:type="spellStart"/>
+      <w:r>
+        <w:rPr>
+          <w:rFonts w:ascii="Aptos" w:hAnsi="Aptos"/>
+          <w:b/>
+          <w:bCs/>
+          <w:sz w:val="20"/>
+          <w:szCs w:val="20"/>
         </w:rPr>
         <w:t>geopandas</w:t>
       </w:r>
-      <w:r>
-        <w:rPr>
-          <w:rFonts w:ascii="Aptos" w:hAnsi="Aptos"/>
-        </w:rPr>
-        <w:t xml:space="preserve"> library and its read_file() function. This operation transformed the spatial data into a GeoDataFrame, allowing us to manage geographic coordinates as structured data. We then generated a visual map by calling the plot() </w:t>
-      </w:r>
-      <w:r>
-        <w:rPr>
-          <w:rFonts w:ascii="Aptos" w:hAnsi="Aptos"/>
+      <w:proofErr w:type="spellEnd"/>
+      <w:r>
+        <w:rPr>
+          <w:rFonts w:ascii="Aptos" w:hAnsi="Aptos"/>
+          <w:sz w:val="20"/>
+          <w:szCs w:val="20"/>
+        </w:rPr>
+        <w:t xml:space="preserve"> library and its </w:t>
+      </w:r>
+      <w:proofErr w:type="spellStart"/>
+      <w:r>
+        <w:rPr>
+          <w:rFonts w:ascii="Aptos" w:hAnsi="Aptos"/>
+          <w:sz w:val="20"/>
+          <w:szCs w:val="20"/>
+        </w:rPr>
+        <w:t>read_</w:t>
+      </w:r>
+      <w:proofErr w:type="gramStart"/>
+      <w:r>
+        <w:rPr>
+          <w:rFonts w:ascii="Aptos" w:hAnsi="Aptos"/>
+          <w:sz w:val="20"/>
+          <w:szCs w:val="20"/>
+        </w:rPr>
+        <w:t>file</w:t>
+      </w:r>
+      <w:proofErr w:type="spellEnd"/>
+      <w:r>
+        <w:rPr>
+          <w:rFonts w:ascii="Aptos" w:hAnsi="Aptos"/>
+          <w:sz w:val="20"/>
+          <w:szCs w:val="20"/>
+        </w:rPr>
+        <w:t>(</w:t>
+      </w:r>
+      <w:proofErr w:type="gramEnd"/>
+      <w:r>
+        <w:rPr>
+          <w:rFonts w:ascii="Aptos" w:hAnsi="Aptos"/>
+          <w:sz w:val="20"/>
+          <w:szCs w:val="20"/>
+        </w:rPr>
+        <w:t xml:space="preserve">) function. This operation transformed the spatial data into a </w:t>
+      </w:r>
+      <w:proofErr w:type="spellStart"/>
+      <w:r>
+        <w:rPr>
+          <w:rFonts w:ascii="Aptos" w:hAnsi="Aptos"/>
+          <w:sz w:val="20"/>
+          <w:szCs w:val="20"/>
+        </w:rPr>
+        <w:t>GeoDataFrame</w:t>
+      </w:r>
+      <w:proofErr w:type="spellEnd"/>
+      <w:r>
+        <w:rPr>
+          <w:rFonts w:ascii="Aptos" w:hAnsi="Aptos"/>
+          <w:sz w:val="20"/>
+          <w:szCs w:val="20"/>
+        </w:rPr>
+        <w:t xml:space="preserve">, allowing us to manage geographic coordinates as structured data. We then generated a visual map by calling the </w:t>
+      </w:r>
+      <w:proofErr w:type="gramStart"/>
+      <w:r>
+        <w:rPr>
+          <w:rFonts w:ascii="Aptos" w:hAnsi="Aptos"/>
+          <w:sz w:val="20"/>
+          <w:szCs w:val="20"/>
+        </w:rPr>
+        <w:t>plot(</w:t>
+      </w:r>
+      <w:proofErr w:type="gramEnd"/>
+      <w:r>
+        <w:rPr>
+          <w:rFonts w:ascii="Aptos" w:hAnsi="Aptos"/>
+          <w:sz w:val="20"/>
+          <w:szCs w:val="20"/>
+        </w:rPr>
+        <w:t xml:space="preserve">) method. This visualization allowed us to verify the geographical boundaries of the taxi zones and served as a </w:t>
+      </w:r>
+      <w:r>
+        <w:rPr>
+          <w:rFonts w:ascii="Aptos" w:hAnsi="Aptos"/>
+          <w:sz w:val="20"/>
+          <w:szCs w:val="20"/>
         </w:rPr>
         <w:lastRenderedPageBreak/>
-        <w:t>method. This visualization allowed us to verify the geographical boundaries of the taxi zones and served as a foundational spatial reference, ensuring that our trip data correctly mapped to the physical locations across New York City’s five boroughs.</w:t>
+        <w:t>foundational spatial reference, ensuring that our trip data correctly mapped to the physical locations across New York City’s five boroughs.</w:t>
       </w:r>
     </w:p>
     <w:p>
@@ -2428,18 +4017,113 @@
       <w:r>
         <w:rPr>
           <w:rFonts w:ascii="Aptos" w:hAnsi="Aptos"/>
-          <w:b/>
-        </w:rPr>
-        <w:br/>
-      </w:r>
-      <w:r>
-        <w:rPr>
-          <w:rFonts w:ascii="Aptos" w:hAnsi="Aptos"/>
-          <w:sz w:val="20"/>
-          <w:szCs w:val="20"/>
-          <w:lang w:val="en-GB"/>
-        </w:rPr>
-        <w:t>We merged the trip records with the taxi zone lookup table using the pd.merge() function. We aligned the PULocationID and DOLocationID from the trip dataset with the LocationID column in the spatial data. This operation allowed us to append borough and zone names to each trip record, transforming numerical IDs into meaningful geographic locations. By performing this join, we facilitated a granular spatial analysis, enabling us to identify high-demand neighborhoods and visualize pickup patterns across the five boroughs of New York City.</w:t>
+          <w:sz w:val="20"/>
+          <w:szCs w:val="20"/>
+          <w:lang w:val="en-GB"/>
+        </w:rPr>
+        <w:t xml:space="preserve">We merged the trip records with the taxi zone lookup table using the </w:t>
+      </w:r>
+      <w:proofErr w:type="spellStart"/>
+      <w:proofErr w:type="gramStart"/>
+      <w:r>
+        <w:rPr>
+          <w:rFonts w:ascii="Aptos" w:hAnsi="Aptos"/>
+          <w:sz w:val="20"/>
+          <w:szCs w:val="20"/>
+          <w:lang w:val="en-GB"/>
+        </w:rPr>
+        <w:t>pd.merge</w:t>
+      </w:r>
+      <w:proofErr w:type="spellEnd"/>
+      <w:proofErr w:type="gramEnd"/>
+      <w:r>
+        <w:rPr>
+          <w:rFonts w:ascii="Aptos" w:hAnsi="Aptos"/>
+          <w:sz w:val="20"/>
+          <w:szCs w:val="20"/>
+          <w:lang w:val="en-GB"/>
+        </w:rPr>
+        <w:t xml:space="preserve">() function. We aligned the </w:t>
+      </w:r>
+      <w:proofErr w:type="spellStart"/>
+      <w:r>
+        <w:rPr>
+          <w:rFonts w:ascii="Aptos" w:hAnsi="Aptos"/>
+          <w:sz w:val="20"/>
+          <w:szCs w:val="20"/>
+          <w:lang w:val="en-GB"/>
+        </w:rPr>
+        <w:t>PULocationID</w:t>
+      </w:r>
+      <w:proofErr w:type="spellEnd"/>
+      <w:r>
+        <w:rPr>
+          <w:rFonts w:ascii="Aptos" w:hAnsi="Aptos"/>
+          <w:sz w:val="20"/>
+          <w:szCs w:val="20"/>
+          <w:lang w:val="en-GB"/>
+        </w:rPr>
+        <w:t xml:space="preserve"> and </w:t>
+      </w:r>
+      <w:proofErr w:type="spellStart"/>
+      <w:r>
+        <w:rPr>
+          <w:rFonts w:ascii="Aptos" w:hAnsi="Aptos"/>
+          <w:sz w:val="20"/>
+          <w:szCs w:val="20"/>
+          <w:lang w:val="en-GB"/>
+        </w:rPr>
+        <w:t>DOLocationID</w:t>
+      </w:r>
+      <w:proofErr w:type="spellEnd"/>
+      <w:r>
+        <w:rPr>
+          <w:rFonts w:ascii="Aptos" w:hAnsi="Aptos"/>
+          <w:sz w:val="20"/>
+          <w:szCs w:val="20"/>
+          <w:lang w:val="en-GB"/>
+        </w:rPr>
+        <w:t xml:space="preserve"> from the trip dataset with the </w:t>
+      </w:r>
+      <w:proofErr w:type="spellStart"/>
+      <w:r>
+        <w:rPr>
+          <w:rFonts w:ascii="Aptos" w:hAnsi="Aptos"/>
+          <w:sz w:val="20"/>
+          <w:szCs w:val="20"/>
+          <w:lang w:val="en-GB"/>
+        </w:rPr>
+        <w:t>LocationID</w:t>
+      </w:r>
+      <w:proofErr w:type="spellEnd"/>
+      <w:r>
+        <w:rPr>
+          <w:rFonts w:ascii="Aptos" w:hAnsi="Aptos"/>
+          <w:sz w:val="20"/>
+          <w:szCs w:val="20"/>
+          <w:lang w:val="en-GB"/>
+        </w:rPr>
+        <w:t xml:space="preserve"> column in the spatial data. This operation allowed us to append borough and zone names to each trip record, transforming numerical IDs into meaningful geographic locations. By performing this join, we facilitated a granular spatial analysis, enabling us to identify high-demand </w:t>
+      </w:r>
+      <w:proofErr w:type="spellStart"/>
+      <w:r>
+        <w:rPr>
+          <w:rFonts w:ascii="Aptos" w:hAnsi="Aptos"/>
+          <w:sz w:val="20"/>
+          <w:szCs w:val="20"/>
+          <w:lang w:val="en-GB"/>
+        </w:rPr>
+        <w:t>neighborhoods</w:t>
+      </w:r>
+      <w:proofErr w:type="spellEnd"/>
+      <w:r>
+        <w:rPr>
+          <w:rFonts w:ascii="Aptos" w:hAnsi="Aptos"/>
+          <w:sz w:val="20"/>
+          <w:szCs w:val="20"/>
+          <w:lang w:val="en-GB"/>
+        </w:rPr>
+        <w:t xml:space="preserve"> and visualize pickup patterns across the five boroughs of New York City.</w:t>
       </w:r>
     </w:p>
     <w:p>
@@ -2483,7 +4167,87 @@
           <w:sz w:val="20"/>
           <w:szCs w:val="20"/>
         </w:rPr>
-        <w:t>We calculated the trip frequency for each location by applying the value_counts() method to the PULocationID column. This allowed us to quantify the total number of pickups occurring within each specific taxi zone. We stored these results in a new DataFrame to serve as a frequency distribution table. By identifying these counts, we pinpointed the most and least active geographic areas in the dataset, providing a clear statistical basis for our subsequent spatial mapping and demand analysis.</w:t>
+        <w:t xml:space="preserve">We calculated the trip frequency for each location by applying the </w:t>
+      </w:r>
+      <w:proofErr w:type="spellStart"/>
+      <w:r>
+        <w:rPr>
+          <w:rFonts w:ascii="Aptos" w:hAnsi="Aptos"/>
+          <w:bCs/>
+          <w:sz w:val="20"/>
+          <w:szCs w:val="20"/>
+        </w:rPr>
+        <w:t>value_</w:t>
+      </w:r>
+      <w:proofErr w:type="gramStart"/>
+      <w:r>
+        <w:rPr>
+          <w:rFonts w:ascii="Aptos" w:hAnsi="Aptos"/>
+          <w:bCs/>
+          <w:sz w:val="20"/>
+          <w:szCs w:val="20"/>
+        </w:rPr>
+        <w:t>counts</w:t>
+      </w:r>
+      <w:proofErr w:type="spellEnd"/>
+      <w:r>
+        <w:rPr>
+          <w:rFonts w:ascii="Aptos" w:hAnsi="Aptos"/>
+          <w:bCs/>
+          <w:sz w:val="20"/>
+          <w:szCs w:val="20"/>
+        </w:rPr>
+        <w:t>(</w:t>
+      </w:r>
+      <w:proofErr w:type="gramEnd"/>
+      <w:r>
+        <w:rPr>
+          <w:rFonts w:ascii="Aptos" w:hAnsi="Aptos"/>
+          <w:bCs/>
+          <w:sz w:val="20"/>
+          <w:szCs w:val="20"/>
+        </w:rPr>
+        <w:t xml:space="preserve">) method to the </w:t>
+      </w:r>
+      <w:proofErr w:type="spellStart"/>
+      <w:r>
+        <w:rPr>
+          <w:rFonts w:ascii="Aptos" w:hAnsi="Aptos"/>
+          <w:bCs/>
+          <w:sz w:val="20"/>
+          <w:szCs w:val="20"/>
+        </w:rPr>
+        <w:t>PULocationID</w:t>
+      </w:r>
+      <w:proofErr w:type="spellEnd"/>
+      <w:r>
+        <w:rPr>
+          <w:rFonts w:ascii="Aptos" w:hAnsi="Aptos"/>
+          <w:bCs/>
+          <w:sz w:val="20"/>
+          <w:szCs w:val="20"/>
+        </w:rPr>
+        <w:t xml:space="preserve"> column. This allowed us to quantify the total number of pickups occurring within each specific taxi zone. We stored these results in a new </w:t>
+      </w:r>
+      <w:proofErr w:type="spellStart"/>
+      <w:r>
+        <w:rPr>
+          <w:rFonts w:ascii="Aptos" w:hAnsi="Aptos"/>
+          <w:bCs/>
+          <w:sz w:val="20"/>
+          <w:szCs w:val="20"/>
+        </w:rPr>
+        <w:t>DataFrame</w:t>
+      </w:r>
+      <w:proofErr w:type="spellEnd"/>
+      <w:r>
+        <w:rPr>
+          <w:rFonts w:ascii="Aptos" w:hAnsi="Aptos"/>
+          <w:bCs/>
+          <w:sz w:val="20"/>
+          <w:szCs w:val="20"/>
+        </w:rPr>
+        <w:t xml:space="preserve"> to serve as a frequency distribution table. By identifying these counts, we pinpointed the most and least active geographic areas in the dataset, providing a clear statistical basis for our subsequent spatial mapping and demand analysis.</w:t>
       </w:r>
       <w:r>
         <w:rPr>
@@ -2511,8 +4275,17 @@
           <w:rFonts w:ascii="Aptos" w:hAnsi="Aptos"/>
           <w:b/>
         </w:rPr>
-        <w:t>Add the number of trips for each zone to the zones dataframe</w:t>
-      </w:r>
+        <w:t xml:space="preserve">Add the number of trips for each zone to the zones </w:t>
+      </w:r>
+      <w:proofErr w:type="spellStart"/>
+      <w:r>
+        <w:rPr>
+          <w:rFonts w:ascii="Aptos" w:hAnsi="Aptos"/>
+          <w:b/>
+        </w:rPr>
+        <w:t>dataframe</w:t>
+      </w:r>
+      <w:proofErr w:type="spellEnd"/>
       <w:r>
         <w:rPr>
           <w:rFonts w:ascii="Aptos" w:hAnsi="Aptos"/>
@@ -2527,7 +4300,67 @@
           <w:sz w:val="20"/>
           <w:szCs w:val="20"/>
         </w:rPr>
-        <w:t>We integrated the trip counts into our spatial dataset by merging the frequency table with the taxi zones GeoDataFrame. We used a left join on the LocationID column to ensure that every geographic zone retained its boundary data while gaining a new attribute for trip volume. We filled any resulting null values with zero to represent zones with no recorded activity. This combined structure enabled us to link statistical trip data directly with physical map coordinates for visualization.</w:t>
+        <w:t xml:space="preserve">We integrated the trip counts into our spatial dataset by merging the frequency table with the taxi zones </w:t>
+      </w:r>
+      <w:proofErr w:type="spellStart"/>
+      <w:r>
+        <w:rPr>
+          <w:rFonts w:ascii="Aptos" w:hAnsi="Aptos"/>
+          <w:bCs/>
+          <w:sz w:val="20"/>
+          <w:szCs w:val="20"/>
+        </w:rPr>
+        <w:t>GeoDataFrame</w:t>
+      </w:r>
+      <w:proofErr w:type="spellEnd"/>
+      <w:r>
+        <w:rPr>
+          <w:rFonts w:ascii="Aptos" w:hAnsi="Aptos"/>
+          <w:bCs/>
+          <w:sz w:val="20"/>
+          <w:szCs w:val="20"/>
+        </w:rPr>
+        <w:t xml:space="preserve">. We used a left </w:t>
+      </w:r>
+      <w:proofErr w:type="gramStart"/>
+      <w:r>
+        <w:rPr>
+          <w:rFonts w:ascii="Aptos" w:hAnsi="Aptos"/>
+          <w:bCs/>
+          <w:sz w:val="20"/>
+          <w:szCs w:val="20"/>
+        </w:rPr>
+        <w:t>join</w:t>
+      </w:r>
+      <w:proofErr w:type="gramEnd"/>
+      <w:r>
+        <w:rPr>
+          <w:rFonts w:ascii="Aptos" w:hAnsi="Aptos"/>
+          <w:bCs/>
+          <w:sz w:val="20"/>
+          <w:szCs w:val="20"/>
+        </w:rPr>
+        <w:t xml:space="preserve"> on the </w:t>
+      </w:r>
+      <w:proofErr w:type="spellStart"/>
+      <w:r>
+        <w:rPr>
+          <w:rFonts w:ascii="Aptos" w:hAnsi="Aptos"/>
+          <w:bCs/>
+          <w:sz w:val="20"/>
+          <w:szCs w:val="20"/>
+        </w:rPr>
+        <w:t>LocationID</w:t>
+      </w:r>
+      <w:proofErr w:type="spellEnd"/>
+      <w:r>
+        <w:rPr>
+          <w:rFonts w:ascii="Aptos" w:hAnsi="Aptos"/>
+          <w:bCs/>
+          <w:sz w:val="20"/>
+          <w:szCs w:val="20"/>
+        </w:rPr>
+        <w:t xml:space="preserve"> column to ensure that every geographic zone retained its boundary data while gaining a new attribute for trip volume. We filled any resulting null values with zero to represent zones with no recorded activity. This combined structure enabled us to link statistical trip data directly with physical map coordinates for visualization.</w:t>
       </w:r>
     </w:p>
     <w:p>
@@ -2580,7 +4413,7 @@
                     </pic:cNvPicPr>
                   </pic:nvPicPr>
                   <pic:blipFill>
-                    <a:blip r:embed="rId12" cstate="print">
+                    <a:blip r:embed="rId15" cstate="print">
                       <a:extLst>
                         <a:ext uri="{28A0092B-C50C-407E-A947-70E740481C1C}">
                           <a14:useLocalDpi xmlns:a14="http://schemas.microsoft.com/office/drawing/2010/main" val="0"/>
@@ -2622,22 +4455,50 @@
         <w:rPr>
           <w:rFonts w:ascii="Aptos" w:hAnsi="Aptos"/>
           <w:bCs/>
-        </w:rPr>
-        <w:t>We visualized the geographic distribution of taxi demand by creating a choropleth map using the geopandas library. We plotted the taxi zones and used a color gradient to represent the trip counts added in the previous step. By utilizing the plot() function with a defined color map, we highlighted high-density pickup areas, such as Manhattan and major airports. This map provided an intuitive overview of NYC's transit hubs, making it easy to identify spatial clusters of high passenger activity.</w:t>
-      </w:r>
-      <w:r>
-        <w:rPr>
-          <w:rFonts w:ascii="Aptos" w:hAnsi="Aptos"/>
-          <w:bCs/>
-        </w:rPr>
-        <w:br/>
-      </w:r>
-      <w:r>
-        <w:rPr>
-          <w:rFonts w:ascii="Aptos" w:hAnsi="Aptos"/>
-          <w:b/>
-        </w:rPr>
-        <w:br/>
+          <w:sz w:val="20"/>
+          <w:szCs w:val="20"/>
+        </w:rPr>
+        <w:t xml:space="preserve">We visualized the geographic distribution of taxi demand by creating a choropleth map using the </w:t>
+      </w:r>
+      <w:proofErr w:type="spellStart"/>
+      <w:r>
+        <w:rPr>
+          <w:rFonts w:ascii="Aptos" w:hAnsi="Aptos"/>
+          <w:bCs/>
+          <w:sz w:val="20"/>
+          <w:szCs w:val="20"/>
+        </w:rPr>
+        <w:t>geopandas</w:t>
+      </w:r>
+      <w:proofErr w:type="spellEnd"/>
+      <w:r>
+        <w:rPr>
+          <w:rFonts w:ascii="Aptos" w:hAnsi="Aptos"/>
+          <w:bCs/>
+          <w:sz w:val="20"/>
+          <w:szCs w:val="20"/>
+        </w:rPr>
+        <w:t xml:space="preserve"> library. We plotted the taxi zones and used a color gradient to represent the trip counts added in the previous step. By utilizing the </w:t>
+      </w:r>
+      <w:proofErr w:type="gramStart"/>
+      <w:r>
+        <w:rPr>
+          <w:rFonts w:ascii="Aptos" w:hAnsi="Aptos"/>
+          <w:bCs/>
+          <w:sz w:val="20"/>
+          <w:szCs w:val="20"/>
+        </w:rPr>
+        <w:t>plot(</w:t>
+      </w:r>
+      <w:proofErr w:type="gramEnd"/>
+      <w:r>
+        <w:rPr>
+          <w:rFonts w:ascii="Aptos" w:hAnsi="Aptos"/>
+          <w:bCs/>
+          <w:sz w:val="20"/>
+          <w:szCs w:val="20"/>
+        </w:rPr>
+        <w:t>) function with a defined color map, we highlighted high-density pickup areas, such as Manhattan and major airports. This map provided an intuitive overview of NYC's transit hubs, making it easy to identify spatial clusters of high passenger activity.</w:t>
       </w:r>
     </w:p>
     <w:p>
@@ -2650,6 +4511,8 @@
         <w:rPr>
           <w:rFonts w:ascii="Aptos" w:hAnsi="Aptos"/>
           <w:b/>
+          <w:sz w:val="20"/>
+          <w:szCs w:val="20"/>
         </w:rPr>
       </w:pPr>
       <w:r>
@@ -2670,6 +4533,8 @@
         <w:rPr>
           <w:rFonts w:ascii="Aptos" w:hAnsi="Aptos"/>
           <w:bCs/>
+          <w:sz w:val="20"/>
+          <w:szCs w:val="20"/>
         </w:rPr>
         <w:t xml:space="preserve">We concluded that taxi activity in New York City is heavily concentrated in Manhattan and at major transportation hubs like JFK and LaGuardia airports. Our analysis confirmed that demand follows a highly predictable temporal and spatial pattern, peaking during evening rush hours in commercial districts. We identified significant correlations between fare amounts and trip distances, while also noting that credit card payments dominate the market. </w:t>
       </w:r>
@@ -2745,8 +4610,83 @@
           <w:rFonts w:ascii="Aptos" w:hAnsi="Aptos"/>
           <w:bCs/>
         </w:rPr>
-        <w:t xml:space="preserve">       PULocationID  DOLocationID  pickup_hour  speed_mph</w:t>
-      </w:r>
+        <w:t xml:space="preserve">       </w:t>
+      </w:r>
+      <w:proofErr w:type="spellStart"/>
+      <w:proofErr w:type="gramStart"/>
+      <w:r>
+        <w:rPr>
+          <w:rFonts w:ascii="Aptos" w:hAnsi="Aptos"/>
+          <w:bCs/>
+        </w:rPr>
+        <w:t>PULocationID</w:t>
+      </w:r>
+      <w:proofErr w:type="spellEnd"/>
+      <w:r>
+        <w:rPr>
+          <w:rFonts w:ascii="Aptos" w:hAnsi="Aptos"/>
+          <w:bCs/>
+        </w:rPr>
+        <w:t xml:space="preserve">  </w:t>
+      </w:r>
+      <w:proofErr w:type="spellStart"/>
+      <w:r>
+        <w:rPr>
+          <w:rFonts w:ascii="Aptos" w:hAnsi="Aptos"/>
+          <w:bCs/>
+        </w:rPr>
+        <w:t>DOLocationID</w:t>
+      </w:r>
+      <w:proofErr w:type="spellEnd"/>
+      <w:proofErr w:type="gramEnd"/>
+      <w:r>
+        <w:rPr>
+          <w:rFonts w:ascii="Aptos" w:hAnsi="Aptos"/>
+          <w:bCs/>
+        </w:rPr>
+        <w:t xml:space="preserve">  </w:t>
+      </w:r>
+      <w:proofErr w:type="spellStart"/>
+      <w:r>
+        <w:rPr>
+          <w:rFonts w:ascii="Aptos" w:hAnsi="Aptos"/>
+          <w:bCs/>
+        </w:rPr>
+        <w:t>pickup_</w:t>
+      </w:r>
+      <w:proofErr w:type="gramStart"/>
+      <w:r>
+        <w:rPr>
+          <w:rFonts w:ascii="Aptos" w:hAnsi="Aptos"/>
+          <w:bCs/>
+        </w:rPr>
+        <w:t>hour</w:t>
+      </w:r>
+      <w:proofErr w:type="spellEnd"/>
+      <w:r>
+        <w:rPr>
+          <w:rFonts w:ascii="Aptos" w:hAnsi="Aptos"/>
+          <w:bCs/>
+        </w:rPr>
+        <w:t xml:space="preserve">  </w:t>
+      </w:r>
+      <w:proofErr w:type="spellStart"/>
+      <w:r>
+        <w:rPr>
+          <w:rFonts w:ascii="Aptos" w:hAnsi="Aptos"/>
+          <w:bCs/>
+        </w:rPr>
+        <w:t>speed</w:t>
+      </w:r>
+      <w:proofErr w:type="gramEnd"/>
+      <w:r>
+        <w:rPr>
+          <w:rFonts w:ascii="Aptos" w:hAnsi="Aptos"/>
+          <w:bCs/>
+        </w:rPr>
+        <w:t>_mph</w:t>
+      </w:r>
+      <w:proofErr w:type="spellEnd"/>
     </w:p>
     <w:p>
       <w:pPr>
@@ -2779,7 +4719,6 @@
           <w:rFonts w:ascii="Aptos" w:hAnsi="Aptos"/>
           <w:bCs/>
         </w:rPr>
-        <w:lastRenderedPageBreak/>
         <w:t>54308           140           216           14        0.0</w:t>
       </w:r>
     </w:p>
@@ -2814,6 +4753,7 @@
           <w:rFonts w:ascii="Aptos" w:hAnsi="Aptos"/>
           <w:bCs/>
         </w:rPr>
+        <w:lastRenderedPageBreak/>
         <w:t>31113           100            55            0        0.0</w:t>
       </w:r>
     </w:p>
@@ -2847,8 +4787,30 @@
         <w:rPr>
           <w:rFonts w:ascii="Aptos" w:hAnsi="Aptos"/>
           <w:bCs/>
-        </w:rPr>
-        <w:t>We identified slow-moving routes by first calculating the duration of each trip and then dividing the trip_distance by this time to determine the average speed. We grouped these results by pickup and drop-off location pairs to find routes with consistently low speeds. This analysis allowed us to isolate areas affected by heavy traffic congestion or infrastructure bottlenecks. By highlighting these "slow routes," we provided insights that could help drivers avoid inefficient paths and improve overall trip turnaround times.</w:t>
+          <w:sz w:val="20"/>
+          <w:szCs w:val="20"/>
+        </w:rPr>
+        <w:t xml:space="preserve">We identified slow-moving routes by first calculating the duration of each trip and then dividing the </w:t>
+      </w:r>
+      <w:proofErr w:type="spellStart"/>
+      <w:r>
+        <w:rPr>
+          <w:rFonts w:ascii="Aptos" w:hAnsi="Aptos"/>
+          <w:bCs/>
+          <w:sz w:val="20"/>
+          <w:szCs w:val="20"/>
+        </w:rPr>
+        <w:t>trip_distance</w:t>
+      </w:r>
+      <w:proofErr w:type="spellEnd"/>
+      <w:r>
+        <w:rPr>
+          <w:rFonts w:ascii="Aptos" w:hAnsi="Aptos"/>
+          <w:bCs/>
+          <w:sz w:val="20"/>
+          <w:szCs w:val="20"/>
+        </w:rPr>
+        <w:t xml:space="preserve"> by this time to determine the average speed. We grouped these results by pickup and drop-off location pairs to find routes with consistently low speeds. This analysis allowed us to isolate areas affected by heavy traffic congestion or infrastructure bottlenecks. By highlighting these "slow routes," we provided insights that could help drivers avoid inefficient paths and improve overall trip turnaround times.</w:t>
       </w:r>
       <w:r>
         <w:rPr>
@@ -2895,7 +4857,7 @@
           <w:noProof/>
         </w:rPr>
         <w:drawing>
-          <wp:inline distT="0" distB="0" distL="0" distR="0" wp14:anchorId="53EB121D" wp14:editId="51EC21F3">
+          <wp:inline distT="0" distB="0" distL="0" distR="0" wp14:anchorId="53EB121D" wp14:editId="07E660F2">
             <wp:extent cx="4209898" cy="2091006"/>
             <wp:effectExtent l="0" t="0" r="635" b="5080"/>
             <wp:docPr id="800869824" name="Picture 9"/>
@@ -2912,7 +4874,7 @@
                     </pic:cNvPicPr>
                   </pic:nvPicPr>
                   <pic:blipFill>
-                    <a:blip r:embed="rId13" cstate="print">
+                    <a:blip r:embed="rId16" cstate="print">
                       <a:extLst>
                         <a:ext uri="{28A0092B-C50C-407E-A947-70E740481C1C}">
                           <a14:useLocalDpi xmlns:a14="http://schemas.microsoft.com/office/drawing/2010/main" val="0"/>
@@ -3166,7 +5128,6 @@
           <w:rFonts w:ascii="Aptos" w:hAnsi="Aptos"/>
           <w:b/>
         </w:rPr>
-        <w:lastRenderedPageBreak/>
         <w:br/>
       </w:r>
     </w:p>
@@ -3186,6 +5147,7 @@
           <w:rFonts w:ascii="Aptos" w:hAnsi="Aptos"/>
           <w:b/>
         </w:rPr>
+        <w:lastRenderedPageBreak/>
         <w:t>Compare hourly traffic on weekdays and weekends</w:t>
       </w:r>
       <w:r>
@@ -3217,7 +5179,7 @@
                     </pic:cNvPicPr>
                   </pic:nvPicPr>
                   <pic:blipFill>
-                    <a:blip r:embed="rId14" cstate="print">
+                    <a:blip r:embed="rId17" cstate="print">
                       <a:extLst>
                         <a:ext uri="{28A0092B-C50C-407E-A947-70E740481C1C}">
                           <a14:useLocalDpi xmlns:a14="http://schemas.microsoft.com/office/drawing/2010/main" val="0"/>
@@ -3333,7 +5295,7 @@
                     </pic:cNvPicPr>
                   </pic:nvPicPr>
                   <pic:blipFill>
-                    <a:blip r:embed="rId15" cstate="print">
+                    <a:blip r:embed="rId18" cstate="print">
                       <a:extLst>
                         <a:ext uri="{28A0092B-C50C-407E-A947-70E740481C1C}">
                           <a14:useLocalDpi xmlns:a14="http://schemas.microsoft.com/office/drawing/2010/main" val="0"/>
@@ -3401,7 +5363,7 @@
                     </pic:cNvPicPr>
                   </pic:nvPicPr>
                   <pic:blipFill>
-                    <a:blip r:embed="rId16" cstate="print">
+                    <a:blip r:embed="rId19" cstate="print">
                       <a:extLst>
                         <a:ext uri="{28A0092B-C50C-407E-A947-70E740481C1C}">
                           <a14:useLocalDpi xmlns:a14="http://schemas.microsoft.com/office/drawing/2010/main" val="0"/>
@@ -3449,7 +5411,25 @@
           <w:sz w:val="20"/>
           <w:szCs w:val="20"/>
         </w:rPr>
-        <w:t>We identified the top 10 most active zones by aggregating the total number of pickups and drop-offs for each LocationID. We sorted these totals in descending order to isolate the highest-traffic areas, which primarily included Midtown Manhattan and the airports. By focusing on these specific zones, we pinpointed the core hubs of the NYC taxi ecosystem. This ranking provides a strategic roadmap for drivers looking to maximize their chances of finding consecutive passengers in high-demand neighborhoods.</w:t>
+        <w:t xml:space="preserve">We identified the top 10 most active zones by aggregating the total number of pickups and drop-offs for each </w:t>
+      </w:r>
+      <w:proofErr w:type="spellStart"/>
+      <w:r>
+        <w:rPr>
+          <w:rFonts w:ascii="Aptos" w:hAnsi="Aptos"/>
+          <w:sz w:val="20"/>
+          <w:szCs w:val="20"/>
+        </w:rPr>
+        <w:t>LocationID</w:t>
+      </w:r>
+      <w:proofErr w:type="spellEnd"/>
+      <w:r>
+        <w:rPr>
+          <w:rFonts w:ascii="Aptos" w:hAnsi="Aptos"/>
+          <w:sz w:val="20"/>
+          <w:szCs w:val="20"/>
+        </w:rPr>
+        <w:t>. We sorted these totals in descending order to isolate the highest-traffic areas, which primarily included Midtown Manhattan and the airports. By focusing on these specific zones, we pinpointed the core hubs of the NYC taxi ecosystem. This ranking provides a strategic roadmap for drivers looking to maximize their chances of finding consecutive passengers in high-demand neighborhoods.</w:t>
       </w:r>
     </w:p>
     <w:p>
@@ -3470,7 +5450,23 @@
           <w:rFonts w:ascii="Aptos" w:hAnsi="Aptos"/>
           <w:b/>
         </w:rPr>
-        <w:t>Find the ratio of pickups and dropoffs in each zone</w:t>
+        <w:t xml:space="preserve">Find the ratio of pickups and </w:t>
+      </w:r>
+      <w:proofErr w:type="spellStart"/>
+      <w:r>
+        <w:rPr>
+          <w:rFonts w:ascii="Aptos" w:hAnsi="Aptos"/>
+          <w:b/>
+        </w:rPr>
+        <w:t>dropoffs</w:t>
+      </w:r>
+      <w:proofErr w:type="spellEnd"/>
+      <w:r>
+        <w:rPr>
+          <w:rFonts w:ascii="Aptos" w:hAnsi="Aptos"/>
+          <w:b/>
+        </w:rPr>
+        <w:t xml:space="preserve"> in each zone</w:t>
       </w:r>
       <w:r>
         <w:rPr>
@@ -3545,7 +5541,7 @@
                     </pic:cNvPicPr>
                   </pic:nvPicPr>
                   <pic:blipFill>
-                    <a:blip r:embed="rId17" cstate="print">
+                    <a:blip r:embed="rId20" cstate="print">
                       <a:extLst>
                         <a:ext uri="{28A0092B-C50C-407E-A947-70E740481C1C}">
                           <a14:useLocalDpi xmlns:a14="http://schemas.microsoft.com/office/drawing/2010/main" val="0"/>
@@ -3659,7 +5655,7 @@
                     </pic:cNvPicPr>
                   </pic:nvPicPr>
                   <pic:blipFill>
-                    <a:blip r:embed="rId18">
+                    <a:blip r:embed="rId21">
                       <a:extLst>
                         <a:ext uri="{28A0092B-C50C-407E-A947-70E740481C1C}">
                           <a14:useLocalDpi xmlns:a14="http://schemas.microsoft.com/office/drawing/2010/main" val="0"/>
@@ -3707,7 +5703,25 @@
           <w:sz w:val="20"/>
           <w:szCs w:val="20"/>
         </w:rPr>
-        <w:t>We determined the revenue distribution by summing the total_amount for trips classified as "day" (6 AM - 8 PM) and "night" (8 PM - 6 AM). We then calculated the percentage share for each period. Although daytime hours account for a higher volume of trips, we analyzed the average revenue per trip to see if nighttime premiums or surcharges significantly impacted the total share. This comparison helped us evaluate the financial viability of different shifts and the impact of time-based pricing on overall earnings.</w:t>
+        <w:t xml:space="preserve">We determined the revenue distribution by summing the </w:t>
+      </w:r>
+      <w:proofErr w:type="spellStart"/>
+      <w:r>
+        <w:rPr>
+          <w:rFonts w:ascii="Aptos" w:hAnsi="Aptos"/>
+          <w:sz w:val="20"/>
+          <w:szCs w:val="20"/>
+        </w:rPr>
+        <w:t>total_amount</w:t>
+      </w:r>
+      <w:proofErr w:type="spellEnd"/>
+      <w:r>
+        <w:rPr>
+          <w:rFonts w:ascii="Aptos" w:hAnsi="Aptos"/>
+          <w:sz w:val="20"/>
+          <w:szCs w:val="20"/>
+        </w:rPr>
+        <w:t xml:space="preserve"> for trips classified as "day" (6 AM - 8 PM) and "night" (8 PM - 6 AM). We then calculated the percentage share for each period. Although daytime hours account for a higher volume of trips, we analyzed the average revenue per trip to see if nighttime premiums or surcharges significantly impacted the total share. This comparison helped us evaluate the financial viability of different shifts and the impact of time-based pricing on overall earnings.</w:t>
       </w:r>
     </w:p>
     <w:p>
@@ -3764,7 +5778,7 @@
                     </pic:cNvPicPr>
                   </pic:nvPicPr>
                   <pic:blipFill>
-                    <a:blip r:embed="rId19">
+                    <a:blip r:embed="rId22">
                       <a:extLst>
                         <a:ext uri="{28A0092B-C50C-407E-A947-70E740481C1C}">
                           <a14:useLocalDpi xmlns:a14="http://schemas.microsoft.com/office/drawing/2010/main" val="0"/>
@@ -3815,7 +5829,79 @@
           <w:sz w:val="20"/>
           <w:szCs w:val="20"/>
         </w:rPr>
-        <w:t>We calculated the economic efficiency of trips by dividing the fare_amount by the product of trip_distance and passenger_count. We grouped these results to compare how the cost-per-mile changes as the number of passengers increases. This analysis revealed how "ride-sharing" within a single taxi affects the individual cost for riders. By examining these averages, we assessed the value proposition of taxi travel for groups versus solo travelers, providing a clearer picture of passenger behavior and fare structures.</w:t>
+        <w:t xml:space="preserve">We calculated the economic efficiency of trips by dividing the </w:t>
+      </w:r>
+      <w:proofErr w:type="spellStart"/>
+      <w:r>
+        <w:rPr>
+          <w:rFonts w:ascii="Aptos" w:hAnsi="Aptos"/>
+          <w:sz w:val="20"/>
+          <w:szCs w:val="20"/>
+        </w:rPr>
+        <w:t>fare_amount</w:t>
+      </w:r>
+      <w:proofErr w:type="spellEnd"/>
+      <w:r>
+        <w:rPr>
+          <w:rFonts w:ascii="Aptos" w:hAnsi="Aptos"/>
+          <w:sz w:val="20"/>
+          <w:szCs w:val="20"/>
+        </w:rPr>
+        <w:t xml:space="preserve"> by the product of </w:t>
+      </w:r>
+      <w:proofErr w:type="spellStart"/>
+      <w:r>
+        <w:rPr>
+          <w:rFonts w:ascii="Aptos" w:hAnsi="Aptos"/>
+          <w:sz w:val="20"/>
+          <w:szCs w:val="20"/>
+        </w:rPr>
+        <w:t>trip_distance</w:t>
+      </w:r>
+      <w:proofErr w:type="spellEnd"/>
+      <w:r>
+        <w:rPr>
+          <w:rFonts w:ascii="Aptos" w:hAnsi="Aptos"/>
+          <w:sz w:val="20"/>
+          <w:szCs w:val="20"/>
+        </w:rPr>
+        <w:t xml:space="preserve"> and </w:t>
+      </w:r>
+      <w:proofErr w:type="spellStart"/>
+      <w:r>
+        <w:rPr>
+          <w:rFonts w:ascii="Aptos" w:hAnsi="Aptos"/>
+          <w:sz w:val="20"/>
+          <w:szCs w:val="20"/>
+        </w:rPr>
+        <w:t>passenger_count</w:t>
+      </w:r>
+      <w:proofErr w:type="spellEnd"/>
+      <w:r>
+        <w:rPr>
+          <w:rFonts w:ascii="Aptos" w:hAnsi="Aptos"/>
+          <w:sz w:val="20"/>
+          <w:szCs w:val="20"/>
+        </w:rPr>
+        <w:t>. We grouped these results to compare how the cost-per-mile changes as the number of passengers increases. This analysis revealed how "</w:t>
+      </w:r>
+      <w:proofErr w:type="gramStart"/>
+      <w:r>
+        <w:rPr>
+          <w:rFonts w:ascii="Aptos" w:hAnsi="Aptos"/>
+          <w:sz w:val="20"/>
+          <w:szCs w:val="20"/>
+        </w:rPr>
+        <w:t>ride-sharing</w:t>
+      </w:r>
+      <w:proofErr w:type="gramEnd"/>
+      <w:r>
+        <w:rPr>
+          <w:rFonts w:ascii="Aptos" w:hAnsi="Aptos"/>
+          <w:sz w:val="20"/>
+          <w:szCs w:val="20"/>
+        </w:rPr>
+        <w:t>" within a single taxi affects the individual cost for riders. By examining these averages, we assessed the value proposition of taxi travel for groups versus solo travelers, providing a clearer picture of passenger behavior and fare structures.</w:t>
       </w:r>
     </w:p>
     <w:p>
@@ -3874,13 +5960,22 @@
           <w:rFonts w:ascii="Aptos" w:hAnsi="Aptos"/>
         </w:rPr>
       </w:pPr>
+      <w:proofErr w:type="spellStart"/>
       <w:r>
         <w:rPr>
           <w:rFonts w:ascii="Aptos" w:hAnsi="Aptos"/>
           <w:b/>
         </w:rPr>
         <w:lastRenderedPageBreak/>
-        <w:t>Analyse the average fare per mile for the different vendors</w:t>
+        <w:t>Analyse</w:t>
+      </w:r>
+      <w:proofErr w:type="spellEnd"/>
+      <w:r>
+        <w:rPr>
+          <w:rFonts w:ascii="Aptos" w:hAnsi="Aptos"/>
+          <w:b/>
+        </w:rPr>
+        <w:t xml:space="preserve"> the average fare per mile for the different vendors</w:t>
       </w:r>
       <w:r>
         <w:rPr>
@@ -3911,7 +6006,7 @@
                     </pic:cNvPicPr>
                   </pic:nvPicPr>
                   <pic:blipFill>
-                    <a:blip r:embed="rId20" cstate="print">
+                    <a:blip r:embed="rId23" cstate="print">
                       <a:extLst>
                         <a:ext uri="{28A0092B-C50C-407E-A947-70E740481C1C}">
                           <a14:useLocalDpi xmlns:a14="http://schemas.microsoft.com/office/drawing/2010/main" val="0"/>
@@ -3957,19 +6052,45 @@
         <w:rPr>
           <w:rFonts w:ascii="Aptos" w:hAnsi="Aptos"/>
           <w:bCs/>
-        </w:rPr>
-      </w:pPr>
-      <w:r>
-        <w:rPr>
-          <w:rFonts w:ascii="Aptos" w:hAnsi="Aptos"/>
-          <w:bCs/>
-        </w:rPr>
-        <w:t>We compared the pricing efficiency of different taxi companies by calculating the average fare per mile for each VendorID. By grouping the data by vendor, we looked for significant variations in how they charge for distance. Our analysis aimed to determine if one vendor consistently handled more lucrative or efficient routes than others. This comparison ensures a fair assessment of performance across the fleet and helps identify if specific operational practices lead to better financial outcomes for different providers.</w:t>
-      </w:r>
-      <w:r>
-        <w:rPr>
-          <w:rFonts w:ascii="Aptos" w:hAnsi="Aptos"/>
-          <w:bCs/>
+          <w:sz w:val="20"/>
+          <w:szCs w:val="20"/>
+        </w:rPr>
+      </w:pPr>
+      <w:r>
+        <w:rPr>
+          <w:rFonts w:ascii="Aptos" w:hAnsi="Aptos"/>
+          <w:bCs/>
+          <w:sz w:val="20"/>
+          <w:szCs w:val="20"/>
+        </w:rPr>
+        <w:t xml:space="preserve">We compared the pricing efficiency of different taxi companies by calculating the average fare per mile for each </w:t>
+      </w:r>
+      <w:proofErr w:type="spellStart"/>
+      <w:r>
+        <w:rPr>
+          <w:rFonts w:ascii="Aptos" w:hAnsi="Aptos"/>
+          <w:bCs/>
+          <w:sz w:val="20"/>
+          <w:szCs w:val="20"/>
+        </w:rPr>
+        <w:t>VendorID</w:t>
+      </w:r>
+      <w:proofErr w:type="spellEnd"/>
+      <w:r>
+        <w:rPr>
+          <w:rFonts w:ascii="Aptos" w:hAnsi="Aptos"/>
+          <w:bCs/>
+          <w:sz w:val="20"/>
+          <w:szCs w:val="20"/>
+        </w:rPr>
+        <w:t>. By grouping the data by vendor, we looked for significant variations in how they charge for distance. Our analysis aimed to determine if one vendor consistently handled more lucrative or efficient routes than others. This comparison ensures a fair assessment of performance across the fleet and helps identify if specific operational practices lead to better financial outcomes for different providers.</w:t>
+      </w:r>
+      <w:r>
+        <w:rPr>
+          <w:rFonts w:ascii="Aptos" w:hAnsi="Aptos"/>
+          <w:bCs/>
+          <w:sz w:val="20"/>
+          <w:szCs w:val="20"/>
         </w:rPr>
         <w:br/>
       </w:r>
@@ -4023,7 +6144,7 @@
                     </pic:cNvPicPr>
                   </pic:nvPicPr>
                   <pic:blipFill>
-                    <a:blip r:embed="rId21">
+                    <a:blip r:embed="rId24">
                       <a:extLst>
                         <a:ext uri="{28A0092B-C50C-407E-A947-70E740481C1C}">
                           <a14:useLocalDpi xmlns:a14="http://schemas.microsoft.com/office/drawing/2010/main" val="0"/>
@@ -4067,7 +6188,25 @@
           <w:sz w:val="20"/>
           <w:szCs w:val="20"/>
         </w:rPr>
-        <w:t xml:space="preserve">We performed a tiered analysis by binning trip_distance into categories (e.g., short, medium, long) and comparing the average fare rates for each vendor within those tiers. This approach allowed us to see if certain vendors are more cost-effective for specific trip lengths. We used this granular view to detect pricing anomalies that </w:t>
+        <w:t xml:space="preserve">We performed a tiered analysis by binning </w:t>
+      </w:r>
+      <w:proofErr w:type="spellStart"/>
+      <w:r>
+        <w:rPr>
+          <w:rFonts w:ascii="Aptos" w:hAnsi="Aptos"/>
+          <w:sz w:val="20"/>
+          <w:szCs w:val="20"/>
+        </w:rPr>
+        <w:t>trip_distance</w:t>
+      </w:r>
+      <w:proofErr w:type="spellEnd"/>
+      <w:r>
+        <w:rPr>
+          <w:rFonts w:ascii="Aptos" w:hAnsi="Aptos"/>
+          <w:sz w:val="20"/>
+          <w:szCs w:val="20"/>
+        </w:rPr>
+        <w:t xml:space="preserve"> into categories (e.g., short, medium, long) and comparing the average fare rates for each vendor within those tiers. This approach allowed us to see if certain vendors are more cost-effective for specific trip lengths. We used this granular view to detect pricing anomalies that might be hidden in a global average. By comparing vendors across distance tiers, </w:t>
       </w:r>
       <w:r>
         <w:rPr>
@@ -4076,7 +6215,7 @@
           <w:szCs w:val="20"/>
         </w:rPr>
         <w:lastRenderedPageBreak/>
-        <w:t>might be hidden in a global average. By comparing vendors across distance tiers, we gained a more nuanced understanding of the competitive landscape in the NYC taxi market.</w:t>
+        <w:t>we gained a more nuanced understanding of the competitive landscape in the NYC taxi market.</w:t>
       </w:r>
     </w:p>
     <w:p>
@@ -4090,12 +6229,21 @@
           <w:rFonts w:ascii="Aptos" w:hAnsi="Aptos"/>
         </w:rPr>
       </w:pPr>
-      <w:r>
-        <w:rPr>
-          <w:rFonts w:ascii="Aptos" w:hAnsi="Aptos"/>
-          <w:b/>
-        </w:rPr>
-        <w:t>Analyse the tip percentages</w:t>
+      <w:proofErr w:type="spellStart"/>
+      <w:r>
+        <w:rPr>
+          <w:rFonts w:ascii="Aptos" w:hAnsi="Aptos"/>
+          <w:b/>
+        </w:rPr>
+        <w:t>Analyse</w:t>
+      </w:r>
+      <w:proofErr w:type="spellEnd"/>
+      <w:r>
+        <w:rPr>
+          <w:rFonts w:ascii="Aptos" w:hAnsi="Aptos"/>
+          <w:b/>
+        </w:rPr>
+        <w:t xml:space="preserve"> the tip percentages</w:t>
       </w:r>
     </w:p>
     <w:p>
@@ -4111,7 +6259,7 @@
           <w:noProof/>
         </w:rPr>
         <w:drawing>
-          <wp:inline distT="0" distB="0" distL="0" distR="0" wp14:anchorId="383919C3" wp14:editId="6C13E2AE">
+          <wp:inline distT="0" distB="0" distL="0" distR="0" wp14:anchorId="383919C3" wp14:editId="17B7F95F">
             <wp:extent cx="4561028" cy="2265408"/>
             <wp:effectExtent l="0" t="0" r="0" b="1905"/>
             <wp:docPr id="227001894" name="Picture 17"/>
@@ -4128,7 +6276,7 @@
                     </pic:cNvPicPr>
                   </pic:nvPicPr>
                   <pic:blipFill>
-                    <a:blip r:embed="rId22" cstate="print">
+                    <a:blip r:embed="rId25" cstate="print">
                       <a:extLst>
                         <a:ext uri="{28A0092B-C50C-407E-A947-70E740481C1C}">
                           <a14:useLocalDpi xmlns:a14="http://schemas.microsoft.com/office/drawing/2010/main" val="0"/>
@@ -4173,7 +6321,47 @@
           <w:sz w:val="20"/>
           <w:szCs w:val="20"/>
         </w:rPr>
-        <w:t>We analyzed passenger tipping behavior by calculating the ratio of tip_amount to fare_amount for each trip. We excluded cash transactions where tips are often unrecorded to maintain data accuracy. We then visualized the distribution of these percentages and calculated the mean tip across different zones and times. This analysis allowed us to identify "high-tipping" areas and periods, providing drivers with valuable information on where and when they are likely to earn the highest gratuities.</w:t>
+        <w:t xml:space="preserve">We analyzed passenger tipping behavior by calculating the ratio of </w:t>
+      </w:r>
+      <w:proofErr w:type="spellStart"/>
+      <w:r>
+        <w:rPr>
+          <w:rFonts w:ascii="Aptos" w:hAnsi="Aptos"/>
+          <w:bCs/>
+          <w:sz w:val="20"/>
+          <w:szCs w:val="20"/>
+        </w:rPr>
+        <w:t>tip_amount</w:t>
+      </w:r>
+      <w:proofErr w:type="spellEnd"/>
+      <w:r>
+        <w:rPr>
+          <w:rFonts w:ascii="Aptos" w:hAnsi="Aptos"/>
+          <w:bCs/>
+          <w:sz w:val="20"/>
+          <w:szCs w:val="20"/>
+        </w:rPr>
+        <w:t xml:space="preserve"> to </w:t>
+      </w:r>
+      <w:proofErr w:type="spellStart"/>
+      <w:r>
+        <w:rPr>
+          <w:rFonts w:ascii="Aptos" w:hAnsi="Aptos"/>
+          <w:bCs/>
+          <w:sz w:val="20"/>
+          <w:szCs w:val="20"/>
+        </w:rPr>
+        <w:t>fare_amount</w:t>
+      </w:r>
+      <w:proofErr w:type="spellEnd"/>
+      <w:r>
+        <w:rPr>
+          <w:rFonts w:ascii="Aptos" w:hAnsi="Aptos"/>
+          <w:bCs/>
+          <w:sz w:val="20"/>
+          <w:szCs w:val="20"/>
+        </w:rPr>
+        <w:t xml:space="preserve"> for each trip. We excluded cash transactions where tips are often unrecorded to maintain data accuracy. We then visualized the distribution of these percentages and calculated the mean tip across different zones and times. This analysis allowed us to identify "high-tipping" areas and periods, providing drivers with valuable information on where and when they are likely to earn the highest gratuities.</w:t>
       </w:r>
       <w:r>
         <w:rPr>
@@ -4196,12 +6384,23 @@
           <w:rFonts w:ascii="Aptos" w:hAnsi="Aptos"/>
         </w:rPr>
       </w:pPr>
-      <w:r>
-        <w:rPr>
-          <w:rFonts w:ascii="Aptos" w:hAnsi="Aptos"/>
-          <w:b/>
-        </w:rPr>
-        <w:t>Analyse the trends in passenger count</w:t>
+      <w:proofErr w:type="spellStart"/>
+      <w:proofErr w:type="gramStart"/>
+      <w:r>
+        <w:rPr>
+          <w:rFonts w:ascii="Aptos" w:hAnsi="Aptos"/>
+          <w:b/>
+        </w:rPr>
+        <w:t>Analyse</w:t>
+      </w:r>
+      <w:proofErr w:type="spellEnd"/>
+      <w:proofErr w:type="gramEnd"/>
+      <w:r>
+        <w:rPr>
+          <w:rFonts w:ascii="Aptos" w:hAnsi="Aptos"/>
+          <w:b/>
+        </w:rPr>
+        <w:t xml:space="preserve"> the trends in passenger count</w:t>
       </w:r>
     </w:p>
     <w:p>
@@ -4217,7 +6416,7 @@
           <w:noProof/>
         </w:rPr>
         <w:drawing>
-          <wp:inline distT="0" distB="0" distL="0" distR="0" wp14:anchorId="133DBD67" wp14:editId="610085A5">
+          <wp:inline distT="0" distB="0" distL="0" distR="0" wp14:anchorId="133DBD67" wp14:editId="12A67A8C">
             <wp:extent cx="4166007" cy="2540997"/>
             <wp:effectExtent l="0" t="0" r="6350" b="0"/>
             <wp:docPr id="1779419317" name="Picture 18"/>
@@ -4234,7 +6433,7 @@
                     </pic:cNvPicPr>
                   </pic:nvPicPr>
                   <pic:blipFill>
-                    <a:blip r:embed="rId23" cstate="print">
+                    <a:blip r:embed="rId26" cstate="print">
                       <a:extLst>
                         <a:ext uri="{28A0092B-C50C-407E-A947-70E740481C1C}">
                           <a14:useLocalDpi xmlns:a14="http://schemas.microsoft.com/office/drawing/2010/main" val="0"/>
@@ -4279,7 +6478,47 @@
           <w:sz w:val="20"/>
           <w:szCs w:val="20"/>
         </w:rPr>
-        <w:t xml:space="preserve">We examined the social dynamics of taxi usage by analyzing the distribution and trends of the passenger_count variable. We observed that the vast majority of trips </w:t>
+        <w:t xml:space="preserve">We examined the social dynamics of taxi usage by analyzing the distribution and trends of the </w:t>
+      </w:r>
+      <w:proofErr w:type="spellStart"/>
+      <w:r>
+        <w:rPr>
+          <w:rFonts w:ascii="Aptos" w:hAnsi="Aptos"/>
+          <w:bCs/>
+          <w:sz w:val="20"/>
+          <w:szCs w:val="20"/>
+        </w:rPr>
+        <w:t>passenger_count</w:t>
+      </w:r>
+      <w:proofErr w:type="spellEnd"/>
+      <w:r>
+        <w:rPr>
+          <w:rFonts w:ascii="Aptos" w:hAnsi="Aptos"/>
+          <w:bCs/>
+          <w:sz w:val="20"/>
+          <w:szCs w:val="20"/>
+        </w:rPr>
+        <w:t xml:space="preserve"> variable. We observed that </w:t>
+      </w:r>
+      <w:proofErr w:type="gramStart"/>
+      <w:r>
+        <w:rPr>
+          <w:rFonts w:ascii="Aptos" w:hAnsi="Aptos"/>
+          <w:bCs/>
+          <w:sz w:val="20"/>
+          <w:szCs w:val="20"/>
+        </w:rPr>
+        <w:t>the vast majority of</w:t>
+      </w:r>
+      <w:proofErr w:type="gramEnd"/>
+      <w:r>
+        <w:rPr>
+          <w:rFonts w:ascii="Aptos" w:hAnsi="Aptos"/>
+          <w:bCs/>
+          <w:sz w:val="20"/>
+          <w:szCs w:val="20"/>
+        </w:rPr>
+        <w:t xml:space="preserve"> trips involve a single passenger, followed by small groups of two. We also tracked how </w:t>
       </w:r>
       <w:r>
         <w:rPr>
@@ -4289,7 +6528,7 @@
           <w:szCs w:val="20"/>
         </w:rPr>
         <w:lastRenderedPageBreak/>
-        <w:t>involve a single passenger, followed by small groups of two. We also tracked how these counts fluctuate by time of day, noting larger group sizes during late-night hours and weekends. By identifying these trends, we gained insights into the types of commuters using taxis, which helps in predicting vehicle size requirements and demand patterns.</w:t>
+        <w:t>these counts fluctuate by time of day, noting larger group sizes during late-night hours and weekends. By identifying these trends, we gained insights into the types of commuters using taxis, which helps in predicting vehicle size requirements and demand patterns.</w:t>
       </w:r>
       <w:r>
         <w:rPr>
@@ -4312,12 +6551,21 @@
           <w:rFonts w:ascii="Aptos" w:hAnsi="Aptos"/>
         </w:rPr>
       </w:pPr>
-      <w:r>
-        <w:rPr>
-          <w:rFonts w:ascii="Aptos" w:hAnsi="Aptos"/>
-          <w:b/>
-        </w:rPr>
-        <w:t>Analyse the variation of passenger counts across zones</w:t>
+      <w:proofErr w:type="spellStart"/>
+      <w:r>
+        <w:rPr>
+          <w:rFonts w:ascii="Aptos" w:hAnsi="Aptos"/>
+          <w:b/>
+        </w:rPr>
+        <w:t>Analyse</w:t>
+      </w:r>
+      <w:proofErr w:type="spellEnd"/>
+      <w:r>
+        <w:rPr>
+          <w:rFonts w:ascii="Aptos" w:hAnsi="Aptos"/>
+          <w:b/>
+        </w:rPr>
+        <w:t xml:space="preserve"> the variation of passenger counts across zones</w:t>
       </w:r>
     </w:p>
     <w:p>
@@ -4350,7 +6598,7 @@
                     </pic:cNvPicPr>
                   </pic:nvPicPr>
                   <pic:blipFill>
-                    <a:blip r:embed="rId24" cstate="print">
+                    <a:blip r:embed="rId27" cstate="print">
                       <a:extLst>
                         <a:ext uri="{28A0092B-C50C-407E-A947-70E740481C1C}">
                           <a14:useLocalDpi xmlns:a14="http://schemas.microsoft.com/office/drawing/2010/main" val="0"/>
@@ -4395,7 +6643,27 @@
           <w:sz w:val="20"/>
           <w:szCs w:val="20"/>
         </w:rPr>
-        <w:t>We investigated geographic differences in passenger behavior by calculating the average passenger_count for each pickup zone. We observed that certain areas, such as transit hubs and tourist attractions, tend to have higher average passenger counts compared to residential or business districts. This spatial analysis helped us identify where "group travel" is most common. By mapping these variations, we provided a better understanding of neighborhood-specific demand, which can guide the deployment of larger capacity vehicles to specific zones.</w:t>
+        <w:t xml:space="preserve">We investigated geographic differences in passenger behavior by calculating the average </w:t>
+      </w:r>
+      <w:proofErr w:type="spellStart"/>
+      <w:r>
+        <w:rPr>
+          <w:rFonts w:ascii="Aptos" w:hAnsi="Aptos"/>
+          <w:bCs/>
+          <w:sz w:val="20"/>
+          <w:szCs w:val="20"/>
+        </w:rPr>
+        <w:t>passenger_count</w:t>
+      </w:r>
+      <w:proofErr w:type="spellEnd"/>
+      <w:r>
+        <w:rPr>
+          <w:rFonts w:ascii="Aptos" w:hAnsi="Aptos"/>
+          <w:bCs/>
+          <w:sz w:val="20"/>
+          <w:szCs w:val="20"/>
+        </w:rPr>
+        <w:t xml:space="preserve"> for each pickup zone. We observed that certain areas, such as transit hubs and tourist attractions, tend to have higher average passenger counts compared to residential or business districts. This spatial analysis helped us identify where "group travel" is most common. By mapping these variations, we provided a better understanding of neighborhood-specific demand, which can guide the deployment of larger capacity vehicles to specific zones.</w:t>
       </w:r>
       <w:r>
         <w:rPr>
@@ -4430,7 +6698,35 @@
           <w:rFonts w:ascii="Aptos" w:hAnsi="Aptos"/>
           <w:b/>
         </w:rPr>
-        <w:t>Analyse the pickup/dropoff zones or times when extra charges are applied more frequently.</w:t>
+        <w:t>Analyze</w:t>
+      </w:r>
+      <w:r>
+        <w:rPr>
+          <w:rFonts w:ascii="Aptos" w:hAnsi="Aptos"/>
+          <w:b/>
+        </w:rPr>
+        <w:t xml:space="preserve"> the pickup/</w:t>
+      </w:r>
+      <w:r>
+        <w:rPr>
+          <w:rFonts w:ascii="Aptos" w:hAnsi="Aptos"/>
+          <w:b/>
+        </w:rPr>
+        <w:t xml:space="preserve"> </w:t>
+      </w:r>
+      <w:r>
+        <w:rPr>
+          <w:rFonts w:ascii="Aptos" w:hAnsi="Aptos"/>
+          <w:b/>
+        </w:rPr>
+        <w:t>drop-off</w:t>
+      </w:r>
+      <w:r>
+        <w:rPr>
+          <w:rFonts w:ascii="Aptos" w:hAnsi="Aptos"/>
+          <w:b/>
+        </w:rPr>
+        <w:t xml:space="preserve"> zones or times when extra charges are applied more frequently.</w:t>
       </w:r>
     </w:p>
     <w:p>
@@ -4464,7 +6760,7 @@
                     </pic:cNvPicPr>
                   </pic:nvPicPr>
                   <pic:blipFill>
-                    <a:blip r:embed="rId25">
+                    <a:blip r:embed="rId28">
                       <a:extLst>
                         <a:ext uri="{28A0092B-C50C-407E-A947-70E740481C1C}">
                           <a14:useLocalDpi xmlns:a14="http://schemas.microsoft.com/office/drawing/2010/main" val="0"/>
@@ -4512,7 +6808,27 @@
           <w:sz w:val="20"/>
           <w:szCs w:val="20"/>
         </w:rPr>
-        <w:t>We analyzed the application of additional fees by identifying the zones and time windows with the highest frequency of extra charges and congestion_surcharge. We found that these fees are most prevalent during weekday rush hours and for trips originating in the Manhattan congestion zone. By mapping these occurrences, we pinpointed the exact conditions under which passengers pay a premium. This analysis clarifies how regulatory surcharges impact the total cost of taxi services across different NYC neighborhoods and schedules.</w:t>
+        <w:t xml:space="preserve">We analyzed the application of additional fees by identifying the zones and time windows with the highest frequency of extra charges and </w:t>
+      </w:r>
+      <w:proofErr w:type="spellStart"/>
+      <w:r>
+        <w:rPr>
+          <w:rFonts w:ascii="Aptos" w:hAnsi="Aptos"/>
+          <w:bCs/>
+          <w:sz w:val="20"/>
+          <w:szCs w:val="20"/>
+        </w:rPr>
+        <w:t>congestion_surcharge</w:t>
+      </w:r>
+      <w:proofErr w:type="spellEnd"/>
+      <w:r>
+        <w:rPr>
+          <w:rFonts w:ascii="Aptos" w:hAnsi="Aptos"/>
+          <w:bCs/>
+          <w:sz w:val="20"/>
+          <w:szCs w:val="20"/>
+        </w:rPr>
+        <w:t>. We found that these fees are most prevalent during weekday rush hours and for trips originating in the Manhattan congestion zone. By mapping these occurrences, we pinpointed the exact conditions under which passengers pay a premium. This analysis clarifies how regulatory surcharges impact the total cost of taxi services across different NYC neighborhoods and schedules.</w:t>
       </w:r>
       <w:r>
         <w:rPr>
@@ -5011,7 +7327,23 @@
           <w:rFonts w:ascii="Aptos" w:hAnsi="Aptos"/>
           <w:b/>
         </w:rPr>
-        <w:t>Suggestions on strategically positioning cabs across different zones to make best use of insights uncovered by analysing trip trends across time, days and months.</w:t>
+        <w:t xml:space="preserve">Suggestions on strategically positioning cabs across different zones to make best use of insights uncovered by </w:t>
+      </w:r>
+      <w:proofErr w:type="spellStart"/>
+      <w:r>
+        <w:rPr>
+          <w:rFonts w:ascii="Aptos" w:hAnsi="Aptos"/>
+          <w:b/>
+        </w:rPr>
+        <w:t>analysing</w:t>
+      </w:r>
+      <w:proofErr w:type="spellEnd"/>
+      <w:r>
+        <w:rPr>
+          <w:rFonts w:ascii="Aptos" w:hAnsi="Aptos"/>
+          <w:b/>
+        </w:rPr>
+        <w:t xml:space="preserve"> trip trends across time, days and months.</w:t>
       </w:r>
     </w:p>
     <w:p>
@@ -5256,6 +7588,7 @@
         </w:rPr>
         <w:t>, especially during midday lulls when city-</w:t>
       </w:r>
+      <w:proofErr w:type="spellStart"/>
       <w:r>
         <w:rPr>
           <w:rFonts w:ascii="Aptos" w:hAnsi="Aptos"/>
@@ -5264,7 +7597,17 @@
           <w:lang w:val="en-GB"/>
         </w:rPr>
         <w:lastRenderedPageBreak/>
-        <w:t>center demand fluctuates. These hubs provide high-value, long-distance trips that stabilize daily earnings regardless of local traffic.</w:t>
+        <w:t>center</w:t>
+      </w:r>
+      <w:proofErr w:type="spellEnd"/>
+      <w:r>
+        <w:rPr>
+          <w:rFonts w:ascii="Aptos" w:hAnsi="Aptos"/>
+          <w:sz w:val="20"/>
+          <w:szCs w:val="20"/>
+          <w:lang w:val="en-GB"/>
+        </w:rPr>
+        <w:t xml:space="preserve"> demand fluctuates. These hubs provide high-value, long-distance trips that stabilize daily earnings regardless of local traffic.</w:t>
       </w:r>
     </w:p>
     <w:p>
@@ -5368,7 +7711,27 @@
           <w:szCs w:val="20"/>
           <w:lang w:val="en-GB"/>
         </w:rPr>
-        <w:t xml:space="preserve">We propose a </w:t>
+        <w:t>We</w:t>
+      </w:r>
+      <w:r>
+        <w:rPr>
+          <w:rFonts w:ascii="Aptos" w:hAnsi="Aptos"/>
+          <w:bCs/>
+          <w:sz w:val="20"/>
+          <w:szCs w:val="20"/>
+          <w:lang w:val="en-GB"/>
+        </w:rPr>
+        <w:t xml:space="preserve"> can</w:t>
+      </w:r>
+      <w:r>
+        <w:rPr>
+          <w:rFonts w:ascii="Aptos" w:hAnsi="Aptos"/>
+          <w:bCs/>
+          <w:sz w:val="20"/>
+          <w:szCs w:val="20"/>
+          <w:lang w:val="en-GB"/>
+        </w:rPr>
+        <w:t xml:space="preserve"> propose a </w:t>
       </w:r>
       <w:r>
         <w:rPr>
@@ -5560,7 +7923,29 @@
           <w:szCs w:val="20"/>
           <w:lang w:val="en-GB"/>
         </w:rPr>
-        <w:t>We suggest implementing "Zonal Flat-Rates" for high-traffic corridors, such as trips between Midtown Manhattan and major airports. By offering a predictable, competitive fixed fare for these premium routes, we can attract business travelers and tourists who might otherwise choose ride-sharing alternatives. This strategy stabilizes income and simplifies the payment process for our most lucrative trip types.</w:t>
+        <w:t xml:space="preserve">We suggest implementing "Zonal Flat-Rates" for high-traffic corridors, such as trips between Midtown Manhattan and major airports. By offering a predictable, competitive fixed fare for these premium routes, we can attract business </w:t>
+      </w:r>
+      <w:proofErr w:type="spellStart"/>
+      <w:r>
+        <w:rPr>
+          <w:rFonts w:ascii="Aptos" w:hAnsi="Aptos"/>
+          <w:bCs/>
+          <w:sz w:val="20"/>
+          <w:szCs w:val="20"/>
+          <w:lang w:val="en-GB"/>
+        </w:rPr>
+        <w:t>travelers</w:t>
+      </w:r>
+      <w:proofErr w:type="spellEnd"/>
+      <w:r>
+        <w:rPr>
+          <w:rFonts w:ascii="Aptos" w:hAnsi="Aptos"/>
+          <w:bCs/>
+          <w:sz w:val="20"/>
+          <w:szCs w:val="20"/>
+          <w:lang w:val="en-GB"/>
+        </w:rPr>
+        <w:t xml:space="preserve"> and tourists who might otherwise choose ride-sharing alternatives. This strategy stabilizes income and simplifies the payment process for our most lucrative trip types.</w:t>
       </w:r>
     </w:p>
     <w:p>
@@ -5672,6 +8057,7 @@
       </w:r>
     </w:p>
     <w:sectPr>
+      <w:footerReference w:type="default" r:id="rId29"/>
       <w:pgSz w:w="12240" w:h="15840"/>
       <w:pgMar w:top="1440" w:right="1440" w:bottom="1440" w:left="1440" w:header="720" w:footer="720" w:gutter="0"/>
       <w:pgNumType w:start="1"/>
@@ -5679,6 +8065,115 @@
     </w:sectPr>
   </w:body>
 </w:document>
+</file>
+
+<file path=word/endnotes.xml><?xml version="1.0" encoding="utf-8"?>
+<w:endnotes xmlns:wpc="http://schemas.microsoft.com/office/word/2010/wordprocessingCanvas" xmlns:cx="http://schemas.microsoft.com/office/drawing/2014/chartex" xmlns:cx1="http://schemas.microsoft.com/office/drawing/2015/9/8/chartex" xmlns:cx2="http://schemas.microsoft.com/office/drawing/2015/10/21/chartex" xmlns:cx3="http://schemas.microsoft.com/office/drawing/2016/5/9/chartex" xmlns:cx4="http://schemas.microsoft.com/office/drawing/2016/5/10/chartex" xmlns:cx5="http://schemas.microsoft.com/office/drawing/2016/5/11/chartex" xmlns:cx6="http://schemas.microsoft.com/office/drawing/2016/5/12/chartex" xmlns:cx7="http://schemas.microsoft.com/office/drawing/2016/5/13/chartex" xmlns:cx8="http://schemas.microsoft.com/office/drawing/2016/5/14/chartex" xmlns:mc="http://schemas.openxmlformats.org/markup-compatibility/2006" xmlns:aink="http://schemas.microsoft.com/office/drawing/2016/ink" xmlns:am3d="http://schemas.microsoft.com/office/drawing/2017/model3d" xmlns:o="urn:schemas-microsoft-com:office:office" xmlns:oel="http://schemas.microsoft.com/office/2019/extlst" xmlns:r="http://schemas.openxmlformats.org/officeDocument/2006/relationships" xmlns:m="http://schemas.openxmlformats.org/officeDocument/2006/math" xmlns:v="urn:schemas-microsoft-com:vml" xmlns:wp14="http://schemas.microsoft.com/office/word/2010/wordprocessingDrawing" xmlns:wp="http://schemas.openxmlformats.org/drawingml/2006/wordprocessingDrawing" xmlns:w10="urn:schemas-microsoft-com:office:word" xmlns:w="http://schemas.openxmlformats.org/wordprocessingml/2006/main" xmlns:w14="http://schemas.microsoft.com/office/word/2010/wordml" xmlns:w15="http://schemas.microsoft.com/office/word/2012/wordml" xmlns:w16cex="http://schemas.microsoft.com/office/word/2018/wordml/cex" xmlns:w16cid="http://schemas.microsoft.com/office/word/2016/wordml/cid" xmlns:w16="http://schemas.microsoft.com/office/word/2018/wordml" xmlns:w16du="http://schemas.microsoft.com/office/word/2023/wordml/word16du" xmlns:w16sdtdh="http://schemas.microsoft.com/office/word/2020/wordml/sdtdatahash" xmlns:w16sdtfl="http://schemas.microsoft.com/office/word/2024/wordml/sdtformatlock" xmlns:w16se="http://schemas.microsoft.com/office/word/2015/wordml/symex" xmlns:wpg="http://schemas.microsoft.com/office/word/2010/wordprocessingGroup" xmlns:wpi="http://schemas.microsoft.com/office/word/2010/wordprocessingInk" xmlns:wne="http://schemas.microsoft.com/office/word/2006/wordml" xmlns:wps="http://schemas.microsoft.com/office/word/2010/wordprocessingShape" mc:Ignorable="w14 w15 w16se w16cid w16 w16cex w16sdtdh w16sdtfl w16du wp14">
+  <w:endnote w:type="separator" w:id="-1">
+    <w:p>
+      <w:pPr>
+        <w:spacing w:line="240" w:lineRule="auto"/>
+      </w:pPr>
+      <w:r>
+        <w:separator/>
+      </w:r>
+    </w:p>
+  </w:endnote>
+  <w:endnote w:type="continuationSeparator" w:id="0">
+    <w:p>
+      <w:pPr>
+        <w:spacing w:line="240" w:lineRule="auto"/>
+      </w:pPr>
+      <w:r>
+        <w:continuationSeparator/>
+      </w:r>
+    </w:p>
+  </w:endnote>
+</w:endnotes>
+</file>
+
+<file path=word/footer1.xml><?xml version="1.0" encoding="utf-8"?>
+<w:ftr xmlns:wpc="http://schemas.microsoft.com/office/word/2010/wordprocessingCanvas" xmlns:cx="http://schemas.microsoft.com/office/drawing/2014/chartex" xmlns:cx1="http://schemas.microsoft.com/office/drawing/2015/9/8/chartex" xmlns:cx2="http://schemas.microsoft.com/office/drawing/2015/10/21/chartex" xmlns:cx3="http://schemas.microsoft.com/office/drawing/2016/5/9/chartex" xmlns:cx4="http://schemas.microsoft.com/office/drawing/2016/5/10/chartex" xmlns:cx5="http://schemas.microsoft.com/office/drawing/2016/5/11/chartex" xmlns:cx6="http://schemas.microsoft.com/office/drawing/2016/5/12/chartex" xmlns:cx7="http://schemas.microsoft.com/office/drawing/2016/5/13/chartex" xmlns:cx8="http://schemas.microsoft.com/office/drawing/2016/5/14/chartex" xmlns:mc="http://schemas.openxmlformats.org/markup-compatibility/2006" xmlns:aink="http://schemas.microsoft.com/office/drawing/2016/ink" xmlns:am3d="http://schemas.microsoft.com/office/drawing/2017/model3d" xmlns:o="urn:schemas-microsoft-com:office:office" xmlns:oel="http://schemas.microsoft.com/office/2019/extlst" xmlns:r="http://schemas.openxmlformats.org/officeDocument/2006/relationships" xmlns:m="http://schemas.openxmlformats.org/officeDocument/2006/math" xmlns:v="urn:schemas-microsoft-com:vml" xmlns:wp14="http://schemas.microsoft.com/office/word/2010/wordprocessingDrawing" xmlns:wp="http://schemas.openxmlformats.org/drawingml/2006/wordprocessingDrawing" xmlns:w10="urn:schemas-microsoft-com:office:word" xmlns:w="http://schemas.openxmlformats.org/wordprocessingml/2006/main" xmlns:w14="http://schemas.microsoft.com/office/word/2010/wordml" xmlns:w15="http://schemas.microsoft.com/office/word/2012/wordml" xmlns:w16cex="http://schemas.microsoft.com/office/word/2018/wordml/cex" xmlns:w16cid="http://schemas.microsoft.com/office/word/2016/wordml/cid" xmlns:w16="http://schemas.microsoft.com/office/word/2018/wordml" xmlns:w16du="http://schemas.microsoft.com/office/word/2023/wordml/word16du" xmlns:w16sdtdh="http://schemas.microsoft.com/office/word/2020/wordml/sdtdatahash" xmlns:w16sdtfl="http://schemas.microsoft.com/office/word/2024/wordml/sdtformatlock" xmlns:w16se="http://schemas.microsoft.com/office/word/2015/wordml/symex" xmlns:wpg="http://schemas.microsoft.com/office/word/2010/wordprocessingGroup" xmlns:wpi="http://schemas.microsoft.com/office/word/2010/wordprocessingInk" xmlns:wne="http://schemas.microsoft.com/office/word/2006/wordml" xmlns:wps="http://schemas.microsoft.com/office/word/2010/wordprocessingShape" mc:Ignorable="w14 w15 w16se w16cid w16 w16cex w16sdtdh w16sdtfl w16du wp14">
+  <w:p>
+    <w:pPr>
+      <w:pStyle w:val="Footer"/>
+    </w:pPr>
+    <w:r>
+      <w:fldChar w:fldCharType="begin"/>
+    </w:r>
+    <w:r>
+      <w:instrText xml:space="preserve"> PAGE  \* Arabic  \* MERGEFORMAT </w:instrText>
+    </w:r>
+    <w:r>
+      <w:fldChar w:fldCharType="separate"/>
+    </w:r>
+    <w:r>
+      <w:rPr>
+        <w:noProof/>
+      </w:rPr>
+      <w:t>20</w:t>
+    </w:r>
+    <w:r>
+      <w:fldChar w:fldCharType="end"/>
+    </w:r>
+    <w:r>
+      <w:tab/>
+    </w:r>
+    <w:r>
+      <w:tab/>
+    </w:r>
+    <w:sdt>
+      <w:sdtPr>
+        <w:rPr>
+          <w:sz w:val="16"/>
+          <w:szCs w:val="16"/>
+        </w:rPr>
+        <w:alias w:val="Author"/>
+        <w:tag w:val=""/>
+        <w:id w:val="-235015793"/>
+        <w:placeholder>
+          <w:docPart w:val="0209E65275F14BA9B8F359C8FC081E34"/>
+        </w:placeholder>
+        <w:dataBinding w:prefixMappings="xmlns:ns0='http://purl.org/dc/elements/1.1/' xmlns:ns1='http://schemas.openxmlformats.org/package/2006/metadata/core-properties' " w:xpath="/ns1:coreProperties[1]/ns0:creator[1]" w:storeItemID="{6C3C8BC8-F283-45AE-878A-BAB7291924A1}"/>
+        <w:text/>
+      </w:sdtPr>
+      <w:sdtContent>
+        <w:r>
+          <w:rPr>
+            <w:sz w:val="16"/>
+            <w:szCs w:val="16"/>
+          </w:rPr>
+          <w:t>Mayuresh Tungare</w:t>
+        </w:r>
+      </w:sdtContent>
+    </w:sdt>
+  </w:p>
+</w:ftr>
+</file>
+
+<file path=word/footnotes.xml><?xml version="1.0" encoding="utf-8"?>
+<w:footnotes xmlns:wpc="http://schemas.microsoft.com/office/word/2010/wordprocessingCanvas" xmlns:cx="http://schemas.microsoft.com/office/drawing/2014/chartex" xmlns:cx1="http://schemas.microsoft.com/office/drawing/2015/9/8/chartex" xmlns:cx2="http://schemas.microsoft.com/office/drawing/2015/10/21/chartex" xmlns:cx3="http://schemas.microsoft.com/office/drawing/2016/5/9/chartex" xmlns:cx4="http://schemas.microsoft.com/office/drawing/2016/5/10/chartex" xmlns:cx5="http://schemas.microsoft.com/office/drawing/2016/5/11/chartex" xmlns:cx6="http://schemas.microsoft.com/office/drawing/2016/5/12/chartex" xmlns:cx7="http://schemas.microsoft.com/office/drawing/2016/5/13/chartex" xmlns:cx8="http://schemas.microsoft.com/office/drawing/2016/5/14/chartex" xmlns:mc="http://schemas.openxmlformats.org/markup-compatibility/2006" xmlns:aink="http://schemas.microsoft.com/office/drawing/2016/ink" xmlns:am3d="http://schemas.microsoft.com/office/drawing/2017/model3d" xmlns:o="urn:schemas-microsoft-com:office:office" xmlns:oel="http://schemas.microsoft.com/office/2019/extlst" xmlns:r="http://schemas.openxmlformats.org/officeDocument/2006/relationships" xmlns:m="http://schemas.openxmlformats.org/officeDocument/2006/math" xmlns:v="urn:schemas-microsoft-com:vml" xmlns:wp14="http://schemas.microsoft.com/office/word/2010/wordprocessingDrawing" xmlns:wp="http://schemas.openxmlformats.org/drawingml/2006/wordprocessingDrawing" xmlns:w10="urn:schemas-microsoft-com:office:word" xmlns:w="http://schemas.openxmlformats.org/wordprocessingml/2006/main" xmlns:w14="http://schemas.microsoft.com/office/word/2010/wordml" xmlns:w15="http://schemas.microsoft.com/office/word/2012/wordml" xmlns:w16cex="http://schemas.microsoft.com/office/word/2018/wordml/cex" xmlns:w16cid="http://schemas.microsoft.com/office/word/2016/wordml/cid" xmlns:w16="http://schemas.microsoft.com/office/word/2018/wordml" xmlns:w16du="http://schemas.microsoft.com/office/word/2023/wordml/word16du" xmlns:w16sdtdh="http://schemas.microsoft.com/office/word/2020/wordml/sdtdatahash" xmlns:w16sdtfl="http://schemas.microsoft.com/office/word/2024/wordml/sdtformatlock" xmlns:w16se="http://schemas.microsoft.com/office/word/2015/wordml/symex" xmlns:wpg="http://schemas.microsoft.com/office/word/2010/wordprocessingGroup" xmlns:wpi="http://schemas.microsoft.com/office/word/2010/wordprocessingInk" xmlns:wne="http://schemas.microsoft.com/office/word/2006/wordml" xmlns:wps="http://schemas.microsoft.com/office/word/2010/wordprocessingShape" mc:Ignorable="w14 w15 w16se w16cid w16 w16cex w16sdtdh w16sdtfl w16du wp14">
+  <w:footnote w:type="separator" w:id="-1">
+    <w:p>
+      <w:pPr>
+        <w:spacing w:line="240" w:lineRule="auto"/>
+      </w:pPr>
+      <w:r>
+        <w:separator/>
+      </w:r>
+    </w:p>
+  </w:footnote>
+  <w:footnote w:type="continuationSeparator" w:id="0">
+    <w:p>
+      <w:pPr>
+        <w:spacing w:line="240" w:lineRule="auto"/>
+      </w:pPr>
+      <w:r>
+        <w:continuationSeparator/>
+      </w:r>
+    </w:p>
+  </w:footnote>
+</w:footnotes>
 </file>
 
 <file path=word/numbering.xml><?xml version="1.0" encoding="utf-8"?>
@@ -7127,6 +9622,7 @@
   <w:style w:type="character" w:default="1" w:styleId="DefaultParagraphFont">
     <w:name w:val="Default Paragraph Font"/>
     <w:uiPriority w:val="1"/>
+    <w:semiHidden/>
     <w:unhideWhenUsed/>
   </w:style>
   <w:style w:type="table" w:default="1" w:styleId="TableNormal">
@@ -7319,7 +9815,686 @@
       </w:tcPr>
     </w:tblStylePr>
   </w:style>
+  <w:style w:type="character" w:styleId="Hyperlink">
+    <w:name w:val="Hyperlink"/>
+    <w:basedOn w:val="DefaultParagraphFont"/>
+    <w:uiPriority w:val="99"/>
+    <w:unhideWhenUsed/>
+    <w:rsid w:val="00C35ED7"/>
+    <w:rPr>
+      <w:color w:val="0000FF" w:themeColor="hyperlink"/>
+      <w:u w:val="single"/>
+    </w:rPr>
+  </w:style>
+  <w:style w:type="character" w:styleId="UnresolvedMention">
+    <w:name w:val="Unresolved Mention"/>
+    <w:basedOn w:val="DefaultParagraphFont"/>
+    <w:uiPriority w:val="99"/>
+    <w:semiHidden/>
+    <w:unhideWhenUsed/>
+    <w:rsid w:val="00C35ED7"/>
+    <w:rPr>
+      <w:color w:val="605E5C"/>
+      <w:shd w:val="clear" w:color="auto" w:fill="E1DFDD"/>
+    </w:rPr>
+  </w:style>
+  <w:style w:type="paragraph" w:styleId="Header">
+    <w:name w:val="header"/>
+    <w:basedOn w:val="Normal"/>
+    <w:link w:val="HeaderChar"/>
+    <w:uiPriority w:val="99"/>
+    <w:unhideWhenUsed/>
+    <w:rsid w:val="00015AED"/>
+    <w:pPr>
+      <w:tabs>
+        <w:tab w:val="center" w:pos="4513"/>
+        <w:tab w:val="right" w:pos="9026"/>
+      </w:tabs>
+      <w:spacing w:line="240" w:lineRule="auto"/>
+    </w:pPr>
+  </w:style>
+  <w:style w:type="character" w:customStyle="1" w:styleId="HeaderChar">
+    <w:name w:val="Header Char"/>
+    <w:basedOn w:val="DefaultParagraphFont"/>
+    <w:link w:val="Header"/>
+    <w:uiPriority w:val="99"/>
+    <w:rsid w:val="00015AED"/>
+  </w:style>
+  <w:style w:type="paragraph" w:styleId="Footer">
+    <w:name w:val="footer"/>
+    <w:basedOn w:val="Normal"/>
+    <w:link w:val="FooterChar"/>
+    <w:uiPriority w:val="99"/>
+    <w:unhideWhenUsed/>
+    <w:rsid w:val="00015AED"/>
+    <w:pPr>
+      <w:tabs>
+        <w:tab w:val="center" w:pos="4513"/>
+        <w:tab w:val="right" w:pos="9026"/>
+      </w:tabs>
+      <w:spacing w:line="240" w:lineRule="auto"/>
+    </w:pPr>
+  </w:style>
+  <w:style w:type="character" w:customStyle="1" w:styleId="FooterChar">
+    <w:name w:val="Footer Char"/>
+    <w:basedOn w:val="DefaultParagraphFont"/>
+    <w:link w:val="Footer"/>
+    <w:uiPriority w:val="99"/>
+    <w:rsid w:val="00015AED"/>
+  </w:style>
+  <w:style w:type="character" w:styleId="PlaceholderText">
+    <w:name w:val="Placeholder Text"/>
+    <w:basedOn w:val="DefaultParagraphFont"/>
+    <w:uiPriority w:val="99"/>
+    <w:semiHidden/>
+    <w:rsid w:val="00DD3F50"/>
+    <w:rPr>
+      <w:color w:val="666666"/>
+    </w:rPr>
+  </w:style>
 </w:styles>
+</file>
+
+<file path=word/glossary/document.xml><?xml version="1.0" encoding="utf-8"?>
+<w:glossaryDocument xmlns:wpc="http://schemas.microsoft.com/office/word/2010/wordprocessingCanvas" xmlns:cx="http://schemas.microsoft.com/office/drawing/2014/chartex" xmlns:cx1="http://schemas.microsoft.com/office/drawing/2015/9/8/chartex" xmlns:cx2="http://schemas.microsoft.com/office/drawing/2015/10/21/chartex" xmlns:cx3="http://schemas.microsoft.com/office/drawing/2016/5/9/chartex" xmlns:cx4="http://schemas.microsoft.com/office/drawing/2016/5/10/chartex" xmlns:cx5="http://schemas.microsoft.com/office/drawing/2016/5/11/chartex" xmlns:cx6="http://schemas.microsoft.com/office/drawing/2016/5/12/chartex" xmlns:cx7="http://schemas.microsoft.com/office/drawing/2016/5/13/chartex" xmlns:cx8="http://schemas.microsoft.com/office/drawing/2016/5/14/chartex" xmlns:mc="http://schemas.openxmlformats.org/markup-compatibility/2006" xmlns:aink="http://schemas.microsoft.com/office/drawing/2016/ink" xmlns:am3d="http://schemas.microsoft.com/office/drawing/2017/model3d" xmlns:o="urn:schemas-microsoft-com:office:office" xmlns:oel="http://schemas.microsoft.com/office/2019/extlst" xmlns:r="http://schemas.openxmlformats.org/officeDocument/2006/relationships" xmlns:m="http://schemas.openxmlformats.org/officeDocument/2006/math" xmlns:v="urn:schemas-microsoft-com:vml" xmlns:wp14="http://schemas.microsoft.com/office/word/2010/wordprocessingDrawing" xmlns:wp="http://schemas.openxmlformats.org/drawingml/2006/wordprocessingDrawing" xmlns:w10="urn:schemas-microsoft-com:office:word" xmlns:w="http://schemas.openxmlformats.org/wordprocessingml/2006/main" xmlns:w14="http://schemas.microsoft.com/office/word/2010/wordml" xmlns:w15="http://schemas.microsoft.com/office/word/2012/wordml" xmlns:w16cex="http://schemas.microsoft.com/office/word/2018/wordml/cex" xmlns:w16cid="http://schemas.microsoft.com/office/word/2016/wordml/cid" xmlns:w16="http://schemas.microsoft.com/office/word/2018/wordml" xmlns:w16du="http://schemas.microsoft.com/office/word/2023/wordml/word16du" xmlns:w16sdtdh="http://schemas.microsoft.com/office/word/2020/wordml/sdtdatahash" xmlns:w16sdtfl="http://schemas.microsoft.com/office/word/2024/wordml/sdtformatlock" xmlns:w16se="http://schemas.microsoft.com/office/word/2015/wordml/symex" xmlns:wpg="http://schemas.microsoft.com/office/word/2010/wordprocessingGroup" xmlns:wpi="http://schemas.microsoft.com/office/word/2010/wordprocessingInk" xmlns:wne="http://schemas.microsoft.com/office/word/2006/wordml" xmlns:wps="http://schemas.microsoft.com/office/word/2010/wordprocessingShape" mc:Ignorable="w14 w15 w16se w16cid w16 w16cex w16sdtdh w16sdtfl w16du wp14">
+  <w:docParts>
+    <w:docPart>
+      <w:docPartPr>
+        <w:name w:val="0209E65275F14BA9B8F359C8FC081E34"/>
+        <w:category>
+          <w:name w:val="General"/>
+          <w:gallery w:val="placeholder"/>
+        </w:category>
+        <w:types>
+          <w:type w:val="bbPlcHdr"/>
+        </w:types>
+        <w:behaviors>
+          <w:behavior w:val="content"/>
+        </w:behaviors>
+        <w:guid w:val="{851E1621-7A30-4B37-8DF4-1506C7E286D7}"/>
+      </w:docPartPr>
+      <w:docPartBody>
+        <w:p>
+          <w:r>
+            <w:rPr>
+              <w:rStyle w:val="PlaceholderText"/>
+            </w:rPr>
+            <w:t>[Author]</w:t>
+          </w:r>
+        </w:p>
+      </w:docPartBody>
+    </w:docPart>
+  </w:docParts>
+</w:glossaryDocument>
+</file>
+
+<file path=word/glossary/fontTable.xml><?xml version="1.0" encoding="utf-8"?>
+<w:fonts xmlns:mc="http://schemas.openxmlformats.org/markup-compatibility/2006" xmlns:r="http://schemas.openxmlformats.org/officeDocument/2006/relationships" xmlns:w="http://schemas.openxmlformats.org/wordprocessingml/2006/main" xmlns:w14="http://schemas.microsoft.com/office/word/2010/wordml" xmlns:w15="http://schemas.microsoft.com/office/word/2012/wordml" xmlns:w16cex="http://schemas.microsoft.com/office/word/2018/wordml/cex" xmlns:w16cid="http://schemas.microsoft.com/office/word/2016/wordml/cid" xmlns:w16="http://schemas.microsoft.com/office/word/2018/wordml" xmlns:w16du="http://schemas.microsoft.com/office/word/2023/wordml/word16du" xmlns:w16sdtdh="http://schemas.microsoft.com/office/word/2020/wordml/sdtdatahash" xmlns:w16sdtfl="http://schemas.microsoft.com/office/word/2024/wordml/sdtformatlock" xmlns:w16se="http://schemas.microsoft.com/office/word/2015/wordml/symex" mc:Ignorable="w14 w15 w16se w16cid w16 w16cex w16sdtdh w16sdtfl w16du">
+  <w:font w:name="Symbol">
+    <w:panose1 w:val="05050102010706020507"/>
+    <w:charset w:val="02"/>
+    <w:family w:val="roman"/>
+    <w:pitch w:val="variable"/>
+    <w:sig w:usb0="00000000" w:usb1="10000000" w:usb2="00000000" w:usb3="00000000" w:csb0="80000000" w:csb1="00000000"/>
+  </w:font>
+  <w:font w:name="Times New Roman">
+    <w:panose1 w:val="02020603050405020304"/>
+    <w:charset w:val="00"/>
+    <w:family w:val="roman"/>
+    <w:pitch w:val="variable"/>
+    <w:sig w:usb0="E0002EFF" w:usb1="C000785B" w:usb2="00000009" w:usb3="00000000" w:csb0="000001FF" w:csb1="00000000"/>
+  </w:font>
+  <w:font w:name="Courier New">
+    <w:panose1 w:val="02070309020205020404"/>
+    <w:charset w:val="00"/>
+    <w:family w:val="modern"/>
+    <w:pitch w:val="fixed"/>
+    <w:sig w:usb0="E0002EFF" w:usb1="C0007843" w:usb2="00000009" w:usb3="00000000" w:csb0="000001FF" w:csb1="00000000"/>
+  </w:font>
+  <w:font w:name="Wingdings">
+    <w:panose1 w:val="05000000000000000000"/>
+    <w:charset w:val="02"/>
+    <w:family w:val="auto"/>
+    <w:pitch w:val="variable"/>
+    <w:sig w:usb0="00000000" w:usb1="10000000" w:usb2="00000000" w:usb3="00000000" w:csb0="80000000" w:csb1="00000000"/>
+  </w:font>
+  <w:font w:name="Arial">
+    <w:panose1 w:val="020B0604020202020204"/>
+    <w:charset w:val="00"/>
+    <w:family w:val="swiss"/>
+    <w:pitch w:val="variable"/>
+    <w:sig w:usb0="E0002EFF" w:usb1="C000785B" w:usb2="00000009" w:usb3="00000000" w:csb0="000001FF" w:csb1="00000000"/>
+  </w:font>
+  <w:font w:name="Consolas">
+    <w:panose1 w:val="020B0609020204030204"/>
+    <w:charset w:val="00"/>
+    <w:family w:val="modern"/>
+    <w:pitch w:val="fixed"/>
+    <w:sig w:usb0="E00006FF" w:usb1="0000FCFF" w:usb2="00000001" w:usb3="00000000" w:csb0="0000019F" w:csb1="00000000"/>
+  </w:font>
+  <w:font w:name="Aptos">
+    <w:charset w:val="00"/>
+    <w:family w:val="swiss"/>
+    <w:pitch w:val="variable"/>
+    <w:sig w:usb0="20000287" w:usb1="00000003" w:usb2="00000000" w:usb3="00000000" w:csb0="0000019F" w:csb1="00000000"/>
+  </w:font>
+  <w:font w:name="Calibri">
+    <w:panose1 w:val="020F0502020204030204"/>
+    <w:charset w:val="00"/>
+    <w:family w:val="swiss"/>
+    <w:pitch w:val="variable"/>
+    <w:sig w:usb0="E4002EFF" w:usb1="C200247B" w:usb2="00000009" w:usb3="00000000" w:csb0="000001FF" w:csb1="00000000"/>
+  </w:font>
+  <w:font w:name="Cambria">
+    <w:panose1 w:val="02040503050406030204"/>
+    <w:charset w:val="00"/>
+    <w:family w:val="roman"/>
+    <w:pitch w:val="variable"/>
+    <w:sig w:usb0="E00006FF" w:usb1="420024FF" w:usb2="02000000" w:usb3="00000000" w:csb0="0000019F" w:csb1="00000000"/>
+  </w:font>
+  <w:font w:name="Aptos Display">
+    <w:charset w:val="00"/>
+    <w:family w:val="swiss"/>
+    <w:pitch w:val="variable"/>
+    <w:sig w:usb0="20000287" w:usb1="00000003" w:usb2="00000000" w:usb3="00000000" w:csb0="0000019F" w:csb1="00000000"/>
+  </w:font>
+</w:fonts>
+</file>
+
+<file path=word/glossary/settings.xml><?xml version="1.0" encoding="utf-8"?>
+<w:settings xmlns:mc="http://schemas.openxmlformats.org/markup-compatibility/2006" xmlns:o="urn:schemas-microsoft-com:office:office" xmlns:r="http://schemas.openxmlformats.org/officeDocument/2006/relationships" xmlns:m="http://schemas.openxmlformats.org/officeDocument/2006/math" xmlns:v="urn:schemas-microsoft-com:vml" xmlns:w10="urn:schemas-microsoft-com:office:word" xmlns:w="http://schemas.openxmlformats.org/wordprocessingml/2006/main" xmlns:w14="http://schemas.microsoft.com/office/word/2010/wordml" xmlns:w15="http://schemas.microsoft.com/office/word/2012/wordml" xmlns:w16cex="http://schemas.microsoft.com/office/word/2018/wordml/cex" xmlns:w16cid="http://schemas.microsoft.com/office/word/2016/wordml/cid" xmlns:w16="http://schemas.microsoft.com/office/word/2018/wordml" xmlns:w16du="http://schemas.microsoft.com/office/word/2023/wordml/word16du" xmlns:w16sdtdh="http://schemas.microsoft.com/office/word/2020/wordml/sdtdatahash" xmlns:w16sdtfl="http://schemas.microsoft.com/office/word/2024/wordml/sdtformatlock" xmlns:w16se="http://schemas.microsoft.com/office/word/2015/wordml/symex" xmlns:sl="http://schemas.openxmlformats.org/schemaLibrary/2006/main" mc:Ignorable="w14 w15 w16se w16cid w16 w16cex w16sdtdh w16sdtfl w16du">
+  <w:view w:val="normal"/>
+  <w:defaultTabStop w:val="720"/>
+  <w:characterSpacingControl w:val="doNotCompress"/>
+  <w:compat>
+    <w:useFELayout/>
+    <w:compatSetting w:name="compatibilityMode" w:uri="http://schemas.microsoft.com/office/word" w:val="15"/>
+    <w:compatSetting w:name="overrideTableStyleFontSizeAndJustification" w:uri="http://schemas.microsoft.com/office/word" w:val="1"/>
+    <w:compatSetting w:name="enableOpenTypeFeatures" w:uri="http://schemas.microsoft.com/office/word" w:val="1"/>
+    <w:compatSetting w:name="doNotFlipMirrorIndents" w:uri="http://schemas.microsoft.com/office/word" w:val="1"/>
+    <w:compatSetting w:name="differentiateMultirowTableHeaders" w:uri="http://schemas.microsoft.com/office/word" w:val="1"/>
+    <w:compatSetting w:name="useWord2013TrackBottomHyphenation" w:uri="http://schemas.microsoft.com/office/word" w:val="0"/>
+  </w:compat>
+  <w:rsids>
+    <w:rsidRoot w:val="00AC5069"/>
+    <w:rsid w:val="00615DE7"/>
+    <w:rsid w:val="00AC5069"/>
+    <w:rsid w:val="00C12802"/>
+  </w:rsids>
+  <m:mathPr>
+    <m:mathFont m:val="Cambria Math"/>
+    <m:brkBin m:val="before"/>
+    <m:brkBinSub m:val="--"/>
+    <m:smallFrac m:val="0"/>
+    <m:dispDef/>
+    <m:lMargin m:val="0"/>
+    <m:rMargin m:val="0"/>
+    <m:defJc m:val="centerGroup"/>
+    <m:wrapIndent m:val="1440"/>
+    <m:intLim m:val="subSup"/>
+    <m:naryLim m:val="undOvr"/>
+  </m:mathPr>
+  <w:themeFontLang w:val="en-GB"/>
+  <w:clrSchemeMapping w:bg1="light1" w:t1="dark1" w:bg2="light2" w:t2="dark2" w:accent1="accent1" w:accent2="accent2" w:accent3="accent3" w:accent4="accent4" w:accent5="accent5" w:accent6="accent6" w:hyperlink="hyperlink" w:followedHyperlink="followedHyperlink"/>
+  <w:decimalSymbol w:val="."/>
+  <w:listSeparator w:val=","/>
+  <w15:chartTrackingRefBased/>
+</w:settings>
+</file>
+
+<file path=word/glossary/styles.xml><?xml version="1.0" encoding="utf-8"?>
+<w:styles xmlns:mc="http://schemas.openxmlformats.org/markup-compatibility/2006" xmlns:r="http://schemas.openxmlformats.org/officeDocument/2006/relationships" xmlns:w="http://schemas.openxmlformats.org/wordprocessingml/2006/main" xmlns:w14="http://schemas.microsoft.com/office/word/2010/wordml" xmlns:w15="http://schemas.microsoft.com/office/word/2012/wordml" xmlns:w16cex="http://schemas.microsoft.com/office/word/2018/wordml/cex" xmlns:w16cid="http://schemas.microsoft.com/office/word/2016/wordml/cid" xmlns:w16="http://schemas.microsoft.com/office/word/2018/wordml" xmlns:w16du="http://schemas.microsoft.com/office/word/2023/wordml/word16du" xmlns:w16sdtdh="http://schemas.microsoft.com/office/word/2020/wordml/sdtdatahash" xmlns:w16sdtfl="http://schemas.microsoft.com/office/word/2024/wordml/sdtformatlock" xmlns:w16se="http://schemas.microsoft.com/office/word/2015/wordml/symex" mc:Ignorable="w14 w15 w16se w16cid w16 w16cex w16sdtdh w16sdtfl w16du">
+  <w:docDefaults>
+    <w:rPrDefault>
+      <w:rPr>
+        <w:rFonts w:asciiTheme="minorHAnsi" w:eastAsiaTheme="minorEastAsia" w:hAnsiTheme="minorHAnsi" w:cstheme="minorBidi"/>
+        <w:kern w:val="2"/>
+        <w:sz w:val="24"/>
+        <w:szCs w:val="24"/>
+        <w:lang w:val="en-GB" w:eastAsia="en-GB" w:bidi="ar-SA"/>
+        <w14:ligatures w14:val="standardContextual"/>
+      </w:rPr>
+    </w:rPrDefault>
+    <w:pPrDefault>
+      <w:pPr>
+        <w:spacing w:after="160" w:line="278" w:lineRule="auto"/>
+      </w:pPr>
+    </w:pPrDefault>
+  </w:docDefaults>
+  <w:latentStyles w:defLockedState="0" w:defUIPriority="99" w:defSemiHidden="0" w:defUnhideWhenUsed="0" w:defQFormat="0" w:count="376">
+    <w:lsdException w:name="Normal" w:uiPriority="0" w:qFormat="1"/>
+    <w:lsdException w:name="heading 1" w:uiPriority="9" w:qFormat="1"/>
+    <w:lsdException w:name="heading 2" w:semiHidden="1" w:uiPriority="9" w:unhideWhenUsed="1" w:qFormat="1"/>
+    <w:lsdException w:name="heading 3" w:semiHidden="1" w:uiPriority="9" w:unhideWhenUsed="1" w:qFormat="1"/>
+    <w:lsdException w:name="heading 4" w:semiHidden="1" w:uiPriority="9" w:unhideWhenUsed="1" w:qFormat="1"/>
+    <w:lsdException w:name="heading 5" w:semiHidden="1" w:uiPriority="9" w:unhideWhenUsed="1" w:qFormat="1"/>
+    <w:lsdException w:name="heading 6" w:semiHidden="1" w:uiPriority="9" w:unhideWhenUsed="1" w:qFormat="1"/>
+    <w:lsdException w:name="heading 7" w:semiHidden="1" w:uiPriority="9" w:unhideWhenUsed="1" w:qFormat="1"/>
+    <w:lsdException w:name="heading 8" w:semiHidden="1" w:uiPriority="9" w:unhideWhenUsed="1" w:qFormat="1"/>
+    <w:lsdException w:name="heading 9" w:semiHidden="1" w:uiPriority="9" w:unhideWhenUsed="1" w:qFormat="1"/>
+    <w:lsdException w:name="index 1" w:semiHidden="1" w:unhideWhenUsed="1"/>
+    <w:lsdException w:name="index 2" w:semiHidden="1" w:unhideWhenUsed="1"/>
+    <w:lsdException w:name="index 3" w:semiHidden="1" w:unhideWhenUsed="1"/>
+    <w:lsdException w:name="index 4" w:semiHidden="1" w:unhideWhenUsed="1"/>
+    <w:lsdException w:name="index 5" w:semiHidden="1" w:unhideWhenUsed="1"/>
+    <w:lsdException w:name="index 6" w:semiHidden="1" w:unhideWhenUsed="1"/>
+    <w:lsdException w:name="index 7" w:semiHidden="1" w:unhideWhenUsed="1"/>
+    <w:lsdException w:name="index 8" w:semiHidden="1" w:unhideWhenUsed="1"/>
+    <w:lsdException w:name="index 9" w:semiHidden="1" w:unhideWhenUsed="1"/>
+    <w:lsdException w:name="toc 1" w:semiHidden="1" w:uiPriority="39" w:unhideWhenUsed="1"/>
+    <w:lsdException w:name="toc 2" w:semiHidden="1" w:uiPriority="39" w:unhideWhenUsed="1"/>
+    <w:lsdException w:name="toc 3" w:semiHidden="1" w:uiPriority="39" w:unhideWhenUsed="1"/>
+    <w:lsdException w:name="toc 4" w:semiHidden="1" w:uiPriority="39" w:unhideWhenUsed="1"/>
+    <w:lsdException w:name="toc 5" w:semiHidden="1" w:uiPriority="39" w:unhideWhenUsed="1"/>
+    <w:lsdException w:name="toc 6" w:semiHidden="1" w:uiPriority="39" w:unhideWhenUsed="1"/>
+    <w:lsdException w:name="toc 7" w:semiHidden="1" w:uiPriority="39" w:unhideWhenUsed="1"/>
+    <w:lsdException w:name="toc 8" w:semiHidden="1" w:uiPriority="39" w:unhideWhenUsed="1"/>
+    <w:lsdException w:name="toc 9" w:semiHidden="1" w:uiPriority="39" w:unhideWhenUsed="1"/>
+    <w:lsdException w:name="Normal Indent" w:semiHidden="1" w:unhideWhenUsed="1"/>
+    <w:lsdException w:name="footnote text" w:semiHidden="1" w:unhideWhenUsed="1"/>
+    <w:lsdException w:name="annotation text" w:semiHidden="1" w:unhideWhenUsed="1"/>
+    <w:lsdException w:name="header" w:semiHidden="1" w:unhideWhenUsed="1"/>
+    <w:lsdException w:name="footer" w:semiHidden="1" w:unhideWhenUsed="1"/>
+    <w:lsdException w:name="index heading" w:semiHidden="1" w:unhideWhenUsed="1"/>
+    <w:lsdException w:name="caption" w:semiHidden="1" w:uiPriority="35" w:unhideWhenUsed="1" w:qFormat="1"/>
+    <w:lsdException w:name="table of figures" w:semiHidden="1" w:unhideWhenUsed="1"/>
+    <w:lsdException w:name="envelope address" w:semiHidden="1" w:unhideWhenUsed="1"/>
+    <w:lsdException w:name="envelope return" w:semiHidden="1" w:unhideWhenUsed="1"/>
+    <w:lsdException w:name="footnote reference" w:semiHidden="1" w:unhideWhenUsed="1"/>
+    <w:lsdException w:name="annotation reference" w:semiHidden="1" w:unhideWhenUsed="1"/>
+    <w:lsdException w:name="line number" w:semiHidden="1" w:unhideWhenUsed="1"/>
+    <w:lsdException w:name="page number" w:semiHidden="1" w:unhideWhenUsed="1"/>
+    <w:lsdException w:name="endnote reference" w:semiHidden="1" w:unhideWhenUsed="1"/>
+    <w:lsdException w:name="endnote text" w:semiHidden="1" w:unhideWhenUsed="1"/>
+    <w:lsdException w:name="table of authorities" w:semiHidden="1" w:unhideWhenUsed="1"/>
+    <w:lsdException w:name="macro" w:semiHidden="1" w:unhideWhenUsed="1"/>
+    <w:lsdException w:name="toa heading" w:semiHidden="1" w:unhideWhenUsed="1"/>
+    <w:lsdException w:name="List" w:semiHidden="1" w:unhideWhenUsed="1"/>
+    <w:lsdException w:name="List Bullet" w:semiHidden="1" w:unhideWhenUsed="1"/>
+    <w:lsdException w:name="List Number" w:semiHidden="1" w:unhideWhenUsed="1"/>
+    <w:lsdException w:name="List 2" w:semiHidden="1" w:unhideWhenUsed="1"/>
+    <w:lsdException w:name="List 3" w:semiHidden="1" w:unhideWhenUsed="1"/>
+    <w:lsdException w:name="List 4" w:semiHidden="1" w:unhideWhenUsed="1"/>
+    <w:lsdException w:name="List 5" w:semiHidden="1" w:unhideWhenUsed="1"/>
+    <w:lsdException w:name="List Bullet 2" w:semiHidden="1" w:unhideWhenUsed="1"/>
+    <w:lsdException w:name="List Bullet 3" w:semiHidden="1" w:unhideWhenUsed="1"/>
+    <w:lsdException w:name="List Bullet 4" w:semiHidden="1" w:unhideWhenUsed="1"/>
+    <w:lsdException w:name="List Bullet 5" w:semiHidden="1" w:unhideWhenUsed="1"/>
+    <w:lsdException w:name="List Number 2" w:semiHidden="1" w:unhideWhenUsed="1"/>
+    <w:lsdException w:name="List Number 3" w:semiHidden="1" w:unhideWhenUsed="1"/>
+    <w:lsdException w:name="List Number 4" w:semiHidden="1" w:unhideWhenUsed="1"/>
+    <w:lsdException w:name="List Number 5" w:semiHidden="1" w:unhideWhenUsed="1"/>
+    <w:lsdException w:name="Title" w:uiPriority="10" w:qFormat="1"/>
+    <w:lsdException w:name="Closing" w:semiHidden="1" w:unhideWhenUsed="1"/>
+    <w:lsdException w:name="Signature" w:semiHidden="1" w:unhideWhenUsed="1"/>
+    <w:lsdException w:name="Default Paragraph Font" w:semiHidden="1" w:uiPriority="1" w:unhideWhenUsed="1"/>
+    <w:lsdException w:name="Body Text" w:semiHidden="1" w:unhideWhenUsed="1"/>
+    <w:lsdException w:name="Body Text Indent" w:semiHidden="1" w:unhideWhenUsed="1"/>
+    <w:lsdException w:name="List Continue" w:semiHidden="1" w:unhideWhenUsed="1"/>
+    <w:lsdException w:name="List Continue 2" w:semiHidden="1" w:unhideWhenUsed="1"/>
+    <w:lsdException w:name="List Continue 3" w:semiHidden="1" w:unhideWhenUsed="1"/>
+    <w:lsdException w:name="List Continue 4" w:semiHidden="1" w:unhideWhenUsed="1"/>
+    <w:lsdException w:name="List Continue 5" w:semiHidden="1" w:unhideWhenUsed="1"/>
+    <w:lsdException w:name="Message Header" w:semiHidden="1" w:unhideWhenUsed="1"/>
+    <w:lsdException w:name="Subtitle" w:uiPriority="11" w:qFormat="1"/>
+    <w:lsdException w:name="Salutation" w:semiHidden="1" w:unhideWhenUsed="1"/>
+    <w:lsdException w:name="Date" w:semiHidden="1" w:unhideWhenUsed="1"/>
+    <w:lsdException w:name="Body Text First Indent" w:semiHidden="1" w:unhideWhenUsed="1"/>
+    <w:lsdException w:name="Body Text First Indent 2" w:semiHidden="1" w:unhideWhenUsed="1"/>
+    <w:lsdException w:name="Note Heading" w:semiHidden="1" w:unhideWhenUsed="1"/>
+    <w:lsdException w:name="Body Text 2" w:semiHidden="1" w:unhideWhenUsed="1"/>
+    <w:lsdException w:name="Body Text 3" w:semiHidden="1" w:unhideWhenUsed="1"/>
+    <w:lsdException w:name="Body Text Indent 2" w:semiHidden="1" w:unhideWhenUsed="1"/>
+    <w:lsdException w:name="Body Text Indent 3" w:semiHidden="1" w:unhideWhenUsed="1"/>
+    <w:lsdException w:name="Block Text" w:semiHidden="1" w:unhideWhenUsed="1"/>
+    <w:lsdException w:name="Hyperlink" w:semiHidden="1" w:unhideWhenUsed="1"/>
+    <w:lsdException w:name="FollowedHyperlink" w:semiHidden="1" w:unhideWhenUsed="1"/>
+    <w:lsdException w:name="Strong" w:uiPriority="22" w:qFormat="1"/>
+    <w:lsdException w:name="Emphasis" w:uiPriority="20" w:qFormat="1"/>
+    <w:lsdException w:name="Document Map" w:semiHidden="1" w:unhideWhenUsed="1"/>
+    <w:lsdException w:name="Plain Text" w:semiHidden="1" w:unhideWhenUsed="1"/>
+    <w:lsdException w:name="E-mail Signature" w:semiHidden="1" w:unhideWhenUsed="1"/>
+    <w:lsdException w:name="HTML Top of Form" w:semiHidden="1" w:unhideWhenUsed="1"/>
+    <w:lsdException w:name="HTML Bottom of Form" w:semiHidden="1" w:unhideWhenUsed="1"/>
+    <w:lsdException w:name="Normal (Web)" w:semiHidden="1" w:unhideWhenUsed="1"/>
+    <w:lsdException w:name="HTML Acronym" w:semiHidden="1" w:unhideWhenUsed="1"/>
+    <w:lsdException w:name="HTML Address" w:semiHidden="1" w:unhideWhenUsed="1"/>
+    <w:lsdException w:name="HTML Cite" w:semiHidden="1" w:unhideWhenUsed="1"/>
+    <w:lsdException w:name="HTML Code" w:semiHidden="1" w:unhideWhenUsed="1"/>
+    <w:lsdException w:name="HTML Definition" w:semiHidden="1" w:unhideWhenUsed="1"/>
+    <w:lsdException w:name="HTML Keyboard" w:semiHidden="1" w:unhideWhenUsed="1"/>
+    <w:lsdException w:name="HTML Preformatted" w:semiHidden="1" w:unhideWhenUsed="1"/>
+    <w:lsdException w:name="HTML Sample" w:semiHidden="1" w:unhideWhenUsed="1"/>
+    <w:lsdException w:name="HTML Typewriter" w:semiHidden="1" w:unhideWhenUsed="1"/>
+    <w:lsdException w:name="HTML Variable" w:semiHidden="1" w:unhideWhenUsed="1"/>
+    <w:lsdException w:name="Normal Table" w:semiHidden="1" w:unhideWhenUsed="1"/>
+    <w:lsdException w:name="annotation subject" w:semiHidden="1" w:unhideWhenUsed="1"/>
+    <w:lsdException w:name="No List" w:semiHidden="1" w:unhideWhenUsed="1"/>
+    <w:lsdException w:name="Outline List 1" w:semiHidden="1" w:unhideWhenUsed="1"/>
+    <w:lsdException w:name="Outline List 2" w:semiHidden="1" w:unhideWhenUsed="1"/>
+    <w:lsdException w:name="Outline List 3" w:semiHidden="1" w:unhideWhenUsed="1"/>
+    <w:lsdException w:name="Table Simple 1" w:semiHidden="1" w:unhideWhenUsed="1"/>
+    <w:lsdException w:name="Table Simple 2" w:semiHidden="1" w:unhideWhenUsed="1"/>
+    <w:lsdException w:name="Table Simple 3" w:semiHidden="1" w:unhideWhenUsed="1"/>
+    <w:lsdException w:name="Table Classic 1" w:semiHidden="1" w:unhideWhenUsed="1"/>
+    <w:lsdException w:name="Table Classic 2" w:semiHidden="1" w:unhideWhenUsed="1"/>
+    <w:lsdException w:name="Table Classic 3" w:semiHidden="1" w:unhideWhenUsed="1"/>
+    <w:lsdException w:name="Table Classic 4" w:semiHidden="1" w:unhideWhenUsed="1"/>
+    <w:lsdException w:name="Table Colorful 1" w:semiHidden="1" w:unhideWhenUsed="1"/>
+    <w:lsdException w:name="Table Colorful 2" w:semiHidden="1" w:unhideWhenUsed="1"/>
+    <w:lsdException w:name="Table Colorful 3" w:semiHidden="1" w:unhideWhenUsed="1"/>
+    <w:lsdException w:name="Table Columns 1" w:semiHidden="1" w:unhideWhenUsed="1"/>
+    <w:lsdException w:name="Table Columns 2" w:semiHidden="1" w:unhideWhenUsed="1"/>
+    <w:lsdException w:name="Table Columns 3" w:semiHidden="1" w:unhideWhenUsed="1"/>
+    <w:lsdException w:name="Table Columns 4" w:semiHidden="1" w:unhideWhenUsed="1"/>
+    <w:lsdException w:name="Table Columns 5" w:semiHidden="1" w:unhideWhenUsed="1"/>
+    <w:lsdException w:name="Table Grid 1" w:semiHidden="1" w:unhideWhenUsed="1"/>
+    <w:lsdException w:name="Table Grid 2" w:semiHidden="1" w:unhideWhenUsed="1"/>
+    <w:lsdException w:name="Table Grid 3" w:semiHidden="1" w:unhideWhenUsed="1"/>
+    <w:lsdException w:name="Table Grid 4" w:semiHidden="1" w:unhideWhenUsed="1"/>
+    <w:lsdException w:name="Table Grid 5" w:semiHidden="1" w:unhideWhenUsed="1"/>
+    <w:lsdException w:name="Table Grid 6" w:semiHidden="1" w:unhideWhenUsed="1"/>
+    <w:lsdException w:name="Table Grid 7" w:semiHidden="1" w:unhideWhenUsed="1"/>
+    <w:lsdException w:name="Table Grid 8" w:semiHidden="1" w:unhideWhenUsed="1"/>
+    <w:lsdException w:name="Table List 1" w:semiHidden="1" w:unhideWhenUsed="1"/>
+    <w:lsdException w:name="Table List 2" w:semiHidden="1" w:unhideWhenUsed="1"/>
+    <w:lsdException w:name="Table List 3" w:semiHidden="1" w:unhideWhenUsed="1"/>
+    <w:lsdException w:name="Table List 4" w:semiHidden="1" w:unhideWhenUsed="1"/>
+    <w:lsdException w:name="Table List 5" w:semiHidden="1" w:unhideWhenUsed="1"/>
+    <w:lsdException w:name="Table List 6" w:semiHidden="1" w:unhideWhenUsed="1"/>
+    <w:lsdException w:name="Table List 7" w:semiHidden="1" w:unhideWhenUsed="1"/>
+    <w:lsdException w:name="Table List 8" w:semiHidden="1" w:unhideWhenUsed="1"/>
+    <w:lsdException w:name="Table 3D effects 1" w:semiHidden="1" w:unhideWhenUsed="1"/>
+    <w:lsdException w:name="Table 3D effects 2" w:semiHidden="1" w:unhideWhenUsed="1"/>
+    <w:lsdException w:name="Table 3D effects 3" w:semiHidden="1" w:unhideWhenUsed="1"/>
+    <w:lsdException w:name="Table Contemporary" w:semiHidden="1" w:unhideWhenUsed="1"/>
+    <w:lsdException w:name="Table Elegant" w:semiHidden="1" w:unhideWhenUsed="1"/>
+    <w:lsdException w:name="Table Professional" w:semiHidden="1" w:unhideWhenUsed="1"/>
+    <w:lsdException w:name="Table Subtle 1" w:semiHidden="1" w:unhideWhenUsed="1"/>
+    <w:lsdException w:name="Table Subtle 2" w:semiHidden="1" w:unhideWhenUsed="1"/>
+    <w:lsdException w:name="Table Web 1" w:semiHidden="1" w:unhideWhenUsed="1"/>
+    <w:lsdException w:name="Table Web 2" w:semiHidden="1" w:unhideWhenUsed="1"/>
+    <w:lsdException w:name="Table Web 3" w:semiHidden="1" w:unhideWhenUsed="1"/>
+    <w:lsdException w:name="Balloon Text" w:semiHidden="1" w:unhideWhenUsed="1"/>
+    <w:lsdException w:name="Table Grid" w:uiPriority="39"/>
+    <w:lsdException w:name="Table Theme" w:semiHidden="1" w:unhideWhenUsed="1"/>
+    <w:lsdException w:name="Placeholder Text" w:semiHidden="1"/>
+    <w:lsdException w:name="No Spacing" w:uiPriority="1" w:qFormat="1"/>
+    <w:lsdException w:name="Light Shading" w:uiPriority="60"/>
+    <w:lsdException w:name="Light List" w:uiPriority="61"/>
+    <w:lsdException w:name="Light Grid" w:uiPriority="62"/>
+    <w:lsdException w:name="Medium Shading 1" w:uiPriority="63"/>
+    <w:lsdException w:name="Medium Shading 2" w:uiPriority="64"/>
+    <w:lsdException w:name="Medium List 1" w:uiPriority="65"/>
+    <w:lsdException w:name="Medium List 2" w:uiPriority="66"/>
+    <w:lsdException w:name="Medium Grid 1" w:uiPriority="67"/>
+    <w:lsdException w:name="Medium Grid 2" w:uiPriority="68"/>
+    <w:lsdException w:name="Medium Grid 3" w:uiPriority="69"/>
+    <w:lsdException w:name="Dark List" w:uiPriority="70"/>
+    <w:lsdException w:name="Colorful Shading" w:uiPriority="71"/>
+    <w:lsdException w:name="Colorful List" w:uiPriority="72"/>
+    <w:lsdException w:name="Colorful Grid" w:uiPriority="73"/>
+    <w:lsdException w:name="Light Shading Accent 1" w:uiPriority="60"/>
+    <w:lsdException w:name="Light List Accent 1" w:uiPriority="61"/>
+    <w:lsdException w:name="Light Grid Accent 1" w:uiPriority="62"/>
+    <w:lsdException w:name="Medium Shading 1 Accent 1" w:uiPriority="63"/>
+    <w:lsdException w:name="Medium Shading 2 Accent 1" w:uiPriority="64"/>
+    <w:lsdException w:name="Medium List 1 Accent 1" w:uiPriority="65"/>
+    <w:lsdException w:name="Revision" w:semiHidden="1"/>
+    <w:lsdException w:name="List Paragraph" w:uiPriority="34" w:qFormat="1"/>
+    <w:lsdException w:name="Quote" w:uiPriority="29" w:qFormat="1"/>
+    <w:lsdException w:name="Intense Quote" w:uiPriority="30" w:qFormat="1"/>
+    <w:lsdException w:name="Medium List 2 Accent 1" w:uiPriority="66"/>
+    <w:lsdException w:name="Medium Grid 1 Accent 1" w:uiPriority="67"/>
+    <w:lsdException w:name="Medium Grid 2 Accent 1" w:uiPriority="68"/>
+    <w:lsdException w:name="Medium Grid 3 Accent 1" w:uiPriority="69"/>
+    <w:lsdException w:name="Dark List Accent 1" w:uiPriority="70"/>
+    <w:lsdException w:name="Colorful Shading Accent 1" w:uiPriority="71"/>
+    <w:lsdException w:name="Colorful List Accent 1" w:uiPriority="72"/>
+    <w:lsdException w:name="Colorful Grid Accent 1" w:uiPriority="73"/>
+    <w:lsdException w:name="Light Shading Accent 2" w:uiPriority="60"/>
+    <w:lsdException w:name="Light List Accent 2" w:uiPriority="61"/>
+    <w:lsdException w:name="Light Grid Accent 2" w:uiPriority="62"/>
+    <w:lsdException w:name="Medium Shading 1 Accent 2" w:uiPriority="63"/>
+    <w:lsdException w:name="Medium Shading 2 Accent 2" w:uiPriority="64"/>
+    <w:lsdException w:name="Medium List 1 Accent 2" w:uiPriority="65"/>
+    <w:lsdException w:name="Medium List 2 Accent 2" w:uiPriority="66"/>
+    <w:lsdException w:name="Medium Grid 1 Accent 2" w:uiPriority="67"/>
+    <w:lsdException w:name="Medium Grid 2 Accent 2" w:uiPriority="68"/>
+    <w:lsdException w:name="Medium Grid 3 Accent 2" w:uiPriority="69"/>
+    <w:lsdException w:name="Dark List Accent 2" w:uiPriority="70"/>
+    <w:lsdException w:name="Colorful Shading Accent 2" w:uiPriority="71"/>
+    <w:lsdException w:name="Colorful List Accent 2" w:uiPriority="72"/>
+    <w:lsdException w:name="Colorful Grid Accent 2" w:uiPriority="73"/>
+    <w:lsdException w:name="Light Shading Accent 3" w:uiPriority="60"/>
+    <w:lsdException w:name="Light List Accent 3" w:uiPriority="61"/>
+    <w:lsdException w:name="Light Grid Accent 3" w:uiPriority="62"/>
+    <w:lsdException w:name="Medium Shading 1 Accent 3" w:uiPriority="63"/>
+    <w:lsdException w:name="Medium Shading 2 Accent 3" w:uiPriority="64"/>
+    <w:lsdException w:name="Medium List 1 Accent 3" w:uiPriority="65"/>
+    <w:lsdException w:name="Medium List 2 Accent 3" w:uiPriority="66"/>
+    <w:lsdException w:name="Medium Grid 1 Accent 3" w:uiPriority="67"/>
+    <w:lsdException w:name="Medium Grid 2 Accent 3" w:uiPriority="68"/>
+    <w:lsdException w:name="Medium Grid 3 Accent 3" w:uiPriority="69"/>
+    <w:lsdException w:name="Dark List Accent 3" w:uiPriority="70"/>
+    <w:lsdException w:name="Colorful Shading Accent 3" w:uiPriority="71"/>
+    <w:lsdException w:name="Colorful List Accent 3" w:uiPriority="72"/>
+    <w:lsdException w:name="Colorful Grid Accent 3" w:uiPriority="73"/>
+    <w:lsdException w:name="Light Shading Accent 4" w:uiPriority="60"/>
+    <w:lsdException w:name="Light List Accent 4" w:uiPriority="61"/>
+    <w:lsdException w:name="Light Grid Accent 4" w:uiPriority="62"/>
+    <w:lsdException w:name="Medium Shading 1 Accent 4" w:uiPriority="63"/>
+    <w:lsdException w:name="Medium Shading 2 Accent 4" w:uiPriority="64"/>
+    <w:lsdException w:name="Medium List 1 Accent 4" w:uiPriority="65"/>
+    <w:lsdException w:name="Medium List 2 Accent 4" w:uiPriority="66"/>
+    <w:lsdException w:name="Medium Grid 1 Accent 4" w:uiPriority="67"/>
+    <w:lsdException w:name="Medium Grid 2 Accent 4" w:uiPriority="68"/>
+    <w:lsdException w:name="Medium Grid 3 Accent 4" w:uiPriority="69"/>
+    <w:lsdException w:name="Dark List Accent 4" w:uiPriority="70"/>
+    <w:lsdException w:name="Colorful Shading Accent 4" w:uiPriority="71"/>
+    <w:lsdException w:name="Colorful List Accent 4" w:uiPriority="72"/>
+    <w:lsdException w:name="Colorful Grid Accent 4" w:uiPriority="73"/>
+    <w:lsdException w:name="Light Shading Accent 5" w:uiPriority="60"/>
+    <w:lsdException w:name="Light List Accent 5" w:uiPriority="61"/>
+    <w:lsdException w:name="Light Grid Accent 5" w:uiPriority="62"/>
+    <w:lsdException w:name="Medium Shading 1 Accent 5" w:uiPriority="63"/>
+    <w:lsdException w:name="Medium Shading 2 Accent 5" w:uiPriority="64"/>
+    <w:lsdException w:name="Medium List 1 Accent 5" w:uiPriority="65"/>
+    <w:lsdException w:name="Medium List 2 Accent 5" w:uiPriority="66"/>
+    <w:lsdException w:name="Medium Grid 1 Accent 5" w:uiPriority="67"/>
+    <w:lsdException w:name="Medium Grid 2 Accent 5" w:uiPriority="68"/>
+    <w:lsdException w:name="Medium Grid 3 Accent 5" w:uiPriority="69"/>
+    <w:lsdException w:name="Dark List Accent 5" w:uiPriority="70"/>
+    <w:lsdException w:name="Colorful Shading Accent 5" w:uiPriority="71"/>
+    <w:lsdException w:name="Colorful List Accent 5" w:uiPriority="72"/>
+    <w:lsdException w:name="Colorful Grid Accent 5" w:uiPriority="73"/>
+    <w:lsdException w:name="Light Shading Accent 6" w:uiPriority="60"/>
+    <w:lsdException w:name="Light List Accent 6" w:uiPriority="61"/>
+    <w:lsdException w:name="Light Grid Accent 6" w:uiPriority="62"/>
+    <w:lsdException w:name="Medium Shading 1 Accent 6" w:uiPriority="63"/>
+    <w:lsdException w:name="Medium Shading 2 Accent 6" w:uiPriority="64"/>
+    <w:lsdException w:name="Medium List 1 Accent 6" w:uiPriority="65"/>
+    <w:lsdException w:name="Medium List 2 Accent 6" w:uiPriority="66"/>
+    <w:lsdException w:name="Medium Grid 1 Accent 6" w:uiPriority="67"/>
+    <w:lsdException w:name="Medium Grid 2 Accent 6" w:uiPriority="68"/>
+    <w:lsdException w:name="Medium Grid 3 Accent 6" w:uiPriority="69"/>
+    <w:lsdException w:name="Dark List Accent 6" w:uiPriority="70"/>
+    <w:lsdException w:name="Colorful Shading Accent 6" w:uiPriority="71"/>
+    <w:lsdException w:name="Colorful List Accent 6" w:uiPriority="72"/>
+    <w:lsdException w:name="Colorful Grid Accent 6" w:uiPriority="73"/>
+    <w:lsdException w:name="Subtle Emphasis" w:uiPriority="19" w:qFormat="1"/>
+    <w:lsdException w:name="Intense Emphasis" w:uiPriority="21" w:qFormat="1"/>
+    <w:lsdException w:name="Subtle Reference" w:uiPriority="31" w:qFormat="1"/>
+    <w:lsdException w:name="Intense Reference" w:uiPriority="32" w:qFormat="1"/>
+    <w:lsdException w:name="Book Title" w:uiPriority="33" w:qFormat="1"/>
+    <w:lsdException w:name="Bibliography" w:semiHidden="1" w:uiPriority="37" w:unhideWhenUsed="1"/>
+    <w:lsdException w:name="TOC Heading" w:semiHidden="1" w:uiPriority="39" w:unhideWhenUsed="1" w:qFormat="1"/>
+    <w:lsdException w:name="Plain Table 1" w:uiPriority="41"/>
+    <w:lsdException w:name="Plain Table 2" w:uiPriority="42"/>
+    <w:lsdException w:name="Plain Table 3" w:uiPriority="43"/>
+    <w:lsdException w:name="Plain Table 4" w:uiPriority="44"/>
+    <w:lsdException w:name="Plain Table 5" w:uiPriority="45"/>
+    <w:lsdException w:name="Grid Table Light" w:uiPriority="40"/>
+    <w:lsdException w:name="Grid Table 1 Light" w:uiPriority="46"/>
+    <w:lsdException w:name="Grid Table 2" w:uiPriority="47"/>
+    <w:lsdException w:name="Grid Table 3" w:uiPriority="48"/>
+    <w:lsdException w:name="Grid Table 4" w:uiPriority="49"/>
+    <w:lsdException w:name="Grid Table 5 Dark" w:uiPriority="50"/>
+    <w:lsdException w:name="Grid Table 6 Colorful" w:uiPriority="51"/>
+    <w:lsdException w:name="Grid Table 7 Colorful" w:uiPriority="52"/>
+    <w:lsdException w:name="Grid Table 1 Light Accent 1" w:uiPriority="46"/>
+    <w:lsdException w:name="Grid Table 2 Accent 1" w:uiPriority="47"/>
+    <w:lsdException w:name="Grid Table 3 Accent 1" w:uiPriority="48"/>
+    <w:lsdException w:name="Grid Table 4 Accent 1" w:uiPriority="49"/>
+    <w:lsdException w:name="Grid Table 5 Dark Accent 1" w:uiPriority="50"/>
+    <w:lsdException w:name="Grid Table 6 Colorful Accent 1" w:uiPriority="51"/>
+    <w:lsdException w:name="Grid Table 7 Colorful Accent 1" w:uiPriority="52"/>
+    <w:lsdException w:name="Grid Table 1 Light Accent 2" w:uiPriority="46"/>
+    <w:lsdException w:name="Grid Table 2 Accent 2" w:uiPriority="47"/>
+    <w:lsdException w:name="Grid Table 3 Accent 2" w:uiPriority="48"/>
+    <w:lsdException w:name="Grid Table 4 Accent 2" w:uiPriority="49"/>
+    <w:lsdException w:name="Grid Table 5 Dark Accent 2" w:uiPriority="50"/>
+    <w:lsdException w:name="Grid Table 6 Colorful Accent 2" w:uiPriority="51"/>
+    <w:lsdException w:name="Grid Table 7 Colorful Accent 2" w:uiPriority="52"/>
+    <w:lsdException w:name="Grid Table 1 Light Accent 3" w:uiPriority="46"/>
+    <w:lsdException w:name="Grid Table 2 Accent 3" w:uiPriority="47"/>
+    <w:lsdException w:name="Grid Table 3 Accent 3" w:uiPriority="48"/>
+    <w:lsdException w:name="Grid Table 4 Accent 3" w:uiPriority="49"/>
+    <w:lsdException w:name="Grid Table 5 Dark Accent 3" w:uiPriority="50"/>
+    <w:lsdException w:name="Grid Table 6 Colorful Accent 3" w:uiPriority="51"/>
+    <w:lsdException w:name="Grid Table 7 Colorful Accent 3" w:uiPriority="52"/>
+    <w:lsdException w:name="Grid Table 1 Light Accent 4" w:uiPriority="46"/>
+    <w:lsdException w:name="Grid Table 2 Accent 4" w:uiPriority="47"/>
+    <w:lsdException w:name="Grid Table 3 Accent 4" w:uiPriority="48"/>
+    <w:lsdException w:name="Grid Table 4 Accent 4" w:uiPriority="49"/>
+    <w:lsdException w:name="Grid Table 5 Dark Accent 4" w:uiPriority="50"/>
+    <w:lsdException w:name="Grid Table 6 Colorful Accent 4" w:uiPriority="51"/>
+    <w:lsdException w:name="Grid Table 7 Colorful Accent 4" w:uiPriority="52"/>
+    <w:lsdException w:name="Grid Table 1 Light Accent 5" w:uiPriority="46"/>
+    <w:lsdException w:name="Grid Table 2 Accent 5" w:uiPriority="47"/>
+    <w:lsdException w:name="Grid Table 3 Accent 5" w:uiPriority="48"/>
+    <w:lsdException w:name="Grid Table 4 Accent 5" w:uiPriority="49"/>
+    <w:lsdException w:name="Grid Table 5 Dark Accent 5" w:uiPriority="50"/>
+    <w:lsdException w:name="Grid Table 6 Colorful Accent 5" w:uiPriority="51"/>
+    <w:lsdException w:name="Grid Table 7 Colorful Accent 5" w:uiPriority="52"/>
+    <w:lsdException w:name="Grid Table 1 Light Accent 6" w:uiPriority="46"/>
+    <w:lsdException w:name="Grid Table 2 Accent 6" w:uiPriority="47"/>
+    <w:lsdException w:name="Grid Table 3 Accent 6" w:uiPriority="48"/>
+    <w:lsdException w:name="Grid Table 4 Accent 6" w:uiPriority="49"/>
+    <w:lsdException w:name="Grid Table 5 Dark Accent 6" w:uiPriority="50"/>
+    <w:lsdException w:name="Grid Table 6 Colorful Accent 6" w:uiPriority="51"/>
+    <w:lsdException w:name="Grid Table 7 Colorful Accent 6" w:uiPriority="52"/>
+    <w:lsdException w:name="List Table 1 Light" w:uiPriority="46"/>
+    <w:lsdException w:name="List Table 2" w:uiPriority="47"/>
+    <w:lsdException w:name="List Table 3" w:uiPriority="48"/>
+    <w:lsdException w:name="List Table 4" w:uiPriority="49"/>
+    <w:lsdException w:name="List Table 5 Dark" w:uiPriority="50"/>
+    <w:lsdException w:name="List Table 6 Colorful" w:uiPriority="51"/>
+    <w:lsdException w:name="List Table 7 Colorful" w:uiPriority="52"/>
+    <w:lsdException w:name="List Table 1 Light Accent 1" w:uiPriority="46"/>
+    <w:lsdException w:name="List Table 2 Accent 1" w:uiPriority="47"/>
+    <w:lsdException w:name="List Table 3 Accent 1" w:uiPriority="48"/>
+    <w:lsdException w:name="List Table 4 Accent 1" w:uiPriority="49"/>
+    <w:lsdException w:name="List Table 5 Dark Accent 1" w:uiPriority="50"/>
+    <w:lsdException w:name="List Table 6 Colorful Accent 1" w:uiPriority="51"/>
+    <w:lsdException w:name="List Table 7 Colorful Accent 1" w:uiPriority="52"/>
+    <w:lsdException w:name="List Table 1 Light Accent 2" w:uiPriority="46"/>
+    <w:lsdException w:name="List Table 2 Accent 2" w:uiPriority="47"/>
+    <w:lsdException w:name="List Table 3 Accent 2" w:uiPriority="48"/>
+    <w:lsdException w:name="List Table 4 Accent 2" w:uiPriority="49"/>
+    <w:lsdException w:name="List Table 5 Dark Accent 2" w:uiPriority="50"/>
+    <w:lsdException w:name="List Table 6 Colorful Accent 2" w:uiPriority="51"/>
+    <w:lsdException w:name="List Table 7 Colorful Accent 2" w:uiPriority="52"/>
+    <w:lsdException w:name="List Table 1 Light Accent 3" w:uiPriority="46"/>
+    <w:lsdException w:name="List Table 2 Accent 3" w:uiPriority="47"/>
+    <w:lsdException w:name="List Table 3 Accent 3" w:uiPriority="48"/>
+    <w:lsdException w:name="List Table 4 Accent 3" w:uiPriority="49"/>
+    <w:lsdException w:name="List Table 5 Dark Accent 3" w:uiPriority="50"/>
+    <w:lsdException w:name="List Table 6 Colorful Accent 3" w:uiPriority="51"/>
+    <w:lsdException w:name="List Table 7 Colorful Accent 3" w:uiPriority="52"/>
+    <w:lsdException w:name="List Table 1 Light Accent 4" w:uiPriority="46"/>
+    <w:lsdException w:name="List Table 2 Accent 4" w:uiPriority="47"/>
+    <w:lsdException w:name="List Table 3 Accent 4" w:uiPriority="48"/>
+    <w:lsdException w:name="List Table 4 Accent 4" w:uiPriority="49"/>
+    <w:lsdException w:name="List Table 5 Dark Accent 4" w:uiPriority="50"/>
+    <w:lsdException w:name="List Table 6 Colorful Accent 4" w:uiPriority="51"/>
+    <w:lsdException w:name="List Table 7 Colorful Accent 4" w:uiPriority="52"/>
+    <w:lsdException w:name="List Table 1 Light Accent 5" w:uiPriority="46"/>
+    <w:lsdException w:name="List Table 2 Accent 5" w:uiPriority="47"/>
+    <w:lsdException w:name="List Table 3 Accent 5" w:uiPriority="48"/>
+    <w:lsdException w:name="List Table 4 Accent 5" w:uiPriority="49"/>
+    <w:lsdException w:name="List Table 5 Dark Accent 5" w:uiPriority="50"/>
+    <w:lsdException w:name="List Table 6 Colorful Accent 5" w:uiPriority="51"/>
+    <w:lsdException w:name="List Table 7 Colorful Accent 5" w:uiPriority="52"/>
+    <w:lsdException w:name="List Table 1 Light Accent 6" w:uiPriority="46"/>
+    <w:lsdException w:name="List Table 2 Accent 6" w:uiPriority="47"/>
+    <w:lsdException w:name="List Table 3 Accent 6" w:uiPriority="48"/>
+    <w:lsdException w:name="List Table 4 Accent 6" w:uiPriority="49"/>
+    <w:lsdException w:name="List Table 5 Dark Accent 6" w:uiPriority="50"/>
+    <w:lsdException w:name="List Table 6 Colorful Accent 6" w:uiPriority="51"/>
+    <w:lsdException w:name="List Table 7 Colorful Accent 6" w:uiPriority="52"/>
+    <w:lsdException w:name="Mention" w:semiHidden="1" w:unhideWhenUsed="1"/>
+    <w:lsdException w:name="Smart Hyperlink" w:semiHidden="1" w:unhideWhenUsed="1"/>
+    <w:lsdException w:name="Hashtag" w:semiHidden="1" w:unhideWhenUsed="1"/>
+    <w:lsdException w:name="Unresolved Mention" w:semiHidden="1" w:unhideWhenUsed="1"/>
+    <w:lsdException w:name="Smart Link" w:semiHidden="1" w:unhideWhenUsed="1"/>
+  </w:latentStyles>
+  <w:style w:type="paragraph" w:default="1" w:styleId="Normal">
+    <w:name w:val="Normal"/>
+    <w:qFormat/>
+    <w:rsid w:val="00AC5069"/>
+    <w:rPr>
+      <w:rFonts w:cs="Times New Roman"/>
+      <w:sz w:val="3276"/>
+      <w:szCs w:val="3276"/>
+    </w:rPr>
+  </w:style>
+  <w:style w:type="character" w:default="1" w:styleId="DefaultParagraphFont">
+    <w:name w:val="Default Paragraph Font"/>
+    <w:uiPriority w:val="1"/>
+    <w:semiHidden/>
+    <w:unhideWhenUsed/>
+    <w:rsid w:val="00AC5069"/>
+  </w:style>
+  <w:style w:type="table" w:default="1" w:styleId="TableNormal">
+    <w:name w:val="Normal Table"/>
+    <w:uiPriority w:val="99"/>
+    <w:semiHidden/>
+    <w:unhideWhenUsed/>
+    <w:tblPr>
+      <w:tblInd w:w="0" w:type="dxa"/>
+      <w:tblCellMar>
+        <w:top w:w="0" w:type="dxa"/>
+        <w:left w:w="108" w:type="dxa"/>
+        <w:bottom w:w="0" w:type="dxa"/>
+        <w:right w:w="108" w:type="dxa"/>
+      </w:tblCellMar>
+    </w:tblPr>
+  </w:style>
+  <w:style w:type="numbering" w:default="1" w:styleId="NoList">
+    <w:name w:val="No List"/>
+    <w:uiPriority w:val="99"/>
+    <w:semiHidden/>
+    <w:unhideWhenUsed/>
+  </w:style>
+  <w:style w:type="character" w:styleId="PlaceholderText">
+    <w:name w:val="Placeholder Text"/>
+    <w:basedOn w:val="DefaultParagraphFont"/>
+    <w:uiPriority w:val="99"/>
+    <w:semiHidden/>
+    <w:rsid w:val="00AC5069"/>
+    <w:rPr>
+      <w:color w:val="666666"/>
+    </w:rPr>
+  </w:style>
+</w:styles>
+</file>
+
+<file path=word/glossary/webSettings.xml><?xml version="1.0" encoding="utf-8"?>
+<w:webSettings xmlns:mc="http://schemas.openxmlformats.org/markup-compatibility/2006" xmlns:r="http://schemas.openxmlformats.org/officeDocument/2006/relationships" xmlns:w="http://schemas.openxmlformats.org/wordprocessingml/2006/main" xmlns:w14="http://schemas.microsoft.com/office/word/2010/wordml" xmlns:w15="http://schemas.microsoft.com/office/word/2012/wordml" xmlns:w16cex="http://schemas.microsoft.com/office/word/2018/wordml/cex" xmlns:w16cid="http://schemas.microsoft.com/office/word/2016/wordml/cid" xmlns:w16="http://schemas.microsoft.com/office/word/2018/wordml" xmlns:w16du="http://schemas.microsoft.com/office/word/2023/wordml/word16du" xmlns:w16sdtdh="http://schemas.microsoft.com/office/word/2020/wordml/sdtdatahash" xmlns:w16sdtfl="http://schemas.microsoft.com/office/word/2024/wordml/sdtformatlock" xmlns:w16se="http://schemas.microsoft.com/office/word/2015/wordml/symex" mc:Ignorable="w14 w15 w16se w16cid w16 w16cex w16sdtdh w16sdtfl w16du">
+  <w:optimizeForBrowser/>
+  <w:allowPNG/>
+</w:webSettings>
 </file>
 
 <file path=word/theme/theme1.xml><?xml version="1.0" encoding="utf-8"?>

</xml_diff>